<commit_message>
Worked on introdution first draft. Made some formatting adjustments and comments.
</commit_message>
<xml_diff>
--- a/Manuscript draft.docx
+++ b/Manuscript draft.docx
@@ -1,35 +1,252 @@
 
 <file path=word/document.xml><?xml version="1.0" encoding="utf-8"?>
-<w:document xmlns:wpc="http://schemas.microsoft.com/office/word/2010/wordprocessingCanvas" xmlns:cx="http://schemas.microsoft.com/office/drawing/2014/chartex" xmlns:cx1="http://schemas.microsoft.com/office/drawing/2015/9/8/chartex" xmlns:cx2="http://schemas.microsoft.com/office/drawing/2015/10/21/chartex" xmlns:cx3="http://schemas.microsoft.com/office/drawing/2016/5/9/chartex" xmlns:cx4="http://schemas.microsoft.com/office/drawing/2016/5/10/chartex" xmlns:cx5="http://schemas.microsoft.com/office/drawing/2016/5/11/chartex" xmlns:cx6="http://schemas.microsoft.com/office/drawing/2016/5/12/chartex" xmlns:cx7="http://schemas.microsoft.com/office/drawing/2016/5/13/chartex" xmlns:cx8="http://schemas.microsoft.com/office/drawing/2016/5/14/chartex" xmlns:mc="http://schemas.openxmlformats.org/markup-compatibility/2006" xmlns:aink="http://schemas.microsoft.com/office/drawing/2016/ink" xmlns:am3d="http://schemas.microsoft.com/office/drawing/2017/model3d" xmlns:o="urn:schemas-microsoft-com:office:office" xmlns:oel="http://schemas.microsoft.com/office/2019/extlst" xmlns:r="http://schemas.openxmlformats.org/officeDocument/2006/relationships" xmlns:m="http://schemas.openxmlformats.org/officeDocument/2006/math" xmlns:v="urn:schemas-microsoft-com:vml" xmlns:wp14="http://schemas.microsoft.com/office/word/2010/wordprocessingDrawing" xmlns:wp="http://schemas.openxmlformats.org/drawingml/2006/wordprocessingDrawing" xmlns:w10="urn:schemas-microsoft-com:office:word" xmlns:w="http://schemas.openxmlformats.org/wordprocessingml/2006/main" xmlns:w14="http://schemas.microsoft.com/office/word/2010/wordml" xmlns:w15="http://schemas.microsoft.com/office/word/2012/wordml" xmlns:w16cex="http://schemas.microsoft.com/office/word/2018/wordml/cex" xmlns:w16cid="http://schemas.microsoft.com/office/word/2016/wordml/cid" xmlns:w16="http://schemas.microsoft.com/office/word/2018/wordml" xmlns:w16du="http://schemas.microsoft.com/office/word/2023/wordml/word16du" xmlns:w16sdtdh="http://schemas.microsoft.com/office/word/2020/wordml/sdtdatahash" xmlns:w16sdtfl="http://schemas.microsoft.com/office/word/2024/wordml/sdtformatlock" xmlns:w16se="http://schemas.microsoft.com/office/word/2015/wordml/symex" xmlns:wpg="http://schemas.microsoft.com/office/word/2010/wordprocessingGroup" xmlns:wpi="http://schemas.microsoft.com/office/word/2010/wordprocessingInk" xmlns:wne="http://schemas.microsoft.com/office/word/2006/wordml" xmlns:wps="http://schemas.microsoft.com/office/word/2010/wordprocessingShape" mc:Ignorable="w14 w15 w16se w16cid w16 w16cex w16sdtdh w16sdtfl w16du wp14">
+<w:document xmlns:wpc="http://schemas.microsoft.com/office/word/2010/wordprocessingCanvas" xmlns:cx="http://schemas.microsoft.com/office/drawing/2014/chartex" xmlns:cx1="http://schemas.microsoft.com/office/drawing/2015/9/8/chartex" xmlns:cx2="http://schemas.microsoft.com/office/drawing/2015/10/21/chartex" xmlns:cx3="http://schemas.microsoft.com/office/drawing/2016/5/9/chartex" xmlns:cx4="http://schemas.microsoft.com/office/drawing/2016/5/10/chartex" xmlns:cx5="http://schemas.microsoft.com/office/drawing/2016/5/11/chartex" xmlns:cx6="http://schemas.microsoft.com/office/drawing/2016/5/12/chartex" xmlns:cx7="http://schemas.microsoft.com/office/drawing/2016/5/13/chartex" xmlns:cx8="http://schemas.microsoft.com/office/drawing/2016/5/14/chartex" xmlns:mc="http://schemas.openxmlformats.org/markup-compatibility/2006" xmlns:aink="http://schemas.microsoft.com/office/drawing/2016/ink" xmlns:am3d="http://schemas.microsoft.com/office/drawing/2017/model3d" xmlns:o="urn:schemas-microsoft-com:office:office" xmlns:oel="http://schemas.microsoft.com/office/2019/extlst" xmlns:r="http://schemas.openxmlformats.org/officeDocument/2006/relationships" xmlns:m="http://schemas.openxmlformats.org/officeDocument/2006/math" xmlns:v="urn:schemas-microsoft-com:vml" xmlns:wp14="http://schemas.microsoft.com/office/word/2010/wordprocessingDrawing" xmlns:wp="http://schemas.openxmlformats.org/drawingml/2006/wordprocessingDrawing" xmlns:w10="urn:schemas-microsoft-com:office:word" xmlns:w="http://schemas.openxmlformats.org/wordprocessingml/2006/main" xmlns:w14="http://schemas.microsoft.com/office/word/2010/wordml" xmlns:w15="http://schemas.microsoft.com/office/word/2012/wordml" xmlns:w16cei="http://schemas.microsoft.com/office/word/2026/wordml/cei" xmlns:w16cex="http://schemas.microsoft.com/office/word/2018/wordml/cex" xmlns:w16cid="http://schemas.microsoft.com/office/word/2016/wordml/cid" xmlns:w16="http://schemas.microsoft.com/office/word/2018/wordml" xmlns:w16du="http://schemas.microsoft.com/office/word/2023/wordml/word16du" xmlns:w16sdtdh="http://schemas.microsoft.com/office/word/2020/wordml/sdtdatahash" xmlns:w16sdtfl="http://schemas.microsoft.com/office/word/2024/wordml/sdtformatlock" xmlns:w16se="http://schemas.microsoft.com/office/word/2015/wordml/symex" xmlns:wpg="http://schemas.microsoft.com/office/word/2010/wordprocessingGroup" xmlns:wpi="http://schemas.microsoft.com/office/word/2010/wordprocessingInk" xmlns:wne="http://schemas.microsoft.com/office/word/2006/wordml" xmlns:wps="http://schemas.microsoft.com/office/word/2010/wordprocessingShape" mc:Ignorable="w14 w15 w16se w16cid w16 w16cex w16sdtdh w16sdtfl w16du wp14">
   <w:body>
     <w:p>
       <w:pPr>
         <w:pStyle w:val="Title"/>
-      </w:pPr>
-      <w:r>
-        <w:t>[TITLE]</w:t>
-      </w:r>
-    </w:p>
-    <w:p>
-      <w:pPr>
+        <w:jc w:val="left"/>
+      </w:pPr>
+      <w:r>
+        <w:t>Environmental and spatiotemporal influences on winter ichthyoplankton assemblages of the northern California Current</w:t>
+      </w:r>
+    </w:p>
+    <w:p>
+      <w:pPr>
+        <w:pStyle w:val="AuthorList"/>
+      </w:pPr>
+      <w:r>
+        <w:t>Luke A. Bobay</w:t>
+      </w:r>
+      <w:r>
+        <w:rPr>
+          <w:vertAlign w:val="superscript"/>
+        </w:rPr>
+        <w:t>1</w:t>
+      </w:r>
+      <w:r>
+        <w:rPr>
+          <w:vertAlign w:val="superscript"/>
+        </w:rPr>
+        <w:t>,2</w:t>
+      </w:r>
+      <w:r>
+        <w:rPr>
+          <w:vertAlign w:val="superscript"/>
+        </w:rPr>
+        <w:t>^</w:t>
+      </w:r>
+      <w:r>
+        <w:rPr>
+          <w:vertAlign w:val="superscript"/>
+        </w:rPr>
+        <w:t>*</w:t>
+      </w:r>
+      <w:r>
+        <w:t xml:space="preserve">, </w:t>
+      </w:r>
+      <w:r>
+        <w:t>William R. McCloskey</w:t>
+      </w:r>
+      <w:r>
+        <w:rPr>
+          <w:vertAlign w:val="superscript"/>
+        </w:rPr>
+        <w:t>1</w:t>
+      </w:r>
+      <w:commentRangeStart w:id="0"/>
+      <w:r>
+        <w:rPr>
+          <w:vertAlign w:val="superscript"/>
+        </w:rPr>
+        <w:t>^</w:t>
+      </w:r>
+      <w:commentRangeEnd w:id="0"/>
+      <w:r>
+        <w:rPr>
+          <w:rStyle w:val="CommentReference"/>
+          <w:sz w:val="24"/>
+          <w:szCs w:val="24"/>
+        </w:rPr>
+        <w:commentReference w:id="0"/>
+      </w:r>
+      <w:r>
+        <w:t xml:space="preserve">, </w:t>
+      </w:r>
+      <w:r>
+        <w:t>Nicholas F. Howard</w:t>
+      </w:r>
+      <w:r>
+        <w:rPr>
+          <w:vertAlign w:val="superscript"/>
+        </w:rPr>
+        <w:t>2</w:t>
+      </w:r>
+      <w:r>
+        <w:t>, Robert K. Cowen</w:t>
+      </w:r>
+      <w:r>
+        <w:rPr>
+          <w:vertAlign w:val="superscript"/>
+        </w:rPr>
+        <w:t>2</w:t>
+      </w:r>
+      <w:r>
+        <w:t xml:space="preserve"> and</w:t>
+      </w:r>
+      <w:r>
+        <w:t xml:space="preserve"> </w:t>
+      </w:r>
+      <w:r>
+        <w:t>Su Sponaugle</w:t>
+      </w:r>
+      <w:r>
+        <w:rPr>
+          <w:vertAlign w:val="superscript"/>
+        </w:rPr>
+        <w:t>1,2</w:t>
+      </w:r>
+    </w:p>
+    <w:p>
+      <w:pPr>
+        <w:spacing w:line="240" w:lineRule="auto"/>
         <w:rPr>
           <w:b/>
+        </w:rPr>
+      </w:pPr>
+      <w:r>
+        <w:rPr>
+          <w:vertAlign w:val="superscript"/>
+        </w:rPr>
+        <w:t>1</w:t>
+      </w:r>
+      <w:r>
+        <w:t>Department of Integrative Biology, Oregon State University, Corvallis, OR, USA</w:t>
+      </w:r>
+    </w:p>
+    <w:p>
+      <w:pPr>
+        <w:spacing w:line="240" w:lineRule="auto"/>
+      </w:pPr>
+      <w:r>
+        <w:rPr>
+          <w:vertAlign w:val="superscript"/>
+        </w:rPr>
+        <w:t>2</w:t>
+      </w:r>
+      <w:r>
+        <w:t>Hatfield Marine Science Center, Newport, OR, USA</w:t>
+      </w:r>
+    </w:p>
+    <w:p>
+      <w:pPr>
+        <w:spacing w:line="240" w:lineRule="auto"/>
+        <w:rPr>
+          <w:b/>
+        </w:rPr>
+      </w:pPr>
+      <w:r>
+        <w:rPr>
+          <w:b/>
+        </w:rPr>
+        <w:t>^</w:t>
+      </w:r>
+      <w:r>
+        <w:rPr>
+          <w:b/>
+        </w:rPr>
+        <w:t xml:space="preserve"> </w:t>
+      </w:r>
+      <w:r>
+        <w:rPr>
+          <w:b/>
+        </w:rPr>
+        <w:t>First author</w:t>
+      </w:r>
+    </w:p>
+    <w:p>
+      <w:pPr>
+        <w:spacing w:line="240" w:lineRule="auto"/>
+      </w:pPr>
+      <w:r>
+        <w:rPr>
+          <w:b/>
+        </w:rPr>
+        <w:t>*</w:t>
+      </w:r>
+      <w:r>
+        <w:rPr>
           <w:bCs/>
         </w:rPr>
-      </w:pPr>
+        <w:t xml:space="preserve"> </w:t>
+      </w:r>
       <w:r>
         <w:rPr>
           <w:b/>
-          <w:bCs/>
-        </w:rPr>
-        <w:t>[authors</w:t>
+        </w:rPr>
+        <w:t>Correspondence:</w:t>
       </w:r>
       <w:r>
         <w:rPr>
           <w:b/>
-          <w:bCs/>
-        </w:rPr>
-        <w:t xml:space="preserve"> and affiliations]</w:t>
+        </w:rPr>
+        <w:t xml:space="preserve"> </w:t>
+      </w:r>
+      <w:r>
+        <w:t>Luke A. Bobay</w:t>
+      </w:r>
+      <w:r>
+        <w:t xml:space="preserve">; </w:t>
+      </w:r>
+      <w:r>
+        <w:t>bobayl@oregonstate.edu</w:t>
+      </w:r>
+    </w:p>
+    <w:p>
+      <w:pPr>
+        <w:pStyle w:val="AuthorList"/>
+      </w:pPr>
+      <w:r>
+        <w:t xml:space="preserve">KEYWORDS: </w:t>
+      </w:r>
+      <w:r>
+        <w:t>Ichthyoplankton, (total 5-</w:t>
+      </w:r>
+      <w:r>
+        <w:t>-</w:t>
+      </w:r>
+      <w:r>
+        <w:t>8 keywords in order of importance)</w:t>
+      </w:r>
+    </w:p>
+    <w:p>
+      <w:pPr>
+        <w:pStyle w:val="AuthorList"/>
+      </w:pPr>
+      <w:commentRangeStart w:id="1"/>
+      <w:r>
+        <w:t>ABSTRACT</w:t>
+      </w:r>
+      <w:commentRangeEnd w:id="1"/>
+      <w:r>
+        <w:rPr>
+          <w:rStyle w:val="CommentReference"/>
+          <w:sz w:val="24"/>
+          <w:szCs w:val="24"/>
+        </w:rPr>
+        <w:commentReference w:id="1"/>
+      </w:r>
+    </w:p>
+    <w:p>
+      <w:pPr>
+        <w:spacing w:line="240" w:lineRule="auto"/>
+        <w:ind w:firstLine="720"/>
+      </w:pPr>
+      <w:r>
+        <w:t>Winter ichthyoplankton abundance in the northern California Current is a strong predictor of annual recruitment of important fisheries species such as salmon, as juvenile salmon diet at ocean entry is dominated by winter-spawned early juvenile fishes. Yet little is known about the influences of spatiotemporal and environmental factors on the composition of these ichthyoplankton assemblages. To characterize winter ichthyoplankton assemblages and identify the factors that influence their composition, we collected depth-discrete ichthyoplankton samples from across the northern California Current ecosystem (41–47°N) on four two-week research cruises during winter 2018–2023. Temperature, salinity, dissolved oxygen concentration (DO), and fluorescence were measured simultaneously with the ichthyoplankton. Ichthyoplankton were visually identified to the lowest possible taxonomic resolution, and dominant ichthyoplankton assemblages were identified using hierarchical clustering analysis and non-metric multidimensional scaling ordination. Distance-based redundancy analysis was used to estimate the effects of longitude, latitude, year, time of day, sampling depth, seafloor depth, temperature, salinity, DO, and fluorescence on assemblage composition. Finally, generalized linear regression was used to quantify diel differences in the vertical distributions of ichthyoplankton taxa. Dominant ichthyoplankton assemblages included those characterized primarily by Sebastes spp., Parophrys vetulus, mesopelagics, and Osmeridae. Spatiotemporal and environmental conditions accounted for a significant amount of variation in ichthyoplankton assemblage composition. Vertical distributions of several taxa differed significantly between night and day. Understanding these spatiotemporal and environmental influences on winter ichthyoplankton assemblages will help explain variation and potentially predict the abundance of winter-spawning fishes and subsequent recruitment of fisheries species that prey on them.</w:t>
+      </w:r>
+      <w:r>
+        <w:br w:type="page"/>
       </w:r>
     </w:p>
     <w:p>
@@ -37,287 +254,545 @@
         <w:pStyle w:val="Heading1"/>
       </w:pPr>
       <w:r>
-        <w:t>Keywords</w:t>
-      </w:r>
-      <w:r>
-        <w:t xml:space="preserve">: </w:t>
-      </w:r>
-    </w:p>
-    <w:p>
-      <w:r>
-        <w:t>3 to 8 keywords in order of importance</w:t>
-      </w:r>
-    </w:p>
-    <w:p>
-      <w:pPr>
-        <w:pStyle w:val="Heading1"/>
-      </w:pPr>
-      <w:r>
-        <w:t>Abstract</w:t>
-      </w:r>
-    </w:p>
-    <w:p>
-      <w:r>
-        <w:t>Abstract with &lt; 250 words</w:t>
-      </w:r>
-      <w:r>
-        <w:br w:type="page"/>
-      </w:r>
-    </w:p>
-    <w:p>
-      <w:pPr>
-        <w:pStyle w:val="Heading1"/>
-      </w:pPr>
-      <w:r>
         <w:lastRenderedPageBreak/>
-        <w:t>Introduction</w:t>
-      </w:r>
-    </w:p>
-    <w:p>
-      <w:r>
-        <w:t xml:space="preserve">Intro paragraphs (see outline </w:t>
-      </w:r>
-      <w:r>
-        <w:t xml:space="preserve">Google </w:t>
-      </w:r>
-      <w:r>
-        <w:t>doc)</w:t>
-      </w:r>
-    </w:p>
-    <w:p>
-      <w:pPr>
-        <w:spacing w:line="278" w:lineRule="auto"/>
-      </w:pPr>
-      <w:r>
-        <w:br w:type="page"/>
-      </w:r>
-    </w:p>
-    <w:p>
-      <w:pPr>
-        <w:pStyle w:val="Heading1"/>
-      </w:pPr>
-      <w:r>
-        <w:lastRenderedPageBreak/>
-        <w:t>Methods</w:t>
-      </w:r>
-    </w:p>
-    <w:p>
-      <w:pPr>
-        <w:pStyle w:val="Heading2"/>
-      </w:pPr>
-      <w:r>
-        <w:t>Sampling and data collection</w:t>
-      </w:r>
-    </w:p>
-    <w:p>
-      <w:r>
-        <w:t>(see outline Google doc)</w:t>
-      </w:r>
-    </w:p>
-    <w:p>
-      <w:pPr>
-        <w:pStyle w:val="Heading2"/>
-      </w:pPr>
-      <w:r>
-        <w:t>Statistical</w:t>
-      </w:r>
-      <w:r>
-        <w:t xml:space="preserve"> </w:t>
-      </w:r>
-      <w:r>
-        <w:t>analysis</w:t>
-      </w:r>
-    </w:p>
-    <w:p>
-      <w:r>
-        <w:t>All data analyses were performed in RStudio (</w:t>
+        <w:t>1</w:t>
+      </w:r>
+      <w:r>
+        <w:tab/>
+      </w:r>
+      <w:r>
+        <w:t>INTRODUCTION</w:t>
+      </w:r>
+    </w:p>
+    <w:p>
+      <w:pPr>
+        <w:spacing w:line="240" w:lineRule="auto"/>
+        <w:ind w:firstLine="720"/>
+      </w:pPr>
+      <w:r>
+        <w:t>[</w:t>
       </w:r>
       <w:r>
         <w:rPr>
           <w:i/>
           <w:iCs/>
-        </w:rPr>
-        <w:t>add citation and version</w:t>
-      </w:r>
-      <w:r>
-        <w:t xml:space="preserve">). To identify </w:t>
-      </w:r>
-      <w:r>
-        <w:t xml:space="preserve">ecologically distinct </w:t>
-      </w:r>
-      <w:r>
-        <w:t>larval fish assemblages,</w:t>
-      </w:r>
-      <w:r>
-        <w:t xml:space="preserve"> </w:t>
-      </w:r>
-      <w:r>
-        <w:t xml:space="preserve">first </w:t>
-      </w:r>
-      <w:r>
-        <w:t>the density of each taxonomic group within each net tow was square-root transformed. These were then used to generate a matrix of Bray-Curtis dissimilarities between net tows. Agglomerative hierarchal clustering was performed on th</w:t>
-      </w:r>
-      <w:r>
-        <w:t xml:space="preserve">e dissimilarity matrix </w:t>
-      </w:r>
-      <w:r>
-        <w:t xml:space="preserve">with the “average” method. </w:t>
-      </w:r>
-      <w:r>
-        <w:t xml:space="preserve">To determine the number of clusters necessary </w:t>
-      </w:r>
-      <w:r>
-        <w:t>(</w:t>
+          <w:u w:val="single"/>
+        </w:rPr>
+        <w:t xml:space="preserve">Intro </w:t>
       </w:r>
       <w:r>
         <w:rPr>
           <w:i/>
           <w:iCs/>
-        </w:rPr>
-        <w:t>add more here</w:t>
+          <w:u w:val="single"/>
+        </w:rPr>
+        <w:t>paragraph</w:t>
       </w:r>
       <w:r>
         <w:rPr>
           <w:i/>
           <w:iCs/>
-        </w:rPr>
-        <w:t>. necessary for</w:t>
+          <w:u w:val="single"/>
+        </w:rPr>
+        <w:t xml:space="preserve"> building into</w:t>
       </w:r>
       <w:r>
         <w:rPr>
           <w:i/>
           <w:iCs/>
-        </w:rPr>
-        <w:t xml:space="preserve"> what</w:t>
+          <w:u w:val="single"/>
+        </w:rPr>
+        <w:t xml:space="preserve"> the following</w:t>
       </w:r>
       <w:r>
         <w:rPr>
           <w:i/>
           <w:iCs/>
-        </w:rPr>
-        <w:t>?</w:t>
-      </w:r>
-      <w:r>
-        <w:t xml:space="preserve">), a dendrogram of the clustering results </w:t>
-      </w:r>
-      <w:r>
-        <w:t>was</w:t>
-      </w:r>
-      <w:r>
-        <w:t xml:space="preserve"> plotted</w:t>
-      </w:r>
-      <w:r>
-        <w:t xml:space="preserve"> with </w:t>
-      </w:r>
-      <w:r>
-        <w:t>overlayed rectangles to identify cluster boundaries</w:t>
-      </w:r>
+          <w:u w:val="single"/>
+        </w:rPr>
+        <w:t xml:space="preserve"> background</w:t>
+      </w:r>
+      <w:r>
+        <w:t>]</w:t>
+      </w:r>
+    </w:p>
+    <w:p>
+      <w:pPr>
+        <w:spacing w:line="240" w:lineRule="auto"/>
+        <w:ind w:firstLine="720"/>
+      </w:pPr>
+      <w:r>
+        <w:t>For many fish species of the northeast Pacific, peak spawning occurs in the winter during which offshore transport is minimal (Brodeur et al., 2008; Doyle, 1992). However, this season is relatively neglected in ichthyoplankton research in favor of spring and summer when sea conditions are more ideal</w:t>
+      </w:r>
+      <w:commentRangeStart w:id="2"/>
       <w:r>
         <w:t xml:space="preserve">. </w:t>
       </w:r>
-    </w:p>
-    <w:p>
-      <w:r>
-        <w:t xml:space="preserve">To visualize the taxonomic composition of each cluster, </w:t>
-      </w:r>
-      <w:r>
-        <w:t xml:space="preserve">the taxa densities in each net tow were plotted </w:t>
-      </w:r>
-      <w:r>
-        <w:t xml:space="preserve">in a stacked bar plot. Beyond visual </w:t>
-      </w:r>
-      <w:r>
-        <w:t>this visual assessment,</w:t>
-      </w:r>
-      <w:r>
-        <w:t xml:space="preserve"> an in</w:t>
-      </w:r>
-      <w:r>
-        <w:t xml:space="preserve">dicator species analysis </w:t>
-      </w:r>
-      <w:r>
-        <w:t xml:space="preserve">(ISA) </w:t>
-      </w:r>
-      <w:r>
-        <w:t>was run</w:t>
-      </w:r>
-      <w:r>
-        <w:t xml:space="preserve"> to identify </w:t>
-      </w:r>
-      <w:r>
-        <w:t>dominant taxonomic group(s) for every cluster</w:t>
-      </w:r>
-      <w:r>
-        <w:t xml:space="preserve">. </w:t>
-      </w:r>
-      <w:r>
-        <w:t xml:space="preserve">The bar plot and ISA were used in conjunction to </w:t>
-      </w:r>
-      <w:r>
-        <w:t>define major clusters of interest and the</w:t>
-      </w:r>
-      <w:r>
-        <w:t xml:space="preserve"> ecological </w:t>
-      </w:r>
-      <w:r>
-        <w:t>community they represent.</w:t>
+      <w:commentRangeEnd w:id="2"/>
+      <w:r>
+        <w:rPr>
+          <w:rStyle w:val="CommentReference"/>
+          <w:sz w:val="24"/>
+          <w:szCs w:val="24"/>
+        </w:rPr>
+        <w:commentReference w:id="2"/>
+      </w:r>
+      <w:r>
+        <w:t>Being the population that goes on to comprise adult fish stocks, it is vital to understand the dynamics of the larval fish community (LFC) in all seasons and the factors contributing to its composition and abundance. Such knowledge is key for predicting future recruitment and monitoring stocks in a changing environment (Auth, 2011</w:t>
+      </w:r>
+      <w:commentRangeStart w:id="3"/>
+      <w:r>
+        <w:t xml:space="preserve">). </w:t>
+      </w:r>
+      <w:commentRangeEnd w:id="3"/>
+      <w:r>
+        <w:rPr>
+          <w:rStyle w:val="CommentReference"/>
+          <w:sz w:val="24"/>
+          <w:szCs w:val="24"/>
+        </w:rPr>
+        <w:commentReference w:id="3"/>
+      </w:r>
+    </w:p>
+    <w:p>
+      <w:pPr>
+        <w:spacing w:line="240" w:lineRule="auto"/>
+        <w:ind w:firstLine="720"/>
+      </w:pPr>
+      <w:r>
+        <w:t xml:space="preserve">Of particular interest are the highly valuable fisheries on which coastal communities rely for economic, recreational, and cultural purposes, such as salmon. During the vulnerable ocean-entering stage, salmon smolt survival is influenced heavily by prey availability. Significant relationships have been found between winter ichthyoplankton and the juvenile salmon survival with larval biomass explaining between 34% and 85% of the variability in subsequent marine survival and adult returns (Daly et al., 2013). The nearshore region specifically provides optimal habitat for early developmental stages, offering protection from predators and ideal physiochemical conditions, in addition to a rich prey field (Pattrick et al., 2021). Knowing the dominant taxa of nearshore larval fish assemblages and their abundance can give an estimate of available prey for smolt as they enter the ocean. Thus, winter ichthyoplankton data could act as a useful metric in timing hatchery salmon release to optimize feeding conditions upon ocean </w:t>
+      </w:r>
+      <w:commentRangeStart w:id="4"/>
+      <w:r>
+        <w:t xml:space="preserve">entry </w:t>
+      </w:r>
+      <w:commentRangeEnd w:id="4"/>
+      <w:r>
+        <w:rPr>
+          <w:rStyle w:val="CommentReference"/>
+          <w:sz w:val="24"/>
+          <w:szCs w:val="24"/>
+        </w:rPr>
+        <w:commentReference w:id="4"/>
+      </w:r>
+      <w:r>
+        <w:t>(Daly et al., 2013). However, given the dynamic nature of the coastal environment in which pre-settlement larvae and smolt disperse, understanding the influence of environmental and spatiotemporal variables on larval distribution remains challenging (Pattrick et al., 2021).</w:t>
+      </w:r>
+    </w:p>
+    <w:p>
+      <w:pPr>
+        <w:spacing w:line="240" w:lineRule="auto"/>
+        <w:ind w:firstLine="720"/>
+      </w:pPr>
+      <w:r>
+        <w:t xml:space="preserve">While variation in larval assemblages is known to be associated with oceanographic variability, local factors may also influence their composition. Broad oceanographic indicators such as </w:t>
+      </w:r>
+      <w:commentRangeStart w:id="5"/>
+      <w:r>
+        <w:t xml:space="preserve">water mass stability, current direction, and local topography </w:t>
+      </w:r>
+      <w:commentRangeEnd w:id="5"/>
+      <w:r>
+        <w:rPr>
+          <w:rStyle w:val="CommentReference"/>
+          <w:sz w:val="24"/>
+          <w:szCs w:val="24"/>
+        </w:rPr>
+        <w:commentReference w:id="5"/>
+      </w:r>
+      <w:r>
+        <w:t xml:space="preserve">have all been found to influence the composition, abundance, and distribution of larval fish (Doyle et al., 2002; Roussel et al., 2010). </w:t>
+      </w:r>
+      <w:commentRangeStart w:id="6"/>
+      <w:r>
+        <w:t xml:space="preserve">In </w:t>
+      </w:r>
+      <w:commentRangeEnd w:id="6"/>
+      <w:r>
+        <w:rPr>
+          <w:rStyle w:val="CommentReference"/>
+          <w:sz w:val="24"/>
+          <w:szCs w:val="24"/>
+        </w:rPr>
+        <w:commentReference w:id="6"/>
+      </w:r>
+      <w:r>
+        <w:t>the dynamic upwelling system of the northern California Current (NCC), the coastal upwelling transport index (CUTI) predicted taxa co-occurance of larvae with varying strength according to the seasonal upwelling or downwelling regime of the region (Schmid et al., 2023). Variability on finer spatial and temporal scales is also relevant to the LFC in coastal marine environments (Gallego-Zerrato et al., 2024). Early-live distribution, growth, and survival of fish larvae is strongly influenced by temperature, salinity, and dissolved oxygen concentration (DO) (Auth, 2011). In fact, larval fish are particularly vulnerable to depressed DO, compared to adult conspecifics, with hypoxia exposure during early-life having long-term effects on growth and survival (Johnson-Colegrove et al., 2015). Such factors vary in space, alongside ichthyoplankton assemblages generally reflecting the habitat preference of adults (Doyle et al., 2002). The result is distinct horizontal community structuring with coastal upwelling, offshore oligotrophic, and shelf-slope transitional zones (</w:t>
+      </w:r>
+      <w:commentRangeStart w:id="7"/>
+      <w:r>
+        <w:t>Gleiber</w:t>
+      </w:r>
+      <w:commentRangeEnd w:id="7"/>
+      <w:r>
+        <w:rPr>
+          <w:rStyle w:val="CommentReference"/>
+          <w:sz w:val="24"/>
+          <w:szCs w:val="24"/>
+        </w:rPr>
+        <w:commentReference w:id="7"/>
+      </w:r>
+      <w:r>
+        <w:t xml:space="preserve">, 2020; Richardson et al., 1980). Larvae also aggregate vertically, allowing them to reach or maintain a position within water masses of ideal environmental, growth, and feeding conditions and transport potential (Huebert et al., 2010; Primo et al. 2012). These vertical assemblages can differ further on fine, diel time scales. There is evidence for diel vertical migration (DVM) in the larval-stage of many taxa, potentially </w:t>
+      </w:r>
+      <w:r>
+        <w:lastRenderedPageBreak/>
+        <w:t xml:space="preserve">providing an adaptive advantage in predator avoidance; light and temperature optimization; and prey abundance (Haldorson et al., 1993; Primo et al., 2012). </w:t>
+      </w:r>
+      <w:commentRangeStart w:id="8"/>
+      <w:r>
+        <w:t>Diel effects such as migration and visual net avoidance are not accounted for, however, in common sampling schemes that are depth-integrated and do not tow at multiple times of day</w:t>
+      </w:r>
+      <w:commentRangeEnd w:id="8"/>
+      <w:r>
+        <w:rPr>
+          <w:rStyle w:val="CommentReference"/>
+          <w:sz w:val="24"/>
+          <w:szCs w:val="24"/>
+        </w:rPr>
+        <w:commentReference w:id="8"/>
+      </w:r>
+      <w:r>
+        <w:t>.</w:t>
       </w:r>
       <w:r>
         <w:t xml:space="preserve"> </w:t>
       </w:r>
-      <w:r>
-        <w:t xml:space="preserve">Net tows were then mapped </w:t>
-      </w:r>
-      <w:r>
-        <w:t xml:space="preserve">by cluster and net number to </w:t>
-      </w:r>
-      <w:r>
-        <w:t>observe</w:t>
-      </w:r>
-      <w:r>
-        <w:t xml:space="preserve"> how the clusters </w:t>
-      </w:r>
-      <w:r>
-        <w:t>distribute in</w:t>
-      </w:r>
-      <w:r>
-        <w:t xml:space="preserve"> vertical and horizontal </w:t>
-      </w:r>
-      <w:r>
-        <w:t xml:space="preserve">space. </w:t>
+      <w:commentRangeStart w:id="9"/>
+      <w:r>
+        <w:t xml:space="preserve">What remains is a gap in the knowledge of </w:t>
+      </w:r>
+      <w:r>
+        <w:t xml:space="preserve">winter </w:t>
+      </w:r>
+      <w:r>
+        <w:t xml:space="preserve">ichthyoplankton </w:t>
+      </w:r>
+      <w:r>
+        <w:t>assemblage</w:t>
+      </w:r>
+      <w:r>
+        <w:t xml:space="preserve">s, </w:t>
+      </w:r>
+      <w:r>
+        <w:t xml:space="preserve">broadly, as well as </w:t>
+      </w:r>
+      <w:r>
+        <w:t>the specific</w:t>
+      </w:r>
+      <w:r>
+        <w:t xml:space="preserve"> relationships between aggregations and to </w:t>
+      </w:r>
+      <w:r>
+        <w:t xml:space="preserve">the </w:t>
+      </w:r>
+      <w:r>
+        <w:t>environmental and spatiotemporal variables</w:t>
+      </w:r>
+      <w:r>
+        <w:t xml:space="preserve"> that effect their composition and position in space</w:t>
+      </w:r>
+      <w:r>
+        <w:t>.</w:t>
+      </w:r>
+      <w:commentRangeEnd w:id="9"/>
+      <w:r>
+        <w:rPr>
+          <w:rStyle w:val="CommentReference"/>
+          <w:sz w:val="24"/>
+          <w:szCs w:val="24"/>
+        </w:rPr>
+        <w:commentReference w:id="9"/>
+      </w:r>
+    </w:p>
+    <w:p>
+      <w:pPr>
+        <w:spacing w:line="240" w:lineRule="auto"/>
+        <w:ind w:firstLine="720"/>
+      </w:pPr>
+      <w:r>
+        <w:t xml:space="preserve">Using depth-discrete ichthyoplankton data sampled on four two-week cruises across the northern California Current system (41–47°N) during winter 2018–2023, we investigated the LFC to characterize assemblages and identify factors influencing the composition thereof. </w:t>
+      </w:r>
+      <w:commentRangeStart w:id="10"/>
+      <w:r>
+        <w:t>We expect larval assemblages to cluster according to adult habitat affinity with distinct taxonomic and spatial communities. Additionally, we expect significant effects of spatiotemporal and environmental variables—such as latitude, temperature, dissolved oxygen, seafloor depth, productivity, time of day, and salinity—on the clustering of the LFC</w:t>
+      </w:r>
+      <w:commentRangeEnd w:id="10"/>
+      <w:r>
+        <w:rPr>
+          <w:rStyle w:val="CommentReference"/>
+          <w:sz w:val="24"/>
+          <w:szCs w:val="24"/>
+        </w:rPr>
+        <w:commentReference w:id="10"/>
+      </w:r>
+      <w:r>
+        <w:t>. Establishing how larval fish aggregate during the winter and what factors contribute to the composition of each assemblage could provide a baseline for future studies on the changing NCC ecosystem while also aiding in predictions of winter-spawning fish abundance and the recruitment of the important fisheries species that prey on them.</w:t>
       </w:r>
       <w:r>
         <w:t xml:space="preserve"> </w:t>
       </w:r>
     </w:p>
     <w:p>
-      <w:r>
-        <w:t xml:space="preserve">An NMDS was run on the </w:t>
-      </w:r>
-      <w:r>
-        <w:t>previously described Bray-Curtis dissimilarity matrix</w:t>
-      </w:r>
-      <w:r>
-        <w:t xml:space="preserve">. The stress of the ordination was determined and its </w:t>
-      </w:r>
-      <w:r>
-        <w:t>relevance</w:t>
-      </w:r>
-      <w:r>
-        <w:t xml:space="preserve"> (</w:t>
+      <w:pPr>
+        <w:spacing w:line="240" w:lineRule="auto"/>
+      </w:pPr>
+    </w:p>
+    <w:p>
+      <w:pPr>
+        <w:pStyle w:val="Heading1"/>
+      </w:pPr>
+      <w:r>
+        <w:t>2</w:t>
+      </w:r>
+      <w:r>
+        <w:tab/>
+      </w:r>
+      <w:r>
+        <w:t>MATERIALS AND METHODS</w:t>
+      </w:r>
+    </w:p>
+    <w:p>
+      <w:pPr>
+        <w:pStyle w:val="Heading2"/>
+      </w:pPr>
+      <w:r>
+        <w:t xml:space="preserve">2.1 </w:t>
+      </w:r>
+      <w:r>
+        <w:tab/>
+        <w:t>Sampling and data collection</w:t>
+      </w:r>
+    </w:p>
+    <w:p>
+      <w:pPr>
+        <w:spacing w:line="240" w:lineRule="auto"/>
+      </w:pPr>
+      <w:r>
+        <w:t>[</w:t>
       </w:r>
       <w:r>
         <w:rPr>
           <w:i/>
           <w:iCs/>
-        </w:rPr>
-        <w:t>choose a better word</w:t>
-      </w:r>
-      <w:r>
-        <w:t>)</w:t>
-      </w:r>
-      <w:r>
-        <w:t xml:space="preserve"> in the context of our data was assessed with the </w:t>
+          <w:u w:val="single"/>
+        </w:rPr>
+        <w:t>add section text here</w:t>
+      </w:r>
+      <w:r>
+        <w:t>]</w:t>
+      </w:r>
+    </w:p>
+    <w:p>
+      <w:pPr>
+        <w:pStyle w:val="Heading2"/>
+      </w:pPr>
+      <w:r>
+        <w:t>2.2</w:t>
+      </w:r>
+      <w:r>
+        <w:tab/>
+      </w:r>
+      <w:r>
+        <w:t>Statistical</w:t>
+      </w:r>
+      <w:r>
+        <w:t xml:space="preserve"> </w:t>
+      </w:r>
+      <w:r>
+        <w:t>analysis</w:t>
+      </w:r>
+    </w:p>
+    <w:p>
+      <w:pPr>
+        <w:spacing w:line="240" w:lineRule="auto"/>
+        <w:ind w:firstLine="720"/>
+      </w:pPr>
+      <w:r>
+        <w:t>All data analyses were performed in RStudio</w:t>
+      </w:r>
+      <w:commentRangeStart w:id="11"/>
+      <w:r>
+        <w:t xml:space="preserve">. </w:t>
+      </w:r>
+      <w:commentRangeEnd w:id="11"/>
+      <w:r>
+        <w:rPr>
+          <w:rStyle w:val="CommentReference"/>
+          <w:sz w:val="24"/>
+          <w:szCs w:val="24"/>
+        </w:rPr>
+        <w:commentReference w:id="11"/>
+      </w:r>
+      <w:r>
+        <w:t xml:space="preserve">To identify </w:t>
+      </w:r>
+      <w:r>
+        <w:t xml:space="preserve">ecologically distinct </w:t>
+      </w:r>
+      <w:r>
+        <w:t>larval fish assemblages,</w:t>
+      </w:r>
+      <w:r>
+        <w:t xml:space="preserve"> </w:t>
+      </w:r>
+      <w:r>
+        <w:t xml:space="preserve">first </w:t>
+      </w:r>
+      <w:r>
+        <w:t>the density of each taxonomic group within each net tow was square-root transformed. These were then used to generate a matrix of Bray-Curtis dissimilarities between net tows. Agglomerative hierarchal clustering was performed on th</w:t>
+      </w:r>
+      <w:r>
+        <w:t xml:space="preserve">e dissimilarity matrix </w:t>
+      </w:r>
+      <w:r>
+        <w:t xml:space="preserve">with the “average” method. </w:t>
+      </w:r>
+      <w:r>
+        <w:t>To determine the number of clusters necessary</w:t>
+      </w:r>
+      <w:commentRangeStart w:id="12"/>
+      <w:r>
+        <w:t xml:space="preserve">, </w:t>
+      </w:r>
+      <w:commentRangeEnd w:id="12"/>
+      <w:r>
+        <w:rPr>
+          <w:rStyle w:val="CommentReference"/>
+          <w:sz w:val="24"/>
+          <w:szCs w:val="24"/>
+        </w:rPr>
+        <w:commentReference w:id="12"/>
+      </w:r>
+      <w:r>
+        <w:t xml:space="preserve">a dendrogram of the clustering results </w:t>
+      </w:r>
+      <w:r>
+        <w:t>was</w:t>
+      </w:r>
+      <w:r>
+        <w:t xml:space="preserve"> plotted</w:t>
+      </w:r>
+      <w:r>
+        <w:t xml:space="preserve"> with </w:t>
+      </w:r>
+      <w:r>
+        <w:t>overlayed rectangles to identify cluster boundaries</w:t>
+      </w:r>
+      <w:r>
+        <w:t xml:space="preserve">. </w:t>
+      </w:r>
+    </w:p>
+    <w:p>
+      <w:pPr>
+        <w:spacing w:line="240" w:lineRule="auto"/>
+        <w:ind w:firstLine="720"/>
+      </w:pPr>
+      <w:r>
+        <w:t xml:space="preserve">To visualize the taxonomic composition of each cluster, </w:t>
+      </w:r>
+      <w:r>
+        <w:t xml:space="preserve">the taxa densities in each net tow were plotted </w:t>
+      </w:r>
+      <w:r>
+        <w:t xml:space="preserve">in a stacked bar plot. Beyond visual </w:t>
+      </w:r>
+      <w:r>
+        <w:t>this visual assessment,</w:t>
+      </w:r>
+      <w:r>
+        <w:t xml:space="preserve"> an in</w:t>
+      </w:r>
+      <w:r>
+        <w:t xml:space="preserve">dicator species analysis </w:t>
+      </w:r>
+      <w:r>
+        <w:t xml:space="preserve">(ISA) </w:t>
+      </w:r>
+      <w:r>
+        <w:t>was run</w:t>
+      </w:r>
+      <w:r>
+        <w:t xml:space="preserve"> to identify </w:t>
+      </w:r>
+      <w:r>
+        <w:t>dominant taxonomic group(s) for every cluster</w:t>
+      </w:r>
+      <w:r>
+        <w:t xml:space="preserve">. </w:t>
+      </w:r>
+      <w:r>
+        <w:t xml:space="preserve">The bar plot and ISA were used in conjunction to </w:t>
+      </w:r>
+      <w:r>
+        <w:t>define major clusters of interest and the</w:t>
+      </w:r>
+      <w:r>
+        <w:t xml:space="preserve"> ecological </w:t>
+      </w:r>
+      <w:r>
+        <w:t>community they represent.</w:t>
+      </w:r>
+      <w:r>
+        <w:t xml:space="preserve"> </w:t>
+      </w:r>
+      <w:r>
+        <w:t xml:space="preserve">Net tows were then mapped </w:t>
+      </w:r>
+      <w:r>
+        <w:t xml:space="preserve">by cluster and net number to </w:t>
+      </w:r>
+      <w:r>
+        <w:t>observe</w:t>
+      </w:r>
+      <w:r>
+        <w:t xml:space="preserve"> how the clusters </w:t>
+      </w:r>
+      <w:r>
+        <w:t>distribute in</w:t>
+      </w:r>
+      <w:r>
+        <w:t xml:space="preserve"> vertical and horizontal </w:t>
+      </w:r>
+      <w:r>
+        <w:t xml:space="preserve">space. </w:t>
+      </w:r>
+      <w:r>
+        <w:t xml:space="preserve"> </w:t>
+      </w:r>
+    </w:p>
+    <w:p>
+      <w:pPr>
+        <w:spacing w:line="240" w:lineRule="auto"/>
+        <w:ind w:firstLine="720"/>
+      </w:pPr>
+      <w:r>
+        <w:t xml:space="preserve">An NMDS was run on the </w:t>
+      </w:r>
+      <w:r>
+        <w:t>previously described Bray-Curtis dissimilarity matrix</w:t>
+      </w:r>
+      <w:r>
+        <w:t xml:space="preserve">. The stress of the ordination was determined and its </w:t>
+      </w:r>
+      <w:commentRangeStart w:id="13"/>
+      <w:r>
+        <w:t>relevance</w:t>
+      </w:r>
+      <w:r>
+        <w:t xml:space="preserve"> </w:t>
+      </w:r>
+      <w:commentRangeEnd w:id="13"/>
+      <w:r>
+        <w:rPr>
+          <w:rStyle w:val="CommentReference"/>
+          <w:sz w:val="24"/>
+          <w:szCs w:val="24"/>
+        </w:rPr>
+        <w:commentReference w:id="13"/>
+      </w:r>
+      <w:r>
+        <w:t xml:space="preserve">in the context of our data was assessed with the </w:t>
       </w:r>
       <w:r>
         <w:t xml:space="preserve">iterative </w:t>
@@ -331,38 +806,116 @@
       <w:r>
         <w:t xml:space="preserve">methodology </w:t>
       </w:r>
+      <w:commentRangeStart w:id="14"/>
       <w:r>
         <w:t xml:space="preserve">suggested </w:t>
       </w:r>
-      <w:r>
-        <w:t>(</w:t>
+      <w:commentRangeEnd w:id="14"/>
+      <w:r>
+        <w:rPr>
+          <w:rStyle w:val="CommentReference"/>
+          <w:sz w:val="24"/>
+          <w:szCs w:val="24"/>
+        </w:rPr>
+        <w:commentReference w:id="14"/>
+      </w:r>
+      <w:r>
+        <w:t>by Dexter et al. (2018)</w:t>
+      </w:r>
+      <w:r>
+        <w:t>.</w:t>
+      </w:r>
+      <w:r>
+        <w:t xml:space="preserve"> </w:t>
+      </w:r>
+    </w:p>
+    <w:p>
+      <w:pPr>
+        <w:spacing w:line="240" w:lineRule="auto"/>
+      </w:pPr>
+    </w:p>
+    <w:p>
+      <w:pPr>
+        <w:pStyle w:val="Heading1"/>
+      </w:pPr>
+      <w:r>
+        <w:t>3</w:t>
+      </w:r>
+      <w:r>
+        <w:tab/>
+      </w:r>
+      <w:r>
+        <w:t>RESULTS</w:t>
+      </w:r>
+    </w:p>
+    <w:p>
+      <w:r>
+        <w:t>[</w:t>
       </w:r>
       <w:r>
         <w:rPr>
           <w:i/>
           <w:iCs/>
-        </w:rPr>
-        <w:t>choose a better word</w:t>
-      </w:r>
-      <w:r>
-        <w:t>) by Dexter et al. (2018)(</w:t>
+          <w:u w:val="single"/>
+        </w:rPr>
+        <w:t>add section text here</w:t>
+      </w:r>
+      <w:r>
+        <w:t>]</w:t>
+      </w:r>
+    </w:p>
+    <w:p/>
+    <w:p>
+      <w:pPr>
+        <w:pStyle w:val="Heading1"/>
+      </w:pPr>
+      <w:r>
+        <w:t>4</w:t>
+      </w:r>
+      <w:r>
+        <w:tab/>
+        <w:t>DISCUSSION</w:t>
+      </w:r>
+    </w:p>
+    <w:p>
+      <w:r>
+        <w:t>[</w:t>
       </w:r>
       <w:r>
         <w:rPr>
           <w:i/>
           <w:iCs/>
-        </w:rPr>
-        <w:t xml:space="preserve">look into </w:t>
+          <w:u w:val="single"/>
+        </w:rPr>
+        <w:t>add section text here</w:t>
+      </w:r>
+      <w:r>
+        <w:t>]</w:t>
+      </w:r>
+    </w:p>
+    <w:p/>
+    <w:p>
+      <w:pPr>
+        <w:pStyle w:val="Heading1"/>
+      </w:pPr>
+      <w:r>
+        <w:t>REFERENCES</w:t>
+      </w:r>
+    </w:p>
+    <w:p>
+      <w:r>
+        <w:t>[</w:t>
       </w:r>
       <w:r>
         <w:rPr>
           <w:i/>
           <w:iCs/>
-        </w:rPr>
-        <w:t>citation style for MEPS</w:t>
-      </w:r>
-      <w:r>
-        <w:t xml:space="preserve">). </w:t>
+          <w:u w:val="single"/>
+        </w:rPr>
+        <w:t>add references list here… alphabetical order and Harvard style</w:t>
+      </w:r>
+      <w:r>
+        <w:t>]</w:t>
       </w:r>
     </w:p>
     <w:sectPr>
@@ -373,6 +926,327 @@
     </w:sectPr>
   </w:body>
 </w:document>
+</file>
+
+<file path=word/comments.xml><?xml version="1.0" encoding="utf-8"?>
+<w:comments xmlns:wpc="http://schemas.microsoft.com/office/word/2010/wordprocessingCanvas" xmlns:cx="http://schemas.microsoft.com/office/drawing/2014/chartex" xmlns:cx1="http://schemas.microsoft.com/office/drawing/2015/9/8/chartex" xmlns:cx2="http://schemas.microsoft.com/office/drawing/2015/10/21/chartex" xmlns:cx3="http://schemas.microsoft.com/office/drawing/2016/5/9/chartex" xmlns:cx4="http://schemas.microsoft.com/office/drawing/2016/5/10/chartex" xmlns:cx5="http://schemas.microsoft.com/office/drawing/2016/5/11/chartex" xmlns:cx6="http://schemas.microsoft.com/office/drawing/2016/5/12/chartex" xmlns:cx7="http://schemas.microsoft.com/office/drawing/2016/5/13/chartex" xmlns:cx8="http://schemas.microsoft.com/office/drawing/2016/5/14/chartex" xmlns:mc="http://schemas.openxmlformats.org/markup-compatibility/2006" xmlns:aink="http://schemas.microsoft.com/office/drawing/2016/ink" xmlns:am3d="http://schemas.microsoft.com/office/drawing/2017/model3d" xmlns:o="urn:schemas-microsoft-com:office:office" xmlns:oel="http://schemas.microsoft.com/office/2019/extlst" xmlns:r="http://schemas.openxmlformats.org/officeDocument/2006/relationships" xmlns:m="http://schemas.openxmlformats.org/officeDocument/2006/math" xmlns:v="urn:schemas-microsoft-com:vml" xmlns:wp14="http://schemas.microsoft.com/office/word/2010/wordprocessingDrawing" xmlns:wp="http://schemas.openxmlformats.org/drawingml/2006/wordprocessingDrawing" xmlns:w10="urn:schemas-microsoft-com:office:word" xmlns:w="http://schemas.openxmlformats.org/wordprocessingml/2006/main" xmlns:w14="http://schemas.microsoft.com/office/word/2010/wordml" xmlns:w15="http://schemas.microsoft.com/office/word/2012/wordml" xmlns:w16cei="http://schemas.microsoft.com/office/word/2026/wordml/cei" xmlns:w16cex="http://schemas.microsoft.com/office/word/2018/wordml/cex" xmlns:w16cid="http://schemas.microsoft.com/office/word/2016/wordml/cid" xmlns:w16="http://schemas.microsoft.com/office/word/2018/wordml" xmlns:w16du="http://schemas.microsoft.com/office/word/2023/wordml/word16du" xmlns:w16sdtdh="http://schemas.microsoft.com/office/word/2020/wordml/sdtdatahash" xmlns:w16sdtfl="http://schemas.microsoft.com/office/word/2024/wordml/sdtformatlock" xmlns:w16se="http://schemas.microsoft.com/office/word/2015/wordml/symex" xmlns:wpg="http://schemas.microsoft.com/office/word/2010/wordprocessingGroup" xmlns:wpi="http://schemas.microsoft.com/office/word/2010/wordprocessingInk" xmlns:wne="http://schemas.microsoft.com/office/word/2006/wordml" xmlns:wps="http://schemas.microsoft.com/office/word/2010/wordprocessingShape" mc:Ignorable="w14 w15 w16se w16cid w16 w16cex w16sdtdh w16sdtfl w16du wp14">
+  <w:comment w:id="0" w:author="McCloskey, Ross" w:date="2026-08-18T14:36:00Z" w:initials="RM">
+    <w:p>
+      <w:pPr>
+        <w:pStyle w:val="CommentText"/>
+      </w:pPr>
+      <w:r>
+        <w:rPr>
+          <w:rStyle w:val="CommentReference"/>
+        </w:rPr>
+        <w:annotationRef/>
+      </w:r>
+      <w:r>
+        <w:t>Not sure this is the correct way to indicate multiple first authors. Can’t find on Frontiers what their guidelines say about this though.</w:t>
+      </w:r>
+    </w:p>
+  </w:comment>
+  <w:comment w:id="1" w:author="McCloskey, Ross" w:date="2026-08-18T15:05:00Z" w:initials="RM">
+    <w:p>
+      <w:pPr>
+        <w:pStyle w:val="CommentText"/>
+      </w:pPr>
+      <w:r>
+        <w:rPr>
+          <w:rStyle w:val="CommentReference"/>
+        </w:rPr>
+        <w:annotationRef/>
+      </w:r>
+      <w:r>
+        <w:t>This is the abstract Luke wrote to submit to PICES. May need adjustments after rest of the paper is complete.</w:t>
+      </w:r>
+    </w:p>
+  </w:comment>
+  <w:comment w:id="2" w:author="McCloskey, Ross" w:date="2026-08-18T15:06:00Z" w:initials="RM">
+    <w:p>
+      <w:pPr>
+        <w:pStyle w:val="CommentText"/>
+      </w:pPr>
+      <w:r>
+        <w:rPr>
+          <w:rStyle w:val="CommentReference"/>
+        </w:rPr>
+        <w:annotationRef/>
+      </w:r>
+      <w:r>
+        <w:t>Find a source for this?</w:t>
+      </w:r>
+    </w:p>
+  </w:comment>
+  <w:comment w:id="3" w:author="McCloskey, Ross" w:date="2026-08-18T15:08:00Z" w:initials="RM">
+    <w:p>
+      <w:pPr>
+        <w:pStyle w:val="CommentText"/>
+      </w:pPr>
+      <w:r>
+        <w:rPr>
+          <w:rStyle w:val="CommentReference"/>
+        </w:rPr>
+        <w:annotationRef/>
+      </w:r>
+      <w:r>
+        <w:t>Might want this paragraph to be longer. Perhaps some broader introductory sentences can be added at the beginning instead of as a separate first paragraph.</w:t>
+      </w:r>
+    </w:p>
+  </w:comment>
+  <w:comment w:id="4" w:author="McCloskey, Ross" w:date="2026-08-18T15:10:00Z" w:initials="RM">
+    <w:p>
+      <w:pPr>
+        <w:pStyle w:val="CommentText"/>
+      </w:pPr>
+      <w:r>
+        <w:rPr>
+          <w:rStyle w:val="CommentReference"/>
+        </w:rPr>
+        <w:annotationRef/>
+      </w:r>
+      <w:r>
+        <w:t>This phrasing might be too close to the source may need to better paraphrase.</w:t>
+      </w:r>
+    </w:p>
+  </w:comment>
+  <w:comment w:id="5" w:author="McCloskey, Ross" w:date="2026-08-18T15:12:00Z" w:initials="RM">
+    <w:p>
+      <w:pPr>
+        <w:pStyle w:val="CommentText"/>
+      </w:pPr>
+      <w:r>
+        <w:rPr>
+          <w:rStyle w:val="CommentReference"/>
+        </w:rPr>
+        <w:annotationRef/>
+      </w:r>
+      <w:r>
+        <w:t>There are the broad factors I could find from my sources doc but perhaps I should find an alternative source that discusses specifically the broad variables we’re interested in.</w:t>
+      </w:r>
+    </w:p>
+  </w:comment>
+  <w:comment w:id="6" w:author="McCloskey, Ross" w:date="2026-08-18T15:13:00Z" w:initials="RM">
+    <w:p>
+      <w:pPr>
+        <w:pStyle w:val="CommentText"/>
+      </w:pPr>
+      <w:r>
+        <w:rPr>
+          <w:rStyle w:val="CommentReference"/>
+        </w:rPr>
+        <w:annotationRef/>
+      </w:r>
+      <w:r>
+        <w:t>Will probably want to rework this sentence.</w:t>
+      </w:r>
+    </w:p>
+  </w:comment>
+  <w:comment w:id="7" w:author="McCloskey, Ross" w:date="2026-08-18T15:13:00Z" w:initials="RM">
+    <w:p>
+      <w:pPr>
+        <w:pStyle w:val="CommentText"/>
+      </w:pPr>
+      <w:r>
+        <w:rPr>
+          <w:rStyle w:val="CommentReference"/>
+        </w:rPr>
+        <w:annotationRef/>
+      </w:r>
+      <w:r>
+        <w:t>This is a dissertation. Need to check if that is an acceptable source to reference or if I need to replace it.</w:t>
+      </w:r>
+    </w:p>
+  </w:comment>
+  <w:comment w:id="8" w:author="McCloskey, Ross" w:date="2026-08-18T15:14:00Z" w:initials="RM">
+    <w:p>
+      <w:pPr>
+        <w:pStyle w:val="CommentText"/>
+      </w:pPr>
+      <w:r>
+        <w:rPr>
+          <w:rStyle w:val="CommentReference"/>
+        </w:rPr>
+        <w:annotationRef/>
+      </w:r>
+      <w:r>
+        <w:t>Need to rework this to have better phrasing.</w:t>
+      </w:r>
+    </w:p>
+  </w:comment>
+  <w:comment w:id="9" w:author="McCloskey, Ross" w:date="2026-08-18T15:29:00Z" w:initials="RM">
+    <w:p>
+      <w:pPr>
+        <w:pStyle w:val="CommentText"/>
+      </w:pPr>
+      <w:r>
+        <w:rPr>
+          <w:rStyle w:val="CommentReference"/>
+        </w:rPr>
+        <w:annotationRef/>
+      </w:r>
+      <w:r>
+        <w:t xml:space="preserve">Could probably better describe the knowledge gaps in more detail. </w:t>
+      </w:r>
+    </w:p>
+    <w:p>
+      <w:pPr>
+        <w:pStyle w:val="CommentText"/>
+      </w:pPr>
+      <w:r>
+        <w:t>We also discussed in a previous meeting that knowledge on mesopelagic spawning is lacking and this is a gap we could fill. I am wondering where that should come in. Here or is it too specific? Should such a point be left for the discussion?</w:t>
+      </w:r>
+    </w:p>
+  </w:comment>
+  <w:comment w:id="10" w:author="McCloskey, Ross" w:date="2026-08-18T15:18:00Z" w:initials="RM">
+    <w:p>
+      <w:pPr>
+        <w:pStyle w:val="CommentText"/>
+      </w:pPr>
+      <w:r>
+        <w:rPr>
+          <w:rStyle w:val="CommentReference"/>
+        </w:rPr>
+        <w:annotationRef/>
+      </w:r>
+      <w:r>
+        <w:t>There ought to be a better way to describe our expected results. Need to rework the phrasing.</w:t>
+      </w:r>
+    </w:p>
+  </w:comment>
+  <w:comment w:id="11" w:author="McCloskey, Ross" w:date="2026-08-18T14:58:00Z" w:initials="RM">
+    <w:p>
+      <w:pPr>
+        <w:pStyle w:val="CommentText"/>
+      </w:pPr>
+      <w:r>
+        <w:rPr>
+          <w:rStyle w:val="CommentReference"/>
+        </w:rPr>
+        <w:annotationRef/>
+      </w:r>
+      <w:r>
+        <w:t>Add version and citation</w:t>
+      </w:r>
+    </w:p>
+  </w:comment>
+  <w:comment w:id="12" w:author="McCloskey, Ross" w:date="2026-08-18T14:59:00Z" w:initials="RM">
+    <w:p>
+      <w:pPr>
+        <w:pStyle w:val="CommentText"/>
+      </w:pPr>
+      <w:r>
+        <w:rPr>
+          <w:rStyle w:val="CommentReference"/>
+        </w:rPr>
+        <w:annotationRef/>
+      </w:r>
+      <w:r>
+        <w:t>Add more… necessary for what?</w:t>
+      </w:r>
+    </w:p>
+  </w:comment>
+  <w:comment w:id="13" w:author="McCloskey, Ross" w:date="2026-08-18T15:03:00Z" w:initials="RM">
+    <w:p>
+      <w:pPr>
+        <w:pStyle w:val="CommentText"/>
+      </w:pPr>
+      <w:r>
+        <w:rPr>
+          <w:rStyle w:val="CommentReference"/>
+        </w:rPr>
+        <w:annotationRef/>
+      </w:r>
+      <w:r>
+        <w:t>Choose a better word</w:t>
+      </w:r>
+    </w:p>
+  </w:comment>
+  <w:comment w:id="14" w:author="McCloskey, Ross" w:date="2026-08-18T15:04:00Z" w:initials="RM">
+    <w:p>
+      <w:pPr>
+        <w:pStyle w:val="CommentText"/>
+      </w:pPr>
+      <w:r>
+        <w:rPr>
+          <w:rStyle w:val="CommentReference"/>
+        </w:rPr>
+        <w:annotationRef/>
+      </w:r>
+      <w:r>
+        <w:t>Choose a better word</w:t>
+      </w:r>
+    </w:p>
+  </w:comment>
+</w:comments>
+</file>
+
+<file path=word/commentsExtended.xml><?xml version="1.0" encoding="utf-8"?>
+<w15:commentsEx xmlns:wpc="http://schemas.microsoft.com/office/word/2010/wordprocessingCanvas" xmlns:cx="http://schemas.microsoft.com/office/drawing/2014/chartex" xmlns:cx1="http://schemas.microsoft.com/office/drawing/2015/9/8/chartex" xmlns:cx2="http://schemas.microsoft.com/office/drawing/2015/10/21/chartex" xmlns:cx3="http://schemas.microsoft.com/office/drawing/2016/5/9/chartex" xmlns:cx4="http://schemas.microsoft.com/office/drawing/2016/5/10/chartex" xmlns:cx5="http://schemas.microsoft.com/office/drawing/2016/5/11/chartex" xmlns:cx6="http://schemas.microsoft.com/office/drawing/2016/5/12/chartex" xmlns:cx7="http://schemas.microsoft.com/office/drawing/2016/5/13/chartex" xmlns:cx8="http://schemas.microsoft.com/office/drawing/2016/5/14/chartex" xmlns:mc="http://schemas.openxmlformats.org/markup-compatibility/2006" xmlns:aink="http://schemas.microsoft.com/office/drawing/2016/ink" xmlns:am3d="http://schemas.microsoft.com/office/drawing/2017/model3d" xmlns:o="urn:schemas-microsoft-com:office:office" xmlns:oel="http://schemas.microsoft.com/office/2019/extlst" xmlns:r="http://schemas.openxmlformats.org/officeDocument/2006/relationships" xmlns:m="http://schemas.openxmlformats.org/officeDocument/2006/math" xmlns:v="urn:schemas-microsoft-com:vml" xmlns:wp14="http://schemas.microsoft.com/office/word/2010/wordprocessingDrawing" xmlns:wp="http://schemas.openxmlformats.org/drawingml/2006/wordprocessingDrawing" xmlns:w10="urn:schemas-microsoft-com:office:word" xmlns:w="http://schemas.openxmlformats.org/wordprocessingml/2006/main" xmlns:w14="http://schemas.microsoft.com/office/word/2010/wordml" xmlns:w15="http://schemas.microsoft.com/office/word/2012/wordml" xmlns:w16cei="http://schemas.microsoft.com/office/word/2026/wordml/cei" xmlns:w16cex="http://schemas.microsoft.com/office/word/2018/wordml/cex" xmlns:w16cid="http://schemas.microsoft.com/office/word/2016/wordml/cid" xmlns:w16="http://schemas.microsoft.com/office/word/2018/wordml" xmlns:w16du="http://schemas.microsoft.com/office/word/2023/wordml/word16du" xmlns:w16sdtdh="http://schemas.microsoft.com/office/word/2020/wordml/sdtdatahash" xmlns:w16sdtfl="http://schemas.microsoft.com/office/word/2024/wordml/sdtformatlock" xmlns:w16se="http://schemas.microsoft.com/office/word/2015/wordml/symex" xmlns:wpg="http://schemas.microsoft.com/office/word/2010/wordprocessingGroup" xmlns:wpi="http://schemas.microsoft.com/office/word/2010/wordprocessingInk" xmlns:wne="http://schemas.microsoft.com/office/word/2006/wordml" xmlns:wps="http://schemas.microsoft.com/office/word/2010/wordprocessingShape" mc:Ignorable="w14 w15 w16se w16cid w16 w16cex w16sdtdh w16sdtfl w16du wp14">
+  <w15:commentEx w15:paraId="2F1B268D" w15:done="0"/>
+  <w15:commentEx w15:paraId="021223F3" w15:done="0"/>
+  <w15:commentEx w15:paraId="5B8443B7" w15:done="0"/>
+  <w15:commentEx w15:paraId="1B1440FE" w15:done="0"/>
+  <w15:commentEx w15:paraId="40FE5ADD" w15:done="0"/>
+  <w15:commentEx w15:paraId="4C6AC411" w15:done="0"/>
+  <w15:commentEx w15:paraId="48D5E15B" w15:done="0"/>
+  <w15:commentEx w15:paraId="4280AB4B" w15:done="0"/>
+  <w15:commentEx w15:paraId="31CA1C17" w15:done="0"/>
+  <w15:commentEx w15:paraId="763D8A91" w15:done="0"/>
+  <w15:commentEx w15:paraId="5BE36BA3" w15:done="0"/>
+  <w15:commentEx w15:paraId="1F69DA66" w15:done="0"/>
+  <w15:commentEx w15:paraId="4FC2E53E" w15:done="0"/>
+  <w15:commentEx w15:paraId="06E41DD3" w15:done="0"/>
+  <w15:commentEx w15:paraId="45BA8D5F" w15:done="0"/>
+</w15:commentsEx>
+</file>
+
+<file path=word/commentsExtensible.xml><?xml version="1.0" encoding="utf-8"?>
+<w16cex:commentsExtensible xmlns:wpc="http://schemas.microsoft.com/office/word/2010/wordprocessingCanvas" xmlns:cx="http://schemas.microsoft.com/office/drawing/2014/chartex" xmlns:cx1="http://schemas.microsoft.com/office/drawing/2015/9/8/chartex" xmlns:cx2="http://schemas.microsoft.com/office/drawing/2015/10/21/chartex" xmlns:cx3="http://schemas.microsoft.com/office/drawing/2016/5/9/chartex" xmlns:cx4="http://schemas.microsoft.com/office/drawing/2016/5/10/chartex" xmlns:cx5="http://schemas.microsoft.com/office/drawing/2016/5/11/chartex" xmlns:cx6="http://schemas.microsoft.com/office/drawing/2016/5/12/chartex" xmlns:cx7="http://schemas.microsoft.com/office/drawing/2016/5/13/chartex" xmlns:cx8="http://schemas.microsoft.com/office/drawing/2016/5/14/chartex" xmlns:cr="http://schemas.microsoft.com/office/comments/2020/reactions" xmlns:mc="http://schemas.openxmlformats.org/markup-compatibility/2006" xmlns:aink="http://schemas.microsoft.com/office/drawing/2016/ink" xmlns:am3d="http://schemas.microsoft.com/office/drawing/2017/model3d" xmlns:o="urn:schemas-microsoft-com:office:office" xmlns:oel="http://schemas.microsoft.com/office/2019/extlst" xmlns:r="http://schemas.openxmlformats.org/officeDocument/2006/relationships" xmlns:m="http://schemas.openxmlformats.org/officeDocument/2006/math" xmlns:v="urn:schemas-microsoft-com:vml" xmlns:wp14="http://schemas.microsoft.com/office/word/2010/wordprocessingDrawing" xmlns:wp="http://schemas.openxmlformats.org/drawingml/2006/wordprocessingDrawing" xmlns:w10="urn:schemas-microsoft-com:office:word" xmlns:w="http://schemas.openxmlformats.org/wordprocessingml/2006/main" xmlns:w14="http://schemas.microsoft.com/office/word/2010/wordml" xmlns:w15="http://schemas.microsoft.com/office/word/2012/wordml" xmlns:w16cei="http://schemas.microsoft.com/office/word/2026/wordml/cei" xmlns:w16cex="http://schemas.microsoft.com/office/word/2018/wordml/cex" xmlns:w16cid="http://schemas.microsoft.com/office/word/2016/wordml/cid" xmlns:w16="http://schemas.microsoft.com/office/word/2018/wordml" xmlns:w16du="http://schemas.microsoft.com/office/word/2023/wordml/word16du" xmlns:w16sdtdh="http://schemas.microsoft.com/office/word/2020/wordml/sdtdatahash" xmlns:w16sdtfl="http://schemas.microsoft.com/office/word/2024/wordml/sdtformatlock" xmlns:w16se="http://schemas.microsoft.com/office/word/2015/wordml/symex" xmlns:wpg="http://schemas.microsoft.com/office/word/2010/wordprocessingGroup" xmlns:wpi="http://schemas.microsoft.com/office/word/2010/wordprocessingInk" xmlns:wne="http://schemas.microsoft.com/office/word/2006/wordml" xmlns:wps="http://schemas.microsoft.com/office/word/2010/wordprocessingShape" mc:Ignorable="w14 w15 w16se w16cid w16 w16cex w16sdtdh w16sdtfl cr w16du wp14">
+  <w16cex:commentExtensible w16cex:durableId="03FE2B67" w16cex:dateUtc="2026-08-18T19:36:00Z"/>
+  <w16cex:commentExtensible w16cex:durableId="2C3AF867" w16cex:dateUtc="2026-08-18T20:05:00Z"/>
+  <w16cex:commentExtensible w16cex:durableId="0798161C" w16cex:dateUtc="2026-08-18T20:06:00Z"/>
+  <w16cex:commentExtensible w16cex:durableId="2BA08A5F" w16cex:dateUtc="2026-08-18T20:08:00Z"/>
+  <w16cex:commentExtensible w16cex:durableId="266E2573" w16cex:dateUtc="2026-08-18T20:10:00Z"/>
+  <w16cex:commentExtensible w16cex:durableId="2B4ADF92" w16cex:dateUtc="2026-08-18T20:12:00Z"/>
+  <w16cex:commentExtensible w16cex:durableId="13CD5FBE" w16cex:dateUtc="2026-08-18T20:13:00Z"/>
+  <w16cex:commentExtensible w16cex:durableId="178DC72D" w16cex:dateUtc="2026-08-18T20:13:00Z"/>
+  <w16cex:commentExtensible w16cex:durableId="3A87B0B0" w16cex:dateUtc="2026-08-18T20:14:00Z"/>
+  <w16cex:commentExtensible w16cex:durableId="167F67C8" w16cex:dateUtc="2026-08-18T20:29:00Z"/>
+  <w16cex:commentExtensible w16cex:durableId="29A6DD2B" w16cex:dateUtc="2026-08-18T20:18:00Z"/>
+  <w16cex:commentExtensible w16cex:durableId="120E2433" w16cex:dateUtc="2026-08-18T19:58:00Z"/>
+  <w16cex:commentExtensible w16cex:durableId="30192086" w16cex:dateUtc="2026-08-18T19:59:00Z"/>
+  <w16cex:commentExtensible w16cex:durableId="021A571D" w16cex:dateUtc="2026-08-18T20:03:00Z"/>
+  <w16cex:commentExtensible w16cex:durableId="5FAEC444" w16cex:dateUtc="2026-08-18T20:04:00Z"/>
+</w16cex:commentsExtensible>
+</file>
+
+<file path=word/commentsIds.xml><?xml version="1.0" encoding="utf-8"?>
+<w16cid:commentsIds xmlns:wpc="http://schemas.microsoft.com/office/word/2010/wordprocessingCanvas" xmlns:cx="http://schemas.microsoft.com/office/drawing/2014/chartex" xmlns:cx1="http://schemas.microsoft.com/office/drawing/2015/9/8/chartex" xmlns:cx2="http://schemas.microsoft.com/office/drawing/2015/10/21/chartex" xmlns:cx3="http://schemas.microsoft.com/office/drawing/2016/5/9/chartex" xmlns:cx4="http://schemas.microsoft.com/office/drawing/2016/5/10/chartex" xmlns:cx5="http://schemas.microsoft.com/office/drawing/2016/5/11/chartex" xmlns:cx6="http://schemas.microsoft.com/office/drawing/2016/5/12/chartex" xmlns:cx7="http://schemas.microsoft.com/office/drawing/2016/5/13/chartex" xmlns:cx8="http://schemas.microsoft.com/office/drawing/2016/5/14/chartex" xmlns:mc="http://schemas.openxmlformats.org/markup-compatibility/2006" xmlns:aink="http://schemas.microsoft.com/office/drawing/2016/ink" xmlns:am3d="http://schemas.microsoft.com/office/drawing/2017/model3d" xmlns:o="urn:schemas-microsoft-com:office:office" xmlns:oel="http://schemas.microsoft.com/office/2019/extlst" xmlns:r="http://schemas.openxmlformats.org/officeDocument/2006/relationships" xmlns:m="http://schemas.openxmlformats.org/officeDocument/2006/math" xmlns:v="urn:schemas-microsoft-com:vml" xmlns:wp14="http://schemas.microsoft.com/office/word/2010/wordprocessingDrawing" xmlns:wp="http://schemas.openxmlformats.org/drawingml/2006/wordprocessingDrawing" xmlns:w10="urn:schemas-microsoft-com:office:word" xmlns:w="http://schemas.openxmlformats.org/wordprocessingml/2006/main" xmlns:w14="http://schemas.microsoft.com/office/word/2010/wordml" xmlns:w15="http://schemas.microsoft.com/office/word/2012/wordml" xmlns:w16cei="http://schemas.microsoft.com/office/word/2026/wordml/cei" xmlns:w16cex="http://schemas.microsoft.com/office/word/2018/wordml/cex" xmlns:w16cid="http://schemas.microsoft.com/office/word/2016/wordml/cid" xmlns:w16="http://schemas.microsoft.com/office/word/2018/wordml" xmlns:w16du="http://schemas.microsoft.com/office/word/2023/wordml/word16du" xmlns:w16sdtdh="http://schemas.microsoft.com/office/word/2020/wordml/sdtdatahash" xmlns:w16sdtfl="http://schemas.microsoft.com/office/word/2024/wordml/sdtformatlock" xmlns:w16se="http://schemas.microsoft.com/office/word/2015/wordml/symex" xmlns:wpg="http://schemas.microsoft.com/office/word/2010/wordprocessingGroup" xmlns:wpi="http://schemas.microsoft.com/office/word/2010/wordprocessingInk" xmlns:wne="http://schemas.microsoft.com/office/word/2006/wordml" xmlns:wps="http://schemas.microsoft.com/office/word/2010/wordprocessingShape" mc:Ignorable="w14 w15 w16se w16cid w16 w16cex w16sdtdh w16sdtfl w16du wp14">
+  <w16cid:commentId w16cid:paraId="2F1B268D" w16cid:durableId="03FE2B67"/>
+  <w16cid:commentId w16cid:paraId="021223F3" w16cid:durableId="2C3AF867"/>
+  <w16cid:commentId w16cid:paraId="5B8443B7" w16cid:durableId="0798161C"/>
+  <w16cid:commentId w16cid:paraId="1B1440FE" w16cid:durableId="2BA08A5F"/>
+  <w16cid:commentId w16cid:paraId="40FE5ADD" w16cid:durableId="266E2573"/>
+  <w16cid:commentId w16cid:paraId="4C6AC411" w16cid:durableId="2B4ADF92"/>
+  <w16cid:commentId w16cid:paraId="48D5E15B" w16cid:durableId="13CD5FBE"/>
+  <w16cid:commentId w16cid:paraId="4280AB4B" w16cid:durableId="178DC72D"/>
+  <w16cid:commentId w16cid:paraId="31CA1C17" w16cid:durableId="3A87B0B0"/>
+  <w16cid:commentId w16cid:paraId="763D8A91" w16cid:durableId="167F67C8"/>
+  <w16cid:commentId w16cid:paraId="5BE36BA3" w16cid:durableId="29A6DD2B"/>
+  <w16cid:commentId w16cid:paraId="1F69DA66" w16cid:durableId="120E2433"/>
+  <w16cid:commentId w16cid:paraId="4FC2E53E" w16cid:durableId="30192086"/>
+  <w16cid:commentId w16cid:paraId="06E41DD3" w16cid:durableId="021A571D"/>
+  <w16cid:commentId w16cid:paraId="45BA8D5F" w16cid:durableId="5FAEC444"/>
+</w16cid:commentsIds>
+</file>
+
+<file path=word/people.xml><?xml version="1.0" encoding="utf-8"?>
+<w15:people xmlns:wpc="http://schemas.microsoft.com/office/word/2010/wordprocessingCanvas" xmlns:cx="http://schemas.microsoft.com/office/drawing/2014/chartex" xmlns:cx1="http://schemas.microsoft.com/office/drawing/2015/9/8/chartex" xmlns:cx2="http://schemas.microsoft.com/office/drawing/2015/10/21/chartex" xmlns:cx3="http://schemas.microsoft.com/office/drawing/2016/5/9/chartex" xmlns:cx4="http://schemas.microsoft.com/office/drawing/2016/5/10/chartex" xmlns:cx5="http://schemas.microsoft.com/office/drawing/2016/5/11/chartex" xmlns:cx6="http://schemas.microsoft.com/office/drawing/2016/5/12/chartex" xmlns:cx7="http://schemas.microsoft.com/office/drawing/2016/5/13/chartex" xmlns:cx8="http://schemas.microsoft.com/office/drawing/2016/5/14/chartex" xmlns:mc="http://schemas.openxmlformats.org/markup-compatibility/2006" xmlns:aink="http://schemas.microsoft.com/office/drawing/2016/ink" xmlns:am3d="http://schemas.microsoft.com/office/drawing/2017/model3d" xmlns:o="urn:schemas-microsoft-com:office:office" xmlns:oel="http://schemas.microsoft.com/office/2019/extlst" xmlns:r="http://schemas.openxmlformats.org/officeDocument/2006/relationships" xmlns:m="http://schemas.openxmlformats.org/officeDocument/2006/math" xmlns:v="urn:schemas-microsoft-com:vml" xmlns:wp14="http://schemas.microsoft.com/office/word/2010/wordprocessingDrawing" xmlns:wp="http://schemas.openxmlformats.org/drawingml/2006/wordprocessingDrawing" xmlns:w10="urn:schemas-microsoft-com:office:word" xmlns:w="http://schemas.openxmlformats.org/wordprocessingml/2006/main" xmlns:w14="http://schemas.microsoft.com/office/word/2010/wordml" xmlns:w15="http://schemas.microsoft.com/office/word/2012/wordml" xmlns:w16cei="http://schemas.microsoft.com/office/word/2026/wordml/cei" xmlns:w16cex="http://schemas.microsoft.com/office/word/2018/wordml/cex" xmlns:w16cid="http://schemas.microsoft.com/office/word/2016/wordml/cid" xmlns:w16="http://schemas.microsoft.com/office/word/2018/wordml" xmlns:w16du="http://schemas.microsoft.com/office/word/2023/wordml/word16du" xmlns:w16sdtdh="http://schemas.microsoft.com/office/word/2020/wordml/sdtdatahash" xmlns:w16sdtfl="http://schemas.microsoft.com/office/word/2024/wordml/sdtformatlock" xmlns:w16se="http://schemas.microsoft.com/office/word/2015/wordml/symex" xmlns:wpg="http://schemas.microsoft.com/office/word/2010/wordprocessingGroup" xmlns:wpi="http://schemas.microsoft.com/office/word/2010/wordprocessingInk" xmlns:wne="http://schemas.microsoft.com/office/word/2006/wordml" xmlns:wps="http://schemas.microsoft.com/office/word/2010/wordprocessingShape" mc:Ignorable="w14 w15 w16se w16cid w16 w16cex w16sdtdh w16sdtfl w16du wp14">
+  <w15:person w15:author="McCloskey, Ross">
+    <w15:presenceInfo w15:providerId="AD" w15:userId="S::mccloskw@oregonstate.edu::b1990487-ee44-4922-b58f-5b2980a02730"/>
+  </w15:person>
+</w15:people>
 </file>
 
 <file path=word/styles.xml><?xml version="1.0" encoding="utf-8"?>
@@ -775,7 +1649,7 @@
   <w:style w:type="paragraph" w:default="1" w:styleId="Normal">
     <w:name w:val="Normal"/>
     <w:qFormat/>
-    <w:rsid w:val="003D309B"/>
+    <w:rsid w:val="00EA4AC4"/>
     <w:pPr>
       <w:spacing w:line="480" w:lineRule="auto"/>
     </w:pPr>
@@ -790,15 +1664,13 @@
     <w:link w:val="Heading1Char"/>
     <w:uiPriority w:val="9"/>
     <w:qFormat/>
-    <w:rsid w:val="009733A8"/>
+    <w:rsid w:val="00434324"/>
     <w:pPr>
       <w:outlineLvl w:val="0"/>
     </w:pPr>
     <w:rPr>
       <w:b/>
       <w:bCs/>
-      <w:sz w:val="32"/>
-      <w:szCs w:val="32"/>
     </w:rPr>
   </w:style>
   <w:style w:type="paragraph" w:styleId="Heading2">
@@ -809,7 +1681,7 @@
     <w:uiPriority w:val="9"/>
     <w:unhideWhenUsed/>
     <w:qFormat/>
-    <w:rsid w:val="00F951F4"/>
+    <w:rsid w:val="00434324"/>
     <w:pPr>
       <w:keepNext/>
       <w:keepLines/>
@@ -818,10 +1690,9 @@
     </w:pPr>
     <w:rPr>
       <w:rFonts w:eastAsiaTheme="majorEastAsia"/>
+      <w:b/>
+      <w:bCs/>
       <w:color w:val="000000" w:themeColor="text1"/>
-      <w:sz w:val="28"/>
-      <w:szCs w:val="28"/>
-      <w:u w:val="single"/>
     </w:rPr>
   </w:style>
   <w:style w:type="paragraph" w:styleId="Heading3">
@@ -1011,13 +1882,11 @@
     <w:basedOn w:val="DefaultParagraphFont"/>
     <w:link w:val="Heading1"/>
     <w:uiPriority w:val="9"/>
-    <w:rsid w:val="009733A8"/>
+    <w:rsid w:val="00434324"/>
     <w:rPr>
       <w:rFonts w:ascii="Times New Roman" w:hAnsi="Times New Roman" w:cs="Times New Roman"/>
       <w:b/>
       <w:bCs/>
-      <w:sz w:val="32"/>
-      <w:szCs w:val="32"/>
     </w:rPr>
   </w:style>
   <w:style w:type="character" w:customStyle="1" w:styleId="Heading2Char">
@@ -1025,13 +1894,12 @@
     <w:basedOn w:val="DefaultParagraphFont"/>
     <w:link w:val="Heading2"/>
     <w:uiPriority w:val="9"/>
-    <w:rsid w:val="00F951F4"/>
+    <w:rsid w:val="00434324"/>
     <w:rPr>
       <w:rFonts w:ascii="Times New Roman" w:eastAsiaTheme="majorEastAsia" w:hAnsi="Times New Roman" w:cs="Times New Roman"/>
+      <w:b/>
+      <w:bCs/>
       <w:color w:val="000000" w:themeColor="text1"/>
-      <w:sz w:val="28"/>
-      <w:szCs w:val="28"/>
-      <w:u w:val="single"/>
     </w:rPr>
   </w:style>
   <w:style w:type="character" w:customStyle="1" w:styleId="Heading3Char">
@@ -1133,17 +2001,20 @@
     <w:link w:val="TitleChar"/>
     <w:uiPriority w:val="10"/>
     <w:qFormat/>
-    <w:rsid w:val="00E168AC"/>
+    <w:rsid w:val="0014295B"/>
     <w:pPr>
       <w:spacing w:after="80" w:line="240" w:lineRule="auto"/>
       <w:contextualSpacing/>
+      <w:jc w:val="center"/>
     </w:pPr>
     <w:rPr>
       <w:rFonts w:eastAsiaTheme="majorEastAsia"/>
+      <w:b/>
+      <w:bCs/>
       <w:spacing w:val="-10"/>
       <w:kern w:val="28"/>
-      <w:sz w:val="40"/>
-      <w:szCs w:val="40"/>
+      <w:sz w:val="32"/>
+      <w:szCs w:val="32"/>
     </w:rPr>
   </w:style>
   <w:style w:type="character" w:customStyle="1" w:styleId="TitleChar">
@@ -1151,13 +2022,15 @@
     <w:basedOn w:val="DefaultParagraphFont"/>
     <w:link w:val="Title"/>
     <w:uiPriority w:val="10"/>
-    <w:rsid w:val="00E168AC"/>
+    <w:rsid w:val="0014295B"/>
     <w:rPr>
       <w:rFonts w:ascii="Times New Roman" w:eastAsiaTheme="majorEastAsia" w:hAnsi="Times New Roman" w:cs="Times New Roman"/>
+      <w:b/>
+      <w:bCs/>
       <w:spacing w:val="-10"/>
       <w:kern w:val="28"/>
-      <w:sz w:val="40"/>
-      <w:szCs w:val="40"/>
+      <w:sz w:val="32"/>
+      <w:szCs w:val="32"/>
     </w:rPr>
   </w:style>
   <w:style w:type="paragraph" w:styleId="Subtitle">
@@ -1295,6 +2168,122 @@
       <w:smallCaps/>
       <w:color w:val="0F4761" w:themeColor="accent1" w:themeShade="BF"/>
       <w:spacing w:val="5"/>
+    </w:rPr>
+  </w:style>
+  <w:style w:type="paragraph" w:customStyle="1" w:styleId="AuthorList">
+    <w:name w:val="Author List"/>
+    <w:aliases w:val="Keywords,Abstract"/>
+    <w:basedOn w:val="Subtitle"/>
+    <w:next w:val="Normal"/>
+    <w:uiPriority w:val="1"/>
+    <w:qFormat/>
+    <w:rsid w:val="003600B0"/>
+    <w:pPr>
+      <w:numPr>
+        <w:ilvl w:val="0"/>
+      </w:numPr>
+      <w:spacing w:before="240" w:after="240" w:line="240" w:lineRule="auto"/>
+    </w:pPr>
+    <w:rPr>
+      <w:rFonts w:eastAsiaTheme="minorHAnsi" w:cs="Times New Roman"/>
+      <w:b/>
+      <w:color w:val="auto"/>
+      <w:spacing w:val="0"/>
+      <w:kern w:val="0"/>
+      <w:sz w:val="24"/>
+      <w:szCs w:val="24"/>
+      <w14:ligatures w14:val="none"/>
+    </w:rPr>
+  </w:style>
+  <w:style w:type="character" w:styleId="CommentReference">
+    <w:name w:val="annotation reference"/>
+    <w:basedOn w:val="DefaultParagraphFont"/>
+    <w:uiPriority w:val="99"/>
+    <w:semiHidden/>
+    <w:unhideWhenUsed/>
+    <w:rsid w:val="00FC169F"/>
+    <w:rPr>
+      <w:sz w:val="16"/>
+      <w:szCs w:val="16"/>
+    </w:rPr>
+  </w:style>
+  <w:style w:type="paragraph" w:styleId="CommentText">
+    <w:name w:val="annotation text"/>
+    <w:basedOn w:val="Normal"/>
+    <w:link w:val="CommentTextChar"/>
+    <w:uiPriority w:val="99"/>
+    <w:unhideWhenUsed/>
+    <w:rsid w:val="00FC169F"/>
+    <w:pPr>
+      <w:spacing w:line="240" w:lineRule="auto"/>
+    </w:pPr>
+    <w:rPr>
+      <w:sz w:val="20"/>
+      <w:szCs w:val="20"/>
+    </w:rPr>
+  </w:style>
+  <w:style w:type="character" w:customStyle="1" w:styleId="CommentTextChar">
+    <w:name w:val="Comment Text Char"/>
+    <w:basedOn w:val="DefaultParagraphFont"/>
+    <w:link w:val="CommentText"/>
+    <w:uiPriority w:val="99"/>
+    <w:rsid w:val="00FC169F"/>
+    <w:rPr>
+      <w:rFonts w:ascii="Times New Roman" w:hAnsi="Times New Roman" w:cs="Times New Roman"/>
+      <w:sz w:val="20"/>
+      <w:szCs w:val="20"/>
+    </w:rPr>
+  </w:style>
+  <w:style w:type="paragraph" w:styleId="CommentSubject">
+    <w:name w:val="annotation subject"/>
+    <w:basedOn w:val="CommentText"/>
+    <w:next w:val="CommentText"/>
+    <w:link w:val="CommentSubjectChar"/>
+    <w:uiPriority w:val="99"/>
+    <w:semiHidden/>
+    <w:unhideWhenUsed/>
+    <w:rsid w:val="00FC169F"/>
+    <w:rPr>
+      <w:b/>
+      <w:bCs/>
+    </w:rPr>
+  </w:style>
+  <w:style w:type="character" w:customStyle="1" w:styleId="CommentSubjectChar">
+    <w:name w:val="Comment Subject Char"/>
+    <w:basedOn w:val="CommentTextChar"/>
+    <w:link w:val="CommentSubject"/>
+    <w:uiPriority w:val="99"/>
+    <w:semiHidden/>
+    <w:rsid w:val="00FC169F"/>
+    <w:rPr>
+      <w:rFonts w:ascii="Times New Roman" w:hAnsi="Times New Roman" w:cs="Times New Roman"/>
+      <w:b/>
+      <w:bCs/>
+      <w:sz w:val="20"/>
+      <w:szCs w:val="20"/>
+    </w:rPr>
+  </w:style>
+  <w:style w:type="character" w:styleId="Hyperlink">
+    <w:name w:val="Hyperlink"/>
+    <w:basedOn w:val="DefaultParagraphFont"/>
+    <w:uiPriority w:val="99"/>
+    <w:unhideWhenUsed/>
+    <w:rsid w:val="00A5340A"/>
+    <w:rPr>
+      <w:color w:val="467886" w:themeColor="hyperlink"/>
+      <w:u w:val="single"/>
+    </w:rPr>
+  </w:style>
+  <w:style w:type="character" w:styleId="UnresolvedMention">
+    <w:name w:val="Unresolved Mention"/>
+    <w:basedOn w:val="DefaultParagraphFont"/>
+    <w:uiPriority w:val="99"/>
+    <w:semiHidden/>
+    <w:unhideWhenUsed/>
+    <w:rsid w:val="00A5340A"/>
+    <w:rPr>
+      <w:color w:val="605E5C"/>
+      <w:shd w:val="clear" w:color="auto" w:fill="E1DFDD"/>
     </w:rPr>
   </w:style>
 </w:styles>

</xml_diff>

<commit_message>
Add rough draft of introduction and some of the results section.
</commit_message>
<xml_diff>
--- a/Manuscript draft.docx
+++ b/Manuscript draft.docx
@@ -1,11 +1,10 @@
 
 <file path=word/document.xml><?xml version="1.0" encoding="utf-8"?>
-<w:document xmlns:wpc="http://schemas.microsoft.com/office/word/2010/wordprocessingCanvas" xmlns:cx="http://schemas.microsoft.com/office/drawing/2014/chartex" xmlns:cx1="http://schemas.microsoft.com/office/drawing/2015/9/8/chartex" xmlns:cx2="http://schemas.microsoft.com/office/drawing/2015/10/21/chartex" xmlns:cx3="http://schemas.microsoft.com/office/drawing/2016/5/9/chartex" xmlns:cx4="http://schemas.microsoft.com/office/drawing/2016/5/10/chartex" xmlns:cx5="http://schemas.microsoft.com/office/drawing/2016/5/11/chartex" xmlns:cx6="http://schemas.microsoft.com/office/drawing/2016/5/12/chartex" xmlns:cx7="http://schemas.microsoft.com/office/drawing/2016/5/13/chartex" xmlns:cx8="http://schemas.microsoft.com/office/drawing/2016/5/14/chartex" xmlns:mc="http://schemas.openxmlformats.org/markup-compatibility/2006" xmlns:aink="http://schemas.microsoft.com/office/drawing/2016/ink" xmlns:am3d="http://schemas.microsoft.com/office/drawing/2017/model3d" xmlns:o="urn:schemas-microsoft-com:office:office" xmlns:oel="http://schemas.microsoft.com/office/2019/extlst" xmlns:r="http://schemas.openxmlformats.org/officeDocument/2006/relationships" xmlns:m="http://schemas.openxmlformats.org/officeDocument/2006/math" xmlns:v="urn:schemas-microsoft-com:vml" xmlns:wp14="http://schemas.microsoft.com/office/word/2010/wordprocessingDrawing" xmlns:wp="http://schemas.openxmlformats.org/drawingml/2006/wordprocessingDrawing" xmlns:w10="urn:schemas-microsoft-com:office:word" xmlns:w="http://schemas.openxmlformats.org/wordprocessingml/2006/main" xmlns:w14="http://schemas.microsoft.com/office/word/2010/wordml" xmlns:w15="http://schemas.microsoft.com/office/word/2012/wordml" xmlns:w16cei="http://schemas.microsoft.com/office/word/2026/wordml/cei" xmlns:w16cex="http://schemas.microsoft.com/office/word/2018/wordml/cex" xmlns:w16cid="http://schemas.microsoft.com/office/word/2016/wordml/cid" xmlns:w16="http://schemas.microsoft.com/office/word/2018/wordml" xmlns:w16du="http://schemas.microsoft.com/office/word/2023/wordml/word16du" xmlns:w16sdtdh="http://schemas.microsoft.com/office/word/2020/wordml/sdtdatahash" xmlns:w16sdtfl="http://schemas.microsoft.com/office/word/2024/wordml/sdtformatlock" xmlns:w16se="http://schemas.microsoft.com/office/word/2015/wordml/symex" xmlns:wpg="http://schemas.microsoft.com/office/word/2010/wordprocessingGroup" xmlns:wpi="http://schemas.microsoft.com/office/word/2010/wordprocessingInk" xmlns:wne="http://schemas.microsoft.com/office/word/2006/wordml" xmlns:wps="http://schemas.microsoft.com/office/word/2010/wordprocessingShape" mc:Ignorable="w14 w15 w16se w16cid w16 w16cex w16sdtdh w16sdtfl w16du wp14">
+<w:document xmlns:wpc="http://schemas.microsoft.com/office/word/2010/wordprocessingCanvas" xmlns:cx="http://schemas.microsoft.com/office/drawing/2014/chartex" xmlns:cx1="http://schemas.microsoft.com/office/drawing/2015/9/8/chartex" xmlns:cx2="http://schemas.microsoft.com/office/drawing/2015/10/21/chartex" xmlns:cx3="http://schemas.microsoft.com/office/drawing/2016/5/9/chartex" xmlns:cx4="http://schemas.microsoft.com/office/drawing/2016/5/10/chartex" xmlns:cx5="http://schemas.microsoft.com/office/drawing/2016/5/11/chartex" xmlns:cx6="http://schemas.microsoft.com/office/drawing/2016/5/12/chartex" xmlns:cx7="http://schemas.microsoft.com/office/drawing/2016/5/13/chartex" xmlns:cx8="http://schemas.microsoft.com/office/drawing/2016/5/14/chartex" xmlns:mc="http://schemas.openxmlformats.org/markup-compatibility/2006" xmlns:aink="http://schemas.microsoft.com/office/drawing/2016/ink" xmlns:am3d="http://schemas.microsoft.com/office/drawing/2017/model3d" xmlns:o="urn:schemas-microsoft-com:office:office" xmlns:oel="http://schemas.microsoft.com/office/2019/extlst" xmlns:r="http://schemas.openxmlformats.org/officeDocument/2006/relationships" xmlns:m="http://schemas.openxmlformats.org/officeDocument/2006/math" xmlns:v="urn:schemas-microsoft-com:vml" xmlns:wp14="http://schemas.microsoft.com/office/word/2010/wordprocessingDrawing" xmlns:wp="http://schemas.openxmlformats.org/drawingml/2006/wordprocessingDrawing" xmlns:w10="urn:schemas-microsoft-com:office:word" xmlns:w="http://schemas.openxmlformats.org/wordprocessingml/2006/main" xmlns:w14="http://schemas.microsoft.com/office/word/2010/wordml" xmlns:w15="http://schemas.microsoft.com/office/word/2012/wordml" xmlns:w16cex="http://schemas.microsoft.com/office/word/2018/wordml/cex" xmlns:w16cid="http://schemas.microsoft.com/office/word/2016/wordml/cid" xmlns:w16="http://schemas.microsoft.com/office/word/2018/wordml" xmlns:w16du="http://schemas.microsoft.com/office/word/2023/wordml/word16du" xmlns:w16sdtdh="http://schemas.microsoft.com/office/word/2020/wordml/sdtdatahash" xmlns:w16sdtfl="http://schemas.microsoft.com/office/word/2024/wordml/sdtformatlock" xmlns:w16se="http://schemas.microsoft.com/office/word/2015/wordml/symex" xmlns:wpg="http://schemas.microsoft.com/office/word/2010/wordprocessingGroup" xmlns:wpi="http://schemas.microsoft.com/office/word/2010/wordprocessingInk" xmlns:wne="http://schemas.microsoft.com/office/word/2006/wordml" xmlns:wps="http://schemas.microsoft.com/office/word/2010/wordprocessingShape" mc:Ignorable="w14 w15 w16se w16cid w16 w16cex w16sdtdh w16sdtfl w16du wp14">
   <w:body>
     <w:p>
       <w:pPr>
         <w:pStyle w:val="Title"/>
-        <w:jc w:val="left"/>
       </w:pPr>
       <w:r>
         <w:t>Environmental and spatiotemporal influences on winter ichthyoplankton assemblages of the northern California Current</w:t>
@@ -109,7 +108,6 @@
     </w:p>
     <w:p>
       <w:pPr>
-        <w:spacing w:line="240" w:lineRule="auto"/>
         <w:rPr>
           <w:b/>
         </w:rPr>
@@ -125,9 +123,6 @@
       </w:r>
     </w:p>
     <w:p>
-      <w:pPr>
-        <w:spacing w:line="240" w:lineRule="auto"/>
-      </w:pPr>
       <w:r>
         <w:rPr>
           <w:vertAlign w:val="superscript"/>
@@ -139,35 +134,17 @@
       </w:r>
     </w:p>
     <w:p>
-      <w:pPr>
-        <w:spacing w:line="240" w:lineRule="auto"/>
-        <w:rPr>
-          <w:b/>
-        </w:rPr>
-      </w:pPr>
-      <w:r>
-        <w:rPr>
-          <w:b/>
-        </w:rPr>
+      <w:r>
         <w:t>^</w:t>
       </w:r>
       <w:r>
-        <w:rPr>
-          <w:b/>
-        </w:rPr>
         <w:t xml:space="preserve"> </w:t>
       </w:r>
       <w:r>
-        <w:rPr>
-          <w:b/>
-        </w:rPr>
         <w:t>First author</w:t>
       </w:r>
     </w:p>
     <w:p>
-      <w:pPr>
-        <w:spacing w:line="240" w:lineRule="auto"/>
-      </w:pPr>
       <w:r>
         <w:rPr>
           <w:b/>
@@ -238,10 +215,6 @@
       </w:r>
     </w:p>
     <w:p>
-      <w:pPr>
-        <w:spacing w:line="240" w:lineRule="auto"/>
-        <w:ind w:firstLine="720"/>
-      </w:pPr>
       <w:r>
         <w:t>Winter ichthyoplankton abundance in the northern California Current is a strong predictor of annual recruitment of important fisheries species such as salmon, as juvenile salmon diet at ocean entry is dominated by winter-spawned early juvenile fishes. Yet little is known about the influences of spatiotemporal and environmental factors on the composition of these ichthyoplankton assemblages. To characterize winter ichthyoplankton assemblages and identify the factors that influence their composition, we collected depth-discrete ichthyoplankton samples from across the northern California Current ecosystem (41–47°N) on four two-week research cruises during winter 2018–2023. Temperature, salinity, dissolved oxygen concentration (DO), and fluorescence were measured simultaneously with the ichthyoplankton. Ichthyoplankton were visually identified to the lowest possible taxonomic resolution, and dominant ichthyoplankton assemblages were identified using hierarchical clustering analysis and non-metric multidimensional scaling ordination. Distance-based redundancy analysis was used to estimate the effects of longitude, latitude, year, time of day, sampling depth, seafloor depth, temperature, salinity, DO, and fluorescence on assemblage composition. Finally, generalized linear regression was used to quantify diel differences in the vertical distributions of ichthyoplankton taxa. Dominant ichthyoplankton assemblages included those characterized primarily by Sebastes spp., Parophrys vetulus, mesopelagics, and Osmeridae. Spatiotemporal and environmental conditions accounted for a significant amount of variation in ichthyoplankton assemblage composition. Vertical distributions of several taxa differed significantly between night and day. Understanding these spatiotemporal and environmental influences on winter ichthyoplankton assemblages will help explain variation and potentially predict the abundance of winter-spawning fishes and subsequent recruitment of fisheries species that prey on them.</w:t>
       </w:r>
@@ -265,64 +238,11 @@
       </w:r>
     </w:p>
     <w:p>
-      <w:pPr>
-        <w:spacing w:line="240" w:lineRule="auto"/>
-        <w:ind w:firstLine="720"/>
-      </w:pPr>
-      <w:r>
-        <w:t>[</w:t>
-      </w:r>
-      <w:r>
-        <w:rPr>
-          <w:i/>
-          <w:iCs/>
-          <w:u w:val="single"/>
-        </w:rPr>
-        <w:t xml:space="preserve">Intro </w:t>
-      </w:r>
-      <w:r>
-        <w:rPr>
-          <w:i/>
-          <w:iCs/>
-          <w:u w:val="single"/>
-        </w:rPr>
-        <w:t>paragraph</w:t>
-      </w:r>
-      <w:r>
-        <w:rPr>
-          <w:i/>
-          <w:iCs/>
-          <w:u w:val="single"/>
-        </w:rPr>
-        <w:t xml:space="preserve"> building into</w:t>
-      </w:r>
-      <w:r>
-        <w:rPr>
-          <w:i/>
-          <w:iCs/>
-          <w:u w:val="single"/>
-        </w:rPr>
-        <w:t xml:space="preserve"> the following</w:t>
-      </w:r>
-      <w:r>
-        <w:rPr>
-          <w:i/>
-          <w:iCs/>
-          <w:u w:val="single"/>
-        </w:rPr>
-        <w:t xml:space="preserve"> background</w:t>
-      </w:r>
-      <w:r>
-        <w:t>]</w:t>
-      </w:r>
-    </w:p>
-    <w:p>
-      <w:pPr>
-        <w:spacing w:line="240" w:lineRule="auto"/>
-        <w:ind w:firstLine="720"/>
-      </w:pPr>
-      <w:r>
-        <w:t>For many fish species of the northeast Pacific, peak spawning occurs in the winter during which offshore transport is minimal (Brodeur et al., 2008; Doyle, 1992). However, this season is relatively neglected in ichthyoplankton research in favor of spring and summer when sea conditions are more ideal</w:t>
+      <w:r>
+        <w:t>The northern California Current (NCC) is a dynamic eastern boundary current system that supports an abundance of important fish populations whose early life stages are tightly coupled to seasonal oceanographic processes (Auth, 2011). For many of these species</w:t>
+      </w:r>
+      <w:r>
+        <w:t>, peak spawning occurs in the winter during which offshore transport is minimal (Brodeur et al., 2008; Doyle, 1992). However, this season is relatively neglected in ichthyoplankton research in favor of spring and summer when sea conditions are more ideal</w:t>
       </w:r>
       <w:commentRangeStart w:id="2"/>
       <w:r>
@@ -338,11 +258,16 @@
         <w:commentReference w:id="2"/>
       </w:r>
       <w:r>
-        <w:t>Being the population that goes on to comprise adult fish stocks, it is vital to understand the dynamics of the larval fish community (LFC) in all seasons and the factors contributing to its composition and abundance. Such knowledge is key for predicting future recruitment and monitoring stocks in a changing environment (Auth, 2011</w:t>
+        <w:t xml:space="preserve">Being the population that goes on to comprise adult fish stocks, it is vital to understand the dynamics of the larval fish community (LFC) in all seasons and the factors contributing to its composition and abundance. Such knowledge is key for predicting future recruitment and monitoring stocks in a changing environment (Auth, 2011). </w:t>
+      </w:r>
+    </w:p>
+    <w:p>
+      <w:r>
+        <w:t xml:space="preserve">Of particular interest are the highly valuable fisheries on which coastal communities rely for economic, recreational, and cultural purposes, such as salmon. During the vulnerable ocean-entering stage, salmon smolt survival is influenced heavily by prey availability. Significant relationships have been found between winter ichthyoplankton and the juvenile salmon survival with larval biomass explaining between 34% and 85% of the variability in subsequent marine survival and adult returns (Daly et al., 2013). The nearshore region specifically provides optimal habitat for early developmental stages, offering protection from predators and ideal physiochemical conditions, in addition to a rich prey field (Pattrick et al., 2021). Knowing the dominant taxa of nearshore larval fish assemblages and their abundance can give an estimate of available prey for smolt as they enter the ocean. Thus, winter ichthyoplankton data could act as a useful metric in timing hatchery salmon release to optimize feeding conditions upon ocean </w:t>
       </w:r>
       <w:commentRangeStart w:id="3"/>
       <w:r>
-        <w:t xml:space="preserve">). </w:t>
+        <w:t xml:space="preserve">entry </w:t>
       </w:r>
       <w:commentRangeEnd w:id="3"/>
       <w:r>
@@ -353,18 +278,17 @@
         </w:rPr>
         <w:commentReference w:id="3"/>
       </w:r>
-    </w:p>
-    <w:p>
-      <w:pPr>
-        <w:spacing w:line="240" w:lineRule="auto"/>
-        <w:ind w:firstLine="720"/>
-      </w:pPr>
-      <w:r>
-        <w:t xml:space="preserve">Of particular interest are the highly valuable fisheries on which coastal communities rely for economic, recreational, and cultural purposes, such as salmon. During the vulnerable ocean-entering stage, salmon smolt survival is influenced heavily by prey availability. Significant relationships have been found between winter ichthyoplankton and the juvenile salmon survival with larval biomass explaining between 34% and 85% of the variability in subsequent marine survival and adult returns (Daly et al., 2013). The nearshore region specifically provides optimal habitat for early developmental stages, offering protection from predators and ideal physiochemical conditions, in addition to a rich prey field (Pattrick et al., 2021). Knowing the dominant taxa of nearshore larval fish assemblages and their abundance can give an estimate of available prey for smolt as they enter the ocean. Thus, winter ichthyoplankton data could act as a useful metric in timing hatchery salmon release to optimize feeding conditions upon ocean </w:t>
+      <w:r>
+        <w:t>(Daly et al., 2013). However, given the dynamic nature of the coastal environment in which pre-settlement larvae and smolt disperse, understanding the influence of environmental and spatiotemporal variables on larval distribution remains challenging (Pattrick et al., 2021).</w:t>
+      </w:r>
+    </w:p>
+    <w:p>
+      <w:r>
+        <w:t xml:space="preserve">While variation in larval assemblages is known to be associated with oceanographic variability, local factors may also influence their composition. Broad oceanographic indicators such as </w:t>
       </w:r>
       <w:commentRangeStart w:id="4"/>
       <w:r>
-        <w:t xml:space="preserve">entry </w:t>
+        <w:t xml:space="preserve">water mass stability, current direction, and local topography </w:t>
       </w:r>
       <w:commentRangeEnd w:id="4"/>
       <w:r>
@@ -376,20 +300,84 @@
         <w:commentReference w:id="4"/>
       </w:r>
       <w:r>
-        <w:t>(Daly et al., 2013). However, given the dynamic nature of the coastal environment in which pre-settlement larvae and smolt disperse, understanding the influence of environmental and spatiotemporal variables on larval distribution remains challenging (Pattrick et al., 2021).</w:t>
-      </w:r>
-    </w:p>
-    <w:p>
-      <w:pPr>
-        <w:spacing w:line="240" w:lineRule="auto"/>
-        <w:ind w:firstLine="720"/>
-      </w:pPr>
-      <w:r>
-        <w:t xml:space="preserve">While variation in larval assemblages is known to be associated with oceanographic variability, local factors may also influence their composition. Broad oceanographic indicators such as </w:t>
+        <w:t>have all been found to influence the composition, abundance, and distribution of larval fish (Doyle et al., 2002; Roussel et al., 2010). In the dynamic upwelling system of the NCC, the coastal upwelling transport index (CUTI) predicted taxa co-</w:t>
+      </w:r>
+      <w:r>
+        <w:t>occurrence</w:t>
+      </w:r>
+      <w:r>
+        <w:t xml:space="preserve"> of larvae with varying strength according to the seasonal upwelling or downwelling regime of the region (Schmid et al., 2023). Variability on finer spatial and temporal scales is also relevant to the LFC in coastal marine environments (Gallego-Zerrato et al., 2024). Early-li</w:t>
+      </w:r>
+      <w:r>
+        <w:t>f</w:t>
+      </w:r>
+      <w:r>
+        <w:t xml:space="preserve">e distribution, growth, and survival of fish larvae is strongly influenced by temperature, salinity, and dissolved oxygen concentration (DO) (Auth, 2011). In fact, larval fish are particularly vulnerable to depressed DO, compared to adult conspecifics, with hypoxia exposure during early-life having long-term effects on growth and survival (Johnson-Colegrove et al., 2015). Such factors vary in space, alongside ichthyoplankton assemblages generally reflecting the habitat preference of adults (Doyle et al., 2002). The result is distinct horizontal community structuring with coastal upwelling, offshore oligotrophic, and shelf-slope transitional zones (Gleiber, 2020; Richardson et al., 1980). Larvae also aggregate vertically, allowing them to reach or maintain a position within water masses of ideal environmental, growth, and feeding conditions and transport potential (Huebert et al., 2010; Primo et al. 2012). These vertical assemblages can differ further on fine, diel time scales. There is evidence for diel vertical migration (DVM) in the </w:t>
+      </w:r>
+      <w:r>
+        <w:t>larval stage</w:t>
+      </w:r>
+      <w:r>
+        <w:t xml:space="preserve"> of many taxa, potentially providing an adaptive advantage in predator avoidance; light and temperature optimization; and prey abundance (Haldorson et al., </w:t>
+      </w:r>
+      <w:r>
+        <w:lastRenderedPageBreak/>
+        <w:t>1993; Primo et al., 2012). Diel effects such as migration and visual net avoidance are not accounted for, however, in common sampling schemes that are depth-integrated and do not tow at multiple times of day</w:t>
+      </w:r>
+      <w:r>
+        <w:t>.</w:t>
+      </w:r>
+      <w:r>
+        <w:t xml:space="preserve"> </w:t>
       </w:r>
       <w:commentRangeStart w:id="5"/>
       <w:r>
-        <w:t xml:space="preserve">water mass stability, current direction, and local topography </w:t>
+        <w:t xml:space="preserve">What remains is a gap in the knowledge of </w:t>
+      </w:r>
+      <w:r>
+        <w:t xml:space="preserve">winter </w:t>
+      </w:r>
+      <w:r>
+        <w:t xml:space="preserve">ichthyoplankton </w:t>
+      </w:r>
+      <w:r>
+        <w:t>assemblage</w:t>
+      </w:r>
+      <w:r>
+        <w:t xml:space="preserve">s, </w:t>
+      </w:r>
+      <w:r>
+        <w:t xml:space="preserve">broadly, as well as </w:t>
+      </w:r>
+      <w:r>
+        <w:t>the specific</w:t>
+      </w:r>
+      <w:r>
+        <w:t xml:space="preserve"> relationships between aggregations </w:t>
+      </w:r>
+      <w:r>
+        <w:t>and</w:t>
+      </w:r>
+      <w:r>
+        <w:t xml:space="preserve"> </w:t>
+      </w:r>
+      <w:r>
+        <w:t xml:space="preserve">the </w:t>
+      </w:r>
+      <w:r>
+        <w:t>environmental and spatiotemporal variables</w:t>
+      </w:r>
+      <w:r>
+        <w:t xml:space="preserve"> that </w:t>
+      </w:r>
+      <w:r>
+        <w:t>affect</w:t>
+      </w:r>
+      <w:r>
+        <w:t xml:space="preserve"> their composition and position in space</w:t>
+      </w:r>
+      <w:r>
+        <w:t>.</w:t>
       </w:r>
       <w:commentRangeEnd w:id="5"/>
       <w:r>
@@ -400,12 +388,71 @@
         </w:rPr>
         <w:commentReference w:id="5"/>
       </w:r>
-      <w:r>
-        <w:t xml:space="preserve">have all been found to influence the composition, abundance, and distribution of larval fish (Doyle et al., 2002; Roussel et al., 2010). </w:t>
+    </w:p>
+    <w:p>
+      <w:r>
+        <w:t xml:space="preserve">Using depth-discrete ichthyoplankton data sampled on four two-week cruises across the northern California Current system (41–47°N) during winter 2018–2023, we investigated the LFC to characterize assemblages and identify factors influencing the composition thereof. We expect larval assemblages to cluster according to adult habitat affinity with distinct taxonomic and spatial communities. Additionally, we expect significant effects of spatiotemporal and environmental variables—such as latitude, temperature, dissolved oxygen, seafloor depth, productivity, time of day, and salinity—on the clustering of the LFC. Establishing how larval fish aggregate during the winter and what factors contribute to the composition of each assemblage could provide a baseline for future studies on the changing NCC ecosystem while also aiding in predictions of winter-spawning fish abundance and the recruitment of the important fisheries species that prey on them. </w:t>
+      </w:r>
+    </w:p>
+    <w:p/>
+    <w:p>
+      <w:pPr>
+        <w:pStyle w:val="Heading1"/>
+      </w:pPr>
+      <w:r>
+        <w:t>2</w:t>
+      </w:r>
+      <w:r>
+        <w:tab/>
+      </w:r>
+      <w:r>
+        <w:t>MATERIALS AND METHODS</w:t>
+      </w:r>
+    </w:p>
+    <w:p>
+      <w:pPr>
+        <w:pStyle w:val="Heading2"/>
+      </w:pPr>
+      <w:r>
+        <w:t xml:space="preserve">2.1 </w:t>
+      </w:r>
+      <w:r>
+        <w:tab/>
+        <w:t>Sampling and data collection</w:t>
+      </w:r>
+    </w:p>
+    <w:p>
+      <w:r>
+        <w:t>[add section text here]</w:t>
+      </w:r>
+    </w:p>
+    <w:p>
+      <w:pPr>
+        <w:pStyle w:val="Heading2"/>
+      </w:pPr>
+      <w:r>
+        <w:t>2.2</w:t>
+      </w:r>
+      <w:r>
+        <w:tab/>
+      </w:r>
+      <w:r>
+        <w:t>Statistical</w:t>
+      </w:r>
+      <w:r>
+        <w:t xml:space="preserve"> </w:t>
+      </w:r>
+      <w:r>
+        <w:t>analysis</w:t>
+      </w:r>
+    </w:p>
+    <w:p>
+      <w:r>
+        <w:t>All data analyses were performed in RStudio</w:t>
       </w:r>
       <w:commentRangeStart w:id="6"/>
       <w:r>
-        <w:t xml:space="preserve">In </w:t>
+        <w:t xml:space="preserve">. </w:t>
       </w:r>
       <w:commentRangeEnd w:id="6"/>
       <w:r>
@@ -417,11 +464,35 @@
         <w:commentReference w:id="6"/>
       </w:r>
       <w:r>
-        <w:t>the dynamic upwelling system of the northern California Current (NCC), the coastal upwelling transport index (CUTI) predicted taxa co-occurance of larvae with varying strength according to the seasonal upwelling or downwelling regime of the region (Schmid et al., 2023). Variability on finer spatial and temporal scales is also relevant to the LFC in coastal marine environments (Gallego-Zerrato et al., 2024). Early-live distribution, growth, and survival of fish larvae is strongly influenced by temperature, salinity, and dissolved oxygen concentration (DO) (Auth, 2011). In fact, larval fish are particularly vulnerable to depressed DO, compared to adult conspecifics, with hypoxia exposure during early-life having long-term effects on growth and survival (Johnson-Colegrove et al., 2015). Such factors vary in space, alongside ichthyoplankton assemblages generally reflecting the habitat preference of adults (Doyle et al., 2002). The result is distinct horizontal community structuring with coastal upwelling, offshore oligotrophic, and shelf-slope transitional zones (</w:t>
+        <w:t xml:space="preserve">To identify </w:t>
+      </w:r>
+      <w:r>
+        <w:t xml:space="preserve">ecologically distinct </w:t>
+      </w:r>
+      <w:r>
+        <w:t>larval fish assemblages,</w:t>
+      </w:r>
+      <w:r>
+        <w:t xml:space="preserve"> </w:t>
+      </w:r>
+      <w:r>
+        <w:t xml:space="preserve">first </w:t>
+      </w:r>
+      <w:r>
+        <w:t>the density of each taxonomic group within each net tow was square-root transformed. These were then used to generate a matrix of Bray-Curtis dissimilarities between net tows. Agglomerative hierarchal clustering was performed on th</w:t>
+      </w:r>
+      <w:r>
+        <w:t xml:space="preserve">e dissimilarity matrix </w:t>
+      </w:r>
+      <w:r>
+        <w:t xml:space="preserve">with the “average” method. </w:t>
+      </w:r>
+      <w:r>
+        <w:t>To determine the number of clusters necessary</w:t>
       </w:r>
       <w:commentRangeStart w:id="7"/>
       <w:r>
-        <w:t>Gleiber</w:t>
+        <w:t xml:space="preserve">, </w:t>
       </w:r>
       <w:commentRangeEnd w:id="7"/>
       <w:r>
@@ -433,15 +504,114 @@
         <w:commentReference w:id="7"/>
       </w:r>
       <w:r>
-        <w:t xml:space="preserve">, 2020; Richardson et al., 1980). Larvae also aggregate vertically, allowing them to reach or maintain a position within water masses of ideal environmental, growth, and feeding conditions and transport potential (Huebert et al., 2010; Primo et al. 2012). These vertical assemblages can differ further on fine, diel time scales. There is evidence for diel vertical migration (DVM) in the larval-stage of many taxa, potentially </w:t>
-      </w:r>
-      <w:r>
-        <w:lastRenderedPageBreak/>
-        <w:t xml:space="preserve">providing an adaptive advantage in predator avoidance; light and temperature optimization; and prey abundance (Haldorson et al., 1993; Primo et al., 2012). </w:t>
+        <w:t xml:space="preserve">a dendrogram of the clustering results </w:t>
+      </w:r>
+      <w:r>
+        <w:t>was</w:t>
+      </w:r>
+      <w:r>
+        <w:t xml:space="preserve"> plotted</w:t>
+      </w:r>
+      <w:r>
+        <w:t xml:space="preserve"> with </w:t>
+      </w:r>
+      <w:r>
+        <w:t>overlayed rectangles to identify cluster boundaries</w:t>
+      </w:r>
+      <w:r>
+        <w:t xml:space="preserve">. </w:t>
+      </w:r>
+    </w:p>
+    <w:p>
+      <w:r>
+        <w:t xml:space="preserve">To visualize the taxonomic composition of each cluster, </w:t>
+      </w:r>
+      <w:r>
+        <w:t xml:space="preserve">the taxa densities in each net tow were plotted </w:t>
+      </w:r>
+      <w:r>
+        <w:t xml:space="preserve">in a stacked bar plot. Beyond visual </w:t>
+      </w:r>
+      <w:r>
+        <w:t>this visual assessment,</w:t>
+      </w:r>
+      <w:r>
+        <w:t xml:space="preserve"> an in</w:t>
+      </w:r>
+      <w:r>
+        <w:t xml:space="preserve">dicator species analysis </w:t>
+      </w:r>
+      <w:r>
+        <w:t xml:space="preserve">(ISA) </w:t>
+      </w:r>
+      <w:r>
+        <w:t>was run</w:t>
+      </w:r>
+      <w:r>
+        <w:t xml:space="preserve"> to identify </w:t>
+      </w:r>
+      <w:r>
+        <w:t>dominant taxonomic group(s) for every cluster</w:t>
+      </w:r>
+      <w:r>
+        <w:t xml:space="preserve">. </w:t>
+      </w:r>
+      <w:r>
+        <w:t xml:space="preserve">The bar plot and ISA were used in conjunction to </w:t>
+      </w:r>
+      <w:r>
+        <w:t>define major clusters of interest and the</w:t>
+      </w:r>
+      <w:r>
+        <w:t xml:space="preserve"> ecological </w:t>
+      </w:r>
+      <w:r>
+        <w:t>community they represent.</w:t>
+      </w:r>
+      <w:r>
+        <w:t xml:space="preserve"> </w:t>
+      </w:r>
+      <w:r>
+        <w:t xml:space="preserve">Net tows were then mapped </w:t>
+      </w:r>
+      <w:r>
+        <w:t xml:space="preserve">by cluster and net number to </w:t>
+      </w:r>
+      <w:r>
+        <w:t>observe</w:t>
+      </w:r>
+      <w:r>
+        <w:t xml:space="preserve"> how the clusters </w:t>
+      </w:r>
+      <w:r>
+        <w:t>distribute in</w:t>
+      </w:r>
+      <w:r>
+        <w:t xml:space="preserve"> vertical and horizontal </w:t>
+      </w:r>
+      <w:r>
+        <w:t xml:space="preserve">space. </w:t>
+      </w:r>
+      <w:r>
+        <w:t xml:space="preserve"> </w:t>
+      </w:r>
+    </w:p>
+    <w:p>
+      <w:r>
+        <w:t xml:space="preserve">An NMDS was run on the </w:t>
+      </w:r>
+      <w:r>
+        <w:t>previously described Bray-Curtis dissimilarity matrix</w:t>
+      </w:r>
+      <w:r>
+        <w:t xml:space="preserve">. The stress of the ordination was determined and its </w:t>
       </w:r>
       <w:commentRangeStart w:id="8"/>
       <w:r>
-        <w:t>Diel effects such as migration and visual net avoidance are not accounted for, however, in common sampling schemes that are depth-integrated and do not tow at multiple times of day</w:t>
+        <w:t>relevance</w:t>
+      </w:r>
+      <w:r>
+        <w:t xml:space="preserve"> </w:t>
       </w:r>
       <w:commentRangeEnd w:id="8"/>
       <w:r>
@@ -453,47 +623,23 @@
         <w:commentReference w:id="8"/>
       </w:r>
       <w:r>
-        <w:t>.</w:t>
+        <w:t xml:space="preserve">in the context of our data was assessed with the </w:t>
+      </w:r>
+      <w:r>
+        <w:t xml:space="preserve">iterative </w:t>
+      </w:r>
+      <w:r>
+        <w:t>permutation</w:t>
       </w:r>
       <w:r>
         <w:t xml:space="preserve"> </w:t>
       </w:r>
+      <w:r>
+        <w:t xml:space="preserve">methodology </w:t>
+      </w:r>
       <w:commentRangeStart w:id="9"/>
       <w:r>
-        <w:t xml:space="preserve">What remains is a gap in the knowledge of </w:t>
-      </w:r>
-      <w:r>
-        <w:t xml:space="preserve">winter </w:t>
-      </w:r>
-      <w:r>
-        <w:t xml:space="preserve">ichthyoplankton </w:t>
-      </w:r>
-      <w:r>
-        <w:t>assemblage</w:t>
-      </w:r>
-      <w:r>
-        <w:t xml:space="preserve">s, </w:t>
-      </w:r>
-      <w:r>
-        <w:t xml:space="preserve">broadly, as well as </w:t>
-      </w:r>
-      <w:r>
-        <w:t>the specific</w:t>
-      </w:r>
-      <w:r>
-        <w:t xml:space="preserve"> relationships between aggregations and to </w:t>
-      </w:r>
-      <w:r>
-        <w:t xml:space="preserve">the </w:t>
-      </w:r>
-      <w:r>
-        <w:t>environmental and spatiotemporal variables</w:t>
-      </w:r>
-      <w:r>
-        <w:t xml:space="preserve"> that effect their composition and position in space</w:t>
-      </w:r>
-      <w:r>
-        <w:t>.</w:t>
+        <w:t xml:space="preserve">suggested </w:t>
       </w:r>
       <w:commentRangeEnd w:id="9"/>
       <w:r>
@@ -504,52 +650,29 @@
         </w:rPr>
         <w:commentReference w:id="9"/>
       </w:r>
-    </w:p>
-    <w:p>
-      <w:pPr>
-        <w:spacing w:line="240" w:lineRule="auto"/>
-        <w:ind w:firstLine="720"/>
-      </w:pPr>
-      <w:r>
-        <w:t xml:space="preserve">Using depth-discrete ichthyoplankton data sampled on four two-week cruises across the northern California Current system (41–47°N) during winter 2018–2023, we investigated the LFC to characterize assemblages and identify factors influencing the composition thereof. </w:t>
-      </w:r>
-      <w:commentRangeStart w:id="10"/>
-      <w:r>
-        <w:t>We expect larval assemblages to cluster according to adult habitat affinity with distinct taxonomic and spatial communities. Additionally, we expect significant effects of spatiotemporal and environmental variables—such as latitude, temperature, dissolved oxygen, seafloor depth, productivity, time of day, and salinity—on the clustering of the LFC</w:t>
-      </w:r>
-      <w:commentRangeEnd w:id="10"/>
-      <w:r>
-        <w:rPr>
-          <w:rStyle w:val="CommentReference"/>
-          <w:sz w:val="24"/>
-          <w:szCs w:val="24"/>
-        </w:rPr>
-        <w:commentReference w:id="10"/>
-      </w:r>
-      <w:r>
-        <w:t>. Establishing how larval fish aggregate during the winter and what factors contribute to the composition of each assemblage could provide a baseline for future studies on the changing NCC ecosystem while also aiding in predictions of winter-spawning fish abundance and the recruitment of the important fisheries species that prey on them.</w:t>
+      <w:r>
+        <w:t>by Dexter et al. (2018)</w:t>
+      </w:r>
+      <w:r>
+        <w:t>.</w:t>
       </w:r>
       <w:r>
         <w:t xml:space="preserve"> </w:t>
       </w:r>
     </w:p>
-    <w:p>
-      <w:pPr>
-        <w:spacing w:line="240" w:lineRule="auto"/>
-      </w:pPr>
-    </w:p>
+    <w:p/>
     <w:p>
       <w:pPr>
         <w:pStyle w:val="Heading1"/>
       </w:pPr>
       <w:r>
-        <w:t>2</w:t>
+        <w:t>3</w:t>
       </w:r>
       <w:r>
         <w:tab/>
       </w:r>
       <w:r>
-        <w:t>MATERIALS AND METHODS</w:t>
+        <w:t>RESULTS</w:t>
       </w:r>
     </w:p>
     <w:p>
@@ -557,311 +680,179 @@
         <w:pStyle w:val="Heading2"/>
       </w:pPr>
       <w:r>
-        <w:t xml:space="preserve">2.1 </w:t>
+        <w:lastRenderedPageBreak/>
+        <w:t>3.1</w:t>
       </w:r>
       <w:r>
         <w:tab/>
-        <w:t>Sampling and data collection</w:t>
-      </w:r>
-    </w:p>
-    <w:p>
-      <w:pPr>
-        <w:spacing w:line="240" w:lineRule="auto"/>
-      </w:pPr>
-      <w:r>
-        <w:t>[</w:t>
+      </w:r>
+      <w:r>
+        <w:t xml:space="preserve">Description of the </w:t>
+      </w:r>
+      <w:r>
+        <w:t>LFC</w:t>
+      </w:r>
+    </w:p>
+    <w:p>
+      <w:r>
+        <w:t>Post-thresholding there was a total of 38,363 individual larvae from 82 sampling stations. Among these remaining stations, all transects were represented (Fig. 1A). Oceanographic conditions during sampling varied with depth and interannually. Gradients in temperature (℃) differed between years with 2018 and 2023 exhibiting a peak in temperature around 25-meters depth followed by a general decrease in temperature with increasing depth. Years 2019 and 2022 had similarly minimal changes in temperature across depths (Fig. 1B). During all years, salinity (PSU) increased with depth while DO (mL L⁻¹) exhibited the opposite trend—lower at greater depths (Fig. 1C–D). Productivity was the most varied during 2018 though no significant difference in mean productivity was apparent across all four years (Fig. 1E).</w:t>
+      </w:r>
+    </w:p>
+    <w:p>
+      <w:pPr>
+        <w:rPr>
+          <w:b/>
+          <w:bCs/>
+        </w:rPr>
+      </w:pPr>
+      <w:r>
+        <w:t xml:space="preserve">Cluster analysis of net tows yielded seven total clusters, two of which—clusters 4 and 7—contained only a single sampling tow (Supplementary Material Fig. 1). The composition of clusters was assessed statistically and visually, concentrating on the other five clusters that consisted of multiple samples. Cluster 1 was present in all four sampling years and was heavily dominated by its indicator taxa, </w:t>
       </w:r>
       <w:r>
         <w:rPr>
           <w:i/>
           <w:iCs/>
-          <w:u w:val="single"/>
-        </w:rPr>
-        <w:t>add section text here</w:t>
-      </w:r>
-      <w:r>
-        <w:t>]</w:t>
-      </w:r>
-    </w:p>
-    <w:p>
-      <w:pPr>
-        <w:pStyle w:val="Heading2"/>
-      </w:pPr>
-      <w:r>
-        <w:t>2.2</w:t>
-      </w:r>
-      <w:r>
-        <w:tab/>
-      </w:r>
-      <w:r>
-        <w:t>Statistical</w:t>
-      </w:r>
-      <w:r>
-        <w:t xml:space="preserve"> </w:t>
-      </w:r>
-      <w:r>
-        <w:t>analysis</w:t>
-      </w:r>
-    </w:p>
-    <w:p>
-      <w:pPr>
-        <w:spacing w:line="240" w:lineRule="auto"/>
-        <w:ind w:firstLine="720"/>
-      </w:pPr>
-      <w:r>
-        <w:t>All data analyses were performed in RStudio</w:t>
-      </w:r>
-      <w:commentRangeStart w:id="11"/>
-      <w:r>
-        <w:t xml:space="preserve">. </w:t>
-      </w:r>
-      <w:commentRangeEnd w:id="11"/>
-      <w:r>
-        <w:rPr>
-          <w:rStyle w:val="CommentReference"/>
-          <w:sz w:val="24"/>
-          <w:szCs w:val="24"/>
-        </w:rPr>
-        <w:commentReference w:id="11"/>
-      </w:r>
-      <w:r>
-        <w:t xml:space="preserve">To identify </w:t>
-      </w:r>
-      <w:r>
-        <w:t xml:space="preserve">ecologically distinct </w:t>
-      </w:r>
-      <w:r>
-        <w:t>larval fish assemblages,</w:t>
-      </w:r>
-      <w:r>
-        <w:t xml:space="preserve"> </w:t>
-      </w:r>
-      <w:r>
-        <w:t xml:space="preserve">first </w:t>
-      </w:r>
-      <w:r>
-        <w:t>the density of each taxonomic group within each net tow was square-root transformed. These were then used to generate a matrix of Bray-Curtis dissimilarities between net tows. Agglomerative hierarchal clustering was performed on th</w:t>
-      </w:r>
-      <w:r>
-        <w:t xml:space="preserve">e dissimilarity matrix </w:t>
-      </w:r>
-      <w:r>
-        <w:t xml:space="preserve">with the “average” method. </w:t>
-      </w:r>
-      <w:r>
-        <w:t>To determine the number of clusters necessary</w:t>
-      </w:r>
-      <w:commentRangeStart w:id="12"/>
-      <w:r>
-        <w:t xml:space="preserve">, </w:t>
-      </w:r>
-      <w:commentRangeEnd w:id="12"/>
-      <w:r>
-        <w:rPr>
-          <w:rStyle w:val="CommentReference"/>
-          <w:sz w:val="24"/>
-          <w:szCs w:val="24"/>
-        </w:rPr>
-        <w:commentReference w:id="12"/>
-      </w:r>
-      <w:r>
-        <w:t xml:space="preserve">a dendrogram of the clustering results </w:t>
-      </w:r>
-      <w:r>
-        <w:t>was</w:t>
-      </w:r>
-      <w:r>
-        <w:t xml:space="preserve"> plotted</w:t>
-      </w:r>
-      <w:r>
-        <w:t xml:space="preserve"> with </w:t>
-      </w:r>
-      <w:r>
-        <w:t>overlayed rectangles to identify cluster boundaries</w:t>
-      </w:r>
-      <w:r>
-        <w:t xml:space="preserve">. </w:t>
-      </w:r>
-    </w:p>
-    <w:p>
-      <w:pPr>
-        <w:spacing w:line="240" w:lineRule="auto"/>
-        <w:ind w:firstLine="720"/>
-      </w:pPr>
-      <w:r>
-        <w:t xml:space="preserve">To visualize the taxonomic composition of each cluster, </w:t>
-      </w:r>
-      <w:r>
-        <w:t xml:space="preserve">the taxa densities in each net tow were plotted </w:t>
-      </w:r>
-      <w:r>
-        <w:t xml:space="preserve">in a stacked bar plot. Beyond visual </w:t>
-      </w:r>
-      <w:r>
-        <w:t>this visual assessment,</w:t>
-      </w:r>
-      <w:r>
-        <w:t xml:space="preserve"> an in</w:t>
-      </w:r>
-      <w:r>
-        <w:t xml:space="preserve">dicator species analysis </w:t>
-      </w:r>
-      <w:r>
-        <w:t xml:space="preserve">(ISA) </w:t>
-      </w:r>
-      <w:r>
-        <w:t>was run</w:t>
-      </w:r>
-      <w:r>
-        <w:t xml:space="preserve"> to identify </w:t>
-      </w:r>
-      <w:r>
-        <w:t>dominant taxonomic group(s) for every cluster</w:t>
-      </w:r>
-      <w:r>
-        <w:t xml:space="preserve">. </w:t>
-      </w:r>
-      <w:r>
-        <w:t xml:space="preserve">The bar plot and ISA were used in conjunction to </w:t>
-      </w:r>
-      <w:r>
-        <w:t>define major clusters of interest and the</w:t>
-      </w:r>
-      <w:r>
-        <w:t xml:space="preserve"> ecological </w:t>
-      </w:r>
-      <w:r>
-        <w:t>community they represent.</w:t>
-      </w:r>
-      <w:r>
-        <w:t xml:space="preserve"> </w:t>
-      </w:r>
-      <w:r>
-        <w:t xml:space="preserve">Net tows were then mapped </w:t>
-      </w:r>
-      <w:r>
-        <w:t xml:space="preserve">by cluster and net number to </w:t>
-      </w:r>
-      <w:r>
-        <w:t>observe</w:t>
-      </w:r>
-      <w:r>
-        <w:t xml:space="preserve"> how the clusters </w:t>
-      </w:r>
-      <w:r>
-        <w:t>distribute in</w:t>
-      </w:r>
-      <w:r>
-        <w:t xml:space="preserve"> vertical and horizontal </w:t>
-      </w:r>
-      <w:r>
-        <w:t xml:space="preserve">space. </w:t>
-      </w:r>
-      <w:r>
-        <w:t xml:space="preserve"> </w:t>
-      </w:r>
-    </w:p>
-    <w:p>
-      <w:pPr>
-        <w:spacing w:line="240" w:lineRule="auto"/>
-        <w:ind w:firstLine="720"/>
-      </w:pPr>
-      <w:r>
-        <w:t xml:space="preserve">An NMDS was run on the </w:t>
-      </w:r>
-      <w:r>
-        <w:t>previously described Bray-Curtis dissimilarity matrix</w:t>
-      </w:r>
-      <w:r>
-        <w:t xml:space="preserve">. The stress of the ordination was determined and its </w:t>
-      </w:r>
-      <w:commentRangeStart w:id="13"/>
-      <w:r>
-        <w:t>relevance</w:t>
-      </w:r>
-      <w:r>
-        <w:t xml:space="preserve"> </w:t>
-      </w:r>
-      <w:commentRangeEnd w:id="13"/>
-      <w:r>
-        <w:rPr>
-          <w:rStyle w:val="CommentReference"/>
-          <w:sz w:val="24"/>
-          <w:szCs w:val="24"/>
-        </w:rPr>
-        <w:commentReference w:id="13"/>
-      </w:r>
-      <w:r>
-        <w:t xml:space="preserve">in the context of our data was assessed with the </w:t>
-      </w:r>
-      <w:r>
-        <w:t xml:space="preserve">iterative </w:t>
-      </w:r>
-      <w:r>
-        <w:t>permutation</w:t>
-      </w:r>
-      <w:r>
-        <w:t xml:space="preserve"> </w:t>
-      </w:r>
-      <w:r>
-        <w:t xml:space="preserve">methodology </w:t>
-      </w:r>
-      <w:commentRangeStart w:id="14"/>
-      <w:r>
-        <w:t xml:space="preserve">suggested </w:t>
-      </w:r>
-      <w:commentRangeEnd w:id="14"/>
-      <w:r>
-        <w:rPr>
-          <w:rStyle w:val="CommentReference"/>
-          <w:sz w:val="24"/>
-          <w:szCs w:val="24"/>
-        </w:rPr>
-        <w:commentReference w:id="14"/>
-      </w:r>
-      <w:r>
-        <w:t>by Dexter et al. (2018)</w:t>
-      </w:r>
-      <w:r>
-        <w:t>.</w:t>
-      </w:r>
-      <w:r>
-        <w:t xml:space="preserve"> </w:t>
-      </w:r>
-    </w:p>
-    <w:p>
-      <w:pPr>
-        <w:spacing w:line="240" w:lineRule="auto"/>
-      </w:pPr>
-    </w:p>
-    <w:p>
-      <w:pPr>
-        <w:pStyle w:val="Heading1"/>
-      </w:pPr>
-      <w:r>
-        <w:t>3</w:t>
-      </w:r>
-      <w:r>
-        <w:tab/>
-      </w:r>
-      <w:r>
-        <w:t>RESULTS</w:t>
-      </w:r>
-    </w:p>
-    <w:p>
-      <w:r>
-        <w:t>[</w:t>
+        </w:rPr>
+        <w:t>Sebastes</w:t>
+      </w:r>
+      <w:r>
+        <w:t xml:space="preserve"> spp. (Fig. 2 and Table 1). Though also present in all years, clusters 2 and 3 had the greatest visual prevalence of their indicator taxa during 2019 (Fig. 2B). Cluster 2 was dominantly composed of pleuronectiformes, particularly the indicator species </w:t>
       </w:r>
       <w:r>
         <w:rPr>
           <w:i/>
           <w:iCs/>
-          <w:u w:val="single"/>
-        </w:rPr>
-        <w:t>add section text here</w:t>
-      </w:r>
-      <w:r>
-        <w:t>]</w:t>
+        </w:rPr>
+        <w:t>P. vetulus</w:t>
+      </w:r>
+      <w:r>
+        <w:t xml:space="preserve"> (Fig. 2A and Table 1). Cluster 3 was significantly indicated by </w:t>
+      </w:r>
+      <w:r>
+        <w:rPr>
+          <w:i/>
+          <w:iCs/>
+        </w:rPr>
+        <w:t>S. leucopsarus</w:t>
+      </w:r>
+      <w:r>
+        <w:t xml:space="preserve"> (Table 1) and visually dominated by mesopelagic species, particularly Myctophids (Fig. 2A). Cluster 5 was composed predominantly of samples from 2022 and was visually split between </w:t>
+      </w:r>
+      <w:r>
+        <w:rPr>
+          <w:i/>
+          <w:iCs/>
+        </w:rPr>
+        <w:t>P. vetulus</w:t>
+      </w:r>
+      <w:r>
+        <w:t xml:space="preserve"> and </w:t>
+      </w:r>
+      <w:r>
+        <w:rPr>
+          <w:i/>
+          <w:iCs/>
+        </w:rPr>
+        <w:t>Liparis</w:t>
+      </w:r>
+      <w:r>
+        <w:t xml:space="preserve"> spp. (Fig. 2). This is indicative of a general nearshore community, further supported by the ISA (Table 1). Cluster 6 was present in 2022 and 2023 and was visually dominated by coastal taxa, especially Osmerid</w:t>
+      </w:r>
+      <w:r>
+        <w:t xml:space="preserve">ae </w:t>
+      </w:r>
+      <w:r>
+        <w:t>(Fig. 2). Although other taxa were present, the contribution of Osmerid</w:t>
+      </w:r>
+      <w:r>
+        <w:t>s</w:t>
+      </w:r>
+      <w:r>
+        <w:t xml:space="preserve"> as an indicator of cluster 6 was significant (Table 1).</w:t>
+      </w:r>
+    </w:p>
+    <w:p>
+      <w:pPr>
+        <w:rPr>
+          <w:b/>
+          <w:bCs/>
+        </w:rPr>
+      </w:pPr>
+      <w:r>
+        <w:t xml:space="preserve">Net tows were mapped according to the latitude and longitude of the station at which sampling occurred. Points were colored according to the tow’s cluster assignment and color value was applied to represent the mean depth sampled by the tow. This was used to visualize the clustering of the LFC in horizontal and vertical space across the sampling area. The </w:t>
+      </w:r>
+      <w:r>
+        <w:rPr>
+          <w:i/>
+          <w:iCs/>
+        </w:rPr>
+        <w:t>Sebastes</w:t>
+      </w:r>
+      <w:r>
+        <w:t xml:space="preserve"> spp. assemblage (cluster 1) was generally found along the shelf-slope break, regardless of depth, during all years—especially 2022 (Fig. 3). Similarly, the </w:t>
+      </w:r>
+      <w:r>
+        <w:rPr>
+          <w:i/>
+          <w:iCs/>
+        </w:rPr>
+        <w:t>P. vetulus</w:t>
+      </w:r>
+      <w:r>
+        <w:t xml:space="preserve"> community (cluster 2) was present almost exclusively on the shelf during all years without a distinct depth preference (Fig. 3). Cluster 3, the Myctophid community, was most apparent offshore and in tows at greater depths (Fig. 3). The assemblage of nearshore taxa </w:t>
+      </w:r>
+      <w:r>
+        <w:t xml:space="preserve">(cluster 5 ) </w:t>
+      </w:r>
+      <w:r>
+        <w:t xml:space="preserve">was most prevalent in 2022 and occurred mostly nearshore, though depth varied (Fig. 3). Cluster 6, the community of Osmeridae and other coastal taxa, was found almost exclusively at the most nearshore stations and shallowest depths (Fig. 3). </w:t>
+      </w:r>
+    </w:p>
+    <w:p>
+      <w:pPr>
+        <w:pStyle w:val="Heading2"/>
+      </w:pPr>
+      <w:r>
+        <w:t>2.2</w:t>
+      </w:r>
+      <w:r>
+        <w:tab/>
+      </w:r>
+      <w:r>
+        <w:t xml:space="preserve">Influences on the </w:t>
+      </w:r>
+      <w:r>
+        <w:t>LFC</w:t>
+      </w:r>
+    </w:p>
+    <w:p>
+      <w:r>
+        <w:t>[add section text here]</w:t>
+      </w:r>
+    </w:p>
+    <w:p>
+      <w:pPr>
+        <w:pStyle w:val="Heading2"/>
+      </w:pPr>
+      <w:r>
+        <w:t>2.</w:t>
+      </w:r>
+      <w:r>
+        <w:t>3</w:t>
+      </w:r>
+      <w:r>
+        <w:tab/>
+      </w:r>
+      <w:r>
+        <w:t xml:space="preserve">Diel effects on </w:t>
+      </w:r>
+      <w:r>
+        <w:t>depth and abundance</w:t>
+      </w:r>
+    </w:p>
+    <w:p>
+      <w:r>
+        <w:t>[add section text here]</w:t>
       </w:r>
     </w:p>
     <w:p/>
@@ -879,18 +870,8 @@
     </w:p>
     <w:p>
       <w:r>
-        <w:t>[</w:t>
-      </w:r>
-      <w:r>
-        <w:rPr>
-          <w:i/>
-          <w:iCs/>
-          <w:u w:val="single"/>
-        </w:rPr>
-        <w:t>add section text here</w:t>
-      </w:r>
-      <w:r>
-        <w:t>]</w:t>
+        <w:lastRenderedPageBreak/>
+        <w:t>[add section text here]</w:t>
       </w:r>
     </w:p>
     <w:p/>
@@ -904,18 +885,7 @@
     </w:p>
     <w:p>
       <w:r>
-        <w:t>[</w:t>
-      </w:r>
-      <w:r>
-        <w:rPr>
-          <w:i/>
-          <w:iCs/>
-          <w:u w:val="single"/>
-        </w:rPr>
-        <w:t>add references list here… alphabetical order and Harvard style</w:t>
-      </w:r>
-      <w:r>
-        <w:t>]</w:t>
+        <w:t>[add references list here… alphabetical order and Harvard style]</w:t>
       </w:r>
     </w:p>
     <w:sectPr>
@@ -929,7 +899,7 @@
 </file>
 
 <file path=word/comments.xml><?xml version="1.0" encoding="utf-8"?>
-<w:comments xmlns:wpc="http://schemas.microsoft.com/office/word/2010/wordprocessingCanvas" xmlns:cx="http://schemas.microsoft.com/office/drawing/2014/chartex" xmlns:cx1="http://schemas.microsoft.com/office/drawing/2015/9/8/chartex" xmlns:cx2="http://schemas.microsoft.com/office/drawing/2015/10/21/chartex" xmlns:cx3="http://schemas.microsoft.com/office/drawing/2016/5/9/chartex" xmlns:cx4="http://schemas.microsoft.com/office/drawing/2016/5/10/chartex" xmlns:cx5="http://schemas.microsoft.com/office/drawing/2016/5/11/chartex" xmlns:cx6="http://schemas.microsoft.com/office/drawing/2016/5/12/chartex" xmlns:cx7="http://schemas.microsoft.com/office/drawing/2016/5/13/chartex" xmlns:cx8="http://schemas.microsoft.com/office/drawing/2016/5/14/chartex" xmlns:mc="http://schemas.openxmlformats.org/markup-compatibility/2006" xmlns:aink="http://schemas.microsoft.com/office/drawing/2016/ink" xmlns:am3d="http://schemas.microsoft.com/office/drawing/2017/model3d" xmlns:o="urn:schemas-microsoft-com:office:office" xmlns:oel="http://schemas.microsoft.com/office/2019/extlst" xmlns:r="http://schemas.openxmlformats.org/officeDocument/2006/relationships" xmlns:m="http://schemas.openxmlformats.org/officeDocument/2006/math" xmlns:v="urn:schemas-microsoft-com:vml" xmlns:wp14="http://schemas.microsoft.com/office/word/2010/wordprocessingDrawing" xmlns:wp="http://schemas.openxmlformats.org/drawingml/2006/wordprocessingDrawing" xmlns:w10="urn:schemas-microsoft-com:office:word" xmlns:w="http://schemas.openxmlformats.org/wordprocessingml/2006/main" xmlns:w14="http://schemas.microsoft.com/office/word/2010/wordml" xmlns:w15="http://schemas.microsoft.com/office/word/2012/wordml" xmlns:w16cei="http://schemas.microsoft.com/office/word/2026/wordml/cei" xmlns:w16cex="http://schemas.microsoft.com/office/word/2018/wordml/cex" xmlns:w16cid="http://schemas.microsoft.com/office/word/2016/wordml/cid" xmlns:w16="http://schemas.microsoft.com/office/word/2018/wordml" xmlns:w16du="http://schemas.microsoft.com/office/word/2023/wordml/word16du" xmlns:w16sdtdh="http://schemas.microsoft.com/office/word/2020/wordml/sdtdatahash" xmlns:w16sdtfl="http://schemas.microsoft.com/office/word/2024/wordml/sdtformatlock" xmlns:w16se="http://schemas.microsoft.com/office/word/2015/wordml/symex" xmlns:wpg="http://schemas.microsoft.com/office/word/2010/wordprocessingGroup" xmlns:wpi="http://schemas.microsoft.com/office/word/2010/wordprocessingInk" xmlns:wne="http://schemas.microsoft.com/office/word/2006/wordml" xmlns:wps="http://schemas.microsoft.com/office/word/2010/wordprocessingShape" mc:Ignorable="w14 w15 w16se w16cid w16 w16cex w16sdtdh w16sdtfl w16du wp14">
+<w:comments xmlns:wpc="http://schemas.microsoft.com/office/word/2010/wordprocessingCanvas" xmlns:cx="http://schemas.microsoft.com/office/drawing/2014/chartex" xmlns:cx1="http://schemas.microsoft.com/office/drawing/2015/9/8/chartex" xmlns:cx2="http://schemas.microsoft.com/office/drawing/2015/10/21/chartex" xmlns:cx3="http://schemas.microsoft.com/office/drawing/2016/5/9/chartex" xmlns:cx4="http://schemas.microsoft.com/office/drawing/2016/5/10/chartex" xmlns:cx5="http://schemas.microsoft.com/office/drawing/2016/5/11/chartex" xmlns:cx6="http://schemas.microsoft.com/office/drawing/2016/5/12/chartex" xmlns:cx7="http://schemas.microsoft.com/office/drawing/2016/5/13/chartex" xmlns:cx8="http://schemas.microsoft.com/office/drawing/2016/5/14/chartex" xmlns:mc="http://schemas.openxmlformats.org/markup-compatibility/2006" xmlns:aink="http://schemas.microsoft.com/office/drawing/2016/ink" xmlns:am3d="http://schemas.microsoft.com/office/drawing/2017/model3d" xmlns:o="urn:schemas-microsoft-com:office:office" xmlns:oel="http://schemas.microsoft.com/office/2019/extlst" xmlns:r="http://schemas.openxmlformats.org/officeDocument/2006/relationships" xmlns:m="http://schemas.openxmlformats.org/officeDocument/2006/math" xmlns:v="urn:schemas-microsoft-com:vml" xmlns:wp14="http://schemas.microsoft.com/office/word/2010/wordprocessingDrawing" xmlns:wp="http://schemas.openxmlformats.org/drawingml/2006/wordprocessingDrawing" xmlns:w10="urn:schemas-microsoft-com:office:word" xmlns:w="http://schemas.openxmlformats.org/wordprocessingml/2006/main" xmlns:w14="http://schemas.microsoft.com/office/word/2010/wordml" xmlns:w15="http://schemas.microsoft.com/office/word/2012/wordml" xmlns:w16cex="http://schemas.microsoft.com/office/word/2018/wordml/cex" xmlns:w16cid="http://schemas.microsoft.com/office/word/2016/wordml/cid" xmlns:w16="http://schemas.microsoft.com/office/word/2018/wordml" xmlns:w16du="http://schemas.microsoft.com/office/word/2023/wordml/word16du" xmlns:w16sdtdh="http://schemas.microsoft.com/office/word/2020/wordml/sdtdatahash" xmlns:w16sdtfl="http://schemas.microsoft.com/office/word/2024/wordml/sdtformatlock" xmlns:w16se="http://schemas.microsoft.com/office/word/2015/wordml/symex" xmlns:wpg="http://schemas.microsoft.com/office/word/2010/wordprocessingGroup" xmlns:wpi="http://schemas.microsoft.com/office/word/2010/wordprocessingInk" xmlns:wne="http://schemas.microsoft.com/office/word/2006/wordml" xmlns:wps="http://schemas.microsoft.com/office/word/2010/wordprocessingShape" mc:Ignorable="w14 w15 w16se w16cid w16 w16cex w16sdtdh w16sdtfl w16du wp14">
   <w:comment w:id="0" w:author="McCloskey, Ross" w:date="2026-08-18T14:36:00Z" w:initials="RM">
     <w:p>
       <w:pPr>
@@ -978,7 +948,7 @@
       </w:r>
     </w:p>
   </w:comment>
-  <w:comment w:id="3" w:author="McCloskey, Ross" w:date="2026-08-18T15:08:00Z" w:initials="RM">
+  <w:comment w:id="3" w:author="McCloskey, Ross" w:date="2026-08-18T15:10:00Z" w:initials="RM">
     <w:p>
       <w:pPr>
         <w:pStyle w:val="CommentText"/>
@@ -990,11 +960,11 @@
         <w:annotationRef/>
       </w:r>
       <w:r>
-        <w:t>Might want this paragraph to be longer. Perhaps some broader introductory sentences can be added at the beginning instead of as a separate first paragraph.</w:t>
+        <w:t>This phrasing might be too close to the source may need to better paraphrase.</w:t>
       </w:r>
     </w:p>
   </w:comment>
-  <w:comment w:id="4" w:author="McCloskey, Ross" w:date="2026-08-18T15:10:00Z" w:initials="RM">
+  <w:comment w:id="4" w:author="McCloskey, Ross" w:date="2026-08-18T15:12:00Z" w:initials="RM">
     <w:p>
       <w:pPr>
         <w:pStyle w:val="CommentText"/>
@@ -1006,11 +976,11 @@
         <w:annotationRef/>
       </w:r>
       <w:r>
-        <w:t>This phrasing might be too close to the source may need to better paraphrase.</w:t>
+        <w:t>There are the broad factors I could find from my sources doc but perhaps I should find an alternative source that discusses specifically the broad variables we’re interested in.</w:t>
       </w:r>
     </w:p>
   </w:comment>
-  <w:comment w:id="5" w:author="McCloskey, Ross" w:date="2026-08-18T15:12:00Z" w:initials="RM">
+  <w:comment w:id="5" w:author="McCloskey, Ross" w:date="2026-08-18T15:29:00Z" w:initials="RM">
     <w:p>
       <w:pPr>
         <w:pStyle w:val="CommentText"/>
@@ -1022,11 +992,19 @@
         <w:annotationRef/>
       </w:r>
       <w:r>
-        <w:t>There are the broad factors I could find from my sources doc but perhaps I should find an alternative source that discusses specifically the broad variables we’re interested in.</w:t>
+        <w:t xml:space="preserve">Could probably better describe the knowledge gaps in more detail. </w:t>
+      </w:r>
+    </w:p>
+    <w:p>
+      <w:pPr>
+        <w:pStyle w:val="CommentText"/>
+      </w:pPr>
+      <w:r>
+        <w:t>We also discussed in a previous meeting that knowledge on mesopelagic spawning is lacking and this is a gap we could fill. I am wondering where that should come in. Here or is it too specific? Should such a point be left for the discussion?</w:t>
       </w:r>
     </w:p>
   </w:comment>
-  <w:comment w:id="6" w:author="McCloskey, Ross" w:date="2026-08-18T15:13:00Z" w:initials="RM">
+  <w:comment w:id="6" w:author="McCloskey, Ross" w:date="2026-08-18T14:58:00Z" w:initials="RM">
     <w:p>
       <w:pPr>
         <w:pStyle w:val="CommentText"/>
@@ -1038,11 +1016,11 @@
         <w:annotationRef/>
       </w:r>
       <w:r>
-        <w:t>Will probably want to rework this sentence.</w:t>
+        <w:t>Add version and citation</w:t>
       </w:r>
     </w:p>
   </w:comment>
-  <w:comment w:id="7" w:author="McCloskey, Ross" w:date="2026-08-18T15:13:00Z" w:initials="RM">
+  <w:comment w:id="7" w:author="McCloskey, Ross" w:date="2026-08-18T14:59:00Z" w:initials="RM">
     <w:p>
       <w:pPr>
         <w:pStyle w:val="CommentText"/>
@@ -1054,11 +1032,11 @@
         <w:annotationRef/>
       </w:r>
       <w:r>
-        <w:t>This is a dissertation. Need to check if that is an acceptable source to reference or if I need to replace it.</w:t>
+        <w:t>Add more… necessary for what?</w:t>
       </w:r>
     </w:p>
   </w:comment>
-  <w:comment w:id="8" w:author="McCloskey, Ross" w:date="2026-08-18T15:14:00Z" w:initials="RM">
+  <w:comment w:id="8" w:author="McCloskey, Ross" w:date="2026-08-18T15:03:00Z" w:initials="RM">
     <w:p>
       <w:pPr>
         <w:pStyle w:val="CommentText"/>
@@ -1070,99 +1048,11 @@
         <w:annotationRef/>
       </w:r>
       <w:r>
-        <w:t>Need to rework this to have better phrasing.</w:t>
+        <w:t>Choose a better word</w:t>
       </w:r>
     </w:p>
   </w:comment>
-  <w:comment w:id="9" w:author="McCloskey, Ross" w:date="2026-08-18T15:29:00Z" w:initials="RM">
-    <w:p>
-      <w:pPr>
-        <w:pStyle w:val="CommentText"/>
-      </w:pPr>
-      <w:r>
-        <w:rPr>
-          <w:rStyle w:val="CommentReference"/>
-        </w:rPr>
-        <w:annotationRef/>
-      </w:r>
-      <w:r>
-        <w:t xml:space="preserve">Could probably better describe the knowledge gaps in more detail. </w:t>
-      </w:r>
-    </w:p>
-    <w:p>
-      <w:pPr>
-        <w:pStyle w:val="CommentText"/>
-      </w:pPr>
-      <w:r>
-        <w:t>We also discussed in a previous meeting that knowledge on mesopelagic spawning is lacking and this is a gap we could fill. I am wondering where that should come in. Here or is it too specific? Should such a point be left for the discussion?</w:t>
-      </w:r>
-    </w:p>
-  </w:comment>
-  <w:comment w:id="10" w:author="McCloskey, Ross" w:date="2026-08-18T15:18:00Z" w:initials="RM">
-    <w:p>
-      <w:pPr>
-        <w:pStyle w:val="CommentText"/>
-      </w:pPr>
-      <w:r>
-        <w:rPr>
-          <w:rStyle w:val="CommentReference"/>
-        </w:rPr>
-        <w:annotationRef/>
-      </w:r>
-      <w:r>
-        <w:t>There ought to be a better way to describe our expected results. Need to rework the phrasing.</w:t>
-      </w:r>
-    </w:p>
-  </w:comment>
-  <w:comment w:id="11" w:author="McCloskey, Ross" w:date="2026-08-18T14:58:00Z" w:initials="RM">
-    <w:p>
-      <w:pPr>
-        <w:pStyle w:val="CommentText"/>
-      </w:pPr>
-      <w:r>
-        <w:rPr>
-          <w:rStyle w:val="CommentReference"/>
-        </w:rPr>
-        <w:annotationRef/>
-      </w:r>
-      <w:r>
-        <w:t>Add version and citation</w:t>
-      </w:r>
-    </w:p>
-  </w:comment>
-  <w:comment w:id="12" w:author="McCloskey, Ross" w:date="2026-08-18T14:59:00Z" w:initials="RM">
-    <w:p>
-      <w:pPr>
-        <w:pStyle w:val="CommentText"/>
-      </w:pPr>
-      <w:r>
-        <w:rPr>
-          <w:rStyle w:val="CommentReference"/>
-        </w:rPr>
-        <w:annotationRef/>
-      </w:r>
-      <w:r>
-        <w:t>Add more… necessary for what?</w:t>
-      </w:r>
-    </w:p>
-  </w:comment>
-  <w:comment w:id="13" w:author="McCloskey, Ross" w:date="2026-08-18T15:03:00Z" w:initials="RM">
-    <w:p>
-      <w:pPr>
-        <w:pStyle w:val="CommentText"/>
-      </w:pPr>
-      <w:r>
-        <w:rPr>
-          <w:rStyle w:val="CommentReference"/>
-        </w:rPr>
-        <w:annotationRef/>
-      </w:r>
-      <w:r>
-        <w:t>Choose a better word</w:t>
-      </w:r>
-    </w:p>
-  </w:comment>
-  <w:comment w:id="14" w:author="McCloskey, Ross" w:date="2026-08-18T15:04:00Z" w:initials="RM">
+  <w:comment w:id="9" w:author="McCloskey, Ross" w:date="2026-08-18T15:04:00Z" w:initials="RM">
     <w:p>
       <w:pPr>
         <w:pStyle w:val="CommentText"/>
@@ -1182,18 +1072,13 @@
 </file>
 
 <file path=word/commentsExtended.xml><?xml version="1.0" encoding="utf-8"?>
-<w15:commentsEx xmlns:wpc="http://schemas.microsoft.com/office/word/2010/wordprocessingCanvas" xmlns:cx="http://schemas.microsoft.com/office/drawing/2014/chartex" xmlns:cx1="http://schemas.microsoft.com/office/drawing/2015/9/8/chartex" xmlns:cx2="http://schemas.microsoft.com/office/drawing/2015/10/21/chartex" xmlns:cx3="http://schemas.microsoft.com/office/drawing/2016/5/9/chartex" xmlns:cx4="http://schemas.microsoft.com/office/drawing/2016/5/10/chartex" xmlns:cx5="http://schemas.microsoft.com/office/drawing/2016/5/11/chartex" xmlns:cx6="http://schemas.microsoft.com/office/drawing/2016/5/12/chartex" xmlns:cx7="http://schemas.microsoft.com/office/drawing/2016/5/13/chartex" xmlns:cx8="http://schemas.microsoft.com/office/drawing/2016/5/14/chartex" xmlns:mc="http://schemas.openxmlformats.org/markup-compatibility/2006" xmlns:aink="http://schemas.microsoft.com/office/drawing/2016/ink" xmlns:am3d="http://schemas.microsoft.com/office/drawing/2017/model3d" xmlns:o="urn:schemas-microsoft-com:office:office" xmlns:oel="http://schemas.microsoft.com/office/2019/extlst" xmlns:r="http://schemas.openxmlformats.org/officeDocument/2006/relationships" xmlns:m="http://schemas.openxmlformats.org/officeDocument/2006/math" xmlns:v="urn:schemas-microsoft-com:vml" xmlns:wp14="http://schemas.microsoft.com/office/word/2010/wordprocessingDrawing" xmlns:wp="http://schemas.openxmlformats.org/drawingml/2006/wordprocessingDrawing" xmlns:w10="urn:schemas-microsoft-com:office:word" xmlns:w="http://schemas.openxmlformats.org/wordprocessingml/2006/main" xmlns:w14="http://schemas.microsoft.com/office/word/2010/wordml" xmlns:w15="http://schemas.microsoft.com/office/word/2012/wordml" xmlns:w16cei="http://schemas.microsoft.com/office/word/2026/wordml/cei" xmlns:w16cex="http://schemas.microsoft.com/office/word/2018/wordml/cex" xmlns:w16cid="http://schemas.microsoft.com/office/word/2016/wordml/cid" xmlns:w16="http://schemas.microsoft.com/office/word/2018/wordml" xmlns:w16du="http://schemas.microsoft.com/office/word/2023/wordml/word16du" xmlns:w16sdtdh="http://schemas.microsoft.com/office/word/2020/wordml/sdtdatahash" xmlns:w16sdtfl="http://schemas.microsoft.com/office/word/2024/wordml/sdtformatlock" xmlns:w16se="http://schemas.microsoft.com/office/word/2015/wordml/symex" xmlns:wpg="http://schemas.microsoft.com/office/word/2010/wordprocessingGroup" xmlns:wpi="http://schemas.microsoft.com/office/word/2010/wordprocessingInk" xmlns:wne="http://schemas.microsoft.com/office/word/2006/wordml" xmlns:wps="http://schemas.microsoft.com/office/word/2010/wordprocessingShape" mc:Ignorable="w14 w15 w16se w16cid w16 w16cex w16sdtdh w16sdtfl w16du wp14">
+<w15:commentsEx xmlns:wpc="http://schemas.microsoft.com/office/word/2010/wordprocessingCanvas" xmlns:cx="http://schemas.microsoft.com/office/drawing/2014/chartex" xmlns:cx1="http://schemas.microsoft.com/office/drawing/2015/9/8/chartex" xmlns:cx2="http://schemas.microsoft.com/office/drawing/2015/10/21/chartex" xmlns:cx3="http://schemas.microsoft.com/office/drawing/2016/5/9/chartex" xmlns:cx4="http://schemas.microsoft.com/office/drawing/2016/5/10/chartex" xmlns:cx5="http://schemas.microsoft.com/office/drawing/2016/5/11/chartex" xmlns:cx6="http://schemas.microsoft.com/office/drawing/2016/5/12/chartex" xmlns:cx7="http://schemas.microsoft.com/office/drawing/2016/5/13/chartex" xmlns:cx8="http://schemas.microsoft.com/office/drawing/2016/5/14/chartex" xmlns:mc="http://schemas.openxmlformats.org/markup-compatibility/2006" xmlns:aink="http://schemas.microsoft.com/office/drawing/2016/ink" xmlns:am3d="http://schemas.microsoft.com/office/drawing/2017/model3d" xmlns:o="urn:schemas-microsoft-com:office:office" xmlns:oel="http://schemas.microsoft.com/office/2019/extlst" xmlns:r="http://schemas.openxmlformats.org/officeDocument/2006/relationships" xmlns:m="http://schemas.openxmlformats.org/officeDocument/2006/math" xmlns:v="urn:schemas-microsoft-com:vml" xmlns:wp14="http://schemas.microsoft.com/office/word/2010/wordprocessingDrawing" xmlns:wp="http://schemas.openxmlformats.org/drawingml/2006/wordprocessingDrawing" xmlns:w10="urn:schemas-microsoft-com:office:word" xmlns:w="http://schemas.openxmlformats.org/wordprocessingml/2006/main" xmlns:w14="http://schemas.microsoft.com/office/word/2010/wordml" xmlns:w15="http://schemas.microsoft.com/office/word/2012/wordml" xmlns:w16cex="http://schemas.microsoft.com/office/word/2018/wordml/cex" xmlns:w16cid="http://schemas.microsoft.com/office/word/2016/wordml/cid" xmlns:w16="http://schemas.microsoft.com/office/word/2018/wordml" xmlns:w16du="http://schemas.microsoft.com/office/word/2023/wordml/word16du" xmlns:w16sdtdh="http://schemas.microsoft.com/office/word/2020/wordml/sdtdatahash" xmlns:w16sdtfl="http://schemas.microsoft.com/office/word/2024/wordml/sdtformatlock" xmlns:w16se="http://schemas.microsoft.com/office/word/2015/wordml/symex" xmlns:wpg="http://schemas.microsoft.com/office/word/2010/wordprocessingGroup" xmlns:wpi="http://schemas.microsoft.com/office/word/2010/wordprocessingInk" xmlns:wne="http://schemas.microsoft.com/office/word/2006/wordml" xmlns:wps="http://schemas.microsoft.com/office/word/2010/wordprocessingShape" mc:Ignorable="w14 w15 w16se w16cid w16 w16cex w16sdtdh w16sdtfl w16du wp14">
   <w15:commentEx w15:paraId="2F1B268D" w15:done="0"/>
   <w15:commentEx w15:paraId="021223F3" w15:done="0"/>
   <w15:commentEx w15:paraId="5B8443B7" w15:done="0"/>
-  <w15:commentEx w15:paraId="1B1440FE" w15:done="0"/>
   <w15:commentEx w15:paraId="40FE5ADD" w15:done="0"/>
   <w15:commentEx w15:paraId="4C6AC411" w15:done="0"/>
-  <w15:commentEx w15:paraId="48D5E15B" w15:done="0"/>
-  <w15:commentEx w15:paraId="4280AB4B" w15:done="0"/>
-  <w15:commentEx w15:paraId="31CA1C17" w15:done="0"/>
   <w15:commentEx w15:paraId="763D8A91" w15:done="0"/>
-  <w15:commentEx w15:paraId="5BE36BA3" w15:done="0"/>
   <w15:commentEx w15:paraId="1F69DA66" w15:done="0"/>
   <w15:commentEx w15:paraId="4FC2E53E" w15:done="0"/>
   <w15:commentEx w15:paraId="06E41DD3" w15:done="0"/>
@@ -1202,18 +1087,13 @@
 </file>
 
 <file path=word/commentsExtensible.xml><?xml version="1.0" encoding="utf-8"?>
-<w16cex:commentsExtensible xmlns:wpc="http://schemas.microsoft.com/office/word/2010/wordprocessingCanvas" xmlns:cx="http://schemas.microsoft.com/office/drawing/2014/chartex" xmlns:cx1="http://schemas.microsoft.com/office/drawing/2015/9/8/chartex" xmlns:cx2="http://schemas.microsoft.com/office/drawing/2015/10/21/chartex" xmlns:cx3="http://schemas.microsoft.com/office/drawing/2016/5/9/chartex" xmlns:cx4="http://schemas.microsoft.com/office/drawing/2016/5/10/chartex" xmlns:cx5="http://schemas.microsoft.com/office/drawing/2016/5/11/chartex" xmlns:cx6="http://schemas.microsoft.com/office/drawing/2016/5/12/chartex" xmlns:cx7="http://schemas.microsoft.com/office/drawing/2016/5/13/chartex" xmlns:cx8="http://schemas.microsoft.com/office/drawing/2016/5/14/chartex" xmlns:cr="http://schemas.microsoft.com/office/comments/2020/reactions" xmlns:mc="http://schemas.openxmlformats.org/markup-compatibility/2006" xmlns:aink="http://schemas.microsoft.com/office/drawing/2016/ink" xmlns:am3d="http://schemas.microsoft.com/office/drawing/2017/model3d" xmlns:o="urn:schemas-microsoft-com:office:office" xmlns:oel="http://schemas.microsoft.com/office/2019/extlst" xmlns:r="http://schemas.openxmlformats.org/officeDocument/2006/relationships" xmlns:m="http://schemas.openxmlformats.org/officeDocument/2006/math" xmlns:v="urn:schemas-microsoft-com:vml" xmlns:wp14="http://schemas.microsoft.com/office/word/2010/wordprocessingDrawing" xmlns:wp="http://schemas.openxmlformats.org/drawingml/2006/wordprocessingDrawing" xmlns:w10="urn:schemas-microsoft-com:office:word" xmlns:w="http://schemas.openxmlformats.org/wordprocessingml/2006/main" xmlns:w14="http://schemas.microsoft.com/office/word/2010/wordml" xmlns:w15="http://schemas.microsoft.com/office/word/2012/wordml" xmlns:w16cei="http://schemas.microsoft.com/office/word/2026/wordml/cei" xmlns:w16cex="http://schemas.microsoft.com/office/word/2018/wordml/cex" xmlns:w16cid="http://schemas.microsoft.com/office/word/2016/wordml/cid" xmlns:w16="http://schemas.microsoft.com/office/word/2018/wordml" xmlns:w16du="http://schemas.microsoft.com/office/word/2023/wordml/word16du" xmlns:w16sdtdh="http://schemas.microsoft.com/office/word/2020/wordml/sdtdatahash" xmlns:w16sdtfl="http://schemas.microsoft.com/office/word/2024/wordml/sdtformatlock" xmlns:w16se="http://schemas.microsoft.com/office/word/2015/wordml/symex" xmlns:wpg="http://schemas.microsoft.com/office/word/2010/wordprocessingGroup" xmlns:wpi="http://schemas.microsoft.com/office/word/2010/wordprocessingInk" xmlns:wne="http://schemas.microsoft.com/office/word/2006/wordml" xmlns:wps="http://schemas.microsoft.com/office/word/2010/wordprocessingShape" mc:Ignorable="w14 w15 w16se w16cid w16 w16cex w16sdtdh w16sdtfl cr w16du wp14">
+<w16cex:commentsExtensible xmlns:wpc="http://schemas.microsoft.com/office/word/2010/wordprocessingCanvas" xmlns:cx="http://schemas.microsoft.com/office/drawing/2014/chartex" xmlns:cx1="http://schemas.microsoft.com/office/drawing/2015/9/8/chartex" xmlns:cx2="http://schemas.microsoft.com/office/drawing/2015/10/21/chartex" xmlns:cx3="http://schemas.microsoft.com/office/drawing/2016/5/9/chartex" xmlns:cx4="http://schemas.microsoft.com/office/drawing/2016/5/10/chartex" xmlns:cx5="http://schemas.microsoft.com/office/drawing/2016/5/11/chartex" xmlns:cx6="http://schemas.microsoft.com/office/drawing/2016/5/12/chartex" xmlns:cx7="http://schemas.microsoft.com/office/drawing/2016/5/13/chartex" xmlns:cx8="http://schemas.microsoft.com/office/drawing/2016/5/14/chartex" xmlns:cr="http://schemas.microsoft.com/office/comments/2020/reactions" xmlns:mc="http://schemas.openxmlformats.org/markup-compatibility/2006" xmlns:aink="http://schemas.microsoft.com/office/drawing/2016/ink" xmlns:am3d="http://schemas.microsoft.com/office/drawing/2017/model3d" xmlns:o="urn:schemas-microsoft-com:office:office" xmlns:oel="http://schemas.microsoft.com/office/2019/extlst" xmlns:r="http://schemas.openxmlformats.org/officeDocument/2006/relationships" xmlns:m="http://schemas.openxmlformats.org/officeDocument/2006/math" xmlns:v="urn:schemas-microsoft-com:vml" xmlns:wp14="http://schemas.microsoft.com/office/word/2010/wordprocessingDrawing" xmlns:wp="http://schemas.openxmlformats.org/drawingml/2006/wordprocessingDrawing" xmlns:w10="urn:schemas-microsoft-com:office:word" xmlns:w="http://schemas.openxmlformats.org/wordprocessingml/2006/main" xmlns:w14="http://schemas.microsoft.com/office/word/2010/wordml" xmlns:w15="http://schemas.microsoft.com/office/word/2012/wordml" xmlns:w16cex="http://schemas.microsoft.com/office/word/2018/wordml/cex" xmlns:w16cid="http://schemas.microsoft.com/office/word/2016/wordml/cid" xmlns:w16="http://schemas.microsoft.com/office/word/2018/wordml" xmlns:w16du="http://schemas.microsoft.com/office/word/2023/wordml/word16du" xmlns:w16sdtdh="http://schemas.microsoft.com/office/word/2020/wordml/sdtdatahash" xmlns:w16sdtfl="http://schemas.microsoft.com/office/word/2024/wordml/sdtformatlock" xmlns:w16se="http://schemas.microsoft.com/office/word/2015/wordml/symex" xmlns:wpg="http://schemas.microsoft.com/office/word/2010/wordprocessingGroup" xmlns:wpi="http://schemas.microsoft.com/office/word/2010/wordprocessingInk" xmlns:wne="http://schemas.microsoft.com/office/word/2006/wordml" xmlns:wps="http://schemas.microsoft.com/office/word/2010/wordprocessingShape" mc:Ignorable="w14 w15 w16se w16cid w16 w16cex w16sdtdh w16sdtfl cr w16du wp14">
   <w16cex:commentExtensible w16cex:durableId="03FE2B67" w16cex:dateUtc="2026-08-18T19:36:00Z"/>
   <w16cex:commentExtensible w16cex:durableId="2C3AF867" w16cex:dateUtc="2026-08-18T20:05:00Z"/>
   <w16cex:commentExtensible w16cex:durableId="0798161C" w16cex:dateUtc="2026-08-18T20:06:00Z"/>
-  <w16cex:commentExtensible w16cex:durableId="2BA08A5F" w16cex:dateUtc="2026-08-18T20:08:00Z"/>
   <w16cex:commentExtensible w16cex:durableId="266E2573" w16cex:dateUtc="2026-08-18T20:10:00Z"/>
   <w16cex:commentExtensible w16cex:durableId="2B4ADF92" w16cex:dateUtc="2026-08-18T20:12:00Z"/>
-  <w16cex:commentExtensible w16cex:durableId="13CD5FBE" w16cex:dateUtc="2026-08-18T20:13:00Z"/>
-  <w16cex:commentExtensible w16cex:durableId="178DC72D" w16cex:dateUtc="2026-08-18T20:13:00Z"/>
-  <w16cex:commentExtensible w16cex:durableId="3A87B0B0" w16cex:dateUtc="2026-08-18T20:14:00Z"/>
   <w16cex:commentExtensible w16cex:durableId="167F67C8" w16cex:dateUtc="2026-08-18T20:29:00Z"/>
-  <w16cex:commentExtensible w16cex:durableId="29A6DD2B" w16cex:dateUtc="2026-08-18T20:18:00Z"/>
   <w16cex:commentExtensible w16cex:durableId="120E2433" w16cex:dateUtc="2026-08-18T19:58:00Z"/>
   <w16cex:commentExtensible w16cex:durableId="30192086" w16cex:dateUtc="2026-08-18T19:59:00Z"/>
   <w16cex:commentExtensible w16cex:durableId="021A571D" w16cex:dateUtc="2026-08-18T20:03:00Z"/>
@@ -1222,18 +1102,13 @@
 </file>
 
 <file path=word/commentsIds.xml><?xml version="1.0" encoding="utf-8"?>
-<w16cid:commentsIds xmlns:wpc="http://schemas.microsoft.com/office/word/2010/wordprocessingCanvas" xmlns:cx="http://schemas.microsoft.com/office/drawing/2014/chartex" xmlns:cx1="http://schemas.microsoft.com/office/drawing/2015/9/8/chartex" xmlns:cx2="http://schemas.microsoft.com/office/drawing/2015/10/21/chartex" xmlns:cx3="http://schemas.microsoft.com/office/drawing/2016/5/9/chartex" xmlns:cx4="http://schemas.microsoft.com/office/drawing/2016/5/10/chartex" xmlns:cx5="http://schemas.microsoft.com/office/drawing/2016/5/11/chartex" xmlns:cx6="http://schemas.microsoft.com/office/drawing/2016/5/12/chartex" xmlns:cx7="http://schemas.microsoft.com/office/drawing/2016/5/13/chartex" xmlns:cx8="http://schemas.microsoft.com/office/drawing/2016/5/14/chartex" xmlns:mc="http://schemas.openxmlformats.org/markup-compatibility/2006" xmlns:aink="http://schemas.microsoft.com/office/drawing/2016/ink" xmlns:am3d="http://schemas.microsoft.com/office/drawing/2017/model3d" xmlns:o="urn:schemas-microsoft-com:office:office" xmlns:oel="http://schemas.microsoft.com/office/2019/extlst" xmlns:r="http://schemas.openxmlformats.org/officeDocument/2006/relationships" xmlns:m="http://schemas.openxmlformats.org/officeDocument/2006/math" xmlns:v="urn:schemas-microsoft-com:vml" xmlns:wp14="http://schemas.microsoft.com/office/word/2010/wordprocessingDrawing" xmlns:wp="http://schemas.openxmlformats.org/drawingml/2006/wordprocessingDrawing" xmlns:w10="urn:schemas-microsoft-com:office:word" xmlns:w="http://schemas.openxmlformats.org/wordprocessingml/2006/main" xmlns:w14="http://schemas.microsoft.com/office/word/2010/wordml" xmlns:w15="http://schemas.microsoft.com/office/word/2012/wordml" xmlns:w16cei="http://schemas.microsoft.com/office/word/2026/wordml/cei" xmlns:w16cex="http://schemas.microsoft.com/office/word/2018/wordml/cex" xmlns:w16cid="http://schemas.microsoft.com/office/word/2016/wordml/cid" xmlns:w16="http://schemas.microsoft.com/office/word/2018/wordml" xmlns:w16du="http://schemas.microsoft.com/office/word/2023/wordml/word16du" xmlns:w16sdtdh="http://schemas.microsoft.com/office/word/2020/wordml/sdtdatahash" xmlns:w16sdtfl="http://schemas.microsoft.com/office/word/2024/wordml/sdtformatlock" xmlns:w16se="http://schemas.microsoft.com/office/word/2015/wordml/symex" xmlns:wpg="http://schemas.microsoft.com/office/word/2010/wordprocessingGroup" xmlns:wpi="http://schemas.microsoft.com/office/word/2010/wordprocessingInk" xmlns:wne="http://schemas.microsoft.com/office/word/2006/wordml" xmlns:wps="http://schemas.microsoft.com/office/word/2010/wordprocessingShape" mc:Ignorable="w14 w15 w16se w16cid w16 w16cex w16sdtdh w16sdtfl w16du wp14">
+<w16cid:commentsIds xmlns:wpc="http://schemas.microsoft.com/office/word/2010/wordprocessingCanvas" xmlns:cx="http://schemas.microsoft.com/office/drawing/2014/chartex" xmlns:cx1="http://schemas.microsoft.com/office/drawing/2015/9/8/chartex" xmlns:cx2="http://schemas.microsoft.com/office/drawing/2015/10/21/chartex" xmlns:cx3="http://schemas.microsoft.com/office/drawing/2016/5/9/chartex" xmlns:cx4="http://schemas.microsoft.com/office/drawing/2016/5/10/chartex" xmlns:cx5="http://schemas.microsoft.com/office/drawing/2016/5/11/chartex" xmlns:cx6="http://schemas.microsoft.com/office/drawing/2016/5/12/chartex" xmlns:cx7="http://schemas.microsoft.com/office/drawing/2016/5/13/chartex" xmlns:cx8="http://schemas.microsoft.com/office/drawing/2016/5/14/chartex" xmlns:mc="http://schemas.openxmlformats.org/markup-compatibility/2006" xmlns:aink="http://schemas.microsoft.com/office/drawing/2016/ink" xmlns:am3d="http://schemas.microsoft.com/office/drawing/2017/model3d" xmlns:o="urn:schemas-microsoft-com:office:office" xmlns:oel="http://schemas.microsoft.com/office/2019/extlst" xmlns:r="http://schemas.openxmlformats.org/officeDocument/2006/relationships" xmlns:m="http://schemas.openxmlformats.org/officeDocument/2006/math" xmlns:v="urn:schemas-microsoft-com:vml" xmlns:wp14="http://schemas.microsoft.com/office/word/2010/wordprocessingDrawing" xmlns:wp="http://schemas.openxmlformats.org/drawingml/2006/wordprocessingDrawing" xmlns:w10="urn:schemas-microsoft-com:office:word" xmlns:w="http://schemas.openxmlformats.org/wordprocessingml/2006/main" xmlns:w14="http://schemas.microsoft.com/office/word/2010/wordml" xmlns:w15="http://schemas.microsoft.com/office/word/2012/wordml" xmlns:w16cex="http://schemas.microsoft.com/office/word/2018/wordml/cex" xmlns:w16cid="http://schemas.microsoft.com/office/word/2016/wordml/cid" xmlns:w16="http://schemas.microsoft.com/office/word/2018/wordml" xmlns:w16du="http://schemas.microsoft.com/office/word/2023/wordml/word16du" xmlns:w16sdtdh="http://schemas.microsoft.com/office/word/2020/wordml/sdtdatahash" xmlns:w16sdtfl="http://schemas.microsoft.com/office/word/2024/wordml/sdtformatlock" xmlns:w16se="http://schemas.microsoft.com/office/word/2015/wordml/symex" xmlns:wpg="http://schemas.microsoft.com/office/word/2010/wordprocessingGroup" xmlns:wpi="http://schemas.microsoft.com/office/word/2010/wordprocessingInk" xmlns:wne="http://schemas.microsoft.com/office/word/2006/wordml" xmlns:wps="http://schemas.microsoft.com/office/word/2010/wordprocessingShape" mc:Ignorable="w14 w15 w16se w16cid w16 w16cex w16sdtdh w16sdtfl w16du wp14">
   <w16cid:commentId w16cid:paraId="2F1B268D" w16cid:durableId="03FE2B67"/>
   <w16cid:commentId w16cid:paraId="021223F3" w16cid:durableId="2C3AF867"/>
   <w16cid:commentId w16cid:paraId="5B8443B7" w16cid:durableId="0798161C"/>
-  <w16cid:commentId w16cid:paraId="1B1440FE" w16cid:durableId="2BA08A5F"/>
   <w16cid:commentId w16cid:paraId="40FE5ADD" w16cid:durableId="266E2573"/>
   <w16cid:commentId w16cid:paraId="4C6AC411" w16cid:durableId="2B4ADF92"/>
-  <w16cid:commentId w16cid:paraId="48D5E15B" w16cid:durableId="13CD5FBE"/>
-  <w16cid:commentId w16cid:paraId="4280AB4B" w16cid:durableId="178DC72D"/>
-  <w16cid:commentId w16cid:paraId="31CA1C17" w16cid:durableId="3A87B0B0"/>
   <w16cid:commentId w16cid:paraId="763D8A91" w16cid:durableId="167F67C8"/>
-  <w16cid:commentId w16cid:paraId="5BE36BA3" w16cid:durableId="29A6DD2B"/>
   <w16cid:commentId w16cid:paraId="1F69DA66" w16cid:durableId="120E2433"/>
   <w16cid:commentId w16cid:paraId="4FC2E53E" w16cid:durableId="30192086"/>
   <w16cid:commentId w16cid:paraId="06E41DD3" w16cid:durableId="021A571D"/>
@@ -1242,7 +1117,7 @@
 </file>
 
 <file path=word/people.xml><?xml version="1.0" encoding="utf-8"?>
-<w15:people xmlns:wpc="http://schemas.microsoft.com/office/word/2010/wordprocessingCanvas" xmlns:cx="http://schemas.microsoft.com/office/drawing/2014/chartex" xmlns:cx1="http://schemas.microsoft.com/office/drawing/2015/9/8/chartex" xmlns:cx2="http://schemas.microsoft.com/office/drawing/2015/10/21/chartex" xmlns:cx3="http://schemas.microsoft.com/office/drawing/2016/5/9/chartex" xmlns:cx4="http://schemas.microsoft.com/office/drawing/2016/5/10/chartex" xmlns:cx5="http://schemas.microsoft.com/office/drawing/2016/5/11/chartex" xmlns:cx6="http://schemas.microsoft.com/office/drawing/2016/5/12/chartex" xmlns:cx7="http://schemas.microsoft.com/office/drawing/2016/5/13/chartex" xmlns:cx8="http://schemas.microsoft.com/office/drawing/2016/5/14/chartex" xmlns:mc="http://schemas.openxmlformats.org/markup-compatibility/2006" xmlns:aink="http://schemas.microsoft.com/office/drawing/2016/ink" xmlns:am3d="http://schemas.microsoft.com/office/drawing/2017/model3d" xmlns:o="urn:schemas-microsoft-com:office:office" xmlns:oel="http://schemas.microsoft.com/office/2019/extlst" xmlns:r="http://schemas.openxmlformats.org/officeDocument/2006/relationships" xmlns:m="http://schemas.openxmlformats.org/officeDocument/2006/math" xmlns:v="urn:schemas-microsoft-com:vml" xmlns:wp14="http://schemas.microsoft.com/office/word/2010/wordprocessingDrawing" xmlns:wp="http://schemas.openxmlformats.org/drawingml/2006/wordprocessingDrawing" xmlns:w10="urn:schemas-microsoft-com:office:word" xmlns:w="http://schemas.openxmlformats.org/wordprocessingml/2006/main" xmlns:w14="http://schemas.microsoft.com/office/word/2010/wordml" xmlns:w15="http://schemas.microsoft.com/office/word/2012/wordml" xmlns:w16cei="http://schemas.microsoft.com/office/word/2026/wordml/cei" xmlns:w16cex="http://schemas.microsoft.com/office/word/2018/wordml/cex" xmlns:w16cid="http://schemas.microsoft.com/office/word/2016/wordml/cid" xmlns:w16="http://schemas.microsoft.com/office/word/2018/wordml" xmlns:w16du="http://schemas.microsoft.com/office/word/2023/wordml/word16du" xmlns:w16sdtdh="http://schemas.microsoft.com/office/word/2020/wordml/sdtdatahash" xmlns:w16sdtfl="http://schemas.microsoft.com/office/word/2024/wordml/sdtformatlock" xmlns:w16se="http://schemas.microsoft.com/office/word/2015/wordml/symex" xmlns:wpg="http://schemas.microsoft.com/office/word/2010/wordprocessingGroup" xmlns:wpi="http://schemas.microsoft.com/office/word/2010/wordprocessingInk" xmlns:wne="http://schemas.microsoft.com/office/word/2006/wordml" xmlns:wps="http://schemas.microsoft.com/office/word/2010/wordprocessingShape" mc:Ignorable="w14 w15 w16se w16cid w16 w16cex w16sdtdh w16sdtfl w16du wp14">
+<w15:people xmlns:wpc="http://schemas.microsoft.com/office/word/2010/wordprocessingCanvas" xmlns:cx="http://schemas.microsoft.com/office/drawing/2014/chartex" xmlns:cx1="http://schemas.microsoft.com/office/drawing/2015/9/8/chartex" xmlns:cx2="http://schemas.microsoft.com/office/drawing/2015/10/21/chartex" xmlns:cx3="http://schemas.microsoft.com/office/drawing/2016/5/9/chartex" xmlns:cx4="http://schemas.microsoft.com/office/drawing/2016/5/10/chartex" xmlns:cx5="http://schemas.microsoft.com/office/drawing/2016/5/11/chartex" xmlns:cx6="http://schemas.microsoft.com/office/drawing/2016/5/12/chartex" xmlns:cx7="http://schemas.microsoft.com/office/drawing/2016/5/13/chartex" xmlns:cx8="http://schemas.microsoft.com/office/drawing/2016/5/14/chartex" xmlns:mc="http://schemas.openxmlformats.org/markup-compatibility/2006" xmlns:aink="http://schemas.microsoft.com/office/drawing/2016/ink" xmlns:am3d="http://schemas.microsoft.com/office/drawing/2017/model3d" xmlns:o="urn:schemas-microsoft-com:office:office" xmlns:oel="http://schemas.microsoft.com/office/2019/extlst" xmlns:r="http://schemas.openxmlformats.org/officeDocument/2006/relationships" xmlns:m="http://schemas.openxmlformats.org/officeDocument/2006/math" xmlns:v="urn:schemas-microsoft-com:vml" xmlns:wp14="http://schemas.microsoft.com/office/word/2010/wordprocessingDrawing" xmlns:wp="http://schemas.openxmlformats.org/drawingml/2006/wordprocessingDrawing" xmlns:w10="urn:schemas-microsoft-com:office:word" xmlns:w="http://schemas.openxmlformats.org/wordprocessingml/2006/main" xmlns:w14="http://schemas.microsoft.com/office/word/2010/wordml" xmlns:w15="http://schemas.microsoft.com/office/word/2012/wordml" xmlns:w16cex="http://schemas.microsoft.com/office/word/2018/wordml/cex" xmlns:w16cid="http://schemas.microsoft.com/office/word/2016/wordml/cid" xmlns:w16="http://schemas.microsoft.com/office/word/2018/wordml" xmlns:w16du="http://schemas.microsoft.com/office/word/2023/wordml/word16du" xmlns:w16sdtdh="http://schemas.microsoft.com/office/word/2020/wordml/sdtdatahash" xmlns:w16sdtfl="http://schemas.microsoft.com/office/word/2024/wordml/sdtformatlock" xmlns:w16se="http://schemas.microsoft.com/office/word/2015/wordml/symex" xmlns:wpg="http://schemas.microsoft.com/office/word/2010/wordprocessingGroup" xmlns:wpi="http://schemas.microsoft.com/office/word/2010/wordprocessingInk" xmlns:wne="http://schemas.microsoft.com/office/word/2006/wordml" xmlns:wps="http://schemas.microsoft.com/office/word/2010/wordprocessingShape" mc:Ignorable="w14 w15 w16se w16cid w16 w16cex w16sdtdh w16sdtfl w16du wp14">
   <w15:person w15:author="McCloskey, Ross">
     <w15:presenceInfo w15:providerId="AD" w15:userId="S::mccloskw@oregonstate.edu::b1990487-ee44-4922-b58f-5b2980a02730"/>
   </w15:person>
@@ -1649,9 +1524,9 @@
   <w:style w:type="paragraph" w:default="1" w:styleId="Normal">
     <w:name w:val="Normal"/>
     <w:qFormat/>
-    <w:rsid w:val="00EA4AC4"/>
+    <w:rsid w:val="00241E61"/>
     <w:pPr>
-      <w:spacing w:line="480" w:lineRule="auto"/>
+      <w:spacing w:line="240" w:lineRule="auto"/>
     </w:pPr>
     <w:rPr>
       <w:rFonts w:ascii="Times New Roman" w:hAnsi="Times New Roman" w:cs="Times New Roman"/>
@@ -1853,7 +1728,6 @@
   <w:style w:type="character" w:default="1" w:styleId="DefaultParagraphFont">
     <w:name w:val="Default Paragraph Font"/>
     <w:uiPriority w:val="1"/>
-    <w:semiHidden/>
     <w:unhideWhenUsed/>
   </w:style>
   <w:style w:type="table" w:default="1" w:styleId="TableNormal">
@@ -2003,7 +1877,7 @@
     <w:qFormat/>
     <w:rsid w:val="0014295B"/>
     <w:pPr>
-      <w:spacing w:after="80" w:line="240" w:lineRule="auto"/>
+      <w:spacing w:after="80"/>
       <w:contextualSpacing/>
       <w:jc w:val="center"/>
     </w:pPr>
@@ -2182,7 +2056,7 @@
       <w:numPr>
         <w:ilvl w:val="0"/>
       </w:numPr>
-      <w:spacing w:before="240" w:after="240" w:line="240" w:lineRule="auto"/>
+      <w:spacing w:before="240" w:after="240"/>
     </w:pPr>
     <w:rPr>
       <w:rFonts w:eastAsiaTheme="minorHAnsi" w:cs="Times New Roman"/>
@@ -2214,9 +2088,6 @@
     <w:uiPriority w:val="99"/>
     <w:unhideWhenUsed/>
     <w:rsid w:val="00FC169F"/>
-    <w:pPr>
-      <w:spacing w:line="240" w:lineRule="auto"/>
-    </w:pPr>
     <w:rPr>
       <w:sz w:val="20"/>
       <w:szCs w:val="20"/>

</xml_diff>

<commit_message>
added line numbers and fixed formatting for a couple taxa in results
</commit_message>
<xml_diff>
--- a/Manuscript draft.docx
+++ b/Manuscript draft.docx
@@ -216,7 +216,27 @@
     </w:p>
     <w:p>
       <w:r>
-        <w:t>Winter ichthyoplankton abundance in the northern California Current is a strong predictor of annual recruitment of important fisheries species such as salmon, as juvenile salmon diet at ocean entry is dominated by winter-spawned early juvenile fishes. Yet little is known about the influences of spatiotemporal and environmental factors on the composition of these ichthyoplankton assemblages. To characterize winter ichthyoplankton assemblages and identify the factors that influence their composition, we collected depth-discrete ichthyoplankton samples from across the northern California Current ecosystem (41–47°N) on four two-week research cruises during winter 2018–2023. Temperature, salinity, dissolved oxygen concentration (DO), and fluorescence were measured simultaneously with the ichthyoplankton. Ichthyoplankton were visually identified to the lowest possible taxonomic resolution, and dominant ichthyoplankton assemblages were identified using hierarchical clustering analysis and non-metric multidimensional scaling ordination. Distance-based redundancy analysis was used to estimate the effects of longitude, latitude, year, time of day, sampling depth, seafloor depth, temperature, salinity, DO, and fluorescence on assemblage composition. Finally, generalized linear regression was used to quantify diel differences in the vertical distributions of ichthyoplankton taxa. Dominant ichthyoplankton assemblages included those characterized primarily by Sebastes spp., Parophrys vetulus, mesopelagics, and Osmeridae. Spatiotemporal and environmental conditions accounted for a significant amount of variation in ichthyoplankton assemblage composition. Vertical distributions of several taxa differed significantly between night and day. Understanding these spatiotemporal and environmental influences on winter ichthyoplankton assemblages will help explain variation and potentially predict the abundance of winter-spawning fishes and subsequent recruitment of fisheries species that prey on them.</w:t>
+        <w:t xml:space="preserve">Winter ichthyoplankton abundance in the northern California Current is a strong predictor of annual recruitment of important fisheries species such as salmon, as juvenile salmon diet at ocean entry is dominated by winter-spawned early juvenile fishes. Yet little is known about the influences of spatiotemporal and environmental factors on the composition of these ichthyoplankton assemblages. To characterize winter ichthyoplankton assemblages and identify the factors that influence their composition, we collected depth-discrete ichthyoplankton samples from across the northern California Current ecosystem (41–47°N) on four two-week research cruises during winter 2018–2023. Temperature, salinity, dissolved oxygen concentration (DO), and fluorescence were measured simultaneously with the ichthyoplankton. Ichthyoplankton were visually identified to the lowest possible taxonomic resolution, and dominant ichthyoplankton assemblages were identified using hierarchical clustering analysis and non-metric multidimensional scaling ordination. Distance-based redundancy analysis was used to estimate the effects of longitude, latitude, year, time of day, sampling depth, seafloor depth, temperature, salinity, DO, and fluorescence on assemblage composition. Finally, generalized linear regression was used to quantify diel differences in the vertical distributions of ichthyoplankton taxa. Dominant ichthyoplankton assemblages included those characterized primarily by </w:t>
+      </w:r>
+      <w:r>
+        <w:rPr>
+          <w:i/>
+          <w:iCs/>
+        </w:rPr>
+        <w:t>Sebastes</w:t>
+      </w:r>
+      <w:r>
+        <w:t xml:space="preserve"> spp., </w:t>
+      </w:r>
+      <w:r>
+        <w:rPr>
+          <w:i/>
+          <w:iCs/>
+        </w:rPr>
+        <w:t>Parophrys vetulus</w:t>
+      </w:r>
+      <w:r>
+        <w:t>, mesopelagics, and Osmeridae. Spatiotemporal and environmental conditions accounted for a significant amount of variation in ichthyoplankton assemblage composition. Vertical distributions of several taxa differed significantly between night and day. Understanding these spatiotemporal and environmental influences on winter ichthyoplankton assemblages will help explain variation and potentially predict the abundance of winter-spawning fishes and subsequent recruitment of fisheries species that prey on them.</w:t>
       </w:r>
       <w:r>
         <w:br w:type="page"/>
@@ -287,6 +307,7 @@
         <w:t xml:space="preserve">While variation in larval assemblages is known to be associated with oceanographic variability, local factors may also influence their composition. Broad oceanographic indicators such as </w:t>
       </w:r>
       <w:commentRangeStart w:id="4"/>
+      <w:commentRangeStart w:id="5"/>
       <w:r>
         <w:t xml:space="preserve">water mass stability, current direction, and local topography </w:t>
       </w:r>
@@ -299,86 +320,6 @@
         </w:rPr>
         <w:commentReference w:id="4"/>
       </w:r>
-      <w:r>
-        <w:t>have all been found to influence the composition, abundance, and distribution of larval fish (Doyle et al., 2002; Roussel et al., 2010). In the dynamic upwelling system of the NCC, the coastal upwelling transport index (CUTI) predicted taxa co-</w:t>
-      </w:r>
-      <w:r>
-        <w:t>occurrence</w:t>
-      </w:r>
-      <w:r>
-        <w:t xml:space="preserve"> of larvae with varying strength according to the seasonal upwelling or downwelling regime of the region (Schmid et al., 2023). Variability on finer spatial and temporal scales is also relevant to the LFC in coastal marine environments (Gallego-Zerrato et al., 2024). Early-li</w:t>
-      </w:r>
-      <w:r>
-        <w:t>f</w:t>
-      </w:r>
-      <w:r>
-        <w:t xml:space="preserve">e distribution, growth, and survival of fish larvae is strongly influenced by temperature, salinity, and dissolved oxygen concentration (DO) (Auth, 2011). In fact, larval fish are particularly vulnerable to depressed DO, compared to adult conspecifics, with hypoxia exposure during early-life having long-term effects on growth and survival (Johnson-Colegrove et al., 2015). Such factors vary in space, alongside ichthyoplankton assemblages generally reflecting the habitat preference of adults (Doyle et al., 2002). The result is distinct horizontal community structuring with coastal upwelling, offshore oligotrophic, and shelf-slope transitional zones (Gleiber, 2020; Richardson et al., 1980). Larvae also aggregate vertically, allowing them to reach or maintain a position within water masses of ideal environmental, growth, and feeding conditions and transport potential (Huebert et al., 2010; Primo et al. 2012). These vertical assemblages can differ further on fine, diel time scales. There is evidence for diel vertical migration (DVM) in the </w:t>
-      </w:r>
-      <w:r>
-        <w:t>larval stage</w:t>
-      </w:r>
-      <w:r>
-        <w:t xml:space="preserve"> of many taxa, potentially providing an adaptive advantage in predator avoidance; light and temperature optimization; and prey abundance (Haldorson et al., </w:t>
-      </w:r>
-      <w:r>
-        <w:lastRenderedPageBreak/>
-        <w:t>1993; Primo et al., 2012). Diel effects such as migration and visual net avoidance are not accounted for, however, in common sampling schemes that are depth-integrated and do not tow at multiple times of day</w:t>
-      </w:r>
-      <w:r>
-        <w:t>.</w:t>
-      </w:r>
-      <w:r>
-        <w:t xml:space="preserve"> </w:t>
-      </w:r>
-      <w:commentRangeStart w:id="5"/>
-      <w:r>
-        <w:t xml:space="preserve">What remains is a gap in the knowledge of </w:t>
-      </w:r>
-      <w:r>
-        <w:t xml:space="preserve">winter </w:t>
-      </w:r>
-      <w:r>
-        <w:t xml:space="preserve">ichthyoplankton </w:t>
-      </w:r>
-      <w:r>
-        <w:t>assemblage</w:t>
-      </w:r>
-      <w:r>
-        <w:t xml:space="preserve">s, </w:t>
-      </w:r>
-      <w:r>
-        <w:t xml:space="preserve">broadly, as well as </w:t>
-      </w:r>
-      <w:r>
-        <w:t>the specific</w:t>
-      </w:r>
-      <w:r>
-        <w:t xml:space="preserve"> relationships between aggregations </w:t>
-      </w:r>
-      <w:r>
-        <w:t>and</w:t>
-      </w:r>
-      <w:r>
-        <w:t xml:space="preserve"> </w:t>
-      </w:r>
-      <w:r>
-        <w:t xml:space="preserve">the </w:t>
-      </w:r>
-      <w:r>
-        <w:t>environmental and spatiotemporal variables</w:t>
-      </w:r>
-      <w:r>
-        <w:t xml:space="preserve"> that </w:t>
-      </w:r>
-      <w:r>
-        <w:t>affect</w:t>
-      </w:r>
-      <w:r>
-        <w:t xml:space="preserve"> their composition and position in space</w:t>
-      </w:r>
-      <w:r>
-        <w:t>.</w:t>
-      </w:r>
       <w:commentRangeEnd w:id="5"/>
       <w:r>
         <w:rPr>
@@ -388,71 +329,85 @@
         </w:rPr>
         <w:commentReference w:id="5"/>
       </w:r>
-    </w:p>
-    <w:p>
-      <w:r>
-        <w:t xml:space="preserve">Using depth-discrete ichthyoplankton data sampled on four two-week cruises across the northern California Current system (41–47°N) during winter 2018–2023, we investigated the LFC to characterize assemblages and identify factors influencing the composition thereof. We expect larval assemblages to cluster according to adult habitat affinity with distinct taxonomic and spatial communities. Additionally, we expect significant effects of spatiotemporal and environmental variables—such as latitude, temperature, dissolved oxygen, seafloor depth, productivity, time of day, and salinity—on the clustering of the LFC. Establishing how larval fish aggregate during the winter and what factors contribute to the composition of each assemblage could provide a baseline for future studies on the changing NCC ecosystem while also aiding in predictions of winter-spawning fish abundance and the recruitment of the important fisheries species that prey on them. </w:t>
-      </w:r>
-    </w:p>
-    <w:p/>
-    <w:p>
-      <w:pPr>
-        <w:pStyle w:val="Heading1"/>
-      </w:pPr>
-      <w:r>
-        <w:t>2</w:t>
-      </w:r>
-      <w:r>
-        <w:tab/>
-      </w:r>
-      <w:r>
-        <w:t>MATERIALS AND METHODS</w:t>
-      </w:r>
-    </w:p>
-    <w:p>
-      <w:pPr>
-        <w:pStyle w:val="Heading2"/>
-      </w:pPr>
-      <w:r>
-        <w:t xml:space="preserve">2.1 </w:t>
-      </w:r>
-      <w:r>
-        <w:tab/>
-        <w:t>Sampling and data collection</w:t>
-      </w:r>
-    </w:p>
-    <w:p>
-      <w:r>
-        <w:t>[add section text here]</w:t>
-      </w:r>
-    </w:p>
-    <w:p>
-      <w:pPr>
-        <w:pStyle w:val="Heading2"/>
-      </w:pPr>
-      <w:r>
-        <w:t>2.2</w:t>
-      </w:r>
-      <w:r>
-        <w:tab/>
-      </w:r>
-      <w:r>
-        <w:t>Statistical</w:t>
+      <w:r>
+        <w:t>have all been found to influence the composition, abundance, and distribution of larval fish (Doyle et al., 2002; Roussel et al., 2010). In the dynamic upwelling system of the NCC, the coastal upwelling transport index (CUTI) predicted taxa co-</w:t>
+      </w:r>
+      <w:r>
+        <w:t>occurrence</w:t>
+      </w:r>
+      <w:r>
+        <w:t xml:space="preserve"> of larvae with varying strength according to the seasonal upwelling or downwelling regime of the region (Schmid et al., 2023). Variability on finer spatial and temporal scales is also relevant to the LFC in coastal marine environments (Gallego-Zerrato et al., 2024). Early-li</w:t>
+      </w:r>
+      <w:r>
+        <w:t>f</w:t>
+      </w:r>
+      <w:r>
+        <w:t xml:space="preserve">e distribution, growth, and survival of fish larvae is strongly influenced by temperature, salinity, and dissolved oxygen concentration (DO) (Auth, 2011). In fact, larval fish are particularly vulnerable to depressed DO, compared to adult conspecifics, with hypoxia exposure during early-life having long-term effects on growth and survival (Johnson-Colegrove et al., 2015). Such factors vary in space, alongside ichthyoplankton assemblages generally reflecting the habitat preference of adults (Doyle et al., 2002). The result is distinct horizontal community structuring with coastal upwelling, offshore oligotrophic, and shelf-slope transitional zones (Gleiber, 2020; Richardson et al., 1980). Larvae also aggregate vertically, allowing them to reach or maintain a position within water masses of ideal environmental, growth, and feeding conditions and transport potential (Huebert et al., 2010; Primo et al. 2012). These vertical assemblages can differ further on fine, diel time scales. There is evidence for diel vertical migration (DVM) in the </w:t>
+      </w:r>
+      <w:r>
+        <w:t>larval stage</w:t>
+      </w:r>
+      <w:r>
+        <w:t xml:space="preserve"> of many taxa, potentially providing an adaptive advantage in predator avoidance; light and temperature optimization; and prey abundance (Haldorson et al., </w:t>
+      </w:r>
+      <w:r>
+        <w:lastRenderedPageBreak/>
+        <w:t>1993; Primo et al., 2012). Diel effects such as migration and visual net avoidance are not accounted for, however, in common sampling schemes that are depth-integrated and do not tow at multiple times of day</w:t>
+      </w:r>
+      <w:r>
+        <w:t>.</w:t>
       </w:r>
       <w:r>
         <w:t xml:space="preserve"> </w:t>
       </w:r>
-      <w:r>
-        <w:t>analysis</w:t>
-      </w:r>
-    </w:p>
-    <w:p>
-      <w:r>
-        <w:t>All data analyses were performed in RStudio</w:t>
-      </w:r>
       <w:commentRangeStart w:id="6"/>
       <w:r>
-        <w:t xml:space="preserve">. </w:t>
+        <w:t xml:space="preserve">What remains is a gap in the knowledge of </w:t>
+      </w:r>
+      <w:r>
+        <w:t xml:space="preserve">winter </w:t>
+      </w:r>
+      <w:r>
+        <w:t xml:space="preserve">ichthyoplankton </w:t>
+      </w:r>
+      <w:r>
+        <w:t>assemblage</w:t>
+      </w:r>
+      <w:r>
+        <w:t xml:space="preserve">s, </w:t>
+      </w:r>
+      <w:r>
+        <w:t xml:space="preserve">broadly, as well as </w:t>
+      </w:r>
+      <w:r>
+        <w:t>the specific</w:t>
+      </w:r>
+      <w:r>
+        <w:t xml:space="preserve"> relationships between aggregations </w:t>
+      </w:r>
+      <w:r>
+        <w:t>and</w:t>
+      </w:r>
+      <w:r>
+        <w:t xml:space="preserve"> </w:t>
+      </w:r>
+      <w:r>
+        <w:t xml:space="preserve">the </w:t>
+      </w:r>
+      <w:r>
+        <w:t>environmental and spatiotemporal variables</w:t>
+      </w:r>
+      <w:r>
+        <w:t xml:space="preserve"> that </w:t>
+      </w:r>
+      <w:r>
+        <w:t>affect</w:t>
+      </w:r>
+      <w:r>
+        <w:t xml:space="preserve"> their composition and position in space</w:t>
+      </w:r>
+      <w:r>
+        <w:t>.</w:t>
       </w:r>
       <w:commentRangeEnd w:id="6"/>
       <w:r>
@@ -463,36 +418,71 @@
         </w:rPr>
         <w:commentReference w:id="6"/>
       </w:r>
-      <w:r>
-        <w:t xml:space="preserve">To identify </w:t>
-      </w:r>
-      <w:r>
-        <w:t xml:space="preserve">ecologically distinct </w:t>
-      </w:r>
-      <w:r>
-        <w:t>larval fish assemblages,</w:t>
+    </w:p>
+    <w:p>
+      <w:r>
+        <w:t xml:space="preserve">Using depth-discrete ichthyoplankton data sampled on four two-week cruises across the northern California Current system (41–47°N) during winter 2018–2023, we investigated the LFC to characterize assemblages and identify factors influencing the composition thereof. We expect larval assemblages to cluster according to adult habitat affinity with distinct taxonomic and spatial communities. Additionally, we expect significant effects of spatiotemporal and environmental variables—such as latitude, temperature, dissolved oxygen, seafloor depth, productivity, time of day, and salinity—on the clustering of the LFC. Establishing how larval fish aggregate during the winter and what factors contribute to the composition of each assemblage could provide a baseline for future studies on the changing NCC ecosystem while also aiding in predictions of winter-spawning fish abundance and the recruitment of the important fisheries species that prey on them. </w:t>
+      </w:r>
+    </w:p>
+    <w:p/>
+    <w:p>
+      <w:pPr>
+        <w:pStyle w:val="Heading1"/>
+      </w:pPr>
+      <w:r>
+        <w:t>2</w:t>
+      </w:r>
+      <w:r>
+        <w:tab/>
+      </w:r>
+      <w:r>
+        <w:t>MATERIALS AND METHODS</w:t>
+      </w:r>
+    </w:p>
+    <w:p>
+      <w:pPr>
+        <w:pStyle w:val="Heading2"/>
+      </w:pPr>
+      <w:r>
+        <w:t xml:space="preserve">2.1 </w:t>
+      </w:r>
+      <w:r>
+        <w:tab/>
+        <w:t>Sampling and data collection</w:t>
+      </w:r>
+    </w:p>
+    <w:p>
+      <w:r>
+        <w:t>[add section text here]</w:t>
+      </w:r>
+    </w:p>
+    <w:p>
+      <w:pPr>
+        <w:pStyle w:val="Heading2"/>
+      </w:pPr>
+      <w:r>
+        <w:t>2.2</w:t>
+      </w:r>
+      <w:r>
+        <w:tab/>
+      </w:r>
+      <w:r>
+        <w:t>Statistical</w:t>
       </w:r>
       <w:r>
         <w:t xml:space="preserve"> </w:t>
       </w:r>
       <w:r>
-        <w:t xml:space="preserve">first </w:t>
-      </w:r>
-      <w:r>
-        <w:t>the density of each taxonomic group within each net tow was square-root transformed. These were then used to generate a matrix of Bray-Curtis dissimilarities between net tows. Agglomerative hierarchal clustering was performed on th</w:t>
-      </w:r>
-      <w:r>
-        <w:t xml:space="preserve">e dissimilarity matrix </w:t>
-      </w:r>
-      <w:r>
-        <w:t xml:space="preserve">with the “average” method. </w:t>
-      </w:r>
-      <w:r>
-        <w:t>To determine the number of clusters necessary</w:t>
+        <w:t>analysis</w:t>
+      </w:r>
+    </w:p>
+    <w:p>
+      <w:r>
+        <w:t>All data analyses were performed in RStudio</w:t>
       </w:r>
       <w:commentRangeStart w:id="7"/>
       <w:r>
-        <w:t xml:space="preserve">, </w:t>
+        <w:t xml:space="preserve">. </w:t>
       </w:r>
       <w:commentRangeEnd w:id="7"/>
       <w:r>
@@ -504,114 +494,35 @@
         <w:commentReference w:id="7"/>
       </w:r>
       <w:r>
-        <w:t xml:space="preserve">a dendrogram of the clustering results </w:t>
-      </w:r>
-      <w:r>
-        <w:t>was</w:t>
-      </w:r>
-      <w:r>
-        <w:t xml:space="preserve"> plotted</w:t>
-      </w:r>
-      <w:r>
-        <w:t xml:space="preserve"> with </w:t>
-      </w:r>
-      <w:r>
-        <w:t>overlayed rectangles to identify cluster boundaries</w:t>
-      </w:r>
-      <w:r>
-        <w:t xml:space="preserve">. </w:t>
-      </w:r>
-    </w:p>
-    <w:p>
-      <w:r>
-        <w:t xml:space="preserve">To visualize the taxonomic composition of each cluster, </w:t>
-      </w:r>
-      <w:r>
-        <w:t xml:space="preserve">the taxa densities in each net tow were plotted </w:t>
-      </w:r>
-      <w:r>
-        <w:t xml:space="preserve">in a stacked bar plot. Beyond visual </w:t>
-      </w:r>
-      <w:r>
-        <w:t>this visual assessment,</w:t>
-      </w:r>
-      <w:r>
-        <w:t xml:space="preserve"> an in</w:t>
-      </w:r>
-      <w:r>
-        <w:t xml:space="preserve">dicator species analysis </w:t>
-      </w:r>
-      <w:r>
-        <w:t xml:space="preserve">(ISA) </w:t>
-      </w:r>
-      <w:r>
-        <w:t>was run</w:t>
-      </w:r>
-      <w:r>
-        <w:t xml:space="preserve"> to identify </w:t>
-      </w:r>
-      <w:r>
-        <w:t>dominant taxonomic group(s) for every cluster</w:t>
-      </w:r>
-      <w:r>
-        <w:t xml:space="preserve">. </w:t>
-      </w:r>
-      <w:r>
-        <w:t xml:space="preserve">The bar plot and ISA were used in conjunction to </w:t>
-      </w:r>
-      <w:r>
-        <w:t>define major clusters of interest and the</w:t>
-      </w:r>
-      <w:r>
-        <w:t xml:space="preserve"> ecological </w:t>
-      </w:r>
-      <w:r>
-        <w:t>community they represent.</w:t>
+        <w:t xml:space="preserve">To identify </w:t>
+      </w:r>
+      <w:r>
+        <w:t xml:space="preserve">ecologically distinct </w:t>
+      </w:r>
+      <w:r>
+        <w:t>larval fish assemblages,</w:t>
       </w:r>
       <w:r>
         <w:t xml:space="preserve"> </w:t>
       </w:r>
       <w:r>
-        <w:t xml:space="preserve">Net tows were then mapped </w:t>
-      </w:r>
-      <w:r>
-        <w:t xml:space="preserve">by cluster and net number to </w:t>
-      </w:r>
-      <w:r>
-        <w:t>observe</w:t>
-      </w:r>
-      <w:r>
-        <w:t xml:space="preserve"> how the clusters </w:t>
-      </w:r>
-      <w:r>
-        <w:t>distribute in</w:t>
-      </w:r>
-      <w:r>
-        <w:t xml:space="preserve"> vertical and horizontal </w:t>
-      </w:r>
-      <w:r>
-        <w:t xml:space="preserve">space. </w:t>
-      </w:r>
-      <w:r>
-        <w:t xml:space="preserve"> </w:t>
-      </w:r>
-    </w:p>
-    <w:p>
-      <w:r>
-        <w:t xml:space="preserve">An NMDS was run on the </w:t>
-      </w:r>
-      <w:r>
-        <w:t>previously described Bray-Curtis dissimilarity matrix</w:t>
-      </w:r>
-      <w:r>
-        <w:t xml:space="preserve">. The stress of the ordination was determined and its </w:t>
+        <w:t xml:space="preserve">first </w:t>
+      </w:r>
+      <w:r>
+        <w:t>the density of each taxonomic group within each net tow was square-root transformed. These were then used to generate a matrix of Bray-Curtis dissimilarities between net tows. Agglomerative hierarchal clustering was performed on th</w:t>
+      </w:r>
+      <w:r>
+        <w:t xml:space="preserve">e dissimilarity matrix </w:t>
+      </w:r>
+      <w:r>
+        <w:t xml:space="preserve">with the “average” method. </w:t>
+      </w:r>
+      <w:r>
+        <w:t>To determine the number of clusters necessary</w:t>
       </w:r>
       <w:commentRangeStart w:id="8"/>
       <w:r>
-        <w:t>relevance</w:t>
-      </w:r>
-      <w:r>
-        <w:t xml:space="preserve"> </w:t>
+        <w:t xml:space="preserve">, </w:t>
       </w:r>
       <w:commentRangeEnd w:id="8"/>
       <w:r>
@@ -623,23 +534,114 @@
         <w:commentReference w:id="8"/>
       </w:r>
       <w:r>
-        <w:t xml:space="preserve">in the context of our data was assessed with the </w:t>
-      </w:r>
-      <w:r>
-        <w:t xml:space="preserve">iterative </w:t>
-      </w:r>
-      <w:r>
-        <w:t>permutation</w:t>
+        <w:t xml:space="preserve">a dendrogram of the clustering results </w:t>
+      </w:r>
+      <w:r>
+        <w:t>was</w:t>
+      </w:r>
+      <w:r>
+        <w:t xml:space="preserve"> plotted</w:t>
+      </w:r>
+      <w:r>
+        <w:t xml:space="preserve"> with </w:t>
+      </w:r>
+      <w:r>
+        <w:t>overlayed rectangles to identify cluster boundaries</w:t>
+      </w:r>
+      <w:r>
+        <w:t xml:space="preserve">. </w:t>
+      </w:r>
+    </w:p>
+    <w:p>
+      <w:r>
+        <w:t xml:space="preserve">To visualize the taxonomic composition of each cluster, </w:t>
+      </w:r>
+      <w:r>
+        <w:t xml:space="preserve">the taxa densities in each net tow were plotted </w:t>
+      </w:r>
+      <w:r>
+        <w:t xml:space="preserve">in a stacked bar plot. Beyond visual </w:t>
+      </w:r>
+      <w:r>
+        <w:t>this visual assessment,</w:t>
+      </w:r>
+      <w:r>
+        <w:t xml:space="preserve"> an in</w:t>
+      </w:r>
+      <w:r>
+        <w:t xml:space="preserve">dicator species analysis </w:t>
+      </w:r>
+      <w:r>
+        <w:t xml:space="preserve">(ISA) </w:t>
+      </w:r>
+      <w:r>
+        <w:t>was run</w:t>
+      </w:r>
+      <w:r>
+        <w:t xml:space="preserve"> to identify </w:t>
+      </w:r>
+      <w:r>
+        <w:t>dominant taxonomic group(s) for every cluster</w:t>
+      </w:r>
+      <w:r>
+        <w:t xml:space="preserve">. </w:t>
+      </w:r>
+      <w:r>
+        <w:t xml:space="preserve">The bar plot and ISA were used in conjunction to </w:t>
+      </w:r>
+      <w:r>
+        <w:t>define major clusters of interest and the</w:t>
+      </w:r>
+      <w:r>
+        <w:t xml:space="preserve"> ecological </w:t>
+      </w:r>
+      <w:r>
+        <w:t>community they represent.</w:t>
       </w:r>
       <w:r>
         <w:t xml:space="preserve"> </w:t>
       </w:r>
       <w:r>
-        <w:t xml:space="preserve">methodology </w:t>
+        <w:t xml:space="preserve">Net tows were then mapped </w:t>
+      </w:r>
+      <w:r>
+        <w:t xml:space="preserve">by cluster and net number to </w:t>
+      </w:r>
+      <w:r>
+        <w:t>observe</w:t>
+      </w:r>
+      <w:r>
+        <w:t xml:space="preserve"> how the clusters </w:t>
+      </w:r>
+      <w:r>
+        <w:t>distribute in</w:t>
+      </w:r>
+      <w:r>
+        <w:t xml:space="preserve"> vertical and horizontal </w:t>
+      </w:r>
+      <w:r>
+        <w:t xml:space="preserve">space. </w:t>
+      </w:r>
+      <w:r>
+        <w:t xml:space="preserve"> </w:t>
+      </w:r>
+    </w:p>
+    <w:p>
+      <w:r>
+        <w:t xml:space="preserve">An NMDS was run on the </w:t>
+      </w:r>
+      <w:r>
+        <w:t>previously described Bray-Curtis dissimilarity matrix</w:t>
+      </w:r>
+      <w:r>
+        <w:t xml:space="preserve">. The stress of the ordination was determined and its </w:t>
       </w:r>
       <w:commentRangeStart w:id="9"/>
       <w:r>
-        <w:t xml:space="preserve">suggested </w:t>
+        <w:t>relevance</w:t>
+      </w:r>
+      <w:r>
+        <w:t xml:space="preserve"> </w:t>
       </w:r>
       <w:commentRangeEnd w:id="9"/>
       <w:r>
@@ -651,6 +653,34 @@
         <w:commentReference w:id="9"/>
       </w:r>
       <w:r>
+        <w:t xml:space="preserve">in the context of our data was assessed with the </w:t>
+      </w:r>
+      <w:r>
+        <w:t xml:space="preserve">iterative </w:t>
+      </w:r>
+      <w:r>
+        <w:t>permutation</w:t>
+      </w:r>
+      <w:r>
+        <w:t xml:space="preserve"> </w:t>
+      </w:r>
+      <w:r>
+        <w:t xml:space="preserve">methodology </w:t>
+      </w:r>
+      <w:commentRangeStart w:id="10"/>
+      <w:r>
+        <w:t xml:space="preserve">suggested </w:t>
+      </w:r>
+      <w:commentRangeEnd w:id="10"/>
+      <w:r>
+        <w:rPr>
+          <w:rStyle w:val="CommentReference"/>
+          <w:sz w:val="24"/>
+          <w:szCs w:val="24"/>
+        </w:rPr>
+        <w:commentReference w:id="10"/>
+      </w:r>
+      <w:r>
         <w:t>by Dexter et al. (2018)</w:t>
       </w:r>
       <w:r>
@@ -685,8 +715,6 @@
       </w:r>
       <w:r>
         <w:tab/>
-      </w:r>
-      <w:r>
         <w:t xml:space="preserve">Description of the </w:t>
       </w:r>
       <w:r>
@@ -799,13 +827,7 @@
         <w:t>P. vetulus</w:t>
       </w:r>
       <w:r>
-        <w:t xml:space="preserve"> community (cluster 2) was present almost exclusively on the shelf during all years without a distinct depth preference (Fig. 3). Cluster 3, the Myctophid community, was most apparent offshore and in tows at greater depths (Fig. 3). The assemblage of nearshore taxa </w:t>
-      </w:r>
-      <w:r>
-        <w:t xml:space="preserve">(cluster 5 ) </w:t>
-      </w:r>
-      <w:r>
-        <w:t xml:space="preserve">was most prevalent in 2022 and occurred mostly nearshore, though depth varied (Fig. 3). Cluster 6, the community of Osmeridae and other coastal taxa, was found almost exclusively at the most nearshore stations and shallowest depths (Fig. 3). </w:t>
+        <w:t xml:space="preserve"> community (cluster 2) was present almost exclusively on the shelf during all years without a distinct depth preference (Fig. 3). Cluster 3, the Myctophid community, was most apparent offshore and in tows at greater depths (Fig. 3). The assemblage of nearshore taxa was most prevalent in 2022 and occurred mostly nearshore, though depth varied (Fig. 3). Cluster 6, the community of Osmeridae and other coastal taxa, was found almost exclusively at the most nearshore stations and shallowest depths (Fig. 3). </w:t>
       </w:r>
     </w:p>
     <w:p>
@@ -817,8 +839,6 @@
       </w:r>
       <w:r>
         <w:tab/>
-      </w:r>
-      <w:r>
         <w:t xml:space="preserve">Influences on the </w:t>
       </w:r>
       <w:r>
@@ -835,15 +855,10 @@
         <w:pStyle w:val="Heading2"/>
       </w:pPr>
       <w:r>
-        <w:t>2.</w:t>
-      </w:r>
-      <w:r>
-        <w:t>3</w:t>
+        <w:t>2.3</w:t>
       </w:r>
       <w:r>
         <w:tab/>
-      </w:r>
-      <w:r>
         <w:t xml:space="preserve">Diel effects on </w:t>
       </w:r>
       <w:r>
@@ -891,6 +906,7 @@
     <w:sectPr>
       <w:pgSz w:w="12240" w:h="15840"/>
       <w:pgMar w:top="1440" w:right="1440" w:bottom="1440" w:left="1440" w:header="720" w:footer="720" w:gutter="0"/>
+      <w:lnNumType w:countBy="1" w:restart="continuous"/>
       <w:cols w:space="720"/>
       <w:docGrid w:linePitch="360"/>
     </w:sectPr>
@@ -980,7 +996,7 @@
       </w:r>
     </w:p>
   </w:comment>
-  <w:comment w:id="5" w:author="McCloskey, Ross" w:date="2026-08-18T15:29:00Z" w:initials="RM">
+  <w:comment w:id="5" w:author="McCloskey, Ross" w:date="2026-08-25T13:29:00Z" w:initials="RM">
     <w:p>
       <w:pPr>
         <w:pStyle w:val="CommentText"/>
@@ -992,6 +1008,22 @@
         <w:annotationRef/>
       </w:r>
       <w:r>
+        <w:t>Mention PDO, ENSO as indicators for LFC ?</w:t>
+      </w:r>
+    </w:p>
+  </w:comment>
+  <w:comment w:id="6" w:author="McCloskey, Ross" w:date="2026-08-18T15:29:00Z" w:initials="RM">
+    <w:p>
+      <w:pPr>
+        <w:pStyle w:val="CommentText"/>
+      </w:pPr>
+      <w:r>
+        <w:rPr>
+          <w:rStyle w:val="CommentReference"/>
+        </w:rPr>
+        <w:annotationRef/>
+      </w:r>
+      <w:r>
         <w:t xml:space="preserve">Could probably better describe the knowledge gaps in more detail. </w:t>
       </w:r>
     </w:p>
@@ -1004,7 +1036,7 @@
       </w:r>
     </w:p>
   </w:comment>
-  <w:comment w:id="6" w:author="McCloskey, Ross" w:date="2026-08-18T14:58:00Z" w:initials="RM">
+  <w:comment w:id="7" w:author="McCloskey, Ross" w:date="2026-08-18T14:58:00Z" w:initials="RM">
     <w:p>
       <w:pPr>
         <w:pStyle w:val="CommentText"/>
@@ -1020,7 +1052,7 @@
       </w:r>
     </w:p>
   </w:comment>
-  <w:comment w:id="7" w:author="McCloskey, Ross" w:date="2026-08-18T14:59:00Z" w:initials="RM">
+  <w:comment w:id="8" w:author="McCloskey, Ross" w:date="2026-08-18T14:59:00Z" w:initials="RM">
     <w:p>
       <w:pPr>
         <w:pStyle w:val="CommentText"/>
@@ -1036,7 +1068,7 @@
       </w:r>
     </w:p>
   </w:comment>
-  <w:comment w:id="8" w:author="McCloskey, Ross" w:date="2026-08-18T15:03:00Z" w:initials="RM">
+  <w:comment w:id="9" w:author="McCloskey, Ross" w:date="2026-08-18T15:03:00Z" w:initials="RM">
     <w:p>
       <w:pPr>
         <w:pStyle w:val="CommentText"/>
@@ -1052,7 +1084,7 @@
       </w:r>
     </w:p>
   </w:comment>
-  <w:comment w:id="9" w:author="McCloskey, Ross" w:date="2026-08-18T15:04:00Z" w:initials="RM">
+  <w:comment w:id="10" w:author="McCloskey, Ross" w:date="2026-08-18T15:04:00Z" w:initials="RM">
     <w:p>
       <w:pPr>
         <w:pStyle w:val="CommentText"/>
@@ -1078,6 +1110,7 @@
   <w15:commentEx w15:paraId="5B8443B7" w15:done="0"/>
   <w15:commentEx w15:paraId="40FE5ADD" w15:done="0"/>
   <w15:commentEx w15:paraId="4C6AC411" w15:done="0"/>
+  <w15:commentEx w15:paraId="4E80129C" w15:paraIdParent="4C6AC411" w15:done="0"/>
   <w15:commentEx w15:paraId="763D8A91" w15:done="0"/>
   <w15:commentEx w15:paraId="1F69DA66" w15:done="0"/>
   <w15:commentEx w15:paraId="4FC2E53E" w15:done="0"/>
@@ -1093,6 +1126,7 @@
   <w16cex:commentExtensible w16cex:durableId="0798161C" w16cex:dateUtc="2026-08-18T20:06:00Z"/>
   <w16cex:commentExtensible w16cex:durableId="266E2573" w16cex:dateUtc="2026-08-18T20:10:00Z"/>
   <w16cex:commentExtensible w16cex:durableId="2B4ADF92" w16cex:dateUtc="2026-08-18T20:12:00Z"/>
+  <w16cex:commentExtensible w16cex:durableId="0EE97655" w16cex:dateUtc="2026-08-25T18:29:00Z"/>
   <w16cex:commentExtensible w16cex:durableId="167F67C8" w16cex:dateUtc="2026-08-18T20:29:00Z"/>
   <w16cex:commentExtensible w16cex:durableId="120E2433" w16cex:dateUtc="2026-08-18T19:58:00Z"/>
   <w16cex:commentExtensible w16cex:durableId="30192086" w16cex:dateUtc="2026-08-18T19:59:00Z"/>
@@ -1108,6 +1142,7 @@
   <w16cid:commentId w16cid:paraId="5B8443B7" w16cid:durableId="0798161C"/>
   <w16cid:commentId w16cid:paraId="40FE5ADD" w16cid:durableId="266E2573"/>
   <w16cid:commentId w16cid:paraId="4C6AC411" w16cid:durableId="2B4ADF92"/>
+  <w16cid:commentId w16cid:paraId="4E80129C" w16cid:durableId="0EE97655"/>
   <w16cid:commentId w16cid:paraId="763D8A91" w16cid:durableId="167F67C8"/>
   <w16cid:commentId w16cid:paraId="1F69DA66" w16cid:durableId="120E2433"/>
   <w16cid:commentId w16cid:paraId="4FC2E53E" w16cid:durableId="30192086"/>
@@ -1728,6 +1763,7 @@
   <w:style w:type="character" w:default="1" w:styleId="DefaultParagraphFont">
     <w:name w:val="Default Paragraph Font"/>
     <w:uiPriority w:val="1"/>
+    <w:semiHidden/>
     <w:unhideWhenUsed/>
   </w:style>
   <w:style w:type="table" w:default="1" w:styleId="TableNormal">
@@ -2156,6 +2192,14 @@
       <w:color w:val="605E5C"/>
       <w:shd w:val="clear" w:color="auto" w:fill="E1DFDD"/>
     </w:rPr>
+  </w:style>
+  <w:style w:type="character" w:styleId="LineNumber">
+    <w:name w:val="line number"/>
+    <w:basedOn w:val="DefaultParagraphFont"/>
+    <w:uiPriority w:val="99"/>
+    <w:semiHidden/>
+    <w:unhideWhenUsed/>
+    <w:rsid w:val="00361B67"/>
   </w:style>
 </w:styles>
 </file>

</xml_diff>

<commit_message>
Use CTD DO instead of ISIIS and add sampling methods to manuscript
</commit_message>
<xml_diff>
--- a/Manuscript draft.docx
+++ b/Manuscript draft.docx
@@ -1720,149 +1720,163 @@
     </w:p>
     <w:p>
       <w:r>
-        <w:t xml:space="preserve">Using depth-discrete ichthyoplankton </w:t>
-      </w:r>
-      <w:ins w:id="185" w:author="Bobay, Luke Andrew" w:date="2026-08-28T14:11:00Z" w16du:dateUtc="2026-08-28T21:11:00Z">
+        <w:t>Using depth-discrete</w:t>
+      </w:r>
+      <w:ins w:id="185" w:author="Bobay, Luke Andrew" w:date="2026-08-28T14:48:00Z" w16du:dateUtc="2026-08-28T21:48:00Z">
+        <w:r>
+          <w:t xml:space="preserve"> winter</w:t>
+        </w:r>
+      </w:ins>
+      <w:r>
+        <w:t xml:space="preserve"> ichthyoplankton </w:t>
+      </w:r>
+      <w:ins w:id="186" w:author="Bobay, Luke Andrew" w:date="2026-08-28T14:11:00Z" w16du:dateUtc="2026-08-28T21:11:00Z">
         <w:r>
           <w:t xml:space="preserve">abundance </w:t>
         </w:r>
       </w:ins>
       <w:r>
-        <w:t xml:space="preserve">data </w:t>
-      </w:r>
-      <w:del w:id="186" w:author="Bobay, Luke Andrew" w:date="2026-08-28T14:11:00Z" w16du:dateUtc="2026-08-28T21:11:00Z">
+        <w:t>data</w:t>
+      </w:r>
+      <w:del w:id="187" w:author="Bobay, Luke Andrew" w:date="2026-08-28T14:49:00Z" w16du:dateUtc="2026-08-28T21:49:00Z">
+        <w:r>
+          <w:delText xml:space="preserve"> </w:delText>
+        </w:r>
+      </w:del>
+      <w:del w:id="188" w:author="Bobay, Luke Andrew" w:date="2026-08-28T14:11:00Z" w16du:dateUtc="2026-08-28T21:11:00Z">
         <w:r>
           <w:delText xml:space="preserve">sampled </w:delText>
         </w:r>
       </w:del>
-      <w:ins w:id="187" w:author="Bobay, Luke Andrew" w:date="2026-08-28T14:11:00Z" w16du:dateUtc="2026-08-28T21:11:00Z">
-        <w:r>
-          <w:t>collected</w:t>
-        </w:r>
+      <w:del w:id="189" w:author="Bobay, Luke Andrew" w:date="2026-08-28T14:49:00Z" w16du:dateUtc="2026-08-28T21:49:00Z">
+        <w:r>
+          <w:delText xml:space="preserve">on four two-week cruises across the </w:delText>
+        </w:r>
+      </w:del>
+      <w:del w:id="190" w:author="Bobay, Luke Andrew" w:date="2026-08-28T14:11:00Z" w16du:dateUtc="2026-08-28T21:11:00Z">
+        <w:r>
+          <w:delText>northern California Current system</w:delText>
+        </w:r>
+      </w:del>
+      <w:del w:id="191" w:author="Bobay, Luke Andrew" w:date="2026-08-28T14:49:00Z" w16du:dateUtc="2026-08-28T21:49:00Z">
+        <w:r>
+          <w:delText xml:space="preserve"> (41–47°N) during winter 2018</w:delText>
+        </w:r>
+      </w:del>
+      <w:del w:id="192" w:author="Bobay, Luke Andrew" w:date="2026-08-28T14:17:00Z" w16du:dateUtc="2026-08-28T21:17:00Z">
+        <w:r>
+          <w:delText>–</w:delText>
+        </w:r>
+      </w:del>
+      <w:del w:id="193" w:author="Bobay, Luke Andrew" w:date="2026-08-28T14:49:00Z" w16du:dateUtc="2026-08-28T21:49:00Z">
+        <w:r>
+          <w:delText>2023</w:delText>
+        </w:r>
+      </w:del>
+      <w:r>
+        <w:t>, we</w:t>
+      </w:r>
+      <w:del w:id="194" w:author="Bobay, Luke Andrew" w:date="2026-08-28T14:20:00Z" w16du:dateUtc="2026-08-28T21:20:00Z">
+        <w:r>
+          <w:delText xml:space="preserve"> </w:delText>
+        </w:r>
+      </w:del>
+      <w:del w:id="195" w:author="Bobay, Luke Andrew" w:date="2026-08-28T14:18:00Z" w16du:dateUtc="2026-08-28T21:18:00Z">
+        <w:r>
+          <w:delText>investigated the LFC</w:delText>
+        </w:r>
+      </w:del>
+      <w:del w:id="196" w:author="Bobay, Luke Andrew" w:date="2026-08-28T14:20:00Z" w16du:dateUtc="2026-08-28T21:20:00Z">
+        <w:r>
+          <w:delText xml:space="preserve"> to </w:delText>
+        </w:r>
+      </w:del>
+      <w:del w:id="197" w:author="Bobay, Luke Andrew" w:date="2026-08-28T14:19:00Z" w16du:dateUtc="2026-08-28T21:19:00Z">
+        <w:r>
+          <w:delText>characterize assemblages and identify factors influencing the composition thereof</w:delText>
+        </w:r>
+      </w:del>
+      <w:ins w:id="198" w:author="Bobay, Luke Andrew" w:date="2026-08-28T14:21:00Z" w16du:dateUtc="2026-08-28T21:21:00Z">
         <w:r>
           <w:t xml:space="preserve"> </w:t>
         </w:r>
       </w:ins>
-      <w:r>
-        <w:t xml:space="preserve">on four two-week cruises across the </w:t>
-      </w:r>
-      <w:del w:id="188" w:author="Bobay, Luke Andrew" w:date="2026-08-28T14:11:00Z" w16du:dateUtc="2026-08-28T21:11:00Z">
-        <w:r>
-          <w:delText>northern California Current system</w:delText>
-        </w:r>
-      </w:del>
-      <w:ins w:id="189" w:author="Bobay, Luke Andrew" w:date="2026-08-28T14:11:00Z" w16du:dateUtc="2026-08-28T21:11:00Z">
-        <w:r>
-          <w:t>NCC</w:t>
-        </w:r>
-      </w:ins>
-      <w:r>
-        <w:t xml:space="preserve"> (41–47°N) during winter 2018</w:t>
-      </w:r>
-      <w:del w:id="190" w:author="Bobay, Luke Andrew" w:date="2026-08-28T14:17:00Z" w16du:dateUtc="2026-08-28T21:17:00Z">
-        <w:r>
-          <w:delText>–</w:delText>
-        </w:r>
-      </w:del>
-      <w:ins w:id="191" w:author="Bobay, Luke Andrew" w:date="2026-08-28T14:17:00Z" w16du:dateUtc="2026-08-28T21:17:00Z">
-        <w:r>
-          <w:t xml:space="preserve">, 2019, 2022, and </w:t>
-        </w:r>
-      </w:ins>
-      <w:r>
-        <w:t>2023, we</w:t>
-      </w:r>
-      <w:del w:id="192" w:author="Bobay, Luke Andrew" w:date="2026-08-28T14:20:00Z" w16du:dateUtc="2026-08-28T21:20:00Z">
-        <w:r>
-          <w:delText xml:space="preserve"> </w:delText>
-        </w:r>
-      </w:del>
-      <w:del w:id="193" w:author="Bobay, Luke Andrew" w:date="2026-08-28T14:18:00Z" w16du:dateUtc="2026-08-28T21:18:00Z">
-        <w:r>
-          <w:delText>investigated the LFC</w:delText>
-        </w:r>
-      </w:del>
-      <w:del w:id="194" w:author="Bobay, Luke Andrew" w:date="2026-08-28T14:20:00Z" w16du:dateUtc="2026-08-28T21:20:00Z">
-        <w:r>
-          <w:delText xml:space="preserve"> to </w:delText>
-        </w:r>
-      </w:del>
-      <w:del w:id="195" w:author="Bobay, Luke Andrew" w:date="2026-08-28T14:19:00Z" w16du:dateUtc="2026-08-28T21:19:00Z">
-        <w:r>
-          <w:delText>characterize assemblages and identify factors influencing the composition thereof</w:delText>
-        </w:r>
-      </w:del>
-      <w:ins w:id="196" w:author="Bobay, Luke Andrew" w:date="2026-08-28T14:21:00Z" w16du:dateUtc="2026-08-28T21:21:00Z">
-        <w:r>
-          <w:t xml:space="preserve"> </w:t>
-        </w:r>
-      </w:ins>
-      <w:ins w:id="197" w:author="Bobay, Luke Andrew" w:date="2026-08-28T14:22:00Z" w16du:dateUtc="2026-08-28T21:22:00Z">
+      <w:ins w:id="199" w:author="Bobay, Luke Andrew" w:date="2026-08-28T14:22:00Z" w16du:dateUtc="2026-08-28T21:22:00Z">
         <w:r>
           <w:t>(</w:t>
         </w:r>
       </w:ins>
-      <w:ins w:id="198" w:author="Bobay, Luke Andrew" w:date="2026-08-28T14:21:00Z" w16du:dateUtc="2026-08-28T21:21:00Z">
+      <w:ins w:id="200" w:author="Bobay, Luke Andrew" w:date="2026-08-28T14:21:00Z" w16du:dateUtc="2026-08-28T21:21:00Z">
         <w:r>
           <w:t>1) characterize</w:t>
         </w:r>
       </w:ins>
-      <w:ins w:id="199" w:author="Bobay, Luke Andrew" w:date="2026-08-28T14:26:00Z" w16du:dateUtc="2026-08-28T21:26:00Z">
+      <w:ins w:id="201" w:author="Bobay, Luke Andrew" w:date="2026-08-28T14:26:00Z" w16du:dateUtc="2026-08-28T21:26:00Z">
         <w:r>
           <w:t>d</w:t>
         </w:r>
       </w:ins>
-      <w:ins w:id="200" w:author="Bobay, Luke Andrew" w:date="2026-08-28T14:21:00Z" w16du:dateUtc="2026-08-28T21:21:00Z">
-        <w:r>
-          <w:t xml:space="preserve"> winter ichthyoplankton assemblages, </w:t>
-        </w:r>
-      </w:ins>
-      <w:ins w:id="201" w:author="Bobay, Luke Andrew" w:date="2026-08-28T14:22:00Z" w16du:dateUtc="2026-08-28T21:22:00Z">
+      <w:ins w:id="202" w:author="Bobay, Luke Andrew" w:date="2026-08-28T14:21:00Z" w16du:dateUtc="2026-08-28T21:21:00Z">
+        <w:r>
+          <w:t xml:space="preserve"> winter ichthyoplankton assemblages</w:t>
+        </w:r>
+      </w:ins>
+      <w:ins w:id="203" w:author="Bobay, Luke Andrew" w:date="2026-08-28T14:49:00Z" w16du:dateUtc="2026-08-28T21:49:00Z">
+        <w:r>
+          <w:t xml:space="preserve"> of the NCC</w:t>
+        </w:r>
+      </w:ins>
+      <w:ins w:id="204" w:author="Bobay, Luke Andrew" w:date="2026-08-28T14:21:00Z" w16du:dateUtc="2026-08-28T21:21:00Z">
+        <w:r>
+          <w:t xml:space="preserve">, </w:t>
+        </w:r>
+      </w:ins>
+      <w:ins w:id="205" w:author="Bobay, Luke Andrew" w:date="2026-08-28T14:22:00Z" w16du:dateUtc="2026-08-28T21:22:00Z">
         <w:r>
           <w:t>(</w:t>
         </w:r>
       </w:ins>
-      <w:ins w:id="202" w:author="Bobay, Luke Andrew" w:date="2026-08-28T14:21:00Z" w16du:dateUtc="2026-08-28T21:21:00Z">
+      <w:ins w:id="206" w:author="Bobay, Luke Andrew" w:date="2026-08-28T14:21:00Z" w16du:dateUtc="2026-08-28T21:21:00Z">
         <w:r>
           <w:t xml:space="preserve">2) </w:t>
         </w:r>
       </w:ins>
-      <w:ins w:id="203" w:author="Bobay, Luke Andrew" w:date="2026-08-28T14:23:00Z" w16du:dateUtc="2026-08-28T21:23:00Z">
+      <w:ins w:id="207" w:author="Bobay, Luke Andrew" w:date="2026-08-28T14:23:00Z" w16du:dateUtc="2026-08-28T21:23:00Z">
         <w:r>
           <w:t>use</w:t>
         </w:r>
       </w:ins>
-      <w:ins w:id="204" w:author="Bobay, Luke Andrew" w:date="2026-08-28T14:26:00Z" w16du:dateUtc="2026-08-28T21:26:00Z">
+      <w:ins w:id="208" w:author="Bobay, Luke Andrew" w:date="2026-08-28T14:26:00Z" w16du:dateUtc="2026-08-28T21:26:00Z">
         <w:r>
           <w:t>d</w:t>
         </w:r>
       </w:ins>
-      <w:ins w:id="205" w:author="Bobay, Luke Andrew" w:date="2026-08-28T14:23:00Z" w16du:dateUtc="2026-08-28T21:23:00Z">
+      <w:ins w:id="209" w:author="Bobay, Luke Andrew" w:date="2026-08-28T14:23:00Z" w16du:dateUtc="2026-08-28T21:23:00Z">
         <w:r>
           <w:t xml:space="preserve"> fine-scale spatiotemporal and environmental factors to explain variation in winter ichthyoplankton assemblage composition</w:t>
         </w:r>
       </w:ins>
-      <w:ins w:id="206" w:author="Bobay, Luke Andrew" w:date="2026-08-28T14:24:00Z" w16du:dateUtc="2026-08-28T21:24:00Z">
+      <w:ins w:id="210" w:author="Bobay, Luke Andrew" w:date="2026-08-28T14:24:00Z" w16du:dateUtc="2026-08-28T21:24:00Z">
         <w:r>
           <w:t xml:space="preserve">, and (3) </w:t>
         </w:r>
       </w:ins>
-      <w:ins w:id="207" w:author="Bobay, Luke Andrew" w:date="2026-08-28T14:26:00Z" w16du:dateUtc="2026-08-28T21:26:00Z">
+      <w:ins w:id="211" w:author="Bobay, Luke Andrew" w:date="2026-08-28T14:26:00Z" w16du:dateUtc="2026-08-28T21:26:00Z">
         <w:r>
           <w:t xml:space="preserve">examined </w:t>
         </w:r>
       </w:ins>
-      <w:ins w:id="208" w:author="Bobay, Luke Andrew" w:date="2026-08-28T14:27:00Z" w16du:dateUtc="2026-08-28T21:27:00Z">
+      <w:ins w:id="212" w:author="Bobay, Luke Andrew" w:date="2026-08-28T14:27:00Z" w16du:dateUtc="2026-08-28T21:27:00Z">
         <w:r>
           <w:t xml:space="preserve">taxon-specific </w:t>
         </w:r>
       </w:ins>
-      <w:ins w:id="209" w:author="Bobay, Luke Andrew" w:date="2026-08-28T14:28:00Z" w16du:dateUtc="2026-08-28T21:28:00Z">
+      <w:ins w:id="213" w:author="Bobay, Luke Andrew" w:date="2026-08-28T14:28:00Z" w16du:dateUtc="2026-08-28T21:28:00Z">
         <w:r>
           <w:t xml:space="preserve">diel variation in vertical abundance </w:t>
         </w:r>
       </w:ins>
-      <w:ins w:id="210" w:author="Bobay, Luke Andrew" w:date="2026-08-28T14:29:00Z" w16du:dateUtc="2026-08-28T21:29:00Z">
+      <w:ins w:id="214" w:author="Bobay, Luke Andrew" w:date="2026-08-28T14:29:00Z" w16du:dateUtc="2026-08-28T21:29:00Z">
         <w:r>
           <w:t>distribution</w:t>
         </w:r>
@@ -1870,8 +1884,8 @@
       <w:r>
         <w:t xml:space="preserve">. </w:t>
       </w:r>
-      <w:commentRangeStart w:id="211"/>
-      <w:del w:id="212" w:author="Bobay, Luke Andrew" w:date="2026-08-28T14:30:00Z" w16du:dateUtc="2026-08-28T21:30:00Z">
+      <w:commentRangeStart w:id="215"/>
+      <w:del w:id="216" w:author="Bobay, Luke Andrew" w:date="2026-08-28T14:30:00Z" w16du:dateUtc="2026-08-28T21:30:00Z">
         <w:r>
           <w:delText xml:space="preserve">We expect larval assemblages to cluster according to adult </w:delText>
         </w:r>
@@ -1880,41 +1894,41 @@
           <w:delText>habitat affinity with distinct taxonomic and spatial communities. Additionally, we expect significant effects of spatiotemporal and environmental variables—such as latitude, temperature, dissolved oxygen, seafloor depth, productivity, time of day, and salinity—on the clustering of the LFC</w:delText>
         </w:r>
       </w:del>
-      <w:commentRangeEnd w:id="211"/>
+      <w:commentRangeEnd w:id="215"/>
       <w:r>
         <w:rPr>
           <w:rStyle w:val="CommentReference"/>
           <w:sz w:val="24"/>
           <w:szCs w:val="24"/>
         </w:rPr>
-        <w:commentReference w:id="211"/>
-      </w:r>
-      <w:del w:id="213" w:author="Bobay, Luke Andrew" w:date="2026-08-28T14:30:00Z" w16du:dateUtc="2026-08-28T21:30:00Z">
+        <w:commentReference w:id="215"/>
+      </w:r>
+      <w:del w:id="217" w:author="Bobay, Luke Andrew" w:date="2026-08-28T14:30:00Z" w16du:dateUtc="2026-08-28T21:30:00Z">
         <w:r>
           <w:delText xml:space="preserve">. </w:delText>
         </w:r>
       </w:del>
-      <w:del w:id="214" w:author="Bobay, Luke Andrew" w:date="2026-08-28T14:32:00Z" w16du:dateUtc="2026-08-28T21:32:00Z">
+      <w:del w:id="218" w:author="Bobay, Luke Andrew" w:date="2026-08-28T14:32:00Z" w16du:dateUtc="2026-08-28T21:32:00Z">
         <w:r>
           <w:delText>Establishing how larval fish aggregate during the winter and what factors contribute to the composition of each assemblage could provide a baseline for future studies on the changing NCC ecosystem while also aiding</w:delText>
         </w:r>
       </w:del>
-      <w:ins w:id="215" w:author="Bobay, Luke Andrew" w:date="2026-08-28T14:32:00Z" w16du:dateUtc="2026-08-28T21:32:00Z">
+      <w:ins w:id="219" w:author="Bobay, Luke Andrew" w:date="2026-08-28T14:32:00Z" w16du:dateUtc="2026-08-28T21:32:00Z">
         <w:r>
           <w:t xml:space="preserve">The results of this study will </w:t>
         </w:r>
       </w:ins>
-      <w:del w:id="216" w:author="Bobay, Luke Andrew" w:date="2026-08-28T14:32:00Z" w16du:dateUtc="2026-08-28T21:32:00Z">
+      <w:del w:id="220" w:author="Bobay, Luke Andrew" w:date="2026-08-28T14:32:00Z" w16du:dateUtc="2026-08-28T21:32:00Z">
         <w:r>
           <w:delText xml:space="preserve"> in </w:delText>
         </w:r>
       </w:del>
-      <w:ins w:id="217" w:author="Bobay, Luke Andrew" w:date="2026-08-28T14:32:00Z" w16du:dateUtc="2026-08-28T21:32:00Z">
+      <w:ins w:id="221" w:author="Bobay, Luke Andrew" w:date="2026-08-28T14:32:00Z" w16du:dateUtc="2026-08-28T21:32:00Z">
         <w:r>
           <w:t>support</w:t>
         </w:r>
       </w:ins>
-      <w:ins w:id="218" w:author="Bobay, Luke Andrew" w:date="2026-08-28T14:33:00Z" w16du:dateUtc="2026-08-28T21:33:00Z">
+      <w:ins w:id="222" w:author="Bobay, Luke Andrew" w:date="2026-08-28T14:33:00Z" w16du:dateUtc="2026-08-28T21:33:00Z">
         <w:r>
           <w:t xml:space="preserve"> </w:t>
         </w:r>
@@ -1922,7 +1936,7 @@
       <w:r>
         <w:t>prediction</w:t>
       </w:r>
-      <w:del w:id="219" w:author="Bobay, Luke Andrew" w:date="2026-08-28T14:32:00Z" w16du:dateUtc="2026-08-28T21:32:00Z">
+      <w:del w:id="223" w:author="Bobay, Luke Andrew" w:date="2026-08-28T14:32:00Z" w16du:dateUtc="2026-08-28T21:32:00Z">
         <w:r>
           <w:delText>s</w:delText>
         </w:r>
@@ -1930,12 +1944,12 @@
       <w:r>
         <w:t xml:space="preserve"> of </w:t>
       </w:r>
-      <w:del w:id="220" w:author="Bobay, Luke Andrew" w:date="2026-08-28T14:35:00Z" w16du:dateUtc="2026-08-28T21:35:00Z">
+      <w:del w:id="224" w:author="Bobay, Luke Andrew" w:date="2026-08-28T14:35:00Z" w16du:dateUtc="2026-08-28T21:35:00Z">
         <w:r>
           <w:delText>winter-spawning fish</w:delText>
         </w:r>
       </w:del>
-      <w:ins w:id="221" w:author="Bobay, Luke Andrew" w:date="2026-08-28T14:35:00Z" w16du:dateUtc="2026-08-28T21:35:00Z">
+      <w:ins w:id="225" w:author="Bobay, Luke Andrew" w:date="2026-08-28T14:35:00Z" w16du:dateUtc="2026-08-28T21:35:00Z">
         <w:r>
           <w:t>larval</w:t>
         </w:r>
@@ -1943,7 +1957,7 @@
       <w:r>
         <w:t xml:space="preserve"> abundance </w:t>
       </w:r>
-      <w:ins w:id="222" w:author="Bobay, Luke Andrew" w:date="2026-08-28T14:36:00Z" w16du:dateUtc="2026-08-28T21:36:00Z">
+      <w:ins w:id="226" w:author="Bobay, Luke Andrew" w:date="2026-08-28T14:36:00Z" w16du:dateUtc="2026-08-28T21:36:00Z">
         <w:r>
           <w:t xml:space="preserve">of </w:t>
         </w:r>
@@ -1951,7 +1965,7 @@
       <w:r>
         <w:t xml:space="preserve">and </w:t>
       </w:r>
-      <w:del w:id="223" w:author="Bobay, Luke Andrew" w:date="2026-08-28T14:35:00Z" w16du:dateUtc="2026-08-28T21:35:00Z">
+      <w:del w:id="227" w:author="Bobay, Luke Andrew" w:date="2026-08-28T14:35:00Z" w16du:dateUtc="2026-08-28T21:35:00Z">
         <w:r>
           <w:delText xml:space="preserve">the </w:delText>
         </w:r>
@@ -1959,7 +1973,7 @@
       <w:r>
         <w:t xml:space="preserve">recruitment </w:t>
       </w:r>
-      <w:ins w:id="224" w:author="Bobay, Luke Andrew" w:date="2026-08-28T14:36:00Z" w16du:dateUtc="2026-08-28T21:36:00Z">
+      <w:ins w:id="228" w:author="Bobay, Luke Andrew" w:date="2026-08-28T14:36:00Z" w16du:dateUtc="2026-08-28T21:36:00Z">
         <w:r>
           <w:t xml:space="preserve">to adult populations </w:t>
         </w:r>
@@ -1967,32 +1981,32 @@
       <w:r>
         <w:t xml:space="preserve">of </w:t>
       </w:r>
-      <w:del w:id="225" w:author="Bobay, Luke Andrew" w:date="2026-08-28T14:36:00Z" w16du:dateUtc="2026-08-28T21:36:00Z">
+      <w:del w:id="229" w:author="Bobay, Luke Andrew" w:date="2026-08-28T14:36:00Z" w16du:dateUtc="2026-08-28T21:36:00Z">
         <w:r>
           <w:delText>the important fisheries species that prey on them</w:delText>
         </w:r>
       </w:del>
-      <w:ins w:id="226" w:author="Bobay, Luke Andrew" w:date="2026-08-28T14:36:00Z" w16du:dateUtc="2026-08-28T21:36:00Z">
+      <w:ins w:id="230" w:author="Bobay, Luke Andrew" w:date="2026-08-28T14:36:00Z" w16du:dateUtc="2026-08-28T21:36:00Z">
         <w:r>
           <w:t>winter-spawning fish</w:t>
         </w:r>
       </w:ins>
-      <w:ins w:id="227" w:author="Bobay, Luke Andrew" w:date="2026-08-28T14:39:00Z" w16du:dateUtc="2026-08-28T21:39:00Z">
+      <w:ins w:id="231" w:author="Bobay, Luke Andrew" w:date="2026-08-28T14:39:00Z" w16du:dateUtc="2026-08-28T21:39:00Z">
         <w:r>
           <w:t xml:space="preserve"> </w:t>
         </w:r>
       </w:ins>
-      <w:ins w:id="228" w:author="Bobay, Luke Andrew" w:date="2026-08-28T14:40:00Z" w16du:dateUtc="2026-08-28T21:40:00Z">
+      <w:ins w:id="232" w:author="Bobay, Luke Andrew" w:date="2026-08-28T14:40:00Z" w16du:dateUtc="2026-08-28T21:40:00Z">
         <w:r>
           <w:t xml:space="preserve">and </w:t>
         </w:r>
       </w:ins>
-      <w:ins w:id="229" w:author="Bobay, Luke Andrew" w:date="2026-08-28T14:41:00Z" w16du:dateUtc="2026-08-28T21:41:00Z">
+      <w:ins w:id="233" w:author="Bobay, Luke Andrew" w:date="2026-08-28T14:41:00Z" w16du:dateUtc="2026-08-28T21:41:00Z">
         <w:r>
           <w:t>reveal potential diel biases in</w:t>
         </w:r>
       </w:ins>
-      <w:ins w:id="230" w:author="Bobay, Luke Andrew" w:date="2026-08-28T14:42:00Z" w16du:dateUtc="2026-08-28T21:42:00Z">
+      <w:ins w:id="234" w:author="Bobay, Luke Andrew" w:date="2026-08-28T14:42:00Z" w16du:dateUtc="2026-08-28T21:42:00Z">
         <w:r>
           <w:t xml:space="preserve"> estimates of the abundance of larval fishes</w:t>
         </w:r>
@@ -2029,15 +2043,676 @@
       </w:r>
     </w:p>
     <w:p>
-      <w:r>
-        <w:t>[add section text here]</w:t>
-      </w:r>
+      <w:pPr>
+        <w:rPr>
+          <w:ins w:id="235" w:author="Bobay, Luke Andrew" w:date="2026-08-28T15:08:00Z" w16du:dateUtc="2026-08-28T22:08:00Z"/>
+        </w:rPr>
+      </w:pPr>
+      <w:del w:id="236" w:author="Bobay, Luke Andrew" w:date="2026-08-28T14:49:00Z" w16du:dateUtc="2026-08-28T21:49:00Z">
+        <w:r>
+          <w:delText>[add section text here]</w:delText>
+        </w:r>
+      </w:del>
+      <w:ins w:id="237" w:author="Bobay, Luke Andrew" w:date="2026-08-28T15:06:00Z" w16du:dateUtc="2026-08-28T22:06:00Z">
+        <w:r>
+          <w:t>Field sampling took place</w:t>
+        </w:r>
+      </w:ins>
+      <w:ins w:id="238" w:author="Bobay, Luke Andrew" w:date="2026-08-28T14:50:00Z" w16du:dateUtc="2026-08-28T21:50:00Z">
+        <w:r>
+          <w:t xml:space="preserve"> </w:t>
+        </w:r>
+      </w:ins>
+      <w:ins w:id="239" w:author="Bobay, Luke Andrew" w:date="2026-08-28T15:07:00Z" w16du:dateUtc="2026-08-28T22:07:00Z">
+        <w:r>
+          <w:t>in the NCC (41–47°N)</w:t>
+        </w:r>
+        <w:r>
+          <w:t xml:space="preserve"> </w:t>
+        </w:r>
+        <w:r>
+          <w:t>on four research cruises</w:t>
+        </w:r>
+        <w:r>
+          <w:t xml:space="preserve"> </w:t>
+        </w:r>
+      </w:ins>
+      <w:ins w:id="240" w:author="Bobay, Luke Andrew" w:date="2026-08-28T14:54:00Z" w16du:dateUtc="2026-08-28T21:54:00Z">
+        <w:r>
+          <w:t>during Feb</w:t>
+        </w:r>
+      </w:ins>
+      <w:ins w:id="241" w:author="Bobay, Luke Andrew" w:date="2026-08-28T14:55:00Z" w16du:dateUtc="2026-08-28T21:55:00Z">
+        <w:r>
+          <w:t>ruary 17</w:t>
+        </w:r>
+      </w:ins>
+      <w:ins w:id="242" w:author="Bobay, Luke Andrew" w:date="2026-08-28T14:56:00Z" w16du:dateUtc="2026-08-28T21:56:00Z">
+        <w:r>
+          <w:t>–23, 2018; March 4–</w:t>
+        </w:r>
+      </w:ins>
+      <w:ins w:id="243" w:author="Bobay, Luke Andrew" w:date="2026-08-28T14:57:00Z" w16du:dateUtc="2026-08-28T21:57:00Z">
+        <w:r>
+          <w:t xml:space="preserve">12, 2019; March 3–11, 2022; and </w:t>
+        </w:r>
+      </w:ins>
+      <w:ins w:id="244" w:author="Bobay, Luke Andrew" w:date="2026-08-28T14:58:00Z" w16du:dateUtc="2026-08-28T21:58:00Z">
+        <w:r>
+          <w:t>February 17–26, 2023.</w:t>
+        </w:r>
+      </w:ins>
+      <w:ins w:id="245" w:author="Bobay, Luke Andrew" w:date="2026-08-28T15:01:00Z" w16du:dateUtc="2026-08-28T22:01:00Z">
+        <w:r>
+          <w:t xml:space="preserve"> </w:t>
+        </w:r>
+      </w:ins>
+      <w:ins w:id="246" w:author="Bobay, Luke Andrew" w:date="2026-08-28T15:03:00Z" w16du:dateUtc="2026-08-28T22:03:00Z">
+        <w:r>
+          <w:t>In</w:t>
+        </w:r>
+      </w:ins>
+      <w:ins w:id="247" w:author="Bobay, Luke Andrew" w:date="2026-08-28T15:01:00Z" w16du:dateUtc="2026-08-28T22:01:00Z">
+        <w:r>
+          <w:t xml:space="preserve"> 2018 and 2019, sampling took place</w:t>
+        </w:r>
+      </w:ins>
+      <w:ins w:id="248" w:author="Bobay, Luke Andrew" w:date="2026-08-28T15:18:00Z" w16du:dateUtc="2026-08-28T22:18:00Z">
+        <w:r>
+          <w:t xml:space="preserve"> at five stations</w:t>
+        </w:r>
+      </w:ins>
+      <w:ins w:id="249" w:author="Bobay, Luke Andrew" w:date="2026-08-28T15:01:00Z" w16du:dateUtc="2026-08-28T22:01:00Z">
+        <w:r>
+          <w:t xml:space="preserve"> </w:t>
+        </w:r>
+      </w:ins>
+      <w:ins w:id="250" w:author="Bobay, Luke Andrew" w:date="2026-08-28T15:02:00Z" w16du:dateUtc="2026-08-28T22:02:00Z">
+        <w:r>
+          <w:t>along</w:t>
+        </w:r>
+      </w:ins>
+      <w:ins w:id="251" w:author="Bobay, Luke Andrew" w:date="2026-08-28T15:18:00Z" w16du:dateUtc="2026-08-28T22:18:00Z">
+        <w:r>
+          <w:t xml:space="preserve"> each of</w:t>
+        </w:r>
+      </w:ins>
+      <w:ins w:id="252" w:author="Bobay, Luke Andrew" w:date="2026-08-28T15:02:00Z" w16du:dateUtc="2026-08-28T22:02:00Z">
+        <w:r>
+          <w:t xml:space="preserve"> two cross-shelf transects, which were sampled </w:t>
+        </w:r>
+      </w:ins>
+      <w:ins w:id="253" w:author="Bobay, Luke Andrew" w:date="2026-08-28T15:03:00Z" w16du:dateUtc="2026-08-28T22:03:00Z">
+        <w:r>
+          <w:t xml:space="preserve">multiple times during both day and night. </w:t>
+        </w:r>
+      </w:ins>
+      <w:ins w:id="254" w:author="Bobay, Luke Andrew" w:date="2026-08-28T15:04:00Z" w16du:dateUtc="2026-08-28T22:04:00Z">
+        <w:r>
+          <w:t>In 2022 and 2023, six cross-shelf transects</w:t>
+        </w:r>
+      </w:ins>
+      <w:ins w:id="255" w:author="Bobay, Luke Andrew" w:date="2026-08-28T15:19:00Z" w16du:dateUtc="2026-08-28T22:19:00Z">
+        <w:r>
+          <w:t xml:space="preserve"> with 4–6 stations each</w:t>
+        </w:r>
+      </w:ins>
+      <w:ins w:id="256" w:author="Bobay, Luke Andrew" w:date="2026-08-28T15:04:00Z" w16du:dateUtc="2026-08-28T22:04:00Z">
+        <w:r>
+          <w:t xml:space="preserve"> were sampled </w:t>
+        </w:r>
+      </w:ins>
+      <w:ins w:id="257" w:author="Bobay, Luke Andrew" w:date="2026-08-28T15:05:00Z" w16du:dateUtc="2026-08-28T22:05:00Z">
+        <w:r>
+          <w:t>once per cruise.</w:t>
+        </w:r>
+      </w:ins>
+      <w:ins w:id="258" w:author="Bobay, Luke Andrew" w:date="2026-08-28T17:44:00Z" w16du:dateUtc="2026-08-29T00:44:00Z">
+        <w:r>
+          <w:t xml:space="preserve"> (Fig. 1A)</w:t>
+        </w:r>
+      </w:ins>
+    </w:p>
+    <w:p>
+      <w:pPr>
+        <w:rPr>
+          <w:ins w:id="259" w:author="Bobay, Luke Andrew" w:date="2026-08-28T15:22:00Z" w16du:dateUtc="2026-08-28T22:22:00Z"/>
+        </w:rPr>
+      </w:pPr>
+      <w:ins w:id="260" w:author="Bobay, Luke Andrew" w:date="2026-08-28T15:08:00Z" w16du:dateUtc="2026-08-28T22:08:00Z">
+        <w:r>
+          <w:t>Plankton samples were collected using a c</w:t>
+        </w:r>
+      </w:ins>
+      <w:ins w:id="261" w:author="Bobay, Luke Andrew" w:date="2026-08-28T15:09:00Z" w16du:dateUtc="2026-08-28T22:09:00Z">
+        <w:r>
+          <w:t>oupled Multiple Opening/Closing Net and Environmental Sensing System (MOCNESS)</w:t>
+        </w:r>
+      </w:ins>
+      <w:ins w:id="262" w:author="Bobay, Luke Andrew" w:date="2026-08-28T15:11:00Z" w16du:dateUtc="2026-08-28T22:11:00Z">
+        <w:r>
+          <w:t xml:space="preserve"> which had two sets of </w:t>
+        </w:r>
+      </w:ins>
+      <w:ins w:id="263" w:author="Bobay, Luke Andrew" w:date="2026-08-28T15:13:00Z" w16du:dateUtc="2026-08-28T22:13:00Z">
+        <w:r>
+          <w:t xml:space="preserve">four </w:t>
+        </w:r>
+      </w:ins>
+      <w:ins w:id="264" w:author="Bobay, Luke Andrew" w:date="2026-08-28T15:11:00Z" w16du:dateUtc="2026-08-28T22:11:00Z">
+        <w:r>
+          <w:t>nets. One set of ne</w:t>
+        </w:r>
+      </w:ins>
+      <w:ins w:id="265" w:author="Bobay, Luke Andrew" w:date="2026-08-28T15:12:00Z" w16du:dateUtc="2026-08-28T22:12:00Z">
+        <w:r>
+          <w:t>ts had a 1-m</w:t>
+        </w:r>
+        <w:r>
+          <w:rPr>
+            <w:vertAlign w:val="superscript"/>
+          </w:rPr>
+          <w:t>2</w:t>
+        </w:r>
+        <w:r>
+          <w:t xml:space="preserve"> </w:t>
+        </w:r>
+      </w:ins>
+      <w:ins w:id="266" w:author="Bobay, Luke Andrew" w:date="2026-08-28T15:29:00Z" w16du:dateUtc="2026-08-28T22:29:00Z">
+        <w:r>
+          <w:t>mouth</w:t>
+        </w:r>
+      </w:ins>
+      <w:ins w:id="267" w:author="Bobay, Luke Andrew" w:date="2026-08-28T15:12:00Z" w16du:dateUtc="2026-08-28T22:12:00Z">
+        <w:r>
+          <w:t xml:space="preserve"> and 333-µm mesh, while the other set had a 4-m</w:t>
+        </w:r>
+        <w:r>
+          <w:rPr>
+            <w:vertAlign w:val="superscript"/>
+          </w:rPr>
+          <w:t>2</w:t>
+        </w:r>
+        <w:r>
+          <w:t xml:space="preserve"> </w:t>
+        </w:r>
+      </w:ins>
+      <w:ins w:id="268" w:author="Bobay, Luke Andrew" w:date="2026-08-28T15:29:00Z" w16du:dateUtc="2026-08-28T22:29:00Z">
+        <w:r>
+          <w:t>mouth</w:t>
+        </w:r>
+      </w:ins>
+      <w:ins w:id="269" w:author="Bobay, Luke Andrew" w:date="2026-08-28T15:12:00Z" w16du:dateUtc="2026-08-28T22:12:00Z">
+        <w:r>
+          <w:t xml:space="preserve"> </w:t>
+        </w:r>
+      </w:ins>
+      <w:ins w:id="270" w:author="Bobay, Luke Andrew" w:date="2026-08-28T15:13:00Z" w16du:dateUtc="2026-08-28T22:13:00Z">
+        <w:r>
+          <w:t xml:space="preserve">and 1000-µm mesh. </w:t>
+        </w:r>
+      </w:ins>
+      <w:ins w:id="271" w:author="Bobay, Luke Andrew" w:date="2026-08-28T15:15:00Z" w16du:dateUtc="2026-08-28T22:15:00Z">
+        <w:r>
+          <w:t>Each successive net was used to sample from approximately 100–75 m, 75–50 m, 50</w:t>
+        </w:r>
+      </w:ins>
+      <w:ins w:id="272" w:author="Bobay, Luke Andrew" w:date="2026-08-28T15:16:00Z" w16du:dateUtc="2026-08-28T22:16:00Z">
+        <w:r>
+          <w:t>–25 m, and 25–0 m depth</w:t>
+        </w:r>
+      </w:ins>
+      <w:ins w:id="273" w:author="Bobay, Luke Andrew" w:date="2026-08-28T15:27:00Z" w16du:dateUtc="2026-08-28T22:27:00Z">
+        <w:r>
+          <w:t xml:space="preserve">. At sampling stations where the seafloor was &lt; 100 m below the surface, the </w:t>
+        </w:r>
+      </w:ins>
+      <w:ins w:id="274" w:author="Bobay, Luke Andrew" w:date="2026-08-28T15:28:00Z" w16du:dateUtc="2026-08-28T22:28:00Z">
+        <w:r>
+          <w:t>MOCNESS was used to sample as close as possible (&lt; 10 m) to the seafloor</w:t>
+        </w:r>
+      </w:ins>
+      <w:ins w:id="275" w:author="Bobay, Luke Andrew" w:date="2026-08-28T15:16:00Z" w16du:dateUtc="2026-08-28T22:16:00Z">
+        <w:r>
+          <w:t xml:space="preserve">. </w:t>
+        </w:r>
+      </w:ins>
+      <w:ins w:id="276" w:author="Bobay, Luke Andrew" w:date="2026-08-28T15:17:00Z" w16du:dateUtc="2026-08-28T22:17:00Z">
+        <w:r>
+          <w:t>A depth sensor on the MOCNESS was used to monitor its depth</w:t>
+        </w:r>
+      </w:ins>
+      <w:ins w:id="277" w:author="Bobay, Luke Andrew" w:date="2026-08-28T17:56:00Z" w16du:dateUtc="2026-08-29T00:56:00Z">
+        <w:r>
+          <w:t xml:space="preserve"> (m)</w:t>
+        </w:r>
+      </w:ins>
+      <w:ins w:id="278" w:author="Bobay, Luke Andrew" w:date="2026-08-28T15:17:00Z" w16du:dateUtc="2026-08-28T22:17:00Z">
+        <w:r>
+          <w:t xml:space="preserve">, and temperature and conductivity sensors were used to measure </w:t>
+        </w:r>
+      </w:ins>
+      <w:ins w:id="279" w:author="Bobay, Luke Andrew" w:date="2026-08-28T15:18:00Z" w16du:dateUtc="2026-08-28T22:18:00Z">
+        <w:r>
+          <w:t>temperature</w:t>
+        </w:r>
+      </w:ins>
+      <w:ins w:id="280" w:author="Bobay, Luke Andrew" w:date="2026-08-28T17:56:00Z" w16du:dateUtc="2026-08-29T00:56:00Z">
+        <w:r>
+          <w:t xml:space="preserve"> (</w:t>
+        </w:r>
+      </w:ins>
+      <w:ins w:id="281" w:author="Bobay, Luke Andrew" w:date="2026-08-28T17:57:00Z" w16du:dateUtc="2026-08-29T00:57:00Z">
+        <w:r>
+          <w:t>°C)</w:t>
+        </w:r>
+      </w:ins>
+      <w:ins w:id="282" w:author="Bobay, Luke Andrew" w:date="2026-08-28T15:18:00Z" w16du:dateUtc="2026-08-28T22:18:00Z">
+        <w:r>
+          <w:t xml:space="preserve"> and salinity</w:t>
+        </w:r>
+      </w:ins>
+      <w:ins w:id="283" w:author="Bobay, Luke Andrew" w:date="2026-08-28T17:57:00Z" w16du:dateUtc="2026-08-29T00:57:00Z">
+        <w:r>
+          <w:t xml:space="preserve"> (PSU)</w:t>
+        </w:r>
+      </w:ins>
+      <w:ins w:id="284" w:author="Bobay, Luke Andrew" w:date="2026-08-28T15:18:00Z" w16du:dateUtc="2026-08-28T22:18:00Z">
+        <w:r>
+          <w:t xml:space="preserve"> </w:t>
+        </w:r>
+      </w:ins>
+      <w:ins w:id="285" w:author="Bobay, Luke Andrew" w:date="2026-08-28T17:54:00Z" w16du:dateUtc="2026-08-29T00:54:00Z">
+        <w:r>
+          <w:t xml:space="preserve">at a rate of 1 Hz </w:t>
+        </w:r>
+      </w:ins>
+      <w:ins w:id="286" w:author="Bobay, Luke Andrew" w:date="2026-08-28T15:18:00Z" w16du:dateUtc="2026-08-28T22:18:00Z">
+        <w:r>
+          <w:t>during sampl</w:t>
+        </w:r>
+      </w:ins>
+      <w:ins w:id="287" w:author="Bobay, Luke Andrew" w:date="2026-08-28T15:20:00Z" w16du:dateUtc="2026-08-28T22:20:00Z">
+        <w:r>
+          <w:t>ing</w:t>
+        </w:r>
+      </w:ins>
+      <w:ins w:id="288" w:author="Bobay, Luke Andrew" w:date="2026-08-28T17:41:00Z" w16du:dateUtc="2026-08-29T00:41:00Z">
+        <w:r>
+          <w:t xml:space="preserve">. </w:t>
+        </w:r>
+      </w:ins>
+      <w:ins w:id="289" w:author="Bobay, Luke Andrew" w:date="2026-08-28T17:42:00Z" w16du:dateUtc="2026-08-29T00:42:00Z">
+        <w:r>
+          <w:t>M</w:t>
+        </w:r>
+      </w:ins>
+      <w:ins w:id="290" w:author="Bobay, Luke Andrew" w:date="2026-08-28T17:41:00Z" w16du:dateUtc="2026-08-29T00:41:00Z">
+        <w:r>
+          <w:t>ean depth, temperature, and salinity du</w:t>
+        </w:r>
+      </w:ins>
+      <w:ins w:id="291" w:author="Bobay, Luke Andrew" w:date="2026-08-28T17:42:00Z" w16du:dateUtc="2026-08-29T00:42:00Z">
+        <w:r>
+          <w:t>ring each net tow was calculated</w:t>
+        </w:r>
+      </w:ins>
+      <w:ins w:id="292" w:author="Bobay, Luke Andrew" w:date="2026-08-28T17:44:00Z" w16du:dateUtc="2026-08-29T00:44:00Z">
+        <w:r>
+          <w:t xml:space="preserve"> (Fig. 1</w:t>
+        </w:r>
+      </w:ins>
+      <w:ins w:id="293" w:author="Bobay, Luke Andrew" w:date="2026-08-28T17:45:00Z" w16du:dateUtc="2026-08-29T00:45:00Z">
+        <w:r>
+          <w:t>B–C)</w:t>
+        </w:r>
+      </w:ins>
+      <w:ins w:id="294" w:author="Bobay, Luke Andrew" w:date="2026-08-28T15:20:00Z" w16du:dateUtc="2026-08-28T22:20:00Z">
+        <w:r>
+          <w:t xml:space="preserve">. Upon retrieval of the MOCNESS, bulk plankton samples were preserved in 95% ethanol. </w:t>
+        </w:r>
+      </w:ins>
+      <w:ins w:id="295" w:author="Bobay, Luke Andrew" w:date="2026-08-28T15:21:00Z" w16du:dateUtc="2026-08-28T22:21:00Z">
+        <w:r>
+          <w:t>All ichthyoplankton were then visually identified to the finest possible tax</w:t>
+        </w:r>
+      </w:ins>
+      <w:ins w:id="296" w:author="Bobay, Luke Andrew" w:date="2026-08-28T15:22:00Z" w16du:dateUtc="2026-08-28T22:22:00Z">
+        <w:r>
+          <w:t>onomic resolution (usually genus- or species-level) and counted.</w:t>
+        </w:r>
+      </w:ins>
+    </w:p>
+    <w:p>
+      <w:ins w:id="297" w:author="Bobay, Luke Andrew" w:date="2026-08-28T15:32:00Z" w16du:dateUtc="2026-08-28T22:32:00Z">
+        <w:r>
+          <w:t>At each sampling station, usually immediately prior to</w:t>
+        </w:r>
+      </w:ins>
+      <w:ins w:id="298" w:author="Bobay, Luke Andrew" w:date="2026-08-28T15:33:00Z" w16du:dateUtc="2026-08-28T22:33:00Z">
+        <w:r>
+          <w:t xml:space="preserve">, </w:t>
+        </w:r>
+      </w:ins>
+      <w:ins w:id="299" w:author="Bobay, Luke Andrew" w:date="2026-08-28T15:32:00Z" w16du:dateUtc="2026-08-28T22:32:00Z">
+        <w:r>
+          <w:t>but always with</w:t>
+        </w:r>
+      </w:ins>
+      <w:ins w:id="300" w:author="Bobay, Luke Andrew" w:date="2026-08-28T15:33:00Z" w16du:dateUtc="2026-08-28T22:33:00Z">
+        <w:r>
+          <w:t xml:space="preserve">in </w:t>
+        </w:r>
+      </w:ins>
+      <w:ins w:id="301" w:author="Bobay, Luke Andrew" w:date="2026-08-28T17:39:00Z" w16du:dateUtc="2026-08-29T00:39:00Z">
+        <w:r>
+          <w:t>3</w:t>
+        </w:r>
+      </w:ins>
+      <w:ins w:id="302" w:author="Bobay, Luke Andrew" w:date="2026-08-28T15:33:00Z" w16du:dateUtc="2026-08-28T22:33:00Z">
+        <w:r>
+          <w:t xml:space="preserve"> h of</w:t>
+        </w:r>
+      </w:ins>
+      <w:ins w:id="303" w:author="Bobay, Luke Andrew" w:date="2026-08-28T17:40:00Z" w16du:dateUtc="2026-08-29T00:40:00Z">
+        <w:r>
+          <w:t>,</w:t>
+        </w:r>
+      </w:ins>
+      <w:ins w:id="304" w:author="Bobay, Luke Andrew" w:date="2026-08-28T15:33:00Z" w16du:dateUtc="2026-08-28T22:33:00Z">
+        <w:r>
+          <w:t xml:space="preserve"> MOCNESS sampling, a </w:t>
+        </w:r>
+      </w:ins>
+      <w:ins w:id="305" w:author="Bobay, Luke Andrew" w:date="2026-08-28T17:40:00Z" w16du:dateUtc="2026-08-29T00:40:00Z">
+        <w:r>
+          <w:t>sensor package including a dissolved oxygen sensor</w:t>
+        </w:r>
+      </w:ins>
+      <w:ins w:id="306" w:author="Bobay, Luke Andrew" w:date="2026-08-28T15:34:00Z" w16du:dateUtc="2026-08-28T22:34:00Z">
+        <w:r>
+          <w:t xml:space="preserve"> </w:t>
+        </w:r>
+      </w:ins>
+      <w:ins w:id="307" w:author="Bobay, Luke Andrew" w:date="2026-08-28T17:55:00Z" w16du:dateUtc="2026-08-29T00:55:00Z">
+        <w:r>
+          <w:t xml:space="preserve">and a fluorescence probe </w:t>
+        </w:r>
+      </w:ins>
+      <w:ins w:id="308" w:author="Bobay, Luke Andrew" w:date="2026-08-28T15:34:00Z" w16du:dateUtc="2026-08-28T22:34:00Z">
+        <w:r>
+          <w:t>was towed vertically through the top 100 m of the water column</w:t>
+        </w:r>
+      </w:ins>
+      <w:ins w:id="309" w:author="Bobay, Luke Andrew" w:date="2026-08-28T15:46:00Z" w16du:dateUtc="2026-08-28T22:46:00Z">
+        <w:r>
+          <w:t xml:space="preserve">. </w:t>
+        </w:r>
+      </w:ins>
+      <w:ins w:id="310" w:author="Bobay, Luke Andrew" w:date="2026-08-28T17:46:00Z" w16du:dateUtc="2026-08-29T00:46:00Z">
+        <w:r>
+          <w:t xml:space="preserve">At sampling stations </w:t>
+        </w:r>
+        <w:r>
+          <w:t xml:space="preserve">where the seafloor was &lt; 100 m below the surface, the </w:t>
+        </w:r>
+        <w:r>
+          <w:t>sensor package</w:t>
+        </w:r>
+        <w:r>
+          <w:t xml:space="preserve"> was used to </w:t>
+        </w:r>
+      </w:ins>
+      <w:ins w:id="311" w:author="Bobay, Luke Andrew" w:date="2026-08-28T17:58:00Z" w16du:dateUtc="2026-08-29T00:58:00Z">
+        <w:r>
+          <w:t>measure dissolved oxygen (</w:t>
+        </w:r>
+      </w:ins>
+      <w:ins w:id="312" w:author="Bobay, Luke Andrew" w:date="2026-08-28T18:03:00Z" w16du:dateUtc="2026-08-29T01:03:00Z">
+        <w:r>
+          <w:t xml:space="preserve">DO; </w:t>
+        </w:r>
+      </w:ins>
+      <w:ins w:id="313" w:author="Bobay, Luke Andrew" w:date="2026-08-28T17:58:00Z" w16du:dateUtc="2026-08-29T00:58:00Z">
+        <w:r>
+          <w:t>mL L</w:t>
+        </w:r>
+        <w:r>
+          <w:rPr>
+            <w:vertAlign w:val="superscript"/>
+          </w:rPr>
+          <w:t>-1</w:t>
+        </w:r>
+        <w:r>
+          <w:t xml:space="preserve">) and </w:t>
+        </w:r>
+      </w:ins>
+      <w:ins w:id="314" w:author="Bobay, Luke Andrew" w:date="2026-08-28T18:03:00Z" w16du:dateUtc="2026-08-29T01:03:00Z">
+        <w:r>
+          <w:t>chlorophyll-</w:t>
+        </w:r>
+        <w:r>
+          <w:rPr>
+            <w:i/>
+            <w:iCs/>
+          </w:rPr>
+          <w:t>a</w:t>
+        </w:r>
+        <w:r>
+          <w:t xml:space="preserve"> </w:t>
+        </w:r>
+      </w:ins>
+      <w:ins w:id="315" w:author="Bobay, Luke Andrew" w:date="2026-08-28T17:58:00Z" w16du:dateUtc="2026-08-29T00:58:00Z">
+        <w:r>
+          <w:t>(</w:t>
+        </w:r>
+      </w:ins>
+      <w:ins w:id="316" w:author="Bobay, Luke Andrew" w:date="2026-08-28T18:03:00Z" w16du:dateUtc="2026-08-29T01:03:00Z">
+        <w:r>
+          <w:t>chl-</w:t>
+        </w:r>
+        <w:r>
+          <w:rPr>
+            <w:i/>
+            <w:iCs/>
+          </w:rPr>
+          <w:t>a</w:t>
+        </w:r>
+        <w:r>
+          <w:t>;</w:t>
+        </w:r>
+        <w:r>
+          <w:t xml:space="preserve"> </w:t>
+        </w:r>
+      </w:ins>
+      <w:ins w:id="317" w:author="Bobay, Luke Andrew" w:date="2026-08-28T18:00:00Z" w16du:dateUtc="2026-08-29T01:00:00Z">
+        <w:r>
+          <w:t>mg m</w:t>
+        </w:r>
+        <w:r>
+          <w:rPr>
+            <w:vertAlign w:val="superscript"/>
+          </w:rPr>
+          <w:t>-3</w:t>
+        </w:r>
+      </w:ins>
+      <w:ins w:id="318" w:author="Bobay, Luke Andrew" w:date="2026-08-28T18:01:00Z" w16du:dateUtc="2026-08-29T01:01:00Z">
+        <w:r>
+          <w:t>)</w:t>
+        </w:r>
+      </w:ins>
+      <w:ins w:id="319" w:author="Bobay, Luke Andrew" w:date="2026-08-28T17:46:00Z" w16du:dateUtc="2026-08-29T00:46:00Z">
+        <w:r>
+          <w:t xml:space="preserve"> as close as possible (&lt; 10 m) to the seafloor.</w:t>
+        </w:r>
+        <w:r>
+          <w:t xml:space="preserve"> </w:t>
+        </w:r>
+      </w:ins>
+      <w:ins w:id="320" w:author="Bobay, Luke Andrew" w:date="2026-08-28T18:03:00Z" w16du:dateUtc="2026-08-29T01:03:00Z">
+        <w:r>
+          <w:t>DO</w:t>
+        </w:r>
+      </w:ins>
+      <w:ins w:id="321" w:author="Bobay, Luke Andrew" w:date="2026-08-28T17:55:00Z" w16du:dateUtc="2026-08-29T00:55:00Z">
+        <w:r>
+          <w:t xml:space="preserve"> and </w:t>
+        </w:r>
+      </w:ins>
+      <w:ins w:id="322" w:author="Bobay, Luke Andrew" w:date="2026-08-28T18:01:00Z" w16du:dateUtc="2026-08-29T01:01:00Z">
+        <w:r>
+          <w:t>chl-</w:t>
+        </w:r>
+        <w:r>
+          <w:rPr>
+            <w:i/>
+            <w:iCs/>
+          </w:rPr>
+          <w:t>a</w:t>
+        </w:r>
+      </w:ins>
+      <w:ins w:id="323" w:author="Bobay, Luke Andrew" w:date="2026-08-28T17:55:00Z" w16du:dateUtc="2026-08-29T00:55:00Z">
+        <w:r>
+          <w:t xml:space="preserve"> values were </w:t>
+        </w:r>
+      </w:ins>
+      <w:ins w:id="324" w:author="Bobay, Luke Andrew" w:date="2026-08-28T17:56:00Z" w16du:dateUtc="2026-08-29T00:56:00Z">
+        <w:r>
+          <w:t xml:space="preserve">averaged within 0.5-m depth bins. Then, mean </w:t>
+        </w:r>
+      </w:ins>
+      <w:ins w:id="325" w:author="Bobay, Luke Andrew" w:date="2026-08-28T18:03:00Z" w16du:dateUtc="2026-08-29T01:03:00Z">
+        <w:r>
+          <w:t>DO</w:t>
+        </w:r>
+      </w:ins>
+      <w:ins w:id="326" w:author="Bobay, Luke Andrew" w:date="2026-08-28T17:56:00Z" w16du:dateUtc="2026-08-29T00:56:00Z">
+        <w:r>
+          <w:t xml:space="preserve"> </w:t>
+        </w:r>
+      </w:ins>
+      <w:ins w:id="327" w:author="Bobay, Luke Andrew" w:date="2026-08-28T18:01:00Z" w16du:dateUtc="2026-08-29T01:01:00Z">
+        <w:r>
+          <w:t xml:space="preserve">within the range of depths sampled by each corresponding MOCNESS net tow </w:t>
+        </w:r>
+      </w:ins>
+      <w:ins w:id="328" w:author="Bobay, Luke Andrew" w:date="2026-08-28T18:02:00Z" w16du:dateUtc="2026-08-29T01:02:00Z">
+        <w:r>
+          <w:t>was calculated</w:t>
+        </w:r>
+      </w:ins>
+      <w:ins w:id="329" w:author="Bobay, Luke Andrew" w:date="2026-08-28T18:12:00Z" w16du:dateUtc="2026-08-29T01:12:00Z">
+        <w:r>
+          <w:t xml:space="preserve"> (Fig. 1D)</w:t>
+        </w:r>
+      </w:ins>
+      <w:ins w:id="330" w:author="Bobay, Luke Andrew" w:date="2026-08-28T18:02:00Z" w16du:dateUtc="2026-08-29T01:02:00Z">
+        <w:r>
+          <w:t>. Mean chl-</w:t>
+        </w:r>
+        <w:r>
+          <w:rPr>
+            <w:i/>
+            <w:iCs/>
+          </w:rPr>
+          <w:t>a</w:t>
+        </w:r>
+      </w:ins>
+      <w:ins w:id="331" w:author="Bobay, Luke Andrew" w:date="2026-08-28T18:04:00Z" w16du:dateUtc="2026-08-29T01:04:00Z">
+        <w:r>
+          <w:rPr>
+            <w:i/>
+            <w:iCs/>
+          </w:rPr>
+          <w:t xml:space="preserve"> </w:t>
+        </w:r>
+        <w:r>
+          <w:t>was calculated</w:t>
+        </w:r>
+      </w:ins>
+      <w:ins w:id="332" w:author="Bobay, Luke Andrew" w:date="2026-08-28T18:02:00Z" w16du:dateUtc="2026-08-29T01:02:00Z">
+        <w:r>
+          <w:rPr>
+            <w:i/>
+            <w:iCs/>
+          </w:rPr>
+          <w:t xml:space="preserve"> </w:t>
+        </w:r>
+      </w:ins>
+      <w:ins w:id="333" w:author="Bobay, Luke Andrew" w:date="2026-08-28T18:04:00Z" w16du:dateUtc="2026-08-29T01:04:00Z">
+        <w:r>
+          <w:t>across all depths sampled</w:t>
+        </w:r>
+      </w:ins>
+      <w:ins w:id="334" w:author="Bobay, Luke Andrew" w:date="2026-08-28T18:10:00Z" w16du:dateUtc="2026-08-29T01:10:00Z">
+        <w:r>
+          <w:t xml:space="preserve"> at a given station</w:t>
+        </w:r>
+      </w:ins>
+      <w:ins w:id="335" w:author="Bobay, Luke Andrew" w:date="2026-08-28T18:12:00Z" w16du:dateUtc="2026-08-29T01:12:00Z">
+        <w:r>
+          <w:t xml:space="preserve"> (Fig. 1E)</w:t>
+        </w:r>
+      </w:ins>
+      <w:ins w:id="336" w:author="Bobay, Luke Andrew" w:date="2026-08-28T18:04:00Z" w16du:dateUtc="2026-08-29T01:04:00Z">
+        <w:r>
+          <w:t xml:space="preserve">, as </w:t>
+        </w:r>
+      </w:ins>
+      <w:ins w:id="337" w:author="Bobay, Luke Andrew" w:date="2026-08-28T18:05:00Z" w16du:dateUtc="2026-08-29T01:05:00Z">
+        <w:r>
+          <w:t xml:space="preserve">the vertical position of phytoplankton and zooplankton that are prey for larval fish change on </w:t>
+        </w:r>
+      </w:ins>
+      <w:ins w:id="338" w:author="Bobay, Luke Andrew" w:date="2026-08-28T18:06:00Z" w16du:dateUtc="2026-08-29T01:06:00Z">
+        <w:r>
+          <w:t>shorter temporal scales than those at which they likely influence the abundance of larval fish, so we expected</w:t>
+        </w:r>
+      </w:ins>
+      <w:ins w:id="339" w:author="Bobay, Luke Andrew" w:date="2026-08-28T18:11:00Z" w16du:dateUtc="2026-08-29T01:11:00Z">
+        <w:r>
+          <w:t xml:space="preserve"> depth-integrated</w:t>
+        </w:r>
+      </w:ins>
+      <w:ins w:id="340" w:author="Bobay, Luke Andrew" w:date="2026-08-28T18:06:00Z" w16du:dateUtc="2026-08-29T01:06:00Z">
+        <w:r>
+          <w:t xml:space="preserve"> chl-</w:t>
+        </w:r>
+        <w:r>
+          <w:rPr>
+            <w:i/>
+            <w:iCs/>
+          </w:rPr>
+          <w:t>a</w:t>
+        </w:r>
+      </w:ins>
+      <w:ins w:id="341" w:author="Bobay, Luke Andrew" w:date="2026-08-28T18:07:00Z" w16du:dateUtc="2026-08-29T01:07:00Z">
+        <w:r>
+          <w:t xml:space="preserve"> to be more relevant to ichthyoplankton abundance and assemblage composition </w:t>
+        </w:r>
+      </w:ins>
+      <w:ins w:id="342" w:author="Bobay, Luke Andrew" w:date="2026-08-28T18:11:00Z" w16du:dateUtc="2026-08-29T01:11:00Z">
+        <w:r>
+          <w:t>than depth-discrete chl-</w:t>
+        </w:r>
+        <w:r>
+          <w:rPr>
+            <w:i/>
+            <w:iCs/>
+          </w:rPr>
+          <w:t>a</w:t>
+        </w:r>
+        <w:r>
+          <w:t>.</w:t>
+        </w:r>
+      </w:ins>
     </w:p>
     <w:p>
       <w:pPr>
         <w:pStyle w:val="Heading2"/>
       </w:pPr>
       <w:r>
+        <w:lastRenderedPageBreak/>
         <w:t>2.2</w:t>
       </w:r>
       <w:r>
@@ -2057,18 +2732,18 @@
       <w:r>
         <w:t>All data analyses were performed in RStudio</w:t>
       </w:r>
-      <w:commentRangeStart w:id="231"/>
+      <w:commentRangeStart w:id="343"/>
       <w:r>
         <w:t xml:space="preserve">. </w:t>
       </w:r>
-      <w:commentRangeEnd w:id="231"/>
+      <w:commentRangeEnd w:id="343"/>
       <w:r>
         <w:rPr>
           <w:rStyle w:val="CommentReference"/>
           <w:sz w:val="24"/>
           <w:szCs w:val="24"/>
         </w:rPr>
-        <w:commentReference w:id="231"/>
+        <w:commentReference w:id="343"/>
       </w:r>
       <w:r>
         <w:t xml:space="preserve">To identify </w:t>
@@ -2097,18 +2772,18 @@
       <w:r>
         <w:t>To determine the number of clusters necessary</w:t>
       </w:r>
-      <w:commentRangeStart w:id="232"/>
+      <w:commentRangeStart w:id="344"/>
       <w:r>
         <w:t xml:space="preserve">, </w:t>
       </w:r>
-      <w:commentRangeEnd w:id="232"/>
+      <w:commentRangeEnd w:id="344"/>
       <w:r>
         <w:rPr>
           <w:rStyle w:val="CommentReference"/>
           <w:sz w:val="24"/>
           <w:szCs w:val="24"/>
         </w:rPr>
-        <w:commentReference w:id="232"/>
+        <w:commentReference w:id="344"/>
       </w:r>
       <w:r>
         <w:t xml:space="preserve">a dendrogram of the clustering results </w:t>
@@ -2213,21 +2888,21 @@
       <w:r>
         <w:t xml:space="preserve">. The stress of the ordination was determined and its </w:t>
       </w:r>
-      <w:commentRangeStart w:id="233"/>
+      <w:commentRangeStart w:id="345"/>
       <w:r>
         <w:t>relevance</w:t>
       </w:r>
       <w:r>
         <w:t xml:space="preserve"> </w:t>
       </w:r>
-      <w:commentRangeEnd w:id="233"/>
+      <w:commentRangeEnd w:id="345"/>
       <w:r>
         <w:rPr>
           <w:rStyle w:val="CommentReference"/>
           <w:sz w:val="24"/>
           <w:szCs w:val="24"/>
         </w:rPr>
-        <w:commentReference w:id="233"/>
+        <w:commentReference w:id="345"/>
       </w:r>
       <w:r>
         <w:t xml:space="preserve">in the context of our data was assessed with the </w:t>
@@ -2244,18 +2919,18 @@
       <w:r>
         <w:t xml:space="preserve">methodology </w:t>
       </w:r>
-      <w:commentRangeStart w:id="234"/>
+      <w:commentRangeStart w:id="346"/>
       <w:r>
         <w:t xml:space="preserve">suggested </w:t>
       </w:r>
-      <w:commentRangeEnd w:id="234"/>
+      <w:commentRangeEnd w:id="346"/>
       <w:r>
         <w:rPr>
           <w:rStyle w:val="CommentReference"/>
           <w:sz w:val="24"/>
           <w:szCs w:val="24"/>
         </w:rPr>
-        <w:commentReference w:id="234"/>
+        <w:commentReference w:id="346"/>
       </w:r>
       <w:r>
         <w:t>by Dexter et al. (2018)</w:t>
@@ -2299,11 +2974,31 @@
     </w:p>
     <w:p>
       <w:r>
-        <w:t xml:space="preserve">Post-thresholding there was a total of 38,363 individual larvae from 82 sampling stations. Among these remaining stations, all transects were represented (Fig. 1A). Oceanographic conditions during sampling varied with depth and interannually. Gradients in temperature (℃) differed between years with 2018 and 2023 exhibiting a peak in temperature around 25-meters depth followed by a general decrease in temperature with increasing depth. Years 2019 and 2022 had similarly minimal changes in temperature across depths (Fig. 1B). During all years, salinity (PSU) increased with depth while DO (mL L⁻¹) exhibited the opposite trend—lower at greater </w:t>
-      </w:r>
-      <w:r>
-        <w:lastRenderedPageBreak/>
-        <w:t>depths (Fig. 1C–D). Productivity was the most varied during 2018 though no significant difference in mean productivity was apparent across all four years (Fig. 1E).</w:t>
+        <w:t xml:space="preserve">Post-thresholding there was a total of 38,363 individual larvae from 82 sampling stations. Among these remaining stations, all transects were represented (Fig. 1A). Oceanographic conditions during sampling varied with depth and interannually. Gradients in temperature </w:t>
+      </w:r>
+      <w:del w:id="347" w:author="Bobay, Luke Andrew" w:date="2026-08-28T18:16:00Z" w16du:dateUtc="2026-08-29T01:16:00Z">
+        <w:r>
+          <w:delText xml:space="preserve">(℃) </w:delText>
+        </w:r>
+      </w:del>
+      <w:r>
+        <w:t>differed between years with 2018 and 2023 exhibiting a peak in temperature around 25-meters depth followed by a general decrease in temperature with increasing depth. Years 2019 and 2022 had similarly minimal changes in temperature across depths (Fig. 1B). During all years, salinity</w:t>
+      </w:r>
+      <w:del w:id="348" w:author="Bobay, Luke Andrew" w:date="2026-08-28T18:13:00Z" w16du:dateUtc="2026-08-29T01:13:00Z">
+        <w:r>
+          <w:delText xml:space="preserve"> (PSU)</w:delText>
+        </w:r>
+      </w:del>
+      <w:r>
+        <w:t xml:space="preserve"> increased with depth while DO</w:t>
+      </w:r>
+      <w:del w:id="349" w:author="Bobay, Luke Andrew" w:date="2026-08-28T18:13:00Z" w16du:dateUtc="2026-08-29T01:13:00Z">
+        <w:r>
+          <w:delText xml:space="preserve"> (mL L⁻¹)</w:delText>
+        </w:r>
+      </w:del>
+      <w:r>
+        <w:t xml:space="preserve"> exhibited the opposite trend—lower at greater depths (Fig. 1C–D). Productivity was the most varied during 2018 though no significant difference in mean productivity was apparent across all four years (Fig. 1E).</w:t>
       </w:r>
     </w:p>
     <w:p>
@@ -2387,6 +3082,7 @@
         </w:rPr>
       </w:pPr>
       <w:r>
+        <w:lastRenderedPageBreak/>
         <w:t xml:space="preserve">Net tows were mapped according to the latitude and longitude of the station at which sampling occurred. Points were colored according to the tow’s cluster assignment and color value was applied to represent the mean depth sampled by the tow. This was used to visualize the clustering of the LFC in horizontal and vertical space across the sampling area. The </w:t>
       </w:r>
       <w:r>
@@ -2775,7 +3471,7 @@
       </w:r>
     </w:p>
   </w:comment>
-  <w:comment w:id="211" w:author="Bobay, Luke Andrew" w:date="2026-08-28T14:44:00Z" w:initials="LB">
+  <w:comment w:id="215" w:author="Bobay, Luke Andrew" w:date="2026-08-28T14:44:00Z" w:initials="LB">
     <w:p>
       <w:pPr>
         <w:pStyle w:val="CommentText"/>
@@ -2791,7 +3487,7 @@
       </w:r>
     </w:p>
   </w:comment>
-  <w:comment w:id="231" w:author="McCloskey, Ross" w:date="2026-08-18T14:58:00Z" w:initials="RM">
+  <w:comment w:id="343" w:author="McCloskey, Ross" w:date="2026-08-18T14:58:00Z" w:initials="RM">
     <w:p>
       <w:pPr>
         <w:pStyle w:val="CommentText"/>
@@ -2807,7 +3503,7 @@
       </w:r>
     </w:p>
   </w:comment>
-  <w:comment w:id="232" w:author="McCloskey, Ross" w:date="2026-08-18T14:59:00Z" w:initials="RM">
+  <w:comment w:id="344" w:author="McCloskey, Ross" w:date="2026-08-18T14:59:00Z" w:initials="RM">
     <w:p>
       <w:pPr>
         <w:pStyle w:val="CommentText"/>
@@ -2823,7 +3519,7 @@
       </w:r>
     </w:p>
   </w:comment>
-  <w:comment w:id="233" w:author="McCloskey, Ross" w:date="2026-08-18T15:03:00Z" w:initials="RM">
+  <w:comment w:id="345" w:author="McCloskey, Ross" w:date="2026-08-18T15:03:00Z" w:initials="RM">
     <w:p>
       <w:pPr>
         <w:pStyle w:val="CommentText"/>
@@ -2839,7 +3535,7 @@
       </w:r>
     </w:p>
   </w:comment>
-  <w:comment w:id="234" w:author="McCloskey, Ross" w:date="2026-08-18T15:04:00Z" w:initials="RM">
+  <w:comment w:id="346" w:author="McCloskey, Ross" w:date="2026-08-18T15:04:00Z" w:initials="RM">
     <w:p>
       <w:pPr>
         <w:pStyle w:val="CommentText"/>

</xml_diff>

<commit_message>
Add GLMM results to manuscript
</commit_message>
<xml_diff>
--- a/Manuscript draft.docx
+++ b/Manuscript draft.docx
@@ -636,39 +636,57 @@
       </w:del>
       <w:del w:id="53" w:author="Bobay, Luke Andrew" w:date="2026-08-28T08:30:00Z" w16du:dateUtc="2026-08-28T15:30:00Z">
         <w:r>
-          <w:delText xml:space="preserve">it is vital to understand the dynamics of the larval fish community (LFC) in all seasons and the factors contributing to its composition and abundance. </w:delText>
-        </w:r>
-      </w:del>
-      <w:del w:id="54" w:author="Bobay, Luke Andrew" w:date="2026-08-28T08:37:00Z" w16du:dateUtc="2026-08-28T15:37:00Z">
-        <w:r>
-          <w:delText>Such knowledge is key for predicting future recruitment and monitoring stocks in a changing environment (Auth, 2011).</w:delText>
-        </w:r>
-      </w:del>
-      <w:commentRangeEnd w:id="51"/>
+          <w:delText xml:space="preserve">it is vital to understand the dynamics of the larval fish </w:delText>
+        </w:r>
+        <w:commentRangeStart w:id="54"/>
+        <w:r>
+          <w:delText>community (LFC)</w:delText>
+        </w:r>
+      </w:del>
+      <w:commentRangeEnd w:id="54"/>
       <w:r>
         <w:rPr>
           <w:rStyle w:val="CommentReference"/>
           <w:sz w:val="24"/>
           <w:szCs w:val="24"/>
         </w:rPr>
+        <w:commentReference w:id="54"/>
+      </w:r>
+      <w:del w:id="55" w:author="Bobay, Luke Andrew" w:date="2026-08-28T08:30:00Z" w16du:dateUtc="2026-08-28T15:30:00Z">
+        <w:r>
+          <w:delText xml:space="preserve"> in all seasons and the factors contributing to its composition and abundance. </w:delText>
+        </w:r>
+      </w:del>
+      <w:del w:id="56" w:author="Bobay, Luke Andrew" w:date="2026-08-28T08:37:00Z" w16du:dateUtc="2026-08-28T15:37:00Z">
+        <w:r>
+          <w:delText>Such knowledge is key for predicting future recruitment and monitoring stocks in a changing environment (Auth, 2011).</w:delText>
+        </w:r>
+      </w:del>
+      <w:commentRangeEnd w:id="51"/>
+      <w:r>
+        <w:rPr>
+          <w:rStyle w:val="CommentReference"/>
+          <w:sz w:val="24"/>
+          <w:szCs w:val="24"/>
+        </w:rPr>
         <w:commentReference w:id="51"/>
       </w:r>
-      <w:del w:id="55" w:author="Bobay, Luke Andrew" w:date="2026-08-28T08:37:00Z" w16du:dateUtc="2026-08-28T15:37:00Z">
+      <w:del w:id="57" w:author="Bobay, Luke Andrew" w:date="2026-08-28T08:37:00Z" w16du:dateUtc="2026-08-28T15:37:00Z">
         <w:r>
           <w:delText xml:space="preserve"> </w:delText>
         </w:r>
       </w:del>
-      <w:ins w:id="56" w:author="Bobay, Luke Andrew" w:date="2026-08-28T08:37:00Z" w16du:dateUtc="2026-08-28T15:37:00Z">
+      <w:ins w:id="58" w:author="Bobay, Luke Andrew" w:date="2026-08-28T08:37:00Z" w16du:dateUtc="2026-08-28T15:37:00Z">
         <w:r>
           <w:t xml:space="preserve">Further, </w:t>
         </w:r>
       </w:ins>
-      <w:ins w:id="57" w:author="Bobay, Luke Andrew" w:date="2026-08-28T08:39:00Z" w16du:dateUtc="2026-08-28T15:39:00Z">
+      <w:ins w:id="59" w:author="Bobay, Luke Andrew" w:date="2026-08-28T08:39:00Z" w16du:dateUtc="2026-08-28T15:39:00Z">
         <w:r>
           <w:t>while variation in ichthyoplankton assemblages is associated with oceanographic variability</w:t>
         </w:r>
       </w:ins>
-      <w:ins w:id="58" w:author="Bobay, Luke Andrew" w:date="2026-08-28T08:57:00Z" w16du:dateUtc="2026-08-28T15:57:00Z">
+      <w:ins w:id="60" w:author="Bobay, Luke Andrew" w:date="2026-08-28T08:57:00Z" w16du:dateUtc="2026-08-28T15:57:00Z">
         <w:r>
           <w:t xml:space="preserve"> </w:t>
         </w:r>
@@ -688,42 +706,42 @@
       <w:r>
         <w:fldChar w:fldCharType="end"/>
       </w:r>
-      <w:ins w:id="59" w:author="Bobay, Luke Andrew" w:date="2026-08-28T08:39:00Z" w16du:dateUtc="2026-08-28T15:39:00Z">
+      <w:ins w:id="61" w:author="Bobay, Luke Andrew" w:date="2026-08-28T08:39:00Z" w16du:dateUtc="2026-08-28T15:39:00Z">
         <w:r>
           <w:t xml:space="preserve">, </w:t>
         </w:r>
       </w:ins>
-      <w:ins w:id="60" w:author="Bobay, Luke Andrew" w:date="2026-08-28T08:40:00Z" w16du:dateUtc="2026-08-28T15:40:00Z">
+      <w:ins w:id="62" w:author="Bobay, Luke Andrew" w:date="2026-08-28T08:40:00Z" w16du:dateUtc="2026-08-28T15:40:00Z">
         <w:r>
           <w:t xml:space="preserve">less attention has been paid to </w:t>
         </w:r>
       </w:ins>
-      <w:ins w:id="61" w:author="Bobay, Luke Andrew" w:date="2026-08-28T08:41:00Z" w16du:dateUtc="2026-08-28T15:41:00Z">
+      <w:ins w:id="63" w:author="Bobay, Luke Andrew" w:date="2026-08-28T08:41:00Z" w16du:dateUtc="2026-08-28T15:41:00Z">
         <w:r>
           <w:t xml:space="preserve">fine-scale spatiotemporal and environmental </w:t>
         </w:r>
       </w:ins>
-      <w:ins w:id="62" w:author="Bobay, Luke Andrew" w:date="2026-08-28T08:42:00Z" w16du:dateUtc="2026-08-28T15:42:00Z">
+      <w:ins w:id="64" w:author="Bobay, Luke Andrew" w:date="2026-08-28T08:42:00Z" w16du:dateUtc="2026-08-28T15:42:00Z">
         <w:r>
           <w:t>factors tha</w:t>
         </w:r>
       </w:ins>
-      <w:ins w:id="63" w:author="Bobay, Luke Andrew" w:date="2026-08-28T08:43:00Z" w16du:dateUtc="2026-08-28T15:43:00Z">
+      <w:ins w:id="65" w:author="Bobay, Luke Andrew" w:date="2026-08-28T08:43:00Z" w16du:dateUtc="2026-08-28T15:43:00Z">
         <w:r>
           <w:t xml:space="preserve">t may have </w:t>
         </w:r>
       </w:ins>
-      <w:ins w:id="64" w:author="Bobay, Luke Andrew" w:date="2026-08-28T08:47:00Z" w16du:dateUtc="2026-08-28T15:47:00Z">
+      <w:ins w:id="66" w:author="Bobay, Luke Andrew" w:date="2026-08-28T08:47:00Z" w16du:dateUtc="2026-08-28T15:47:00Z">
         <w:r>
           <w:t xml:space="preserve">influence </w:t>
         </w:r>
       </w:ins>
-      <w:ins w:id="65" w:author="Bobay, Luke Andrew" w:date="2026-08-28T08:45:00Z" w16du:dateUtc="2026-08-28T15:45:00Z">
+      <w:ins w:id="67" w:author="Bobay, Luke Andrew" w:date="2026-08-28T08:45:00Z" w16du:dateUtc="2026-08-28T15:45:00Z">
         <w:r>
           <w:t>ichthyoplankton assemblage composition and abundance</w:t>
         </w:r>
       </w:ins>
-      <w:ins w:id="66" w:author="Bobay, Luke Andrew" w:date="2026-08-28T08:47:00Z" w16du:dateUtc="2026-08-28T15:47:00Z">
+      <w:ins w:id="68" w:author="Bobay, Luke Andrew" w:date="2026-08-28T08:47:00Z" w16du:dateUtc="2026-08-28T15:47:00Z">
         <w:r>
           <w:t xml:space="preserve"> through </w:t>
         </w:r>
@@ -734,7 +752,7 @@
           <w:t xml:space="preserve"> mechanisms</w:t>
         </w:r>
       </w:ins>
-      <w:ins w:id="67" w:author="Bobay, Luke Andrew" w:date="2026-08-28T08:45:00Z" w16du:dateUtc="2026-08-28T15:45:00Z">
+      <w:ins w:id="69" w:author="Bobay, Luke Andrew" w:date="2026-08-28T08:45:00Z" w16du:dateUtc="2026-08-28T15:45:00Z">
         <w:r>
           <w:t>.</w:t>
         </w:r>
@@ -743,44 +761,44 @@
     <w:p>
       <w:pPr>
         <w:rPr>
-          <w:del w:id="68" w:author="Bobay, Luke Andrew" w:date="2026-08-28T08:37:00Z" w16du:dateUtc="2026-08-28T15:37:00Z"/>
+          <w:del w:id="70" w:author="Bobay, Luke Andrew" w:date="2026-08-28T08:37:00Z" w16du:dateUtc="2026-08-28T15:37:00Z"/>
         </w:rPr>
       </w:pPr>
-      <w:commentRangeStart w:id="69"/>
-      <w:del w:id="70" w:author="Bobay, Luke Andrew" w:date="2026-08-28T08:37:00Z" w16du:dateUtc="2026-08-28T15:37:00Z">
+      <w:commentRangeStart w:id="71"/>
+      <w:del w:id="72" w:author="Bobay, Luke Andrew" w:date="2026-08-28T08:37:00Z" w16du:dateUtc="2026-08-28T15:37:00Z">
         <w:r>
           <w:delText xml:space="preserve">Of particular interest are the highly valuable fisheries on which coastal communities rely for economic, recreational, and cultural purposes, such as salmon. During the vulnerable ocean-entering stage, salmon smolt survival is influenced heavily by prey availability. Significant relationships have been found between winter ichthyoplankton and the juvenile salmon survival with larval biomass explaining between 34% and 85% of the variability in subsequent marine survival and adult returns (Daly et al., 2013). The nearshore region specifically provides optimal habitat for early developmental stages, offering protection from predators and ideal physiochemical conditions, in addition to a rich prey field (Pattrick et al., 2021). Knowing the dominant taxa of nearshore larval fish assemblages and their abundance can give an estimate of available prey for smolt as they enter the ocean. Thus, winter ichthyoplankton data could act as a useful metric in timing hatchery salmon release to optimize feeding conditions upon ocean </w:delText>
         </w:r>
-        <w:commentRangeStart w:id="71"/>
+        <w:commentRangeStart w:id="73"/>
         <w:r>
           <w:delText xml:space="preserve">entry </w:delText>
         </w:r>
-        <w:commentRangeEnd w:id="71"/>
+        <w:commentRangeEnd w:id="73"/>
         <w:r>
           <w:rPr>
             <w:rStyle w:val="CommentReference"/>
             <w:sz w:val="24"/>
             <w:szCs w:val="24"/>
           </w:rPr>
-          <w:commentReference w:id="71"/>
+          <w:commentReference w:id="73"/>
         </w:r>
         <w:r>
           <w:delText>(Daly et al., 2013). However, given the dynamic nature of the coastal environment in which pre-settlement larvae and smolt disperse, understanding the influence of environmental and spatiotemporal variables on larval distribution remains challenging (Pattrick et al., 2021).</w:delText>
         </w:r>
       </w:del>
-      <w:commentRangeEnd w:id="69"/>
+      <w:commentRangeEnd w:id="71"/>
       <w:r>
         <w:rPr>
           <w:rStyle w:val="CommentReference"/>
           <w:sz w:val="24"/>
           <w:szCs w:val="24"/>
         </w:rPr>
-        <w:commentReference w:id="69"/>
+        <w:commentReference w:id="71"/>
       </w:r>
     </w:p>
     <w:p>
-      <w:commentRangeStart w:id="72"/>
-      <w:del w:id="73" w:author="Bobay, Luke Andrew" w:date="2026-08-28T09:14:00Z" w16du:dateUtc="2026-08-28T16:14:00Z">
+      <w:commentRangeStart w:id="74"/>
+      <w:del w:id="75" w:author="Bobay, Luke Andrew" w:date="2026-08-28T09:14:00Z" w16du:dateUtc="2026-08-28T16:14:00Z">
         <w:r>
           <w:delText xml:space="preserve">While variation in larval assemblages is known to be associated with oceanographic variability, local factors may also influence their composition. </w:delText>
         </w:r>
@@ -788,12 +806,12 @@
       <w:r>
         <w:t xml:space="preserve">Broad oceanographic </w:t>
       </w:r>
-      <w:del w:id="74" w:author="Bobay, Luke Andrew" w:date="2026-08-28T09:20:00Z" w16du:dateUtc="2026-08-28T16:20:00Z">
+      <w:del w:id="76" w:author="Bobay, Luke Andrew" w:date="2026-08-28T09:20:00Z" w16du:dateUtc="2026-08-28T16:20:00Z">
         <w:r>
           <w:delText xml:space="preserve">indicators </w:delText>
         </w:r>
       </w:del>
-      <w:ins w:id="75" w:author="Bobay, Luke Andrew" w:date="2026-08-28T09:20:00Z" w16du:dateUtc="2026-08-28T16:20:00Z">
+      <w:ins w:id="77" w:author="Bobay, Luke Andrew" w:date="2026-08-28T09:20:00Z" w16du:dateUtc="2026-08-28T16:20:00Z">
         <w:r>
           <w:t>conditions</w:t>
         </w:r>
@@ -804,7 +822,7 @@
       <w:r>
         <w:t>such as</w:t>
       </w:r>
-      <w:ins w:id="76" w:author="Bobay, Luke Andrew" w:date="2026-08-28T09:22:00Z" w16du:dateUtc="2026-08-28T16:22:00Z">
+      <w:ins w:id="78" w:author="Bobay, Luke Andrew" w:date="2026-08-28T09:22:00Z" w16du:dateUtc="2026-08-28T16:22:00Z">
         <w:r>
           <w:t xml:space="preserve"> climate indices,</w:t>
         </w:r>
@@ -812,20 +830,20 @@
       <w:r>
         <w:t xml:space="preserve"> </w:t>
       </w:r>
-      <w:commentRangeStart w:id="77"/>
-      <w:commentRangeStart w:id="78"/>
       <w:commentRangeStart w:id="79"/>
-      <w:del w:id="80" w:author="Bobay, Luke Andrew" w:date="2026-08-28T09:32:00Z" w16du:dateUtc="2026-08-28T16:32:00Z">
+      <w:commentRangeStart w:id="80"/>
+      <w:commentRangeStart w:id="81"/>
+      <w:del w:id="82" w:author="Bobay, Luke Andrew" w:date="2026-08-28T09:32:00Z" w16du:dateUtc="2026-08-28T16:32:00Z">
         <w:r>
           <w:delText xml:space="preserve">water mass stability, </w:delText>
         </w:r>
       </w:del>
-      <w:del w:id="81" w:author="Bobay, Luke Andrew" w:date="2026-08-28T09:37:00Z" w16du:dateUtc="2026-08-28T16:37:00Z">
+      <w:del w:id="83" w:author="Bobay, Luke Andrew" w:date="2026-08-28T09:37:00Z" w16du:dateUtc="2026-08-28T16:37:00Z">
         <w:r>
           <w:delText>current direction</w:delText>
         </w:r>
       </w:del>
-      <w:ins w:id="82" w:author="Bobay, Luke Andrew" w:date="2026-08-28T09:37:00Z" w16du:dateUtc="2026-08-28T16:37:00Z">
+      <w:ins w:id="84" w:author="Bobay, Luke Andrew" w:date="2026-08-28T09:37:00Z" w16du:dateUtc="2026-08-28T16:37:00Z">
         <w:r>
           <w:t>circulation</w:t>
         </w:r>
@@ -833,12 +851,12 @@
       <w:r>
         <w:t xml:space="preserve">, and </w:t>
       </w:r>
-      <w:del w:id="83" w:author="Bobay, Luke Andrew" w:date="2026-08-28T09:25:00Z" w16du:dateUtc="2026-08-28T16:25:00Z">
+      <w:del w:id="85" w:author="Bobay, Luke Andrew" w:date="2026-08-28T09:25:00Z" w16du:dateUtc="2026-08-28T16:25:00Z">
         <w:r>
           <w:delText xml:space="preserve">local </w:delText>
         </w:r>
       </w:del>
-      <w:ins w:id="84" w:author="Bobay, Luke Andrew" w:date="2026-08-28T09:25:00Z" w16du:dateUtc="2026-08-28T16:25:00Z">
+      <w:ins w:id="86" w:author="Bobay, Luke Andrew" w:date="2026-08-28T09:25:00Z" w16du:dateUtc="2026-08-28T16:25:00Z">
         <w:r>
           <w:t>seafloor</w:t>
         </w:r>
@@ -849,37 +867,37 @@
       <w:r>
         <w:t xml:space="preserve">topography </w:t>
       </w:r>
-      <w:commentRangeEnd w:id="77"/>
+      <w:commentRangeEnd w:id="79"/>
       <w:r>
         <w:rPr>
           <w:rStyle w:val="CommentReference"/>
           <w:sz w:val="24"/>
           <w:szCs w:val="24"/>
         </w:rPr>
-        <w:commentReference w:id="77"/>
-      </w:r>
-      <w:commentRangeEnd w:id="78"/>
+        <w:commentReference w:id="79"/>
+      </w:r>
+      <w:commentRangeEnd w:id="80"/>
       <w:r>
         <w:rPr>
           <w:rStyle w:val="CommentReference"/>
           <w:sz w:val="24"/>
           <w:szCs w:val="24"/>
         </w:rPr>
-        <w:commentReference w:id="78"/>
-      </w:r>
-      <w:commentRangeEnd w:id="79"/>
+        <w:commentReference w:id="80"/>
+      </w:r>
+      <w:commentRangeEnd w:id="81"/>
       <w:r>
         <w:rPr>
           <w:rStyle w:val="CommentReference"/>
           <w:sz w:val="24"/>
           <w:szCs w:val="24"/>
         </w:rPr>
-        <w:commentReference w:id="79"/>
+        <w:commentReference w:id="81"/>
       </w:r>
       <w:r>
         <w:t xml:space="preserve">have </w:t>
       </w:r>
-      <w:del w:id="85" w:author="Bobay, Luke Andrew" w:date="2026-08-28T09:47:00Z" w16du:dateUtc="2026-08-28T16:47:00Z">
+      <w:del w:id="87" w:author="Bobay, Luke Andrew" w:date="2026-08-28T09:47:00Z" w16du:dateUtc="2026-08-28T16:47:00Z">
         <w:r>
           <w:delText xml:space="preserve">all </w:delText>
         </w:r>
@@ -887,7 +905,7 @@
       <w:r>
         <w:t>been found to influence the composition, abundance, and distribution of larval fish</w:t>
       </w:r>
-      <w:ins w:id="86" w:author="Bobay, Luke Andrew" w:date="2026-08-28T09:47:00Z" w16du:dateUtc="2026-08-28T16:47:00Z">
+      <w:ins w:id="88" w:author="Bobay, Luke Andrew" w:date="2026-08-28T09:47:00Z" w16du:dateUtc="2026-08-28T16:47:00Z">
         <w:r>
           <w:t xml:space="preserve"> </w:t>
         </w:r>
@@ -907,7 +925,7 @@
       <w:r>
         <w:fldChar w:fldCharType="end"/>
       </w:r>
-      <w:del w:id="87" w:author="Bobay, Luke Andrew" w:date="2026-08-28T09:37:00Z" w16du:dateUtc="2026-08-28T16:37:00Z">
+      <w:del w:id="89" w:author="Bobay, Luke Andrew" w:date="2026-08-28T09:37:00Z" w16du:dateUtc="2026-08-28T16:37:00Z">
         <w:r>
           <w:delText xml:space="preserve"> (Doyle et al., 2002; Roussel et al., 2010)</w:delText>
         </w:r>
@@ -915,7 +933,7 @@
       <w:r>
         <w:t xml:space="preserve">. </w:t>
       </w:r>
-      <w:del w:id="88" w:author="Bobay, Luke Andrew" w:date="2026-08-28T09:18:00Z" w16du:dateUtc="2026-08-28T16:18:00Z">
+      <w:del w:id="90" w:author="Bobay, Luke Andrew" w:date="2026-08-28T09:18:00Z" w16du:dateUtc="2026-08-28T16:18:00Z">
         <w:r>
           <w:delText>In the dynamic upwelling system of the NCC, the coastal upwelling transport index (CUTI) predicted taxa co-</w:delText>
         </w:r>
@@ -933,12 +951,12 @@
         <w:lastRenderedPageBreak/>
         <w:t xml:space="preserve">and temporal scales </w:t>
       </w:r>
-      <w:del w:id="89" w:author="Bobay, Luke Andrew" w:date="2026-08-28T10:12:00Z" w16du:dateUtc="2026-08-28T17:12:00Z">
+      <w:del w:id="91" w:author="Bobay, Luke Andrew" w:date="2026-08-28T10:12:00Z" w16du:dateUtc="2026-08-28T17:12:00Z">
         <w:r>
           <w:delText>is also relevant to</w:delText>
         </w:r>
       </w:del>
-      <w:ins w:id="90" w:author="Bobay, Luke Andrew" w:date="2026-08-28T10:12:00Z" w16du:dateUtc="2026-08-28T17:12:00Z">
+      <w:ins w:id="92" w:author="Bobay, Luke Andrew" w:date="2026-08-28T10:12:00Z" w16du:dateUtc="2026-08-28T17:12:00Z">
         <w:r>
           <w:t>also influences</w:t>
         </w:r>
@@ -946,17 +964,17 @@
       <w:r>
         <w:t xml:space="preserve"> </w:t>
       </w:r>
-      <w:del w:id="91" w:author="Bobay, Luke Andrew" w:date="2026-08-28T09:51:00Z" w16du:dateUtc="2026-08-28T16:51:00Z">
+      <w:del w:id="93" w:author="Bobay, Luke Andrew" w:date="2026-08-28T09:51:00Z" w16du:dateUtc="2026-08-28T16:51:00Z">
         <w:r>
           <w:delText>the LFC</w:delText>
         </w:r>
       </w:del>
-      <w:ins w:id="92" w:author="Bobay, Luke Andrew" w:date="2026-08-28T09:51:00Z" w16du:dateUtc="2026-08-28T16:51:00Z">
+      <w:ins w:id="94" w:author="Bobay, Luke Andrew" w:date="2026-08-28T09:51:00Z" w16du:dateUtc="2026-08-28T16:51:00Z">
         <w:r>
           <w:t>ichthyoplankton abundance and assemblage composition</w:t>
         </w:r>
       </w:ins>
-      <w:del w:id="93" w:author="Bobay, Luke Andrew" w:date="2026-08-28T09:52:00Z" w16du:dateUtc="2026-08-28T16:52:00Z">
+      <w:del w:id="95" w:author="Bobay, Luke Andrew" w:date="2026-08-28T09:52:00Z" w16du:dateUtc="2026-08-28T16:52:00Z">
         <w:r>
           <w:delText xml:space="preserve"> in coastal marine environments (Gallego-Zerrato et al., 2024)</w:delText>
         </w:r>
@@ -964,22 +982,22 @@
       <w:r>
         <w:t xml:space="preserve">. </w:t>
       </w:r>
-      <w:ins w:id="94" w:author="Bobay, Luke Andrew" w:date="2026-08-28T10:33:00Z" w16du:dateUtc="2026-08-28T17:33:00Z">
+      <w:ins w:id="96" w:author="Bobay, Luke Andrew" w:date="2026-08-28T10:33:00Z" w16du:dateUtc="2026-08-28T17:33:00Z">
         <w:r>
           <w:t>Environmental conditions, like temperature, salinity, and dissolved oxygen</w:t>
         </w:r>
       </w:ins>
-      <w:ins w:id="95" w:author="Bobay, Luke Andrew" w:date="2026-08-28T10:37:00Z" w16du:dateUtc="2026-08-28T17:37:00Z">
+      <w:ins w:id="97" w:author="Bobay, Luke Andrew" w:date="2026-08-28T10:37:00Z" w16du:dateUtc="2026-08-28T17:37:00Z">
         <w:r>
           <w:t xml:space="preserve">, may </w:t>
         </w:r>
       </w:ins>
-      <w:ins w:id="96" w:author="Bobay, Luke Andrew" w:date="2026-08-28T10:38:00Z" w16du:dateUtc="2026-08-28T17:38:00Z">
+      <w:ins w:id="98" w:author="Bobay, Luke Andrew" w:date="2026-08-28T10:38:00Z" w16du:dateUtc="2026-08-28T17:38:00Z">
         <w:r>
           <w:t>influence ichthyoplankton abundance and assemblage composition through direct physiological effects</w:t>
         </w:r>
       </w:ins>
-      <w:ins w:id="97" w:author="Bobay, Luke Andrew" w:date="2026-08-28T11:36:00Z" w16du:dateUtc="2026-08-28T18:36:00Z">
+      <w:ins w:id="99" w:author="Bobay, Luke Andrew" w:date="2026-08-28T11:36:00Z" w16du:dateUtc="2026-08-28T18:36:00Z">
         <w:r>
           <w:t xml:space="preserve"> </w:t>
         </w:r>
@@ -1002,27 +1020,27 @@
       <w:r>
         <w:fldChar w:fldCharType="end"/>
       </w:r>
-      <w:ins w:id="98" w:author="Bobay, Luke Andrew" w:date="2026-08-28T10:39:00Z" w16du:dateUtc="2026-08-28T17:39:00Z">
+      <w:ins w:id="100" w:author="Bobay, Luke Andrew" w:date="2026-08-28T10:39:00Z" w16du:dateUtc="2026-08-28T17:39:00Z">
         <w:r>
           <w:t xml:space="preserve">. Salinity may also </w:t>
         </w:r>
       </w:ins>
-      <w:ins w:id="99" w:author="Bobay, Luke Andrew" w:date="2026-08-28T10:41:00Z" w16du:dateUtc="2026-08-28T17:41:00Z">
+      <w:ins w:id="101" w:author="Bobay, Luke Andrew" w:date="2026-08-28T10:41:00Z" w16du:dateUtc="2026-08-28T17:41:00Z">
         <w:r>
           <w:t>be related to</w:t>
         </w:r>
       </w:ins>
-      <w:ins w:id="100" w:author="Bobay, Luke Andrew" w:date="2026-08-28T10:42:00Z" w16du:dateUtc="2026-08-28T17:42:00Z">
+      <w:ins w:id="102" w:author="Bobay, Luke Andrew" w:date="2026-08-28T10:42:00Z" w16du:dateUtc="2026-08-28T17:42:00Z">
         <w:r>
           <w:t xml:space="preserve"> the presence of distinct water masses that larval fishes are as</w:t>
         </w:r>
       </w:ins>
-      <w:ins w:id="101" w:author="Bobay, Luke Andrew" w:date="2026-08-28T10:43:00Z" w16du:dateUtc="2026-08-28T17:43:00Z">
+      <w:ins w:id="103" w:author="Bobay, Luke Andrew" w:date="2026-08-28T10:43:00Z" w16du:dateUtc="2026-08-28T17:43:00Z">
         <w:r>
           <w:t>sociated with</w:t>
         </w:r>
       </w:ins>
-      <w:ins w:id="102" w:author="Bobay, Luke Andrew" w:date="2026-08-28T11:37:00Z" w16du:dateUtc="2026-08-28T18:37:00Z">
+      <w:ins w:id="104" w:author="Bobay, Luke Andrew" w:date="2026-08-28T11:37:00Z" w16du:dateUtc="2026-08-28T18:37:00Z">
         <w:r>
           <w:t xml:space="preserve"> </w:t>
         </w:r>
@@ -1042,7 +1060,7 @@
       <w:r>
         <w:fldChar w:fldCharType="end"/>
       </w:r>
-      <w:ins w:id="103" w:author="Bobay, Luke Andrew" w:date="2026-08-28T10:43:00Z" w16du:dateUtc="2026-08-28T17:43:00Z">
+      <w:ins w:id="105" w:author="Bobay, Luke Andrew" w:date="2026-08-28T10:43:00Z" w16du:dateUtc="2026-08-28T17:43:00Z">
         <w:r>
           <w:t>, and chlorophyll-</w:t>
         </w:r>
@@ -1050,7 +1068,7 @@
           <w:rPr>
             <w:i/>
             <w:iCs/>
-            <w:rPrChange w:id="104" w:author="Bobay, Luke Andrew" w:date="2026-08-28T11:30:00Z" w16du:dateUtc="2026-08-28T18:30:00Z">
+            <w:rPrChange w:id="106" w:author="Bobay, Luke Andrew" w:date="2026-08-28T11:30:00Z" w16du:dateUtc="2026-08-28T18:30:00Z">
               <w:rPr/>
             </w:rPrChange>
           </w:rPr>
@@ -1060,27 +1078,27 @@
           <w:t xml:space="preserve"> concentration</w:t>
         </w:r>
       </w:ins>
-      <w:ins w:id="105" w:author="Bobay, Luke Andrew" w:date="2026-08-28T10:44:00Z" w16du:dateUtc="2026-08-28T17:44:00Z">
+      <w:ins w:id="107" w:author="Bobay, Luke Andrew" w:date="2026-08-28T10:44:00Z" w16du:dateUtc="2026-08-28T17:44:00Z">
         <w:r>
           <w:t xml:space="preserve"> </w:t>
         </w:r>
       </w:ins>
-      <w:ins w:id="106" w:author="Bobay, Luke Andrew" w:date="2026-08-28T11:31:00Z" w16du:dateUtc="2026-08-28T18:31:00Z">
+      <w:ins w:id="108" w:author="Bobay, Luke Andrew" w:date="2026-08-28T11:31:00Z" w16du:dateUtc="2026-08-28T18:31:00Z">
         <w:r>
           <w:t>is related to primary</w:t>
         </w:r>
       </w:ins>
-      <w:ins w:id="107" w:author="Bobay, Luke Andrew" w:date="2026-08-28T10:44:00Z" w16du:dateUtc="2026-08-28T17:44:00Z">
+      <w:ins w:id="109" w:author="Bobay, Luke Andrew" w:date="2026-08-28T10:44:00Z" w16du:dateUtc="2026-08-28T17:44:00Z">
         <w:r>
           <w:t xml:space="preserve"> productivity and </w:t>
         </w:r>
       </w:ins>
-      <w:ins w:id="108" w:author="Bobay, Luke Andrew" w:date="2026-08-28T11:32:00Z" w16du:dateUtc="2026-08-28T18:32:00Z">
+      <w:ins w:id="110" w:author="Bobay, Luke Andrew" w:date="2026-08-28T11:32:00Z" w16du:dateUtc="2026-08-28T18:32:00Z">
         <w:r>
           <w:t>may indirectly indicate favorable prey availability</w:t>
         </w:r>
       </w:ins>
-      <w:ins w:id="109" w:author="Bobay, Luke Andrew" w:date="2026-08-28T11:42:00Z" w16du:dateUtc="2026-08-28T18:42:00Z">
+      <w:ins w:id="111" w:author="Bobay, Luke Andrew" w:date="2026-08-28T11:42:00Z" w16du:dateUtc="2026-08-28T18:42:00Z">
         <w:r>
           <w:t xml:space="preserve"> </w:t>
         </w:r>
@@ -1100,13 +1118,13 @@
       <w:r>
         <w:fldChar w:fldCharType="end"/>
       </w:r>
-      <w:ins w:id="110" w:author="Bobay, Luke Andrew" w:date="2026-08-28T10:46:00Z" w16du:dateUtc="2026-08-28T17:46:00Z">
+      <w:ins w:id="112" w:author="Bobay, Luke Andrew" w:date="2026-08-28T10:46:00Z" w16du:dateUtc="2026-08-28T17:46:00Z">
         <w:r>
           <w:t xml:space="preserve">. </w:t>
         </w:r>
       </w:ins>
-      <w:commentRangeStart w:id="111"/>
-      <w:del w:id="112" w:author="Bobay, Luke Andrew" w:date="2026-08-28T10:46:00Z" w16du:dateUtc="2026-08-28T17:46:00Z">
+      <w:commentRangeStart w:id="113"/>
+      <w:del w:id="114" w:author="Bobay, Luke Andrew" w:date="2026-08-28T10:46:00Z" w16du:dateUtc="2026-08-28T17:46:00Z">
         <w:r>
           <w:delText>Early-li</w:delText>
         </w:r>
@@ -1116,35 +1134,35 @@
         <w:r>
           <w:delText xml:space="preserve">e distribution, growth, and survival of fish larvae is strongly influenced by temperature, salinity, and dissolved oxygen concentration (DO) (Auth, 2011). In fact, larval fish are particularly vulnerable to depressed DO, compared to adult conspecifics, with hypoxia exposure during early-life having long-term effects on growth and survival (Johnson-Colegrove et al., 2015). </w:delText>
         </w:r>
-        <w:commentRangeEnd w:id="111"/>
+        <w:commentRangeEnd w:id="113"/>
         <w:r>
           <w:rPr>
             <w:rStyle w:val="CommentReference"/>
             <w:sz w:val="24"/>
             <w:szCs w:val="24"/>
           </w:rPr>
-          <w:commentReference w:id="111"/>
+          <w:commentReference w:id="113"/>
         </w:r>
       </w:del>
       <w:r>
         <w:t>Such factors vary in space, alongside</w:t>
       </w:r>
-      <w:ins w:id="113" w:author="Bobay, Luke Andrew" w:date="2026-08-28T10:52:00Z" w16du:dateUtc="2026-08-28T17:52:00Z">
+      <w:ins w:id="115" w:author="Bobay, Luke Andrew" w:date="2026-08-28T10:52:00Z" w16du:dateUtc="2026-08-28T17:52:00Z">
         <w:r>
           <w:t xml:space="preserve"> other factors that influence ichthyoplankton assemblages. </w:t>
         </w:r>
       </w:ins>
-      <w:del w:id="114" w:author="Bobay, Luke Andrew" w:date="2026-08-28T10:54:00Z" w16du:dateUtc="2026-08-28T17:54:00Z">
+      <w:del w:id="116" w:author="Bobay, Luke Andrew" w:date="2026-08-28T10:54:00Z" w16du:dateUtc="2026-08-28T17:54:00Z">
         <w:r>
           <w:delText xml:space="preserve"> </w:delText>
         </w:r>
       </w:del>
-      <w:ins w:id="115" w:author="Bobay, Luke Andrew" w:date="2026-08-28T10:54:00Z" w16du:dateUtc="2026-08-28T17:54:00Z">
+      <w:ins w:id="117" w:author="Bobay, Luke Andrew" w:date="2026-08-28T10:54:00Z" w16du:dateUtc="2026-08-28T17:54:00Z">
         <w:r>
           <w:t>I</w:t>
         </w:r>
       </w:ins>
-      <w:del w:id="116" w:author="Bobay, Luke Andrew" w:date="2026-08-28T10:54:00Z" w16du:dateUtc="2026-08-28T17:54:00Z">
+      <w:del w:id="118" w:author="Bobay, Luke Andrew" w:date="2026-08-28T10:54:00Z" w16du:dateUtc="2026-08-28T17:54:00Z">
         <w:r>
           <w:delText>i</w:delText>
         </w:r>
@@ -1152,7 +1170,7 @@
       <w:r>
         <w:t>chthyoplankton assemblages generally reflect</w:t>
       </w:r>
-      <w:del w:id="117" w:author="Bobay, Luke Andrew" w:date="2026-08-28T11:09:00Z" w16du:dateUtc="2026-08-28T18:09:00Z">
+      <w:del w:id="119" w:author="Bobay, Luke Andrew" w:date="2026-08-28T11:09:00Z" w16du:dateUtc="2026-08-28T18:09:00Z">
         <w:r>
           <w:delText>ing</w:delText>
         </w:r>
@@ -1160,12 +1178,12 @@
       <w:r>
         <w:t xml:space="preserve"> the habitat </w:t>
       </w:r>
-      <w:del w:id="118" w:author="Bobay, Luke Andrew" w:date="2026-08-28T10:59:00Z" w16du:dateUtc="2026-08-28T17:59:00Z">
+      <w:del w:id="120" w:author="Bobay, Luke Andrew" w:date="2026-08-28T10:59:00Z" w16du:dateUtc="2026-08-28T17:59:00Z">
         <w:r>
           <w:delText xml:space="preserve">preference </w:delText>
         </w:r>
       </w:del>
-      <w:ins w:id="119" w:author="Bobay, Luke Andrew" w:date="2026-08-28T10:59:00Z" w16du:dateUtc="2026-08-28T17:59:00Z">
+      <w:ins w:id="121" w:author="Bobay, Luke Andrew" w:date="2026-08-28T10:59:00Z" w16du:dateUtc="2026-08-28T17:59:00Z">
         <w:r>
           <w:t>affinities</w:t>
         </w:r>
@@ -1176,17 +1194,17 @@
       <w:r>
         <w:t>of adults</w:t>
       </w:r>
-      <w:del w:id="120" w:author="Bobay, Luke Andrew" w:date="2026-08-28T11:05:00Z" w16du:dateUtc="2026-08-28T18:05:00Z">
+      <w:del w:id="122" w:author="Bobay, Luke Andrew" w:date="2026-08-28T11:05:00Z" w16du:dateUtc="2026-08-28T18:05:00Z">
         <w:r>
           <w:delText xml:space="preserve"> </w:delText>
         </w:r>
       </w:del>
-      <w:ins w:id="121" w:author="Bobay, Luke Andrew" w:date="2026-08-28T11:06:00Z" w16du:dateUtc="2026-08-28T18:06:00Z">
+      <w:ins w:id="123" w:author="Bobay, Luke Andrew" w:date="2026-08-28T11:06:00Z" w16du:dateUtc="2026-08-28T18:06:00Z">
         <w:r>
           <w:t xml:space="preserve"> </w:t>
         </w:r>
       </w:ins>
-      <w:del w:id="122" w:author="Bobay, Luke Andrew" w:date="2026-08-28T11:05:00Z" w16du:dateUtc="2026-08-28T18:05:00Z">
+      <w:del w:id="124" w:author="Bobay, Luke Andrew" w:date="2026-08-28T11:05:00Z" w16du:dateUtc="2026-08-28T18:05:00Z">
         <w:r>
           <w:delText>(Doyle et al., 2002)</w:delText>
         </w:r>
@@ -1209,17 +1227,17 @@
       <w:r>
         <w:t xml:space="preserve">. </w:t>
       </w:r>
-      <w:del w:id="123" w:author="Bobay, Luke Andrew" w:date="2026-08-28T11:07:00Z" w16du:dateUtc="2026-08-28T18:07:00Z">
+      <w:del w:id="125" w:author="Bobay, Luke Andrew" w:date="2026-08-28T11:07:00Z" w16du:dateUtc="2026-08-28T18:07:00Z">
         <w:r>
           <w:delText>The result is distinct horizontal community structuring with coastal upwelling, offshore oligotrophic, and shelf-slope transitional zones</w:delText>
         </w:r>
       </w:del>
-      <w:ins w:id="124" w:author="Bobay, Luke Andrew" w:date="2026-08-28T11:07:00Z" w16du:dateUtc="2026-08-28T18:07:00Z">
+      <w:ins w:id="126" w:author="Bobay, Luke Andrew" w:date="2026-08-28T11:07:00Z" w16du:dateUtc="2026-08-28T18:07:00Z">
         <w:r>
           <w:t xml:space="preserve">Proximity to spawning habitat, as well as local currents, can therefore also </w:t>
         </w:r>
       </w:ins>
-      <w:ins w:id="125" w:author="Bobay, Luke Andrew" w:date="2026-08-28T11:08:00Z" w16du:dateUtc="2026-08-28T18:08:00Z">
+      <w:ins w:id="127" w:author="Bobay, Luke Andrew" w:date="2026-08-28T11:08:00Z" w16du:dateUtc="2026-08-28T18:08:00Z">
         <w:r>
           <w:t>influence horizontal structuring of ichthyoplankton assemblages</w:t>
         </w:r>
@@ -1242,7 +1260,7 @@
       <w:r>
         <w:fldChar w:fldCharType="end"/>
       </w:r>
-      <w:del w:id="126" w:author="Bobay, Luke Andrew" w:date="2026-08-28T11:10:00Z" w16du:dateUtc="2026-08-28T18:10:00Z">
+      <w:del w:id="128" w:author="Bobay, Luke Andrew" w:date="2026-08-28T11:10:00Z" w16du:dateUtc="2026-08-28T18:10:00Z">
         <w:r>
           <w:delText>(Gleiber, 2020; Richardson et al., 1980)</w:delText>
         </w:r>
@@ -1250,7 +1268,7 @@
       <w:r>
         <w:t>. Larvae also aggregate vertically</w:t>
       </w:r>
-      <w:del w:id="127" w:author="Bobay, Luke Andrew" w:date="2026-08-28T11:11:00Z" w16du:dateUtc="2026-08-28T18:11:00Z">
+      <w:del w:id="129" w:author="Bobay, Luke Andrew" w:date="2026-08-28T11:11:00Z" w16du:dateUtc="2026-08-28T18:11:00Z">
         <w:r>
           <w:delText>, allowing them</w:delText>
         </w:r>
@@ -1258,7 +1276,7 @@
       <w:r>
         <w:t xml:space="preserve"> to reach or maintain a position within water masses of ideal environmental</w:t>
       </w:r>
-      <w:del w:id="128" w:author="Bobay, Luke Andrew" w:date="2026-08-28T11:19:00Z" w16du:dateUtc="2026-08-28T18:19:00Z">
+      <w:del w:id="130" w:author="Bobay, Luke Andrew" w:date="2026-08-28T11:19:00Z" w16du:dateUtc="2026-08-28T18:19:00Z">
         <w:r>
           <w:delText>, growth, and feeding</w:delText>
         </w:r>
@@ -1281,32 +1299,32 @@
       <w:r>
         <w:fldChar w:fldCharType="end"/>
       </w:r>
-      <w:del w:id="129" w:author="Bobay, Luke Andrew" w:date="2026-08-28T11:17:00Z" w16du:dateUtc="2026-08-28T18:17:00Z">
+      <w:del w:id="131" w:author="Bobay, Luke Andrew" w:date="2026-08-28T11:17:00Z" w16du:dateUtc="2026-08-28T18:17:00Z">
         <w:r>
           <w:delText xml:space="preserve">(Huebert et al., 2010; </w:delText>
         </w:r>
       </w:del>
-      <w:del w:id="130" w:author="Bobay, Luke Andrew" w:date="2026-08-28T11:26:00Z" w16du:dateUtc="2026-08-28T18:26:00Z">
+      <w:del w:id="132" w:author="Bobay, Luke Andrew" w:date="2026-08-28T11:26:00Z" w16du:dateUtc="2026-08-28T18:26:00Z">
         <w:r>
           <w:delText>Primo et al. 2012)</w:delText>
         </w:r>
       </w:del>
-      <w:ins w:id="131" w:author="Bobay, Luke Andrew" w:date="2026-08-28T11:20:00Z" w16du:dateUtc="2026-08-28T18:20:00Z">
+      <w:ins w:id="133" w:author="Bobay, Luke Andrew" w:date="2026-08-28T11:20:00Z" w16du:dateUtc="2026-08-28T18:20:00Z">
         <w:r>
           <w:t xml:space="preserve">, resulting in vertical </w:t>
         </w:r>
       </w:ins>
-      <w:ins w:id="132" w:author="Bobay, Luke Andrew" w:date="2026-08-28T11:21:00Z" w16du:dateUtc="2026-08-28T18:21:00Z">
+      <w:ins w:id="134" w:author="Bobay, Luke Andrew" w:date="2026-08-28T11:21:00Z" w16du:dateUtc="2026-08-28T18:21:00Z">
         <w:r>
           <w:t xml:space="preserve">ichthyoplankton assemblage </w:t>
         </w:r>
       </w:ins>
-      <w:ins w:id="133" w:author="Bobay, Luke Andrew" w:date="2026-08-28T11:55:00Z" w16du:dateUtc="2026-08-28T18:55:00Z">
+      <w:ins w:id="135" w:author="Bobay, Luke Andrew" w:date="2026-08-28T11:55:00Z" w16du:dateUtc="2026-08-28T18:55:00Z">
         <w:r>
           <w:t>variation</w:t>
         </w:r>
       </w:ins>
-      <w:ins w:id="134" w:author="Bobay, Luke Andrew" w:date="2026-08-28T11:21:00Z" w16du:dateUtc="2026-08-28T18:21:00Z">
+      <w:ins w:id="136" w:author="Bobay, Luke Andrew" w:date="2026-08-28T11:21:00Z" w16du:dateUtc="2026-08-28T18:21:00Z">
         <w:r>
           <w:t xml:space="preserve"> </w:t>
         </w:r>
@@ -1329,12 +1347,12 @@
       <w:r>
         <w:t xml:space="preserve">. </w:t>
       </w:r>
-      <w:del w:id="135" w:author="Bobay, Luke Andrew" w:date="2026-08-28T11:47:00Z" w16du:dateUtc="2026-08-28T18:47:00Z">
+      <w:del w:id="137" w:author="Bobay, Luke Andrew" w:date="2026-08-28T11:47:00Z" w16du:dateUtc="2026-08-28T18:47:00Z">
         <w:r>
           <w:delText>These vertical assemblages can differ further on fine, diel time scales. T</w:delText>
         </w:r>
       </w:del>
-      <w:ins w:id="136" w:author="Bobay, Luke Andrew" w:date="2026-08-28T11:47:00Z" w16du:dateUtc="2026-08-28T18:47:00Z">
+      <w:ins w:id="138" w:author="Bobay, Luke Andrew" w:date="2026-08-28T11:47:00Z" w16du:dateUtc="2026-08-28T18:47:00Z">
         <w:r>
           <w:t>Further, t</w:t>
         </w:r>
@@ -1342,12 +1360,12 @@
       <w:r>
         <w:t xml:space="preserve">here is evidence </w:t>
       </w:r>
-      <w:del w:id="137" w:author="Bobay, Luke Andrew" w:date="2026-08-28T11:57:00Z" w16du:dateUtc="2026-08-28T18:57:00Z">
+      <w:del w:id="139" w:author="Bobay, Luke Andrew" w:date="2026-08-28T11:57:00Z" w16du:dateUtc="2026-08-28T18:57:00Z">
         <w:r>
           <w:delText xml:space="preserve">for </w:delText>
         </w:r>
       </w:del>
-      <w:ins w:id="138" w:author="Bobay, Luke Andrew" w:date="2026-08-28T11:57:00Z" w16du:dateUtc="2026-08-28T18:57:00Z">
+      <w:ins w:id="140" w:author="Bobay, Luke Andrew" w:date="2026-08-28T11:57:00Z" w16du:dateUtc="2026-08-28T18:57:00Z">
         <w:r>
           <w:t>of</w:t>
         </w:r>
@@ -1358,7 +1376,7 @@
       <w:r>
         <w:t xml:space="preserve">diel vertical migration (DVM) in </w:t>
       </w:r>
-      <w:del w:id="139" w:author="Bobay, Luke Andrew" w:date="2026-08-28T11:47:00Z" w16du:dateUtc="2026-08-28T18:47:00Z">
+      <w:del w:id="141" w:author="Bobay, Luke Andrew" w:date="2026-08-28T11:47:00Z" w16du:dateUtc="2026-08-28T18:47:00Z">
         <w:r>
           <w:delText xml:space="preserve">the </w:delText>
         </w:r>
@@ -1369,12 +1387,12 @@
           <w:delText xml:space="preserve"> of many taxa</w:delText>
         </w:r>
       </w:del>
-      <w:ins w:id="140" w:author="Bobay, Luke Andrew" w:date="2026-08-28T11:47:00Z" w16du:dateUtc="2026-08-28T18:47:00Z">
+      <w:ins w:id="142" w:author="Bobay, Luke Andrew" w:date="2026-08-28T11:47:00Z" w16du:dateUtc="2026-08-28T18:47:00Z">
         <w:r>
           <w:t>some larval fishes</w:t>
         </w:r>
       </w:ins>
-      <w:ins w:id="141" w:author="Bobay, Luke Andrew" w:date="2026-08-28T11:59:00Z" w16du:dateUtc="2026-08-28T18:59:00Z">
+      <w:ins w:id="143" w:author="Bobay, Luke Andrew" w:date="2026-08-28T11:59:00Z" w16du:dateUtc="2026-08-28T18:59:00Z">
         <w:r>
           <w:t xml:space="preserve"> </w:t>
         </w:r>
@@ -1397,52 +1415,52 @@
       <w:r>
         <w:t xml:space="preserve">, </w:t>
       </w:r>
-      <w:del w:id="142" w:author="Bobay, Luke Andrew" w:date="2026-08-28T11:53:00Z" w16du:dateUtc="2026-08-28T18:53:00Z">
+      <w:del w:id="144" w:author="Bobay, Luke Andrew" w:date="2026-08-28T11:53:00Z" w16du:dateUtc="2026-08-28T18:53:00Z">
         <w:r>
           <w:delText xml:space="preserve">potentially </w:delText>
         </w:r>
       </w:del>
-      <w:del w:id="143" w:author="Bobay, Luke Andrew" w:date="2026-08-28T11:51:00Z" w16du:dateUtc="2026-08-28T18:51:00Z">
+      <w:del w:id="145" w:author="Bobay, Luke Andrew" w:date="2026-08-28T11:51:00Z" w16du:dateUtc="2026-08-28T18:51:00Z">
         <w:r>
           <w:delText>providing an adaptive advantage in</w:delText>
         </w:r>
       </w:del>
-      <w:del w:id="144" w:author="Bobay, Luke Andrew" w:date="2026-08-28T11:53:00Z" w16du:dateUtc="2026-08-28T18:53:00Z">
+      <w:del w:id="146" w:author="Bobay, Luke Andrew" w:date="2026-08-28T11:53:00Z" w16du:dateUtc="2026-08-28T18:53:00Z">
         <w:r>
           <w:delText xml:space="preserve"> predator avoidance</w:delText>
         </w:r>
       </w:del>
-      <w:del w:id="145" w:author="Bobay, Luke Andrew" w:date="2026-08-28T11:48:00Z" w16du:dateUtc="2026-08-28T18:48:00Z">
+      <w:del w:id="147" w:author="Bobay, Luke Andrew" w:date="2026-08-28T11:48:00Z" w16du:dateUtc="2026-08-28T18:48:00Z">
         <w:r>
           <w:delText>;</w:delText>
         </w:r>
       </w:del>
-      <w:del w:id="146" w:author="Bobay, Luke Andrew" w:date="2026-08-28T11:53:00Z" w16du:dateUtc="2026-08-28T18:53:00Z">
+      <w:del w:id="148" w:author="Bobay, Luke Andrew" w:date="2026-08-28T11:53:00Z" w16du:dateUtc="2026-08-28T18:53:00Z">
         <w:r>
           <w:delText xml:space="preserve"> light and temperature optimization</w:delText>
         </w:r>
       </w:del>
-      <w:del w:id="147" w:author="Bobay, Luke Andrew" w:date="2026-08-28T11:48:00Z" w16du:dateUtc="2026-08-28T18:48:00Z">
+      <w:del w:id="149" w:author="Bobay, Luke Andrew" w:date="2026-08-28T11:48:00Z" w16du:dateUtc="2026-08-28T18:48:00Z">
         <w:r>
           <w:delText>;</w:delText>
         </w:r>
       </w:del>
-      <w:del w:id="148" w:author="Bobay, Luke Andrew" w:date="2026-08-28T11:53:00Z" w16du:dateUtc="2026-08-28T18:53:00Z">
+      <w:del w:id="150" w:author="Bobay, Luke Andrew" w:date="2026-08-28T11:53:00Z" w16du:dateUtc="2026-08-28T18:53:00Z">
         <w:r>
           <w:delText xml:space="preserve"> and prey abundance (Haldorson et al., 1993; Primo et al., 2012)</w:delText>
         </w:r>
       </w:del>
-      <w:ins w:id="149" w:author="Bobay, Luke Andrew" w:date="2026-08-28T11:53:00Z" w16du:dateUtc="2026-08-28T18:53:00Z">
+      <w:ins w:id="151" w:author="Bobay, Luke Andrew" w:date="2026-08-28T11:53:00Z" w16du:dateUtc="2026-08-28T18:53:00Z">
         <w:r>
           <w:t xml:space="preserve">which may </w:t>
         </w:r>
       </w:ins>
-      <w:ins w:id="150" w:author="Bobay, Luke Andrew" w:date="2026-08-28T11:54:00Z" w16du:dateUtc="2026-08-28T18:54:00Z">
+      <w:ins w:id="152" w:author="Bobay, Luke Andrew" w:date="2026-08-28T11:54:00Z" w16du:dateUtc="2026-08-28T18:54:00Z">
         <w:r>
           <w:t xml:space="preserve">contribute to subdaily </w:t>
         </w:r>
       </w:ins>
-      <w:ins w:id="151" w:author="Bobay, Luke Andrew" w:date="2026-08-28T11:55:00Z" w16du:dateUtc="2026-08-28T18:55:00Z">
+      <w:ins w:id="153" w:author="Bobay, Luke Andrew" w:date="2026-08-28T11:55:00Z" w16du:dateUtc="2026-08-28T18:55:00Z">
         <w:r>
           <w:t>vertical variation in ichthyoplankton abundance and assemblage composition</w:t>
         </w:r>
@@ -1450,50 +1468,50 @@
       <w:r>
         <w:t xml:space="preserve">. Diel </w:t>
       </w:r>
-      <w:del w:id="152" w:author="Bobay, Luke Andrew" w:date="2026-08-28T13:29:00Z" w16du:dateUtc="2026-08-28T20:29:00Z">
+      <w:del w:id="154" w:author="Bobay, Luke Andrew" w:date="2026-08-28T13:29:00Z" w16du:dateUtc="2026-08-28T20:29:00Z">
         <w:r>
           <w:delText xml:space="preserve">effects </w:delText>
         </w:r>
       </w:del>
-      <w:ins w:id="153" w:author="Bobay, Luke Andrew" w:date="2026-08-28T13:29:00Z" w16du:dateUtc="2026-08-28T20:29:00Z">
+      <w:ins w:id="155" w:author="Bobay, Luke Andrew" w:date="2026-08-28T13:29:00Z" w16du:dateUtc="2026-08-28T20:29:00Z">
         <w:r>
           <w:t>variation</w:t>
         </w:r>
       </w:ins>
-      <w:ins w:id="154" w:author="Bobay, Luke Andrew" w:date="2026-08-28T13:30:00Z" w16du:dateUtc="2026-08-28T20:30:00Z">
+      <w:ins w:id="156" w:author="Bobay, Luke Andrew" w:date="2026-08-28T13:30:00Z" w16du:dateUtc="2026-08-28T20:30:00Z">
         <w:r>
           <w:t xml:space="preserve"> in ichthyoplankton abundance and assemblage composition</w:t>
         </w:r>
       </w:ins>
-      <w:ins w:id="155" w:author="Bobay, Luke Andrew" w:date="2026-08-28T13:29:00Z" w16du:dateUtc="2026-08-28T20:29:00Z">
+      <w:ins w:id="157" w:author="Bobay, Luke Andrew" w:date="2026-08-28T13:29:00Z" w16du:dateUtc="2026-08-28T20:29:00Z">
         <w:r>
           <w:t xml:space="preserve"> </w:t>
         </w:r>
       </w:ins>
-      <w:del w:id="156" w:author="Bobay, Luke Andrew" w:date="2026-08-28T13:30:00Z" w16du:dateUtc="2026-08-28T20:30:00Z">
+      <w:del w:id="158" w:author="Bobay, Luke Andrew" w:date="2026-08-28T13:30:00Z" w16du:dateUtc="2026-08-28T20:30:00Z">
         <w:r>
           <w:delText xml:space="preserve">such as migration and </w:delText>
         </w:r>
-        <w:commentRangeStart w:id="157"/>
+        <w:commentRangeStart w:id="159"/>
         <w:r>
           <w:delText xml:space="preserve">visual net avoidance </w:delText>
         </w:r>
       </w:del>
-      <w:commentRangeEnd w:id="157"/>
+      <w:commentRangeEnd w:id="159"/>
       <w:r>
         <w:rPr>
           <w:rStyle w:val="CommentReference"/>
           <w:sz w:val="24"/>
           <w:szCs w:val="24"/>
         </w:rPr>
-        <w:commentReference w:id="157"/>
-      </w:r>
-      <w:del w:id="158" w:author="Bobay, Luke Andrew" w:date="2026-08-28T13:30:00Z" w16du:dateUtc="2026-08-28T20:30:00Z">
+        <w:commentReference w:id="159"/>
+      </w:r>
+      <w:del w:id="160" w:author="Bobay, Luke Andrew" w:date="2026-08-28T13:30:00Z" w16du:dateUtc="2026-08-28T20:30:00Z">
         <w:r>
           <w:delText>are</w:delText>
         </w:r>
       </w:del>
-      <w:ins w:id="159" w:author="Bobay, Luke Andrew" w:date="2026-08-28T13:30:00Z" w16du:dateUtc="2026-08-28T20:30:00Z">
+      <w:ins w:id="161" w:author="Bobay, Luke Andrew" w:date="2026-08-28T13:30:00Z" w16du:dateUtc="2026-08-28T20:30:00Z">
         <w:r>
           <w:t>caused by DVM is</w:t>
         </w:r>
@@ -1501,17 +1519,17 @@
       <w:r>
         <w:t xml:space="preserve"> not accounted for, however, in common sampling schemes that are depth-integrated and </w:t>
       </w:r>
-      <w:del w:id="160" w:author="Bobay, Luke Andrew" w:date="2026-08-28T13:41:00Z" w16du:dateUtc="2026-08-28T20:41:00Z">
+      <w:del w:id="162" w:author="Bobay, Luke Andrew" w:date="2026-08-28T13:41:00Z" w16du:dateUtc="2026-08-28T20:41:00Z">
         <w:r>
           <w:delText>do not tow at multiple times of</w:delText>
         </w:r>
       </w:del>
-      <w:ins w:id="161" w:author="Bobay, Luke Andrew" w:date="2026-08-28T13:41:00Z" w16du:dateUtc="2026-08-28T20:41:00Z">
+      <w:ins w:id="163" w:author="Bobay, Luke Andrew" w:date="2026-08-28T13:41:00Z" w16du:dateUtc="2026-08-28T20:41:00Z">
         <w:r>
           <w:t xml:space="preserve">sample </w:t>
         </w:r>
       </w:ins>
-      <w:ins w:id="162" w:author="Bobay, Luke Andrew" w:date="2026-08-28T13:42:00Z" w16du:dateUtc="2026-08-28T20:42:00Z">
+      <w:ins w:id="164" w:author="Bobay, Luke Andrew" w:date="2026-08-28T13:42:00Z" w16du:dateUtc="2026-08-28T20:42:00Z">
         <w:r>
           <w:t>once during a</w:t>
         </w:r>
@@ -1519,22 +1537,22 @@
       <w:r>
         <w:t xml:space="preserve"> day</w:t>
       </w:r>
-      <w:ins w:id="163" w:author="Bobay, Luke Andrew" w:date="2026-08-28T13:55:00Z" w16du:dateUtc="2026-08-28T20:55:00Z">
+      <w:ins w:id="165" w:author="Bobay, Luke Andrew" w:date="2026-08-28T13:55:00Z" w16du:dateUtc="2026-08-28T20:55:00Z">
         <w:r>
           <w:t xml:space="preserve"> and, as a result, can </w:t>
         </w:r>
       </w:ins>
-      <w:ins w:id="164" w:author="Bobay, Luke Andrew" w:date="2026-08-28T13:56:00Z" w16du:dateUtc="2026-08-28T20:56:00Z">
+      <w:ins w:id="166" w:author="Bobay, Luke Andrew" w:date="2026-08-28T13:56:00Z" w16du:dateUtc="2026-08-28T20:56:00Z">
         <w:r>
           <w:t xml:space="preserve">be biased </w:t>
         </w:r>
       </w:ins>
-      <w:ins w:id="165" w:author="Bobay, Luke Andrew" w:date="2026-08-28T13:57:00Z" w16du:dateUtc="2026-08-28T20:57:00Z">
+      <w:ins w:id="167" w:author="Bobay, Luke Andrew" w:date="2026-08-28T13:57:00Z" w16du:dateUtc="2026-08-28T20:57:00Z">
         <w:r>
           <w:t>by DVM</w:t>
         </w:r>
       </w:ins>
-      <w:ins w:id="166" w:author="Bobay, Luke Andrew" w:date="2026-08-28T14:05:00Z" w16du:dateUtc="2026-08-28T21:05:00Z">
+      <w:ins w:id="168" w:author="Bobay, Luke Andrew" w:date="2026-08-28T14:05:00Z" w16du:dateUtc="2026-08-28T21:05:00Z">
         <w:r>
           <w:t xml:space="preserve"> </w:t>
         </w:r>
@@ -1554,12 +1572,12 @@
       <w:r>
         <w:fldChar w:fldCharType="end"/>
       </w:r>
-      <w:ins w:id="167" w:author="Bobay, Luke Andrew" w:date="2026-08-28T13:43:00Z" w16du:dateUtc="2026-08-28T20:43:00Z">
+      <w:ins w:id="169" w:author="Bobay, Luke Andrew" w:date="2026-08-28T13:43:00Z" w16du:dateUtc="2026-08-28T20:43:00Z">
         <w:r>
           <w:t xml:space="preserve">. We are not aware of </w:t>
         </w:r>
       </w:ins>
-      <w:ins w:id="168" w:author="Bobay, Luke Andrew" w:date="2026-08-28T13:44:00Z" w16du:dateUtc="2026-08-28T20:44:00Z">
+      <w:ins w:id="170" w:author="Bobay, Luke Andrew" w:date="2026-08-28T13:44:00Z" w16du:dateUtc="2026-08-28T20:44:00Z">
         <w:r>
           <w:t>any previous depth-stratified studies of ichthyoplankton abundance or assemblage composition during winter in the NCC</w:t>
         </w:r>
@@ -1567,24 +1585,24 @@
       <w:r>
         <w:t>.</w:t>
       </w:r>
-      <w:commentRangeEnd w:id="72"/>
+      <w:commentRangeEnd w:id="74"/>
       <w:r>
         <w:rPr>
           <w:rStyle w:val="CommentReference"/>
           <w:sz w:val="24"/>
           <w:szCs w:val="24"/>
         </w:rPr>
-        <w:commentReference w:id="72"/>
+        <w:commentReference w:id="74"/>
       </w:r>
       <w:r>
         <w:t xml:space="preserve"> </w:t>
       </w:r>
-      <w:ins w:id="169" w:author="Bobay, Luke Andrew" w:date="2026-08-28T13:45:00Z" w16du:dateUtc="2026-08-28T20:45:00Z">
+      <w:ins w:id="171" w:author="Bobay, Luke Andrew" w:date="2026-08-28T13:45:00Z" w16du:dateUtc="2026-08-28T20:45:00Z">
         <w:r>
           <w:t xml:space="preserve">Consequently, </w:t>
         </w:r>
       </w:ins>
-      <w:ins w:id="170" w:author="Bobay, Luke Andrew" w:date="2026-08-28T13:58:00Z" w16du:dateUtc="2026-08-28T20:58:00Z">
+      <w:ins w:id="172" w:author="Bobay, Luke Andrew" w:date="2026-08-28T13:58:00Z" w16du:dateUtc="2026-08-28T20:58:00Z">
         <w:r>
           <w:t xml:space="preserve">the degree of vertical variation in </w:t>
         </w:r>
@@ -1592,64 +1610,64 @@
           <w:t xml:space="preserve">ichthyoplankton abundance and assemblage composition during winter, the time of greatest larval fish abundance and diversity in this region, </w:t>
         </w:r>
       </w:ins>
-      <w:ins w:id="171" w:author="Bobay, Luke Andrew" w:date="2026-08-28T13:45:00Z" w16du:dateUtc="2026-08-28T20:45:00Z">
+      <w:ins w:id="173" w:author="Bobay, Luke Andrew" w:date="2026-08-28T13:45:00Z" w16du:dateUtc="2026-08-28T20:45:00Z">
         <w:r>
           <w:t>is unknown</w:t>
         </w:r>
       </w:ins>
-      <w:ins w:id="172" w:author="Bobay, Luke Andrew" w:date="2026-08-28T14:01:00Z" w16du:dateUtc="2026-08-28T21:01:00Z">
+      <w:ins w:id="174" w:author="Bobay, Luke Andrew" w:date="2026-08-28T14:01:00Z" w16du:dateUtc="2026-08-28T21:01:00Z">
         <w:r>
           <w:t>. Similarly,</w:t>
         </w:r>
       </w:ins>
-      <w:ins w:id="173" w:author="Bobay, Luke Andrew" w:date="2026-08-28T13:58:00Z" w16du:dateUtc="2026-08-28T20:58:00Z">
+      <w:ins w:id="175" w:author="Bobay, Luke Andrew" w:date="2026-08-28T13:58:00Z" w16du:dateUtc="2026-08-28T20:58:00Z">
         <w:r>
           <w:t xml:space="preserve"> </w:t>
         </w:r>
       </w:ins>
-      <w:ins w:id="174" w:author="Bobay, Luke Andrew" w:date="2026-08-28T14:03:00Z" w16du:dateUtc="2026-08-28T21:03:00Z">
+      <w:ins w:id="176" w:author="Bobay, Luke Andrew" w:date="2026-08-28T14:03:00Z" w16du:dateUtc="2026-08-28T21:03:00Z">
         <w:r>
           <w:t>the degree to which</w:t>
         </w:r>
       </w:ins>
-      <w:ins w:id="175" w:author="Bobay, Luke Andrew" w:date="2026-08-28T13:46:00Z" w16du:dateUtc="2026-08-28T20:46:00Z">
+      <w:ins w:id="177" w:author="Bobay, Luke Andrew" w:date="2026-08-28T13:46:00Z" w16du:dateUtc="2026-08-28T20:46:00Z">
         <w:r>
           <w:t xml:space="preserve"> </w:t>
         </w:r>
       </w:ins>
-      <w:ins w:id="176" w:author="Bobay, Luke Andrew" w:date="2026-08-28T13:50:00Z" w16du:dateUtc="2026-08-28T20:50:00Z">
+      <w:ins w:id="178" w:author="Bobay, Luke Andrew" w:date="2026-08-28T13:50:00Z" w16du:dateUtc="2026-08-28T20:50:00Z">
         <w:r>
           <w:t>the limited research o</w:t>
         </w:r>
       </w:ins>
-      <w:ins w:id="177" w:author="Bobay, Luke Andrew" w:date="2026-08-28T13:51:00Z" w16du:dateUtc="2026-08-28T20:51:00Z">
+      <w:ins w:id="179" w:author="Bobay, Luke Andrew" w:date="2026-08-28T13:51:00Z" w16du:dateUtc="2026-08-28T20:51:00Z">
         <w:r>
           <w:t xml:space="preserve">n environmental </w:t>
         </w:r>
       </w:ins>
-      <w:ins w:id="178" w:author="Bobay, Luke Andrew" w:date="2026-08-28T14:00:00Z" w16du:dateUtc="2026-08-28T21:00:00Z">
+      <w:ins w:id="180" w:author="Bobay, Luke Andrew" w:date="2026-08-28T14:00:00Z" w16du:dateUtc="2026-08-28T21:00:00Z">
         <w:r>
           <w:t>influences on</w:t>
         </w:r>
       </w:ins>
-      <w:ins w:id="179" w:author="Bobay, Luke Andrew" w:date="2026-08-28T14:03:00Z" w16du:dateUtc="2026-08-28T21:03:00Z">
+      <w:ins w:id="181" w:author="Bobay, Luke Andrew" w:date="2026-08-28T14:03:00Z" w16du:dateUtc="2026-08-28T21:03:00Z">
         <w:r>
           <w:t xml:space="preserve"> winter</w:t>
         </w:r>
       </w:ins>
-      <w:ins w:id="180" w:author="Bobay, Luke Andrew" w:date="2026-08-28T14:00:00Z" w16du:dateUtc="2026-08-28T21:00:00Z">
+      <w:ins w:id="182" w:author="Bobay, Luke Andrew" w:date="2026-08-28T14:00:00Z" w16du:dateUtc="2026-08-28T21:00:00Z">
         <w:r>
           <w:t xml:space="preserve"> ichthyoplankton assemblages is biased by DVM</w:t>
         </w:r>
       </w:ins>
-      <w:ins w:id="181" w:author="Bobay, Luke Andrew" w:date="2026-08-28T14:10:00Z" w16du:dateUtc="2026-08-28T21:10:00Z">
+      <w:ins w:id="183" w:author="Bobay, Luke Andrew" w:date="2026-08-28T14:10:00Z" w16du:dateUtc="2026-08-28T21:10:00Z">
         <w:r>
           <w:t xml:space="preserve"> is unknown.</w:t>
         </w:r>
       </w:ins>
-      <w:commentRangeStart w:id="182"/>
-      <w:commentRangeStart w:id="183"/>
-      <w:del w:id="184" w:author="Bobay, Luke Andrew" w:date="2026-08-28T14:00:00Z" w16du:dateUtc="2026-08-28T21:00:00Z">
+      <w:commentRangeStart w:id="184"/>
+      <w:commentRangeStart w:id="185"/>
+      <w:del w:id="186" w:author="Bobay, Luke Andrew" w:date="2026-08-28T14:00:00Z" w16du:dateUtc="2026-08-28T21:00:00Z">
         <w:r>
           <w:delText xml:space="preserve">What remains is a gap in the knowledge of </w:delText>
         </w:r>
@@ -1699,30 +1717,30 @@
       <w:r>
         <w:t>.</w:t>
       </w:r>
-      <w:commentRangeEnd w:id="182"/>
+      <w:commentRangeEnd w:id="184"/>
       <w:r>
         <w:rPr>
           <w:rStyle w:val="CommentReference"/>
           <w:sz w:val="24"/>
           <w:szCs w:val="24"/>
         </w:rPr>
-        <w:commentReference w:id="182"/>
-      </w:r>
-      <w:commentRangeEnd w:id="183"/>
+        <w:commentReference w:id="184"/>
+      </w:r>
+      <w:commentRangeEnd w:id="185"/>
       <w:r>
         <w:rPr>
           <w:rStyle w:val="CommentReference"/>
           <w:sz w:val="24"/>
           <w:szCs w:val="24"/>
         </w:rPr>
-        <w:commentReference w:id="183"/>
+        <w:commentReference w:id="185"/>
       </w:r>
     </w:p>
     <w:p>
       <w:r>
         <w:t>Using depth-discrete</w:t>
       </w:r>
-      <w:ins w:id="185" w:author="Bobay, Luke Andrew" w:date="2026-08-28T14:48:00Z" w16du:dateUtc="2026-08-28T21:48:00Z">
+      <w:ins w:id="187" w:author="Bobay, Luke Andrew" w:date="2026-08-28T14:48:00Z" w16du:dateUtc="2026-08-28T21:48:00Z">
         <w:r>
           <w:t xml:space="preserve"> winter</w:t>
         </w:r>
@@ -1730,7 +1748,7 @@
       <w:r>
         <w:t xml:space="preserve"> ichthyoplankton </w:t>
       </w:r>
-      <w:ins w:id="186" w:author="Bobay, Luke Andrew" w:date="2026-08-28T14:11:00Z" w16du:dateUtc="2026-08-28T21:11:00Z">
+      <w:ins w:id="188" w:author="Bobay, Luke Andrew" w:date="2026-08-28T14:11:00Z" w16du:dateUtc="2026-08-28T21:11:00Z">
         <w:r>
           <w:t xml:space="preserve">abundance </w:t>
         </w:r>
@@ -1738,37 +1756,37 @@
       <w:r>
         <w:t>data</w:t>
       </w:r>
-      <w:del w:id="187" w:author="Bobay, Luke Andrew" w:date="2026-08-28T14:49:00Z" w16du:dateUtc="2026-08-28T21:49:00Z">
+      <w:del w:id="189" w:author="Bobay, Luke Andrew" w:date="2026-08-28T14:49:00Z" w16du:dateUtc="2026-08-28T21:49:00Z">
         <w:r>
           <w:delText xml:space="preserve"> </w:delText>
         </w:r>
       </w:del>
-      <w:del w:id="188" w:author="Bobay, Luke Andrew" w:date="2026-08-28T14:11:00Z" w16du:dateUtc="2026-08-28T21:11:00Z">
+      <w:del w:id="190" w:author="Bobay, Luke Andrew" w:date="2026-08-28T14:11:00Z" w16du:dateUtc="2026-08-28T21:11:00Z">
         <w:r>
           <w:delText xml:space="preserve">sampled </w:delText>
         </w:r>
       </w:del>
-      <w:del w:id="189" w:author="Bobay, Luke Andrew" w:date="2026-08-28T14:49:00Z" w16du:dateUtc="2026-08-28T21:49:00Z">
+      <w:del w:id="191" w:author="Bobay, Luke Andrew" w:date="2026-08-28T14:49:00Z" w16du:dateUtc="2026-08-28T21:49:00Z">
         <w:r>
           <w:delText xml:space="preserve">on four two-week cruises across the </w:delText>
         </w:r>
       </w:del>
-      <w:del w:id="190" w:author="Bobay, Luke Andrew" w:date="2026-08-28T14:11:00Z" w16du:dateUtc="2026-08-28T21:11:00Z">
+      <w:del w:id="192" w:author="Bobay, Luke Andrew" w:date="2026-08-28T14:11:00Z" w16du:dateUtc="2026-08-28T21:11:00Z">
         <w:r>
           <w:delText>northern California Current system</w:delText>
         </w:r>
       </w:del>
-      <w:del w:id="191" w:author="Bobay, Luke Andrew" w:date="2026-08-28T14:49:00Z" w16du:dateUtc="2026-08-28T21:49:00Z">
+      <w:del w:id="193" w:author="Bobay, Luke Andrew" w:date="2026-08-28T14:49:00Z" w16du:dateUtc="2026-08-28T21:49:00Z">
         <w:r>
           <w:delText xml:space="preserve"> (41–47°N) during winter 2018</w:delText>
         </w:r>
       </w:del>
-      <w:del w:id="192" w:author="Bobay, Luke Andrew" w:date="2026-08-28T14:17:00Z" w16du:dateUtc="2026-08-28T21:17:00Z">
+      <w:del w:id="194" w:author="Bobay, Luke Andrew" w:date="2026-08-28T14:17:00Z" w16du:dateUtc="2026-08-28T21:17:00Z">
         <w:r>
           <w:delText>–</w:delText>
         </w:r>
       </w:del>
-      <w:del w:id="193" w:author="Bobay, Luke Andrew" w:date="2026-08-28T14:49:00Z" w16du:dateUtc="2026-08-28T21:49:00Z">
+      <w:del w:id="195" w:author="Bobay, Luke Andrew" w:date="2026-08-28T14:49:00Z" w16du:dateUtc="2026-08-28T21:49:00Z">
         <w:r>
           <w:delText>2023</w:delText>
         </w:r>
@@ -1776,107 +1794,107 @@
       <w:r>
         <w:t>, we</w:t>
       </w:r>
-      <w:del w:id="194" w:author="Bobay, Luke Andrew" w:date="2026-08-28T14:20:00Z" w16du:dateUtc="2026-08-28T21:20:00Z">
+      <w:del w:id="196" w:author="Bobay, Luke Andrew" w:date="2026-08-28T14:20:00Z" w16du:dateUtc="2026-08-28T21:20:00Z">
         <w:r>
           <w:delText xml:space="preserve"> </w:delText>
         </w:r>
       </w:del>
-      <w:del w:id="195" w:author="Bobay, Luke Andrew" w:date="2026-08-28T14:18:00Z" w16du:dateUtc="2026-08-28T21:18:00Z">
+      <w:del w:id="197" w:author="Bobay, Luke Andrew" w:date="2026-08-28T14:18:00Z" w16du:dateUtc="2026-08-28T21:18:00Z">
         <w:r>
           <w:delText>investigated the LFC</w:delText>
         </w:r>
       </w:del>
-      <w:del w:id="196" w:author="Bobay, Luke Andrew" w:date="2026-08-28T14:20:00Z" w16du:dateUtc="2026-08-28T21:20:00Z">
+      <w:del w:id="198" w:author="Bobay, Luke Andrew" w:date="2026-08-28T14:20:00Z" w16du:dateUtc="2026-08-28T21:20:00Z">
         <w:r>
           <w:delText xml:space="preserve"> to </w:delText>
         </w:r>
       </w:del>
-      <w:del w:id="197" w:author="Bobay, Luke Andrew" w:date="2026-08-28T14:19:00Z" w16du:dateUtc="2026-08-28T21:19:00Z">
+      <w:del w:id="199" w:author="Bobay, Luke Andrew" w:date="2026-08-28T14:19:00Z" w16du:dateUtc="2026-08-28T21:19:00Z">
         <w:r>
           <w:delText>characterize assemblages and identify factors influencing the composition thereof</w:delText>
         </w:r>
       </w:del>
-      <w:ins w:id="198" w:author="Bobay, Luke Andrew" w:date="2026-08-28T14:21:00Z" w16du:dateUtc="2026-08-28T21:21:00Z">
+      <w:ins w:id="200" w:author="Bobay, Luke Andrew" w:date="2026-08-28T14:21:00Z" w16du:dateUtc="2026-08-28T21:21:00Z">
         <w:r>
           <w:t xml:space="preserve"> </w:t>
         </w:r>
       </w:ins>
-      <w:ins w:id="199" w:author="Bobay, Luke Andrew" w:date="2026-08-28T14:22:00Z" w16du:dateUtc="2026-08-28T21:22:00Z">
+      <w:ins w:id="201" w:author="Bobay, Luke Andrew" w:date="2026-08-28T14:22:00Z" w16du:dateUtc="2026-08-28T21:22:00Z">
         <w:r>
           <w:t>(</w:t>
         </w:r>
       </w:ins>
-      <w:ins w:id="200" w:author="Bobay, Luke Andrew" w:date="2026-08-28T14:21:00Z" w16du:dateUtc="2026-08-28T21:21:00Z">
+      <w:ins w:id="202" w:author="Bobay, Luke Andrew" w:date="2026-08-28T14:21:00Z" w16du:dateUtc="2026-08-28T21:21:00Z">
         <w:r>
           <w:t>1) characterize</w:t>
         </w:r>
       </w:ins>
-      <w:ins w:id="201" w:author="Bobay, Luke Andrew" w:date="2026-08-28T14:26:00Z" w16du:dateUtc="2026-08-28T21:26:00Z">
+      <w:ins w:id="203" w:author="Bobay, Luke Andrew" w:date="2026-08-28T14:26:00Z" w16du:dateUtc="2026-08-28T21:26:00Z">
         <w:r>
           <w:t>d</w:t>
         </w:r>
       </w:ins>
-      <w:ins w:id="202" w:author="Bobay, Luke Andrew" w:date="2026-08-28T14:21:00Z" w16du:dateUtc="2026-08-28T21:21:00Z">
+      <w:ins w:id="204" w:author="Bobay, Luke Andrew" w:date="2026-08-28T14:21:00Z" w16du:dateUtc="2026-08-28T21:21:00Z">
         <w:r>
           <w:t xml:space="preserve"> winter ichthyoplankton assemblages</w:t>
         </w:r>
       </w:ins>
-      <w:ins w:id="203" w:author="Bobay, Luke Andrew" w:date="2026-08-28T14:49:00Z" w16du:dateUtc="2026-08-28T21:49:00Z">
+      <w:ins w:id="205" w:author="Bobay, Luke Andrew" w:date="2026-08-28T14:49:00Z" w16du:dateUtc="2026-08-28T21:49:00Z">
         <w:r>
           <w:t xml:space="preserve"> of the NCC</w:t>
         </w:r>
       </w:ins>
-      <w:ins w:id="204" w:author="Bobay, Luke Andrew" w:date="2026-08-28T14:21:00Z" w16du:dateUtc="2026-08-28T21:21:00Z">
+      <w:ins w:id="206" w:author="Bobay, Luke Andrew" w:date="2026-08-28T14:21:00Z" w16du:dateUtc="2026-08-28T21:21:00Z">
         <w:r>
           <w:t xml:space="preserve">, </w:t>
         </w:r>
       </w:ins>
-      <w:ins w:id="205" w:author="Bobay, Luke Andrew" w:date="2026-08-28T14:22:00Z" w16du:dateUtc="2026-08-28T21:22:00Z">
+      <w:ins w:id="207" w:author="Bobay, Luke Andrew" w:date="2026-08-28T14:22:00Z" w16du:dateUtc="2026-08-28T21:22:00Z">
         <w:r>
           <w:t>(</w:t>
         </w:r>
       </w:ins>
-      <w:ins w:id="206" w:author="Bobay, Luke Andrew" w:date="2026-08-28T14:21:00Z" w16du:dateUtc="2026-08-28T21:21:00Z">
+      <w:ins w:id="208" w:author="Bobay, Luke Andrew" w:date="2026-08-28T14:21:00Z" w16du:dateUtc="2026-08-28T21:21:00Z">
         <w:r>
           <w:t xml:space="preserve">2) </w:t>
         </w:r>
       </w:ins>
-      <w:ins w:id="207" w:author="Bobay, Luke Andrew" w:date="2026-08-28T14:23:00Z" w16du:dateUtc="2026-08-28T21:23:00Z">
+      <w:ins w:id="209" w:author="Bobay, Luke Andrew" w:date="2026-08-28T14:23:00Z" w16du:dateUtc="2026-08-28T21:23:00Z">
         <w:r>
           <w:t>use</w:t>
         </w:r>
       </w:ins>
-      <w:ins w:id="208" w:author="Bobay, Luke Andrew" w:date="2026-08-28T14:26:00Z" w16du:dateUtc="2026-08-28T21:26:00Z">
+      <w:ins w:id="210" w:author="Bobay, Luke Andrew" w:date="2026-08-28T14:26:00Z" w16du:dateUtc="2026-08-28T21:26:00Z">
         <w:r>
           <w:t>d</w:t>
         </w:r>
       </w:ins>
-      <w:ins w:id="209" w:author="Bobay, Luke Andrew" w:date="2026-08-28T14:23:00Z" w16du:dateUtc="2026-08-28T21:23:00Z">
+      <w:ins w:id="211" w:author="Bobay, Luke Andrew" w:date="2026-08-28T14:23:00Z" w16du:dateUtc="2026-08-28T21:23:00Z">
         <w:r>
           <w:t xml:space="preserve"> fine-scale spatiotemporal and environmental factors to explain variation in winter ichthyoplankton assemblage composition</w:t>
         </w:r>
       </w:ins>
-      <w:ins w:id="210" w:author="Bobay, Luke Andrew" w:date="2026-08-28T14:24:00Z" w16du:dateUtc="2026-08-28T21:24:00Z">
+      <w:ins w:id="212" w:author="Bobay, Luke Andrew" w:date="2026-08-28T14:24:00Z" w16du:dateUtc="2026-08-28T21:24:00Z">
         <w:r>
           <w:t xml:space="preserve">, and (3) </w:t>
         </w:r>
       </w:ins>
-      <w:ins w:id="211" w:author="Bobay, Luke Andrew" w:date="2026-08-28T14:26:00Z" w16du:dateUtc="2026-08-28T21:26:00Z">
+      <w:ins w:id="213" w:author="Bobay, Luke Andrew" w:date="2026-08-28T14:26:00Z" w16du:dateUtc="2026-08-28T21:26:00Z">
         <w:r>
           <w:t xml:space="preserve">examined </w:t>
         </w:r>
       </w:ins>
-      <w:ins w:id="212" w:author="Bobay, Luke Andrew" w:date="2026-08-28T14:27:00Z" w16du:dateUtc="2026-08-28T21:27:00Z">
+      <w:ins w:id="214" w:author="Bobay, Luke Andrew" w:date="2026-08-28T14:27:00Z" w16du:dateUtc="2026-08-28T21:27:00Z">
         <w:r>
           <w:t xml:space="preserve">taxon-specific </w:t>
         </w:r>
       </w:ins>
-      <w:ins w:id="213" w:author="Bobay, Luke Andrew" w:date="2026-08-28T14:28:00Z" w16du:dateUtc="2026-08-28T21:28:00Z">
+      <w:ins w:id="215" w:author="Bobay, Luke Andrew" w:date="2026-08-28T14:28:00Z" w16du:dateUtc="2026-08-28T21:28:00Z">
         <w:r>
           <w:t xml:space="preserve">diel variation in vertical abundance </w:t>
         </w:r>
       </w:ins>
-      <w:ins w:id="214" w:author="Bobay, Luke Andrew" w:date="2026-08-28T14:29:00Z" w16du:dateUtc="2026-08-28T21:29:00Z">
+      <w:ins w:id="216" w:author="Bobay, Luke Andrew" w:date="2026-08-28T14:29:00Z" w16du:dateUtc="2026-08-28T21:29:00Z">
         <w:r>
           <w:t>distribution</w:t>
         </w:r>
@@ -1884,8 +1902,8 @@
       <w:r>
         <w:t xml:space="preserve">. </w:t>
       </w:r>
-      <w:commentRangeStart w:id="215"/>
-      <w:del w:id="216" w:author="Bobay, Luke Andrew" w:date="2026-08-28T14:30:00Z" w16du:dateUtc="2026-08-28T21:30:00Z">
+      <w:commentRangeStart w:id="217"/>
+      <w:del w:id="218" w:author="Bobay, Luke Andrew" w:date="2026-08-28T14:30:00Z" w16du:dateUtc="2026-08-28T21:30:00Z">
         <w:r>
           <w:delText xml:space="preserve">We expect larval assemblages to cluster according to adult </w:delText>
         </w:r>
@@ -1894,41 +1912,41 @@
           <w:delText>habitat affinity with distinct taxonomic and spatial communities. Additionally, we expect significant effects of spatiotemporal and environmental variables—such as latitude, temperature, dissolved oxygen, seafloor depth, productivity, time of day, and salinity—on the clustering of the LFC</w:delText>
         </w:r>
       </w:del>
-      <w:commentRangeEnd w:id="215"/>
+      <w:commentRangeEnd w:id="217"/>
       <w:r>
         <w:rPr>
           <w:rStyle w:val="CommentReference"/>
           <w:sz w:val="24"/>
           <w:szCs w:val="24"/>
         </w:rPr>
-        <w:commentReference w:id="215"/>
-      </w:r>
-      <w:del w:id="217" w:author="Bobay, Luke Andrew" w:date="2026-08-28T14:30:00Z" w16du:dateUtc="2026-08-28T21:30:00Z">
+        <w:commentReference w:id="217"/>
+      </w:r>
+      <w:del w:id="219" w:author="Bobay, Luke Andrew" w:date="2026-08-28T14:30:00Z" w16du:dateUtc="2026-08-28T21:30:00Z">
         <w:r>
           <w:delText xml:space="preserve">. </w:delText>
         </w:r>
       </w:del>
-      <w:del w:id="218" w:author="Bobay, Luke Andrew" w:date="2026-08-28T14:32:00Z" w16du:dateUtc="2026-08-28T21:32:00Z">
+      <w:del w:id="220" w:author="Bobay, Luke Andrew" w:date="2026-08-28T14:32:00Z" w16du:dateUtc="2026-08-28T21:32:00Z">
         <w:r>
           <w:delText>Establishing how larval fish aggregate during the winter and what factors contribute to the composition of each assemblage could provide a baseline for future studies on the changing NCC ecosystem while also aiding</w:delText>
         </w:r>
       </w:del>
-      <w:ins w:id="219" w:author="Bobay, Luke Andrew" w:date="2026-08-28T14:32:00Z" w16du:dateUtc="2026-08-28T21:32:00Z">
+      <w:ins w:id="221" w:author="Bobay, Luke Andrew" w:date="2026-08-28T14:32:00Z" w16du:dateUtc="2026-08-28T21:32:00Z">
         <w:r>
           <w:t xml:space="preserve">The results of this study will </w:t>
         </w:r>
       </w:ins>
-      <w:del w:id="220" w:author="Bobay, Luke Andrew" w:date="2026-08-28T14:32:00Z" w16du:dateUtc="2026-08-28T21:32:00Z">
+      <w:del w:id="222" w:author="Bobay, Luke Andrew" w:date="2026-08-28T14:32:00Z" w16du:dateUtc="2026-08-28T21:32:00Z">
         <w:r>
           <w:delText xml:space="preserve"> in </w:delText>
         </w:r>
       </w:del>
-      <w:ins w:id="221" w:author="Bobay, Luke Andrew" w:date="2026-08-28T14:32:00Z" w16du:dateUtc="2026-08-28T21:32:00Z">
+      <w:ins w:id="223" w:author="Bobay, Luke Andrew" w:date="2026-08-28T14:32:00Z" w16du:dateUtc="2026-08-28T21:32:00Z">
         <w:r>
           <w:t>support</w:t>
         </w:r>
       </w:ins>
-      <w:ins w:id="222" w:author="Bobay, Luke Andrew" w:date="2026-08-28T14:33:00Z" w16du:dateUtc="2026-08-28T21:33:00Z">
+      <w:ins w:id="224" w:author="Bobay, Luke Andrew" w:date="2026-08-28T14:33:00Z" w16du:dateUtc="2026-08-28T21:33:00Z">
         <w:r>
           <w:t xml:space="preserve"> </w:t>
         </w:r>
@@ -1936,7 +1954,7 @@
       <w:r>
         <w:t>prediction</w:t>
       </w:r>
-      <w:del w:id="223" w:author="Bobay, Luke Andrew" w:date="2026-08-28T14:32:00Z" w16du:dateUtc="2026-08-28T21:32:00Z">
+      <w:del w:id="225" w:author="Bobay, Luke Andrew" w:date="2026-08-28T14:32:00Z" w16du:dateUtc="2026-08-28T21:32:00Z">
         <w:r>
           <w:delText>s</w:delText>
         </w:r>
@@ -1944,12 +1962,12 @@
       <w:r>
         <w:t xml:space="preserve"> of </w:t>
       </w:r>
-      <w:del w:id="224" w:author="Bobay, Luke Andrew" w:date="2026-08-28T14:35:00Z" w16du:dateUtc="2026-08-28T21:35:00Z">
+      <w:del w:id="226" w:author="Bobay, Luke Andrew" w:date="2026-08-28T14:35:00Z" w16du:dateUtc="2026-08-28T21:35:00Z">
         <w:r>
           <w:delText>winter-spawning fish</w:delText>
         </w:r>
       </w:del>
-      <w:ins w:id="225" w:author="Bobay, Luke Andrew" w:date="2026-08-28T14:35:00Z" w16du:dateUtc="2026-08-28T21:35:00Z">
+      <w:ins w:id="227" w:author="Bobay, Luke Andrew" w:date="2026-08-28T14:35:00Z" w16du:dateUtc="2026-08-28T21:35:00Z">
         <w:r>
           <w:t>larval</w:t>
         </w:r>
@@ -1957,7 +1975,7 @@
       <w:r>
         <w:t xml:space="preserve"> abundance </w:t>
       </w:r>
-      <w:ins w:id="226" w:author="Bobay, Luke Andrew" w:date="2026-08-28T14:36:00Z" w16du:dateUtc="2026-08-28T21:36:00Z">
+      <w:ins w:id="228" w:author="Bobay, Luke Andrew" w:date="2026-08-28T14:36:00Z" w16du:dateUtc="2026-08-28T21:36:00Z">
         <w:r>
           <w:t xml:space="preserve">of </w:t>
         </w:r>
@@ -1965,7 +1983,7 @@
       <w:r>
         <w:t xml:space="preserve">and </w:t>
       </w:r>
-      <w:del w:id="227" w:author="Bobay, Luke Andrew" w:date="2026-08-28T14:35:00Z" w16du:dateUtc="2026-08-28T21:35:00Z">
+      <w:del w:id="229" w:author="Bobay, Luke Andrew" w:date="2026-08-28T14:35:00Z" w16du:dateUtc="2026-08-28T21:35:00Z">
         <w:r>
           <w:delText xml:space="preserve">the </w:delText>
         </w:r>
@@ -1973,7 +1991,7 @@
       <w:r>
         <w:t xml:space="preserve">recruitment </w:t>
       </w:r>
-      <w:ins w:id="228" w:author="Bobay, Luke Andrew" w:date="2026-08-28T14:36:00Z" w16du:dateUtc="2026-08-28T21:36:00Z">
+      <w:ins w:id="230" w:author="Bobay, Luke Andrew" w:date="2026-08-28T14:36:00Z" w16du:dateUtc="2026-08-28T21:36:00Z">
         <w:r>
           <w:t xml:space="preserve">to adult populations </w:t>
         </w:r>
@@ -1981,32 +1999,32 @@
       <w:r>
         <w:t xml:space="preserve">of </w:t>
       </w:r>
-      <w:del w:id="229" w:author="Bobay, Luke Andrew" w:date="2026-08-28T14:36:00Z" w16du:dateUtc="2026-08-28T21:36:00Z">
+      <w:del w:id="231" w:author="Bobay, Luke Andrew" w:date="2026-08-28T14:36:00Z" w16du:dateUtc="2026-08-28T21:36:00Z">
         <w:r>
           <w:delText>the important fisheries species that prey on them</w:delText>
         </w:r>
       </w:del>
-      <w:ins w:id="230" w:author="Bobay, Luke Andrew" w:date="2026-08-28T14:36:00Z" w16du:dateUtc="2026-08-28T21:36:00Z">
+      <w:ins w:id="232" w:author="Bobay, Luke Andrew" w:date="2026-08-28T14:36:00Z" w16du:dateUtc="2026-08-28T21:36:00Z">
         <w:r>
           <w:t>winter-spawning fish</w:t>
         </w:r>
       </w:ins>
-      <w:ins w:id="231" w:author="Bobay, Luke Andrew" w:date="2026-08-28T14:39:00Z" w16du:dateUtc="2026-08-28T21:39:00Z">
+      <w:ins w:id="233" w:author="Bobay, Luke Andrew" w:date="2026-08-28T14:39:00Z" w16du:dateUtc="2026-08-28T21:39:00Z">
         <w:r>
           <w:t xml:space="preserve"> </w:t>
         </w:r>
       </w:ins>
-      <w:ins w:id="232" w:author="Bobay, Luke Andrew" w:date="2026-08-28T14:40:00Z" w16du:dateUtc="2026-08-28T21:40:00Z">
+      <w:ins w:id="234" w:author="Bobay, Luke Andrew" w:date="2026-08-28T14:40:00Z" w16du:dateUtc="2026-08-28T21:40:00Z">
         <w:r>
           <w:t xml:space="preserve">and </w:t>
         </w:r>
       </w:ins>
-      <w:ins w:id="233" w:author="Bobay, Luke Andrew" w:date="2026-08-28T14:41:00Z" w16du:dateUtc="2026-08-28T21:41:00Z">
+      <w:ins w:id="235" w:author="Bobay, Luke Andrew" w:date="2026-08-28T14:41:00Z" w16du:dateUtc="2026-08-28T21:41:00Z">
         <w:r>
           <w:t>reveal potential diel biases in</w:t>
         </w:r>
       </w:ins>
-      <w:ins w:id="234" w:author="Bobay, Luke Andrew" w:date="2026-08-28T14:42:00Z" w16du:dateUtc="2026-08-28T21:42:00Z">
+      <w:ins w:id="236" w:author="Bobay, Luke Andrew" w:date="2026-08-28T14:42:00Z" w16du:dateUtc="2026-08-28T21:42:00Z">
         <w:r>
           <w:t xml:space="preserve"> estimates of the abundance of larval fishes</w:t>
         </w:r>
@@ -2045,25 +2063,25 @@
     <w:p>
       <w:pPr>
         <w:rPr>
-          <w:ins w:id="235" w:author="Bobay, Luke Andrew" w:date="2026-08-28T15:08:00Z" w16du:dateUtc="2026-08-28T22:08:00Z"/>
+          <w:ins w:id="237" w:author="Bobay, Luke Andrew" w:date="2026-08-28T15:08:00Z" w16du:dateUtc="2026-08-28T22:08:00Z"/>
         </w:rPr>
       </w:pPr>
-      <w:del w:id="236" w:author="Bobay, Luke Andrew" w:date="2026-08-28T14:49:00Z" w16du:dateUtc="2026-08-28T21:49:00Z">
+      <w:del w:id="238" w:author="Bobay, Luke Andrew" w:date="2026-08-28T14:49:00Z" w16du:dateUtc="2026-08-28T21:49:00Z">
         <w:r>
           <w:delText>[add section text here]</w:delText>
         </w:r>
       </w:del>
-      <w:ins w:id="237" w:author="Bobay, Luke Andrew" w:date="2026-08-28T15:06:00Z" w16du:dateUtc="2026-08-28T22:06:00Z">
+      <w:ins w:id="239" w:author="Bobay, Luke Andrew" w:date="2026-08-28T15:06:00Z" w16du:dateUtc="2026-08-28T22:06:00Z">
         <w:r>
           <w:t>Field sampling took place</w:t>
         </w:r>
       </w:ins>
-      <w:ins w:id="238" w:author="Bobay, Luke Andrew" w:date="2026-08-28T14:50:00Z" w16du:dateUtc="2026-08-28T21:50:00Z">
+      <w:ins w:id="240" w:author="Bobay, Luke Andrew" w:date="2026-08-28T14:50:00Z" w16du:dateUtc="2026-08-28T21:50:00Z">
         <w:r>
           <w:t xml:space="preserve"> </w:t>
         </w:r>
       </w:ins>
-      <w:ins w:id="239" w:author="Bobay, Luke Andrew" w:date="2026-08-28T15:07:00Z" w16du:dateUtc="2026-08-28T22:07:00Z">
+      <w:ins w:id="241" w:author="Bobay, Luke Andrew" w:date="2026-08-28T15:07:00Z" w16du:dateUtc="2026-08-28T22:07:00Z">
         <w:r>
           <w:t>in the NCC (41–47°N)</w:t>
         </w:r>
@@ -2077,97 +2095,97 @@
           <w:t xml:space="preserve"> </w:t>
         </w:r>
       </w:ins>
-      <w:ins w:id="240" w:author="Bobay, Luke Andrew" w:date="2026-08-28T14:54:00Z" w16du:dateUtc="2026-08-28T21:54:00Z">
+      <w:ins w:id="242" w:author="Bobay, Luke Andrew" w:date="2026-08-28T14:54:00Z" w16du:dateUtc="2026-08-28T21:54:00Z">
         <w:r>
           <w:t>during Feb</w:t>
         </w:r>
       </w:ins>
-      <w:ins w:id="241" w:author="Bobay, Luke Andrew" w:date="2026-08-28T14:55:00Z" w16du:dateUtc="2026-08-28T21:55:00Z">
+      <w:ins w:id="243" w:author="Bobay, Luke Andrew" w:date="2026-08-28T14:55:00Z" w16du:dateUtc="2026-08-28T21:55:00Z">
         <w:r>
           <w:t>ruary 17</w:t>
         </w:r>
       </w:ins>
-      <w:ins w:id="242" w:author="Bobay, Luke Andrew" w:date="2026-08-28T14:56:00Z" w16du:dateUtc="2026-08-28T21:56:00Z">
+      <w:ins w:id="244" w:author="Bobay, Luke Andrew" w:date="2026-08-28T14:56:00Z" w16du:dateUtc="2026-08-28T21:56:00Z">
         <w:r>
           <w:t>–23, 2018; March 4–</w:t>
         </w:r>
       </w:ins>
-      <w:ins w:id="243" w:author="Bobay, Luke Andrew" w:date="2026-08-28T14:57:00Z" w16du:dateUtc="2026-08-28T21:57:00Z">
+      <w:ins w:id="245" w:author="Bobay, Luke Andrew" w:date="2026-08-28T14:57:00Z" w16du:dateUtc="2026-08-28T21:57:00Z">
         <w:r>
           <w:t xml:space="preserve">12, 2019; March 3–11, 2022; and </w:t>
         </w:r>
       </w:ins>
-      <w:ins w:id="244" w:author="Bobay, Luke Andrew" w:date="2026-08-28T14:58:00Z" w16du:dateUtc="2026-08-28T21:58:00Z">
+      <w:ins w:id="246" w:author="Bobay, Luke Andrew" w:date="2026-08-28T14:58:00Z" w16du:dateUtc="2026-08-28T21:58:00Z">
         <w:r>
           <w:t>February 17–26, 2023.</w:t>
         </w:r>
       </w:ins>
-      <w:ins w:id="245" w:author="Bobay, Luke Andrew" w:date="2026-08-28T15:01:00Z" w16du:dateUtc="2026-08-28T22:01:00Z">
+      <w:ins w:id="247" w:author="Bobay, Luke Andrew" w:date="2026-08-28T15:01:00Z" w16du:dateUtc="2026-08-28T22:01:00Z">
         <w:r>
           <w:t xml:space="preserve"> </w:t>
         </w:r>
       </w:ins>
-      <w:ins w:id="246" w:author="Bobay, Luke Andrew" w:date="2026-08-28T15:03:00Z" w16du:dateUtc="2026-08-28T22:03:00Z">
+      <w:ins w:id="248" w:author="Bobay, Luke Andrew" w:date="2026-08-28T15:03:00Z" w16du:dateUtc="2026-08-28T22:03:00Z">
         <w:r>
           <w:t>In</w:t>
         </w:r>
       </w:ins>
-      <w:ins w:id="247" w:author="Bobay, Luke Andrew" w:date="2026-08-28T15:01:00Z" w16du:dateUtc="2026-08-28T22:01:00Z">
+      <w:ins w:id="249" w:author="Bobay, Luke Andrew" w:date="2026-08-28T15:01:00Z" w16du:dateUtc="2026-08-28T22:01:00Z">
         <w:r>
           <w:t xml:space="preserve"> 2018 and 2019, sampling took place</w:t>
         </w:r>
       </w:ins>
-      <w:ins w:id="248" w:author="Bobay, Luke Andrew" w:date="2026-08-28T15:18:00Z" w16du:dateUtc="2026-08-28T22:18:00Z">
+      <w:ins w:id="250" w:author="Bobay, Luke Andrew" w:date="2026-08-28T15:18:00Z" w16du:dateUtc="2026-08-28T22:18:00Z">
         <w:r>
           <w:t xml:space="preserve"> at five stations</w:t>
         </w:r>
       </w:ins>
-      <w:ins w:id="249" w:author="Bobay, Luke Andrew" w:date="2026-08-28T15:01:00Z" w16du:dateUtc="2026-08-28T22:01:00Z">
+      <w:ins w:id="251" w:author="Bobay, Luke Andrew" w:date="2026-08-28T15:01:00Z" w16du:dateUtc="2026-08-28T22:01:00Z">
         <w:r>
           <w:t xml:space="preserve"> </w:t>
         </w:r>
       </w:ins>
-      <w:ins w:id="250" w:author="Bobay, Luke Andrew" w:date="2026-08-28T15:02:00Z" w16du:dateUtc="2026-08-28T22:02:00Z">
+      <w:ins w:id="252" w:author="Bobay, Luke Andrew" w:date="2026-08-28T15:02:00Z" w16du:dateUtc="2026-08-28T22:02:00Z">
         <w:r>
           <w:t>along</w:t>
         </w:r>
       </w:ins>
-      <w:ins w:id="251" w:author="Bobay, Luke Andrew" w:date="2026-08-28T15:18:00Z" w16du:dateUtc="2026-08-28T22:18:00Z">
+      <w:ins w:id="253" w:author="Bobay, Luke Andrew" w:date="2026-08-28T15:18:00Z" w16du:dateUtc="2026-08-28T22:18:00Z">
         <w:r>
           <w:t xml:space="preserve"> each of</w:t>
         </w:r>
       </w:ins>
-      <w:ins w:id="252" w:author="Bobay, Luke Andrew" w:date="2026-08-28T15:02:00Z" w16du:dateUtc="2026-08-28T22:02:00Z">
+      <w:ins w:id="254" w:author="Bobay, Luke Andrew" w:date="2026-08-28T15:02:00Z" w16du:dateUtc="2026-08-28T22:02:00Z">
         <w:r>
           <w:t xml:space="preserve"> two cross-shelf transects, which were sampled </w:t>
         </w:r>
       </w:ins>
-      <w:ins w:id="253" w:author="Bobay, Luke Andrew" w:date="2026-08-28T15:03:00Z" w16du:dateUtc="2026-08-28T22:03:00Z">
+      <w:ins w:id="255" w:author="Bobay, Luke Andrew" w:date="2026-08-28T15:03:00Z" w16du:dateUtc="2026-08-28T22:03:00Z">
         <w:r>
           <w:t xml:space="preserve">multiple times during both day and night. </w:t>
         </w:r>
       </w:ins>
-      <w:ins w:id="254" w:author="Bobay, Luke Andrew" w:date="2026-08-28T15:04:00Z" w16du:dateUtc="2026-08-28T22:04:00Z">
+      <w:ins w:id="256" w:author="Bobay, Luke Andrew" w:date="2026-08-28T15:04:00Z" w16du:dateUtc="2026-08-28T22:04:00Z">
         <w:r>
           <w:t>In 2022 and 2023, six cross-shelf transects</w:t>
         </w:r>
       </w:ins>
-      <w:ins w:id="255" w:author="Bobay, Luke Andrew" w:date="2026-08-28T15:19:00Z" w16du:dateUtc="2026-08-28T22:19:00Z">
+      <w:ins w:id="257" w:author="Bobay, Luke Andrew" w:date="2026-08-28T15:19:00Z" w16du:dateUtc="2026-08-28T22:19:00Z">
         <w:r>
           <w:t xml:space="preserve"> with 4–6 stations each</w:t>
         </w:r>
       </w:ins>
-      <w:ins w:id="256" w:author="Bobay, Luke Andrew" w:date="2026-08-28T15:04:00Z" w16du:dateUtc="2026-08-28T22:04:00Z">
+      <w:ins w:id="258" w:author="Bobay, Luke Andrew" w:date="2026-08-28T15:04:00Z" w16du:dateUtc="2026-08-28T22:04:00Z">
         <w:r>
           <w:t xml:space="preserve"> were sampled </w:t>
         </w:r>
       </w:ins>
-      <w:ins w:id="257" w:author="Bobay, Luke Andrew" w:date="2026-08-28T15:05:00Z" w16du:dateUtc="2026-08-28T22:05:00Z">
+      <w:ins w:id="259" w:author="Bobay, Luke Andrew" w:date="2026-08-28T15:05:00Z" w16du:dateUtc="2026-08-28T22:05:00Z">
         <w:r>
           <w:t>once per cruise.</w:t>
         </w:r>
       </w:ins>
-      <w:ins w:id="258" w:author="Bobay, Luke Andrew" w:date="2026-08-28T17:44:00Z" w16du:dateUtc="2026-08-29T00:44:00Z">
+      <w:ins w:id="260" w:author="Bobay, Luke Andrew" w:date="2026-08-28T17:44:00Z" w16du:dateUtc="2026-08-29T00:44:00Z">
         <w:r>
           <w:t xml:space="preserve"> (Fig. 1A)</w:t>
         </w:r>
@@ -2176,35 +2194,35 @@
     <w:p>
       <w:pPr>
         <w:rPr>
-          <w:ins w:id="259" w:author="Bobay, Luke Andrew" w:date="2026-08-28T15:22:00Z" w16du:dateUtc="2026-08-28T22:22:00Z"/>
+          <w:ins w:id="261" w:author="Bobay, Luke Andrew" w:date="2026-08-28T15:22:00Z" w16du:dateUtc="2026-08-28T22:22:00Z"/>
         </w:rPr>
       </w:pPr>
-      <w:ins w:id="260" w:author="Bobay, Luke Andrew" w:date="2026-08-28T15:08:00Z" w16du:dateUtc="2026-08-28T22:08:00Z">
+      <w:ins w:id="262" w:author="Bobay, Luke Andrew" w:date="2026-08-28T15:08:00Z" w16du:dateUtc="2026-08-28T22:08:00Z">
         <w:r>
           <w:t>Plankton samples were collected using a c</w:t>
         </w:r>
       </w:ins>
-      <w:ins w:id="261" w:author="Bobay, Luke Andrew" w:date="2026-08-28T15:09:00Z" w16du:dateUtc="2026-08-28T22:09:00Z">
+      <w:ins w:id="263" w:author="Bobay, Luke Andrew" w:date="2026-08-28T15:09:00Z" w16du:dateUtc="2026-08-28T22:09:00Z">
         <w:r>
           <w:t>oupled Multiple Opening/Closing Net and Environmental Sensing System (MOCNESS)</w:t>
         </w:r>
       </w:ins>
-      <w:ins w:id="262" w:author="Bobay, Luke Andrew" w:date="2026-08-28T15:11:00Z" w16du:dateUtc="2026-08-28T22:11:00Z">
+      <w:ins w:id="264" w:author="Bobay, Luke Andrew" w:date="2026-08-28T15:11:00Z" w16du:dateUtc="2026-08-28T22:11:00Z">
         <w:r>
           <w:t xml:space="preserve"> which had two sets of </w:t>
         </w:r>
       </w:ins>
-      <w:ins w:id="263" w:author="Bobay, Luke Andrew" w:date="2026-08-28T15:13:00Z" w16du:dateUtc="2026-08-28T22:13:00Z">
+      <w:ins w:id="265" w:author="Bobay, Luke Andrew" w:date="2026-08-28T15:13:00Z" w16du:dateUtc="2026-08-28T22:13:00Z">
         <w:r>
           <w:t xml:space="preserve">four </w:t>
         </w:r>
       </w:ins>
-      <w:ins w:id="264" w:author="Bobay, Luke Andrew" w:date="2026-08-28T15:11:00Z" w16du:dateUtc="2026-08-28T22:11:00Z">
+      <w:ins w:id="266" w:author="Bobay, Luke Andrew" w:date="2026-08-28T15:11:00Z" w16du:dateUtc="2026-08-28T22:11:00Z">
         <w:r>
           <w:t>nets. One set of ne</w:t>
         </w:r>
       </w:ins>
-      <w:ins w:id="265" w:author="Bobay, Luke Andrew" w:date="2026-08-28T15:12:00Z" w16du:dateUtc="2026-08-28T22:12:00Z">
+      <w:ins w:id="267" w:author="Bobay, Luke Andrew" w:date="2026-08-28T15:12:00Z" w16du:dateUtc="2026-08-28T22:12:00Z">
         <w:r>
           <w:t>ts had a 1-m</w:t>
         </w:r>
@@ -2218,12 +2236,12 @@
           <w:t xml:space="preserve"> </w:t>
         </w:r>
       </w:ins>
-      <w:ins w:id="266" w:author="Bobay, Luke Andrew" w:date="2026-08-28T15:29:00Z" w16du:dateUtc="2026-08-28T22:29:00Z">
+      <w:ins w:id="268" w:author="Bobay, Luke Andrew" w:date="2026-08-28T15:29:00Z" w16du:dateUtc="2026-08-28T22:29:00Z">
         <w:r>
           <w:t>mouth</w:t>
         </w:r>
       </w:ins>
-      <w:ins w:id="267" w:author="Bobay, Luke Andrew" w:date="2026-08-28T15:12:00Z" w16du:dateUtc="2026-08-28T22:12:00Z">
+      <w:ins w:id="269" w:author="Bobay, Luke Andrew" w:date="2026-08-28T15:12:00Z" w16du:dateUtc="2026-08-28T22:12:00Z">
         <w:r>
           <w:t xml:space="preserve"> and 333-µm mesh, while the other set had a 4-m</w:t>
         </w:r>
@@ -2237,219 +2255,219 @@
           <w:t xml:space="preserve"> </w:t>
         </w:r>
       </w:ins>
-      <w:ins w:id="268" w:author="Bobay, Luke Andrew" w:date="2026-08-28T15:29:00Z" w16du:dateUtc="2026-08-28T22:29:00Z">
+      <w:ins w:id="270" w:author="Bobay, Luke Andrew" w:date="2026-08-28T15:29:00Z" w16du:dateUtc="2026-08-28T22:29:00Z">
         <w:r>
           <w:t>mouth</w:t>
         </w:r>
       </w:ins>
-      <w:ins w:id="269" w:author="Bobay, Luke Andrew" w:date="2026-08-28T15:12:00Z" w16du:dateUtc="2026-08-28T22:12:00Z">
+      <w:ins w:id="271" w:author="Bobay, Luke Andrew" w:date="2026-08-28T15:12:00Z" w16du:dateUtc="2026-08-28T22:12:00Z">
         <w:r>
           <w:t xml:space="preserve"> </w:t>
         </w:r>
       </w:ins>
-      <w:ins w:id="270" w:author="Bobay, Luke Andrew" w:date="2026-08-28T15:13:00Z" w16du:dateUtc="2026-08-28T22:13:00Z">
+      <w:ins w:id="272" w:author="Bobay, Luke Andrew" w:date="2026-08-28T15:13:00Z" w16du:dateUtc="2026-08-28T22:13:00Z">
         <w:r>
           <w:t xml:space="preserve">and 1000-µm mesh. </w:t>
         </w:r>
       </w:ins>
-      <w:ins w:id="271" w:author="Bobay, Luke Andrew" w:date="2026-08-28T15:15:00Z" w16du:dateUtc="2026-08-28T22:15:00Z">
+      <w:ins w:id="273" w:author="Bobay, Luke Andrew" w:date="2026-08-28T15:15:00Z" w16du:dateUtc="2026-08-28T22:15:00Z">
         <w:r>
           <w:t>Each successive net was used to sample from approximately 100–75 m, 75–50 m, 50</w:t>
         </w:r>
       </w:ins>
-      <w:ins w:id="272" w:author="Bobay, Luke Andrew" w:date="2026-08-28T15:16:00Z" w16du:dateUtc="2026-08-28T22:16:00Z">
+      <w:ins w:id="274" w:author="Bobay, Luke Andrew" w:date="2026-08-28T15:16:00Z" w16du:dateUtc="2026-08-28T22:16:00Z">
         <w:r>
           <w:t>–25 m, and 25–0 m depth</w:t>
         </w:r>
       </w:ins>
-      <w:ins w:id="273" w:author="Bobay, Luke Andrew" w:date="2026-08-28T15:27:00Z" w16du:dateUtc="2026-08-28T22:27:00Z">
+      <w:ins w:id="275" w:author="Bobay, Luke Andrew" w:date="2026-08-28T15:27:00Z" w16du:dateUtc="2026-08-28T22:27:00Z">
         <w:r>
           <w:t xml:space="preserve">. At sampling stations where the seafloor was &lt; 100 m below the surface, the </w:t>
         </w:r>
       </w:ins>
-      <w:ins w:id="274" w:author="Bobay, Luke Andrew" w:date="2026-08-28T15:28:00Z" w16du:dateUtc="2026-08-28T22:28:00Z">
+      <w:ins w:id="276" w:author="Bobay, Luke Andrew" w:date="2026-08-28T15:28:00Z" w16du:dateUtc="2026-08-28T22:28:00Z">
         <w:r>
           <w:t>MOCNESS was used to sample as close as possible (&lt; 10 m) to the seafloor</w:t>
         </w:r>
       </w:ins>
-      <w:ins w:id="275" w:author="Bobay, Luke Andrew" w:date="2026-08-28T15:16:00Z" w16du:dateUtc="2026-08-28T22:16:00Z">
+      <w:ins w:id="277" w:author="Bobay, Luke Andrew" w:date="2026-08-28T15:16:00Z" w16du:dateUtc="2026-08-28T22:16:00Z">
         <w:r>
           <w:t xml:space="preserve">. </w:t>
         </w:r>
       </w:ins>
-      <w:ins w:id="276" w:author="Bobay, Luke Andrew" w:date="2026-08-28T15:17:00Z" w16du:dateUtc="2026-08-28T22:17:00Z">
+      <w:ins w:id="278" w:author="Bobay, Luke Andrew" w:date="2026-08-28T15:17:00Z" w16du:dateUtc="2026-08-28T22:17:00Z">
         <w:r>
           <w:t>A depth sensor on the MOCNESS was used to monitor its depth</w:t>
         </w:r>
       </w:ins>
-      <w:ins w:id="277" w:author="Bobay, Luke Andrew" w:date="2026-08-28T17:56:00Z" w16du:dateUtc="2026-08-29T00:56:00Z">
+      <w:ins w:id="279" w:author="Bobay, Luke Andrew" w:date="2026-08-28T17:56:00Z" w16du:dateUtc="2026-08-29T00:56:00Z">
         <w:r>
           <w:t xml:space="preserve"> (m)</w:t>
         </w:r>
       </w:ins>
-      <w:ins w:id="278" w:author="Bobay, Luke Andrew" w:date="2026-08-28T15:17:00Z" w16du:dateUtc="2026-08-28T22:17:00Z">
+      <w:ins w:id="280" w:author="Bobay, Luke Andrew" w:date="2026-08-28T15:17:00Z" w16du:dateUtc="2026-08-28T22:17:00Z">
         <w:r>
           <w:t xml:space="preserve">, and temperature and conductivity sensors were used to measure </w:t>
         </w:r>
       </w:ins>
-      <w:ins w:id="279" w:author="Bobay, Luke Andrew" w:date="2026-08-28T15:18:00Z" w16du:dateUtc="2026-08-28T22:18:00Z">
+      <w:ins w:id="281" w:author="Bobay, Luke Andrew" w:date="2026-08-28T15:18:00Z" w16du:dateUtc="2026-08-28T22:18:00Z">
         <w:r>
           <w:t>temperature</w:t>
         </w:r>
       </w:ins>
-      <w:ins w:id="280" w:author="Bobay, Luke Andrew" w:date="2026-08-28T17:56:00Z" w16du:dateUtc="2026-08-29T00:56:00Z">
+      <w:ins w:id="282" w:author="Bobay, Luke Andrew" w:date="2026-08-28T17:56:00Z" w16du:dateUtc="2026-08-29T00:56:00Z">
         <w:r>
           <w:t xml:space="preserve"> (</w:t>
         </w:r>
       </w:ins>
-      <w:ins w:id="281" w:author="Bobay, Luke Andrew" w:date="2026-08-28T17:57:00Z" w16du:dateUtc="2026-08-29T00:57:00Z">
+      <w:ins w:id="283" w:author="Bobay, Luke Andrew" w:date="2026-08-28T17:57:00Z" w16du:dateUtc="2026-08-29T00:57:00Z">
         <w:r>
           <w:t>°C)</w:t>
         </w:r>
       </w:ins>
-      <w:ins w:id="282" w:author="Bobay, Luke Andrew" w:date="2026-08-28T15:18:00Z" w16du:dateUtc="2026-08-28T22:18:00Z">
+      <w:ins w:id="284" w:author="Bobay, Luke Andrew" w:date="2026-08-28T15:18:00Z" w16du:dateUtc="2026-08-28T22:18:00Z">
         <w:r>
           <w:t xml:space="preserve"> and salinity</w:t>
         </w:r>
       </w:ins>
-      <w:ins w:id="283" w:author="Bobay, Luke Andrew" w:date="2026-08-28T17:57:00Z" w16du:dateUtc="2026-08-29T00:57:00Z">
+      <w:ins w:id="285" w:author="Bobay, Luke Andrew" w:date="2026-08-28T17:57:00Z" w16du:dateUtc="2026-08-29T00:57:00Z">
         <w:r>
           <w:t xml:space="preserve"> (PSU)</w:t>
         </w:r>
       </w:ins>
-      <w:ins w:id="284" w:author="Bobay, Luke Andrew" w:date="2026-08-28T15:18:00Z" w16du:dateUtc="2026-08-28T22:18:00Z">
+      <w:ins w:id="286" w:author="Bobay, Luke Andrew" w:date="2026-08-28T15:18:00Z" w16du:dateUtc="2026-08-28T22:18:00Z">
         <w:r>
           <w:t xml:space="preserve"> </w:t>
         </w:r>
       </w:ins>
-      <w:ins w:id="285" w:author="Bobay, Luke Andrew" w:date="2026-08-28T17:54:00Z" w16du:dateUtc="2026-08-29T00:54:00Z">
+      <w:ins w:id="287" w:author="Bobay, Luke Andrew" w:date="2026-08-28T17:54:00Z" w16du:dateUtc="2026-08-29T00:54:00Z">
         <w:r>
           <w:t xml:space="preserve">at a rate of 1 Hz </w:t>
         </w:r>
       </w:ins>
-      <w:ins w:id="286" w:author="Bobay, Luke Andrew" w:date="2026-08-28T15:18:00Z" w16du:dateUtc="2026-08-28T22:18:00Z">
+      <w:ins w:id="288" w:author="Bobay, Luke Andrew" w:date="2026-08-28T15:18:00Z" w16du:dateUtc="2026-08-28T22:18:00Z">
         <w:r>
           <w:t>during sampl</w:t>
         </w:r>
       </w:ins>
-      <w:ins w:id="287" w:author="Bobay, Luke Andrew" w:date="2026-08-28T15:20:00Z" w16du:dateUtc="2026-08-28T22:20:00Z">
+      <w:ins w:id="289" w:author="Bobay, Luke Andrew" w:date="2026-08-28T15:20:00Z" w16du:dateUtc="2026-08-28T22:20:00Z">
         <w:r>
           <w:t>ing</w:t>
         </w:r>
       </w:ins>
-      <w:ins w:id="288" w:author="Bobay, Luke Andrew" w:date="2026-08-28T17:41:00Z" w16du:dateUtc="2026-08-29T00:41:00Z">
+      <w:ins w:id="290" w:author="Bobay, Luke Andrew" w:date="2026-08-28T17:41:00Z" w16du:dateUtc="2026-08-29T00:41:00Z">
         <w:r>
           <w:t xml:space="preserve">. </w:t>
         </w:r>
       </w:ins>
-      <w:ins w:id="289" w:author="Bobay, Luke Andrew" w:date="2026-08-28T17:42:00Z" w16du:dateUtc="2026-08-29T00:42:00Z">
+      <w:ins w:id="291" w:author="Bobay, Luke Andrew" w:date="2026-08-28T17:42:00Z" w16du:dateUtc="2026-08-29T00:42:00Z">
         <w:r>
           <w:t>M</w:t>
         </w:r>
       </w:ins>
-      <w:ins w:id="290" w:author="Bobay, Luke Andrew" w:date="2026-08-28T17:41:00Z" w16du:dateUtc="2026-08-29T00:41:00Z">
+      <w:ins w:id="292" w:author="Bobay, Luke Andrew" w:date="2026-08-28T17:41:00Z" w16du:dateUtc="2026-08-29T00:41:00Z">
         <w:r>
           <w:t>ean depth, temperature, and salinity du</w:t>
         </w:r>
       </w:ins>
-      <w:ins w:id="291" w:author="Bobay, Luke Andrew" w:date="2026-08-28T17:42:00Z" w16du:dateUtc="2026-08-29T00:42:00Z">
+      <w:ins w:id="293" w:author="Bobay, Luke Andrew" w:date="2026-08-28T17:42:00Z" w16du:dateUtc="2026-08-29T00:42:00Z">
         <w:r>
           <w:t>ring each net tow was calculated</w:t>
         </w:r>
       </w:ins>
-      <w:ins w:id="292" w:author="Bobay, Luke Andrew" w:date="2026-08-28T17:44:00Z" w16du:dateUtc="2026-08-29T00:44:00Z">
+      <w:ins w:id="294" w:author="Bobay, Luke Andrew" w:date="2026-08-28T17:44:00Z" w16du:dateUtc="2026-08-29T00:44:00Z">
         <w:r>
           <w:t xml:space="preserve"> (Fig. 1</w:t>
         </w:r>
       </w:ins>
-      <w:ins w:id="293" w:author="Bobay, Luke Andrew" w:date="2026-08-28T17:45:00Z" w16du:dateUtc="2026-08-29T00:45:00Z">
+      <w:ins w:id="295" w:author="Bobay, Luke Andrew" w:date="2026-08-28T17:45:00Z" w16du:dateUtc="2026-08-29T00:45:00Z">
         <w:r>
           <w:t>B–C)</w:t>
         </w:r>
       </w:ins>
-      <w:ins w:id="294" w:author="Bobay, Luke Andrew" w:date="2026-08-28T15:20:00Z" w16du:dateUtc="2026-08-28T22:20:00Z">
+      <w:ins w:id="296" w:author="Bobay, Luke Andrew" w:date="2026-08-28T15:20:00Z" w16du:dateUtc="2026-08-28T22:20:00Z">
         <w:r>
           <w:t xml:space="preserve">. Upon retrieval of the MOCNESS, bulk plankton samples were preserved in 95% ethanol. </w:t>
         </w:r>
       </w:ins>
-      <w:ins w:id="295" w:author="Bobay, Luke Andrew" w:date="2026-08-28T15:21:00Z" w16du:dateUtc="2026-08-28T22:21:00Z">
+      <w:ins w:id="297" w:author="Bobay, Luke Andrew" w:date="2026-08-28T15:21:00Z" w16du:dateUtc="2026-08-28T22:21:00Z">
         <w:r>
           <w:t>All ichthyoplankton were then visually identified to the finest possible tax</w:t>
         </w:r>
       </w:ins>
-      <w:ins w:id="296" w:author="Bobay, Luke Andrew" w:date="2026-08-28T15:22:00Z" w16du:dateUtc="2026-08-28T22:22:00Z">
+      <w:ins w:id="298" w:author="Bobay, Luke Andrew" w:date="2026-08-28T15:22:00Z" w16du:dateUtc="2026-08-28T22:22:00Z">
         <w:r>
           <w:t>onomic resolution (usually genus- or species-level) and counted.</w:t>
         </w:r>
       </w:ins>
     </w:p>
     <w:p>
-      <w:ins w:id="297" w:author="Bobay, Luke Andrew" w:date="2026-08-28T15:32:00Z" w16du:dateUtc="2026-08-28T22:32:00Z">
+      <w:ins w:id="299" w:author="Bobay, Luke Andrew" w:date="2026-08-28T15:32:00Z" w16du:dateUtc="2026-08-28T22:32:00Z">
         <w:r>
           <w:t>At each sampling station, usually immediately prior to</w:t>
         </w:r>
       </w:ins>
-      <w:ins w:id="298" w:author="Bobay, Luke Andrew" w:date="2026-08-28T15:33:00Z" w16du:dateUtc="2026-08-28T22:33:00Z">
+      <w:ins w:id="300" w:author="Bobay, Luke Andrew" w:date="2026-08-28T15:33:00Z" w16du:dateUtc="2026-08-28T22:33:00Z">
         <w:r>
           <w:t xml:space="preserve">, </w:t>
         </w:r>
       </w:ins>
-      <w:ins w:id="299" w:author="Bobay, Luke Andrew" w:date="2026-08-28T15:32:00Z" w16du:dateUtc="2026-08-28T22:32:00Z">
+      <w:ins w:id="301" w:author="Bobay, Luke Andrew" w:date="2026-08-28T15:32:00Z" w16du:dateUtc="2026-08-28T22:32:00Z">
         <w:r>
           <w:t>but always with</w:t>
         </w:r>
       </w:ins>
-      <w:ins w:id="300" w:author="Bobay, Luke Andrew" w:date="2026-08-28T15:33:00Z" w16du:dateUtc="2026-08-28T22:33:00Z">
+      <w:ins w:id="302" w:author="Bobay, Luke Andrew" w:date="2026-08-28T15:33:00Z" w16du:dateUtc="2026-08-28T22:33:00Z">
         <w:r>
           <w:t xml:space="preserve">in </w:t>
         </w:r>
       </w:ins>
-      <w:ins w:id="301" w:author="Bobay, Luke Andrew" w:date="2026-08-28T17:39:00Z" w16du:dateUtc="2026-08-29T00:39:00Z">
+      <w:ins w:id="303" w:author="Bobay, Luke Andrew" w:date="2026-08-28T17:39:00Z" w16du:dateUtc="2026-08-29T00:39:00Z">
         <w:r>
           <w:t>3</w:t>
         </w:r>
       </w:ins>
-      <w:ins w:id="302" w:author="Bobay, Luke Andrew" w:date="2026-08-28T15:33:00Z" w16du:dateUtc="2026-08-28T22:33:00Z">
+      <w:ins w:id="304" w:author="Bobay, Luke Andrew" w:date="2026-08-28T15:33:00Z" w16du:dateUtc="2026-08-28T22:33:00Z">
         <w:r>
           <w:t xml:space="preserve"> h of</w:t>
         </w:r>
       </w:ins>
-      <w:ins w:id="303" w:author="Bobay, Luke Andrew" w:date="2026-08-28T17:40:00Z" w16du:dateUtc="2026-08-29T00:40:00Z">
+      <w:ins w:id="305" w:author="Bobay, Luke Andrew" w:date="2026-08-28T17:40:00Z" w16du:dateUtc="2026-08-29T00:40:00Z">
         <w:r>
           <w:t>,</w:t>
         </w:r>
       </w:ins>
-      <w:ins w:id="304" w:author="Bobay, Luke Andrew" w:date="2026-08-28T15:33:00Z" w16du:dateUtc="2026-08-28T22:33:00Z">
+      <w:ins w:id="306" w:author="Bobay, Luke Andrew" w:date="2026-08-28T15:33:00Z" w16du:dateUtc="2026-08-28T22:33:00Z">
         <w:r>
           <w:t xml:space="preserve"> MOCNESS sampling, a </w:t>
         </w:r>
       </w:ins>
-      <w:ins w:id="305" w:author="Bobay, Luke Andrew" w:date="2026-08-28T17:40:00Z" w16du:dateUtc="2026-08-29T00:40:00Z">
+      <w:ins w:id="307" w:author="Bobay, Luke Andrew" w:date="2026-08-28T17:40:00Z" w16du:dateUtc="2026-08-29T00:40:00Z">
         <w:r>
           <w:t>sensor package including a dissolved oxygen sensor</w:t>
         </w:r>
       </w:ins>
-      <w:ins w:id="306" w:author="Bobay, Luke Andrew" w:date="2026-08-28T15:34:00Z" w16du:dateUtc="2026-08-28T22:34:00Z">
+      <w:ins w:id="308" w:author="Bobay, Luke Andrew" w:date="2026-08-28T15:34:00Z" w16du:dateUtc="2026-08-28T22:34:00Z">
         <w:r>
           <w:t xml:space="preserve"> </w:t>
         </w:r>
       </w:ins>
-      <w:ins w:id="307" w:author="Bobay, Luke Andrew" w:date="2026-08-28T17:55:00Z" w16du:dateUtc="2026-08-29T00:55:00Z">
+      <w:ins w:id="309" w:author="Bobay, Luke Andrew" w:date="2026-08-28T17:55:00Z" w16du:dateUtc="2026-08-29T00:55:00Z">
         <w:r>
           <w:t xml:space="preserve">and a fluorescence probe </w:t>
         </w:r>
       </w:ins>
-      <w:ins w:id="308" w:author="Bobay, Luke Andrew" w:date="2026-08-28T15:34:00Z" w16du:dateUtc="2026-08-28T22:34:00Z">
+      <w:ins w:id="310" w:author="Bobay, Luke Andrew" w:date="2026-08-28T15:34:00Z" w16du:dateUtc="2026-08-28T22:34:00Z">
         <w:r>
           <w:t>was towed vertically through the top 100 m of the water column</w:t>
         </w:r>
       </w:ins>
-      <w:ins w:id="309" w:author="Bobay, Luke Andrew" w:date="2026-08-28T15:46:00Z" w16du:dateUtc="2026-08-28T22:46:00Z">
+      <w:ins w:id="311" w:author="Bobay, Luke Andrew" w:date="2026-08-28T15:46:00Z" w16du:dateUtc="2026-08-28T22:46:00Z">
         <w:r>
           <w:t xml:space="preserve">. </w:t>
         </w:r>
       </w:ins>
-      <w:ins w:id="310" w:author="Bobay, Luke Andrew" w:date="2026-08-28T17:46:00Z" w16du:dateUtc="2026-08-29T00:46:00Z">
+      <w:ins w:id="312" w:author="Bobay, Luke Andrew" w:date="2026-08-28T17:46:00Z" w16du:dateUtc="2026-08-29T00:46:00Z">
         <w:r>
           <w:t xml:space="preserve">At sampling stations </w:t>
         </w:r>
@@ -2463,17 +2481,17 @@
           <w:t xml:space="preserve"> was used to </w:t>
         </w:r>
       </w:ins>
-      <w:ins w:id="311" w:author="Bobay, Luke Andrew" w:date="2026-08-28T17:58:00Z" w16du:dateUtc="2026-08-29T00:58:00Z">
+      <w:ins w:id="313" w:author="Bobay, Luke Andrew" w:date="2026-08-28T17:58:00Z" w16du:dateUtc="2026-08-29T00:58:00Z">
         <w:r>
           <w:t>measure dissolved oxygen (</w:t>
         </w:r>
       </w:ins>
-      <w:ins w:id="312" w:author="Bobay, Luke Andrew" w:date="2026-08-28T18:03:00Z" w16du:dateUtc="2026-08-29T01:03:00Z">
+      <w:ins w:id="314" w:author="Bobay, Luke Andrew" w:date="2026-08-28T18:03:00Z" w16du:dateUtc="2026-08-29T01:03:00Z">
         <w:r>
           <w:t xml:space="preserve">DO; </w:t>
         </w:r>
       </w:ins>
-      <w:ins w:id="313" w:author="Bobay, Luke Andrew" w:date="2026-08-28T17:58:00Z" w16du:dateUtc="2026-08-29T00:58:00Z">
+      <w:ins w:id="315" w:author="Bobay, Luke Andrew" w:date="2026-08-28T17:58:00Z" w16du:dateUtc="2026-08-29T00:58:00Z">
         <w:r>
           <w:t>mL L</w:t>
         </w:r>
@@ -2487,7 +2505,7 @@
           <w:t xml:space="preserve">) and </w:t>
         </w:r>
       </w:ins>
-      <w:ins w:id="314" w:author="Bobay, Luke Andrew" w:date="2026-08-28T18:03:00Z" w16du:dateUtc="2026-08-29T01:03:00Z">
+      <w:ins w:id="316" w:author="Bobay, Luke Andrew" w:date="2026-08-28T18:03:00Z" w16du:dateUtc="2026-08-29T01:03:00Z">
         <w:r>
           <w:t>chlorophyll-</w:t>
         </w:r>
@@ -2502,12 +2520,12 @@
           <w:t xml:space="preserve"> </w:t>
         </w:r>
       </w:ins>
-      <w:ins w:id="315" w:author="Bobay, Luke Andrew" w:date="2026-08-28T17:58:00Z" w16du:dateUtc="2026-08-29T00:58:00Z">
+      <w:ins w:id="317" w:author="Bobay, Luke Andrew" w:date="2026-08-28T17:58:00Z" w16du:dateUtc="2026-08-29T00:58:00Z">
         <w:r>
           <w:t>(</w:t>
         </w:r>
       </w:ins>
-      <w:ins w:id="316" w:author="Bobay, Luke Andrew" w:date="2026-08-28T18:03:00Z" w16du:dateUtc="2026-08-29T01:03:00Z">
+      <w:ins w:id="318" w:author="Bobay, Luke Andrew" w:date="2026-08-28T18:03:00Z" w16du:dateUtc="2026-08-29T01:03:00Z">
         <w:r>
           <w:t>chl-</w:t>
         </w:r>
@@ -2525,7 +2543,7 @@
           <w:t xml:space="preserve"> </w:t>
         </w:r>
       </w:ins>
-      <w:ins w:id="317" w:author="Bobay, Luke Andrew" w:date="2026-08-28T18:00:00Z" w16du:dateUtc="2026-08-29T01:00:00Z">
+      <w:ins w:id="319" w:author="Bobay, Luke Andrew" w:date="2026-08-28T18:00:00Z" w16du:dateUtc="2026-08-29T01:00:00Z">
         <w:r>
           <w:t>mg m</w:t>
         </w:r>
@@ -2536,12 +2554,12 @@
           <w:t>-3</w:t>
         </w:r>
       </w:ins>
-      <w:ins w:id="318" w:author="Bobay, Luke Andrew" w:date="2026-08-28T18:01:00Z" w16du:dateUtc="2026-08-29T01:01:00Z">
+      <w:ins w:id="320" w:author="Bobay, Luke Andrew" w:date="2026-08-28T18:01:00Z" w16du:dateUtc="2026-08-29T01:01:00Z">
         <w:r>
           <w:t>)</w:t>
         </w:r>
       </w:ins>
-      <w:ins w:id="319" w:author="Bobay, Luke Andrew" w:date="2026-08-28T17:46:00Z" w16du:dateUtc="2026-08-29T00:46:00Z">
+      <w:ins w:id="321" w:author="Bobay, Luke Andrew" w:date="2026-08-28T17:46:00Z" w16du:dateUtc="2026-08-29T00:46:00Z">
         <w:r>
           <w:t xml:space="preserve"> as close as possible (&lt; 10 m) to the seafloor.</w:t>
         </w:r>
@@ -2549,17 +2567,17 @@
           <w:t xml:space="preserve"> </w:t>
         </w:r>
       </w:ins>
-      <w:ins w:id="320" w:author="Bobay, Luke Andrew" w:date="2026-08-28T18:03:00Z" w16du:dateUtc="2026-08-29T01:03:00Z">
+      <w:ins w:id="322" w:author="Bobay, Luke Andrew" w:date="2026-08-28T18:03:00Z" w16du:dateUtc="2026-08-29T01:03:00Z">
         <w:r>
           <w:t>DO</w:t>
         </w:r>
       </w:ins>
-      <w:ins w:id="321" w:author="Bobay, Luke Andrew" w:date="2026-08-28T17:55:00Z" w16du:dateUtc="2026-08-29T00:55:00Z">
+      <w:ins w:id="323" w:author="Bobay, Luke Andrew" w:date="2026-08-28T17:55:00Z" w16du:dateUtc="2026-08-29T00:55:00Z">
         <w:r>
           <w:t xml:space="preserve"> and </w:t>
         </w:r>
       </w:ins>
-      <w:ins w:id="322" w:author="Bobay, Luke Andrew" w:date="2026-08-28T18:01:00Z" w16du:dateUtc="2026-08-29T01:01:00Z">
+      <w:ins w:id="324" w:author="Bobay, Luke Andrew" w:date="2026-08-28T18:01:00Z" w16du:dateUtc="2026-08-29T01:01:00Z">
         <w:r>
           <w:t>chl-</w:t>
         </w:r>
@@ -2571,42 +2589,42 @@
           <w:t>a</w:t>
         </w:r>
       </w:ins>
-      <w:ins w:id="323" w:author="Bobay, Luke Andrew" w:date="2026-08-28T17:55:00Z" w16du:dateUtc="2026-08-29T00:55:00Z">
+      <w:ins w:id="325" w:author="Bobay, Luke Andrew" w:date="2026-08-28T17:55:00Z" w16du:dateUtc="2026-08-29T00:55:00Z">
         <w:r>
           <w:t xml:space="preserve"> values were </w:t>
         </w:r>
       </w:ins>
-      <w:ins w:id="324" w:author="Bobay, Luke Andrew" w:date="2026-08-28T17:56:00Z" w16du:dateUtc="2026-08-29T00:56:00Z">
+      <w:ins w:id="326" w:author="Bobay, Luke Andrew" w:date="2026-08-28T17:56:00Z" w16du:dateUtc="2026-08-29T00:56:00Z">
         <w:r>
           <w:t xml:space="preserve">averaged within 0.5-m depth bins. Then, mean </w:t>
         </w:r>
       </w:ins>
-      <w:ins w:id="325" w:author="Bobay, Luke Andrew" w:date="2026-08-28T18:03:00Z" w16du:dateUtc="2026-08-29T01:03:00Z">
+      <w:ins w:id="327" w:author="Bobay, Luke Andrew" w:date="2026-08-28T18:03:00Z" w16du:dateUtc="2026-08-29T01:03:00Z">
         <w:r>
           <w:t>DO</w:t>
         </w:r>
       </w:ins>
-      <w:ins w:id="326" w:author="Bobay, Luke Andrew" w:date="2026-08-28T17:56:00Z" w16du:dateUtc="2026-08-29T00:56:00Z">
+      <w:ins w:id="328" w:author="Bobay, Luke Andrew" w:date="2026-08-28T17:56:00Z" w16du:dateUtc="2026-08-29T00:56:00Z">
         <w:r>
           <w:t xml:space="preserve"> </w:t>
         </w:r>
       </w:ins>
-      <w:ins w:id="327" w:author="Bobay, Luke Andrew" w:date="2026-08-28T18:01:00Z" w16du:dateUtc="2026-08-29T01:01:00Z">
+      <w:ins w:id="329" w:author="Bobay, Luke Andrew" w:date="2026-08-28T18:01:00Z" w16du:dateUtc="2026-08-29T01:01:00Z">
         <w:r>
           <w:t xml:space="preserve">within the range of depths sampled by each corresponding MOCNESS net tow </w:t>
         </w:r>
       </w:ins>
-      <w:ins w:id="328" w:author="Bobay, Luke Andrew" w:date="2026-08-28T18:02:00Z" w16du:dateUtc="2026-08-29T01:02:00Z">
+      <w:ins w:id="330" w:author="Bobay, Luke Andrew" w:date="2026-08-28T18:02:00Z" w16du:dateUtc="2026-08-29T01:02:00Z">
         <w:r>
           <w:t>was calculated</w:t>
         </w:r>
       </w:ins>
-      <w:ins w:id="329" w:author="Bobay, Luke Andrew" w:date="2026-08-28T18:12:00Z" w16du:dateUtc="2026-08-29T01:12:00Z">
+      <w:ins w:id="331" w:author="Bobay, Luke Andrew" w:date="2026-08-28T18:12:00Z" w16du:dateUtc="2026-08-29T01:12:00Z">
         <w:r>
           <w:t xml:space="preserve"> (Fig. 1D)</w:t>
         </w:r>
       </w:ins>
-      <w:ins w:id="330" w:author="Bobay, Luke Andrew" w:date="2026-08-28T18:02:00Z" w16du:dateUtc="2026-08-29T01:02:00Z">
+      <w:ins w:id="332" w:author="Bobay, Luke Andrew" w:date="2026-08-28T18:02:00Z" w16du:dateUtc="2026-08-29T01:02:00Z">
         <w:r>
           <w:t>. Mean chl-</w:t>
         </w:r>
@@ -2618,7 +2636,7 @@
           <w:t>a</w:t>
         </w:r>
       </w:ins>
-      <w:ins w:id="331" w:author="Bobay, Luke Andrew" w:date="2026-08-28T18:04:00Z" w16du:dateUtc="2026-08-29T01:04:00Z">
+      <w:ins w:id="333" w:author="Bobay, Luke Andrew" w:date="2026-08-28T18:04:00Z" w16du:dateUtc="2026-08-29T01:04:00Z">
         <w:r>
           <w:rPr>
             <w:i/>
@@ -2630,7 +2648,7 @@
           <w:t>was calculated</w:t>
         </w:r>
       </w:ins>
-      <w:ins w:id="332" w:author="Bobay, Luke Andrew" w:date="2026-08-28T18:02:00Z" w16du:dateUtc="2026-08-29T01:02:00Z">
+      <w:ins w:id="334" w:author="Bobay, Luke Andrew" w:date="2026-08-28T18:02:00Z" w16du:dateUtc="2026-08-29T01:02:00Z">
         <w:r>
           <w:rPr>
             <w:i/>
@@ -2639,42 +2657,42 @@
           <w:t xml:space="preserve"> </w:t>
         </w:r>
       </w:ins>
-      <w:ins w:id="333" w:author="Bobay, Luke Andrew" w:date="2026-08-28T18:04:00Z" w16du:dateUtc="2026-08-29T01:04:00Z">
+      <w:ins w:id="335" w:author="Bobay, Luke Andrew" w:date="2026-08-28T18:04:00Z" w16du:dateUtc="2026-08-29T01:04:00Z">
         <w:r>
           <w:t>across all depths sampled</w:t>
         </w:r>
       </w:ins>
-      <w:ins w:id="334" w:author="Bobay, Luke Andrew" w:date="2026-08-28T18:10:00Z" w16du:dateUtc="2026-08-29T01:10:00Z">
+      <w:ins w:id="336" w:author="Bobay, Luke Andrew" w:date="2026-08-28T18:10:00Z" w16du:dateUtc="2026-08-29T01:10:00Z">
         <w:r>
           <w:t xml:space="preserve"> at a given station</w:t>
         </w:r>
       </w:ins>
-      <w:ins w:id="335" w:author="Bobay, Luke Andrew" w:date="2026-08-28T18:12:00Z" w16du:dateUtc="2026-08-29T01:12:00Z">
+      <w:ins w:id="337" w:author="Bobay, Luke Andrew" w:date="2026-08-28T18:12:00Z" w16du:dateUtc="2026-08-29T01:12:00Z">
         <w:r>
           <w:t xml:space="preserve"> (Fig. 1E)</w:t>
         </w:r>
       </w:ins>
-      <w:ins w:id="336" w:author="Bobay, Luke Andrew" w:date="2026-08-28T18:04:00Z" w16du:dateUtc="2026-08-29T01:04:00Z">
+      <w:ins w:id="338" w:author="Bobay, Luke Andrew" w:date="2026-08-28T18:04:00Z" w16du:dateUtc="2026-08-29T01:04:00Z">
         <w:r>
           <w:t xml:space="preserve">, as </w:t>
         </w:r>
       </w:ins>
-      <w:ins w:id="337" w:author="Bobay, Luke Andrew" w:date="2026-08-28T18:05:00Z" w16du:dateUtc="2026-08-29T01:05:00Z">
+      <w:ins w:id="339" w:author="Bobay, Luke Andrew" w:date="2026-08-28T18:05:00Z" w16du:dateUtc="2026-08-29T01:05:00Z">
         <w:r>
           <w:t xml:space="preserve">the vertical position of phytoplankton and zooplankton that are prey for larval fish change on </w:t>
         </w:r>
       </w:ins>
-      <w:ins w:id="338" w:author="Bobay, Luke Andrew" w:date="2026-08-28T18:06:00Z" w16du:dateUtc="2026-08-29T01:06:00Z">
+      <w:ins w:id="340" w:author="Bobay, Luke Andrew" w:date="2026-08-28T18:06:00Z" w16du:dateUtc="2026-08-29T01:06:00Z">
         <w:r>
           <w:t>shorter temporal scales than those at which they likely influence the abundance of larval fish, so we expected</w:t>
         </w:r>
       </w:ins>
-      <w:ins w:id="339" w:author="Bobay, Luke Andrew" w:date="2026-08-28T18:11:00Z" w16du:dateUtc="2026-08-29T01:11:00Z">
+      <w:ins w:id="341" w:author="Bobay, Luke Andrew" w:date="2026-08-28T18:11:00Z" w16du:dateUtc="2026-08-29T01:11:00Z">
         <w:r>
           <w:t xml:space="preserve"> depth-integrated</w:t>
         </w:r>
       </w:ins>
-      <w:ins w:id="340" w:author="Bobay, Luke Andrew" w:date="2026-08-28T18:06:00Z" w16du:dateUtc="2026-08-29T01:06:00Z">
+      <w:ins w:id="342" w:author="Bobay, Luke Andrew" w:date="2026-08-28T18:06:00Z" w16du:dateUtc="2026-08-29T01:06:00Z">
         <w:r>
           <w:t xml:space="preserve"> chl-</w:t>
         </w:r>
@@ -2686,12 +2704,12 @@
           <w:t>a</w:t>
         </w:r>
       </w:ins>
-      <w:ins w:id="341" w:author="Bobay, Luke Andrew" w:date="2026-08-28T18:07:00Z" w16du:dateUtc="2026-08-29T01:07:00Z">
+      <w:ins w:id="343" w:author="Bobay, Luke Andrew" w:date="2026-08-28T18:07:00Z" w16du:dateUtc="2026-08-29T01:07:00Z">
         <w:r>
           <w:t xml:space="preserve"> to be more relevant to ichthyoplankton abundance and assemblage composition </w:t>
         </w:r>
       </w:ins>
-      <w:ins w:id="342" w:author="Bobay, Luke Andrew" w:date="2026-08-28T18:11:00Z" w16du:dateUtc="2026-08-29T01:11:00Z">
+      <w:ins w:id="344" w:author="Bobay, Luke Andrew" w:date="2026-08-28T18:11:00Z" w16du:dateUtc="2026-08-29T01:11:00Z">
         <w:r>
           <w:t>than depth-discrete chl-</w:t>
         </w:r>
@@ -2732,18 +2750,18 @@
       <w:r>
         <w:t>All data analyses were performed in RStudio</w:t>
       </w:r>
-      <w:commentRangeStart w:id="343"/>
+      <w:commentRangeStart w:id="345"/>
       <w:r>
         <w:t xml:space="preserve">. </w:t>
       </w:r>
-      <w:commentRangeEnd w:id="343"/>
+      <w:commentRangeEnd w:id="345"/>
       <w:r>
         <w:rPr>
           <w:rStyle w:val="CommentReference"/>
           <w:sz w:val="24"/>
           <w:szCs w:val="24"/>
         </w:rPr>
-        <w:commentReference w:id="343"/>
+        <w:commentReference w:id="345"/>
       </w:r>
       <w:r>
         <w:t xml:space="preserve">To identify </w:t>
@@ -2772,18 +2790,18 @@
       <w:r>
         <w:t>To determine the number of clusters necessary</w:t>
       </w:r>
-      <w:commentRangeStart w:id="344"/>
+      <w:commentRangeStart w:id="346"/>
       <w:r>
         <w:t xml:space="preserve">, </w:t>
       </w:r>
-      <w:commentRangeEnd w:id="344"/>
+      <w:commentRangeEnd w:id="346"/>
       <w:r>
         <w:rPr>
           <w:rStyle w:val="CommentReference"/>
           <w:sz w:val="24"/>
           <w:szCs w:val="24"/>
         </w:rPr>
-        <w:commentReference w:id="344"/>
+        <w:commentReference w:id="346"/>
       </w:r>
       <w:r>
         <w:t xml:space="preserve">a dendrogram of the clustering results </w:t>
@@ -2879,6 +2897,11 @@
       </w:r>
     </w:p>
     <w:p>
+      <w:pPr>
+        <w:rPr>
+          <w:ins w:id="347" w:author="Bobay, Luke Andrew" w:date="2026-08-28T23:11:00Z" w16du:dateUtc="2026-08-29T06:11:00Z"/>
+        </w:rPr>
+      </w:pPr>
       <w:r>
         <w:t xml:space="preserve">An NMDS was run on the </w:t>
       </w:r>
@@ -2888,21 +2911,21 @@
       <w:r>
         <w:t xml:space="preserve">. The stress of the ordination was determined and its </w:t>
       </w:r>
-      <w:commentRangeStart w:id="345"/>
+      <w:commentRangeStart w:id="348"/>
       <w:r>
         <w:t>relevance</w:t>
       </w:r>
       <w:r>
         <w:t xml:space="preserve"> </w:t>
       </w:r>
-      <w:commentRangeEnd w:id="345"/>
+      <w:commentRangeEnd w:id="348"/>
       <w:r>
         <w:rPr>
           <w:rStyle w:val="CommentReference"/>
           <w:sz w:val="24"/>
           <w:szCs w:val="24"/>
         </w:rPr>
-        <w:commentReference w:id="345"/>
+        <w:commentReference w:id="348"/>
       </w:r>
       <w:r>
         <w:t xml:space="preserve">in the context of our data was assessed with the </w:t>
@@ -2919,18 +2942,18 @@
       <w:r>
         <w:t xml:space="preserve">methodology </w:t>
       </w:r>
-      <w:commentRangeStart w:id="346"/>
+      <w:commentRangeStart w:id="349"/>
       <w:r>
         <w:t xml:space="preserve">suggested </w:t>
       </w:r>
-      <w:commentRangeEnd w:id="346"/>
+      <w:commentRangeEnd w:id="349"/>
       <w:r>
         <w:rPr>
           <w:rStyle w:val="CommentReference"/>
           <w:sz w:val="24"/>
           <w:szCs w:val="24"/>
         </w:rPr>
-        <w:commentReference w:id="346"/>
+        <w:commentReference w:id="349"/>
       </w:r>
       <w:r>
         <w:t>by Dexter et al. (2018)</w:t>
@@ -2941,6 +2964,1615 @@
       <w:r>
         <w:t xml:space="preserve"> </w:t>
       </w:r>
+    </w:p>
+    <w:p>
+      <w:pPr>
+        <w:rPr>
+          <w:ins w:id="350" w:author="Bobay, Luke Andrew" w:date="2026-08-28T23:28:00Z" w16du:dateUtc="2026-08-29T06:28:00Z"/>
+        </w:rPr>
+      </w:pPr>
+      <w:ins w:id="351" w:author="Bobay, Luke Andrew" w:date="2026-08-28T23:24:00Z" w16du:dateUtc="2026-08-29T06:24:00Z">
+        <w:r>
+          <w:t xml:space="preserve">A negative binomial generalized linear mixed effects model (GLMM) was fit to counts of larval fish from each taxon in each </w:t>
+        </w:r>
+      </w:ins>
+      <w:ins w:id="352" w:author="Bobay, Luke Andrew" w:date="2026-08-29T00:36:00Z" w16du:dateUtc="2026-08-29T07:36:00Z">
+        <w:r>
+          <w:t>sample</w:t>
+        </w:r>
+      </w:ins>
+      <w:ins w:id="353" w:author="Bobay, Luke Andrew" w:date="2026-08-28T23:28:00Z" w16du:dateUtc="2026-08-29T06:28:00Z">
+        <w:r>
+          <w:t xml:space="preserve"> </w:t>
+        </w:r>
+        <w:r>
+          <w:t>using glmmTMB</w:t>
+        </w:r>
+      </w:ins>
+      <w:ins w:id="354" w:author="Bobay, Luke Andrew" w:date="2026-08-28T23:24:00Z" w16du:dateUtc="2026-08-29T06:24:00Z">
+        <w:r>
+          <w:t xml:space="preserve">. </w:t>
+        </w:r>
+      </w:ins>
+      <w:ins w:id="355" w:author="Bobay, Luke Andrew" w:date="2026-08-28T23:25:00Z" w16du:dateUtc="2026-08-29T06:25:00Z">
+        <w:r>
+          <w:t>The log l</w:t>
+        </w:r>
+      </w:ins>
+      <w:ins w:id="356" w:author="Bobay, Luke Andrew" w:date="2026-08-28T23:26:00Z" w16du:dateUtc="2026-08-29T06:26:00Z">
+        <w:r>
+          <w:t xml:space="preserve">ink was used and an offset for the log-transformed volume filtered </w:t>
+        </w:r>
+        <w:r>
+          <w:t>during each net tow was included to account for the effect of s</w:t>
+        </w:r>
+      </w:ins>
+      <w:ins w:id="357" w:author="Bobay, Luke Andrew" w:date="2026-08-28T23:27:00Z" w16du:dateUtc="2026-08-29T06:27:00Z">
+        <w:r>
+          <w:t xml:space="preserve">ampling effort. </w:t>
+        </w:r>
+      </w:ins>
+      <w:ins w:id="358" w:author="Bobay, Luke Andrew" w:date="2026-08-29T00:41:00Z" w16du:dateUtc="2026-08-29T07:41:00Z">
+        <w:r>
+          <w:t xml:space="preserve">Fixed effects included taxon, year, time of day, </w:t>
+        </w:r>
+      </w:ins>
+      <w:ins w:id="359" w:author="Bobay, Luke Andrew" w:date="2026-08-29T00:42:00Z" w16du:dateUtc="2026-08-29T07:42:00Z">
+        <w:r>
+          <w:t>depth, latitude, seafloor depth, temperature, salinity, DO, chl-</w:t>
+        </w:r>
+        <w:r>
+          <w:rPr>
+            <w:i/>
+            <w:iCs/>
+          </w:rPr>
+          <w:t>a</w:t>
+        </w:r>
+        <w:r>
+          <w:rPr>
+            <w:rPrChange w:id="360" w:author="Bobay, Luke Andrew" w:date="2026-08-29T00:42:00Z" w16du:dateUtc="2026-08-29T07:42:00Z">
+              <w:rPr>
+                <w:i/>
+                <w:iCs/>
+              </w:rPr>
+            </w:rPrChange>
+          </w:rPr>
+          <w:t>,</w:t>
+        </w:r>
+        <w:r>
+          <w:rPr>
+            <w:i/>
+            <w:iCs/>
+          </w:rPr>
+          <w:t xml:space="preserve"> </w:t>
+        </w:r>
+        <w:r>
+          <w:t xml:space="preserve">and the full interaction </w:t>
+        </w:r>
+      </w:ins>
+      <w:ins w:id="361" w:author="Bobay, Luke Andrew" w:date="2026-08-29T00:43:00Z" w16du:dateUtc="2026-08-29T07:43:00Z">
+        <w:r>
+          <w:t xml:space="preserve">among taxon, time of day, and depth. </w:t>
+        </w:r>
+      </w:ins>
+      <w:ins w:id="362" w:author="Bobay, Luke Andrew" w:date="2026-08-29T00:44:00Z" w16du:dateUtc="2026-08-29T07:44:00Z">
+        <w:r>
+          <w:t>Continuous predictors were centered and scaled before model fitting.</w:t>
+        </w:r>
+        <w:r>
+          <w:t xml:space="preserve"> </w:t>
+        </w:r>
+      </w:ins>
+      <w:ins w:id="363" w:author="Bobay, Luke Andrew" w:date="2026-08-29T00:43:00Z" w16du:dateUtc="2026-08-29T07:43:00Z">
+        <w:r>
+          <w:t xml:space="preserve">A random intercept for sample was included. </w:t>
+        </w:r>
+      </w:ins>
+      <w:ins w:id="364" w:author="Bobay, Luke Andrew" w:date="2026-08-28T23:27:00Z" w16du:dateUtc="2026-08-29T06:27:00Z">
+        <w:r>
+          <w:t>The model is represented by the equatio</w:t>
+        </w:r>
+      </w:ins>
+      <w:ins w:id="365" w:author="Bobay, Luke Andrew" w:date="2026-08-28T23:28:00Z" w16du:dateUtc="2026-08-29T06:28:00Z">
+        <w:r>
+          <w:t>n:</w:t>
+        </w:r>
+      </w:ins>
+    </w:p>
+    <w:p>
+      <w:pPr>
+        <w:rPr>
+          <w:rFonts w:eastAsiaTheme="minorEastAsia"/>
+        </w:rPr>
+      </w:pPr>
+      <m:oMathPara>
+        <m:oMath>
+          <m:sSub>
+            <m:sSubPr>
+              <m:ctrlPr>
+                <w:rPr>
+                  <w:rFonts w:ascii="Cambria Math" w:eastAsiaTheme="minorEastAsia" w:hAnsi="Cambria Math"/>
+                </w:rPr>
+              </m:ctrlPr>
+            </m:sSubPr>
+            <m:e>
+              <m:r>
+                <w:rPr>
+                  <w:rFonts w:ascii="Cambria Math" w:eastAsiaTheme="minorEastAsia" w:hAnsi="Cambria Math"/>
+                </w:rPr>
+                <m:t>y</m:t>
+              </m:r>
+            </m:e>
+            <m:sub>
+              <m:r>
+                <w:rPr>
+                  <w:rFonts w:ascii="Cambria Math" w:eastAsiaTheme="minorEastAsia" w:hAnsi="Cambria Math"/>
+                </w:rPr>
+                <m:t>i,j,k</m:t>
+              </m:r>
+            </m:sub>
+          </m:sSub>
+          <m:r>
+            <w:rPr>
+              <w:rFonts w:ascii="Cambria Math" w:eastAsiaTheme="minorEastAsia" w:hAnsi="Cambria Math"/>
+            </w:rPr>
+            <m:t> </m:t>
+          </m:r>
+          <m:r>
+            <w:rPr>
+              <w:rFonts w:ascii="Cambria Math" w:eastAsiaTheme="minorEastAsia" w:hAnsi="Cambria Math"/>
+            </w:rPr>
+            <m:t xml:space="preserve">~ </m:t>
+          </m:r>
+          <m:r>
+            <w:rPr>
+              <w:rFonts w:ascii="Cambria Math" w:eastAsiaTheme="minorEastAsia" w:hAnsi="Cambria Math"/>
+            </w:rPr>
+            <m:t>NB</m:t>
+          </m:r>
+          <m:d>
+            <m:dPr>
+              <m:ctrlPr>
+                <w:rPr>
+                  <w:rFonts w:ascii="Cambria Math" w:eastAsiaTheme="minorEastAsia" w:hAnsi="Cambria Math"/>
+                </w:rPr>
+              </m:ctrlPr>
+            </m:dPr>
+            <m:e>
+              <m:sSub>
+                <m:sSubPr>
+                  <m:ctrlPr>
+                    <w:rPr>
+                      <w:rFonts w:ascii="Cambria Math" w:eastAsiaTheme="minorEastAsia" w:hAnsi="Cambria Math"/>
+                    </w:rPr>
+                  </m:ctrlPr>
+                </m:sSubPr>
+                <m:e>
+                  <m:r>
+                    <w:rPr>
+                      <w:rFonts w:ascii="Cambria Math" w:eastAsiaTheme="minorEastAsia" w:hAnsi="Cambria Math"/>
+                    </w:rPr>
+                    <m:t>μ</m:t>
+                  </m:r>
+                </m:e>
+                <m:sub>
+                  <m:r>
+                    <w:rPr>
+                      <w:rFonts w:ascii="Cambria Math" w:eastAsiaTheme="minorEastAsia" w:hAnsi="Cambria Math"/>
+                    </w:rPr>
+                    <m:t>i,j,k</m:t>
+                  </m:r>
+                </m:sub>
+              </m:sSub>
+              <m:r>
+                <w:rPr>
+                  <w:rFonts w:ascii="Cambria Math" w:eastAsiaTheme="minorEastAsia" w:hAnsi="Cambria Math"/>
+                </w:rPr>
+                <m:t>,ϕ</m:t>
+              </m:r>
+            </m:e>
+          </m:d>
+        </m:oMath>
+      </m:oMathPara>
+    </w:p>
+    <w:p>
+      <w:pPr>
+        <w:rPr>
+          <w:rFonts w:eastAsiaTheme="minorEastAsia"/>
+        </w:rPr>
+      </w:pPr>
+      <m:oMathPara>
+        <m:oMath>
+          <m:r>
+            <w:rPr>
+              <w:rFonts w:ascii="Cambria Math" w:eastAsiaTheme="minorEastAsia" w:hAnsi="Cambria Math"/>
+            </w:rPr>
+            <m:t>log</m:t>
+          </m:r>
+          <m:d>
+            <m:dPr>
+              <m:ctrlPr>
+                <w:rPr>
+                  <w:rFonts w:ascii="Cambria Math" w:eastAsiaTheme="minorEastAsia" w:hAnsi="Cambria Math"/>
+                </w:rPr>
+              </m:ctrlPr>
+            </m:dPr>
+            <m:e>
+              <m:sSub>
+                <m:sSubPr>
+                  <m:ctrlPr>
+                    <w:rPr>
+                      <w:rFonts w:ascii="Cambria Math" w:eastAsiaTheme="minorEastAsia" w:hAnsi="Cambria Math"/>
+                    </w:rPr>
+                  </m:ctrlPr>
+                </m:sSubPr>
+                <m:e>
+                  <m:r>
+                    <w:rPr>
+                      <w:rFonts w:ascii="Cambria Math" w:eastAsiaTheme="minorEastAsia" w:hAnsi="Cambria Math"/>
+                    </w:rPr>
+                    <m:t>μ</m:t>
+                  </m:r>
+                </m:e>
+                <m:sub>
+                  <m:r>
+                    <w:rPr>
+                      <w:rFonts w:ascii="Cambria Math" w:eastAsiaTheme="minorEastAsia" w:hAnsi="Cambria Math"/>
+                    </w:rPr>
+                    <m:t>i,j,k</m:t>
+                  </m:r>
+                </m:sub>
+              </m:sSub>
+            </m:e>
+          </m:d>
+          <m:r>
+            <w:rPr>
+              <w:rFonts w:ascii="Cambria Math" w:eastAsiaTheme="minorEastAsia" w:hAnsi="Cambria Math"/>
+            </w:rPr>
+            <m:t>=log</m:t>
+          </m:r>
+          <m:d>
+            <m:dPr>
+              <m:ctrlPr>
+                <w:rPr>
+                  <w:rFonts w:ascii="Cambria Math" w:eastAsiaTheme="minorEastAsia" w:hAnsi="Cambria Math"/>
+                </w:rPr>
+              </m:ctrlPr>
+            </m:dPr>
+            <m:e>
+              <m:sSub>
+                <m:sSubPr>
+                  <m:ctrlPr>
+                    <w:rPr>
+                      <w:rFonts w:ascii="Cambria Math" w:eastAsiaTheme="minorEastAsia" w:hAnsi="Cambria Math"/>
+                    </w:rPr>
+                  </m:ctrlPr>
+                </m:sSubPr>
+                <m:e>
+                  <m:r>
+                    <w:rPr>
+                      <w:rFonts w:ascii="Cambria Math" w:eastAsiaTheme="minorEastAsia" w:hAnsi="Cambria Math"/>
+                    </w:rPr>
+                    <m:t>V</m:t>
+                  </m:r>
+                </m:e>
+                <m:sub>
+                  <m:r>
+                    <w:rPr>
+                      <w:rFonts w:ascii="Cambria Math" w:eastAsiaTheme="minorEastAsia" w:hAnsi="Cambria Math"/>
+                    </w:rPr>
+                    <m:t>i,j,k</m:t>
+                  </m:r>
+                </m:sub>
+              </m:sSub>
+            </m:e>
+          </m:d>
+          <m:r>
+            <w:rPr>
+              <w:rFonts w:ascii="Cambria Math" w:eastAsiaTheme="minorEastAsia" w:hAnsi="Cambria Math"/>
+            </w:rPr>
+            <m:t>+</m:t>
+          </m:r>
+          <m:sSub>
+            <m:sSubPr>
+              <m:ctrlPr>
+                <w:rPr>
+                  <w:rFonts w:ascii="Cambria Math" w:eastAsiaTheme="minorEastAsia" w:hAnsi="Cambria Math"/>
+                </w:rPr>
+              </m:ctrlPr>
+            </m:sSubPr>
+            <m:e>
+              <m:r>
+                <w:rPr>
+                  <w:rFonts w:ascii="Cambria Math" w:eastAsiaTheme="minorEastAsia" w:hAnsi="Cambria Math"/>
+                </w:rPr>
+                <m:t>β</m:t>
+              </m:r>
+            </m:e>
+            <m:sub>
+              <m:r>
+                <w:rPr>
+                  <w:rFonts w:ascii="Cambria Math" w:eastAsiaTheme="minorEastAsia" w:hAnsi="Cambria Math"/>
+                </w:rPr>
+                <m:t>0</m:t>
+              </m:r>
+            </m:sub>
+          </m:sSub>
+          <m:r>
+            <w:rPr>
+              <w:rFonts w:ascii="Cambria Math" w:eastAsiaTheme="minorEastAsia" w:hAnsi="Cambria Math"/>
+            </w:rPr>
+            <m:t>+</m:t>
+          </m:r>
+          <m:sSub>
+            <m:sSubPr>
+              <m:ctrlPr>
+                <w:rPr>
+                  <w:rFonts w:ascii="Cambria Math" w:eastAsiaTheme="minorEastAsia" w:hAnsi="Cambria Math"/>
+                </w:rPr>
+              </m:ctrlPr>
+            </m:sSubPr>
+            <m:e>
+              <m:r>
+                <w:rPr>
+                  <w:rFonts w:ascii="Cambria Math" w:eastAsiaTheme="minorEastAsia" w:hAnsi="Cambria Math"/>
+                </w:rPr>
+                <m:t>β</m:t>
+              </m:r>
+            </m:e>
+            <m:sub>
+              <m:r>
+                <m:rPr>
+                  <m:nor/>
+                </m:rPr>
+                <w:rPr>
+                  <w:rFonts w:ascii="Cambria Math" w:eastAsiaTheme="minorEastAsia" w:hAnsi="Cambria Math"/>
+                </w:rPr>
+                <m:t>taxon</m:t>
+              </m:r>
+              <m:r>
+                <w:rPr>
+                  <w:rFonts w:ascii="Cambria Math" w:eastAsiaTheme="minorEastAsia" w:hAnsi="Cambria Math"/>
+                </w:rPr>
+                <m:t>,i</m:t>
+              </m:r>
+            </m:sub>
+          </m:sSub>
+          <m:r>
+            <w:rPr>
+              <w:rFonts w:ascii="Cambria Math" w:eastAsiaTheme="minorEastAsia" w:hAnsi="Cambria Math"/>
+            </w:rPr>
+            <m:t>+</m:t>
+          </m:r>
+          <m:sSub>
+            <m:sSubPr>
+              <m:ctrlPr>
+                <w:rPr>
+                  <w:rFonts w:ascii="Cambria Math" w:eastAsiaTheme="minorEastAsia" w:hAnsi="Cambria Math"/>
+                </w:rPr>
+              </m:ctrlPr>
+            </m:sSubPr>
+            <m:e>
+              <m:r>
+                <w:rPr>
+                  <w:rFonts w:ascii="Cambria Math" w:eastAsiaTheme="minorEastAsia" w:hAnsi="Cambria Math"/>
+                </w:rPr>
+                <m:t>β</m:t>
+              </m:r>
+            </m:e>
+            <m:sub>
+              <m:r>
+                <m:rPr>
+                  <m:nor/>
+                </m:rPr>
+                <w:rPr>
+                  <w:rFonts w:ascii="Cambria Math" w:eastAsiaTheme="minorEastAsia" w:hAnsi="Cambria Math"/>
+                </w:rPr>
+                <m:t>year</m:t>
+              </m:r>
+              <m:r>
+                <w:rPr>
+                  <w:rFonts w:ascii="Cambria Math" w:eastAsiaTheme="minorEastAsia" w:hAnsi="Cambria Math"/>
+                </w:rPr>
+                <m:t>,j</m:t>
+              </m:r>
+            </m:sub>
+          </m:sSub>
+          <m:r>
+            <w:rPr>
+              <w:rFonts w:ascii="Cambria Math" w:eastAsiaTheme="minorEastAsia" w:hAnsi="Cambria Math"/>
+            </w:rPr>
+            <m:t>+</m:t>
+          </m:r>
+          <m:sSub>
+            <m:sSubPr>
+              <m:ctrlPr>
+                <w:rPr>
+                  <w:rFonts w:ascii="Cambria Math" w:eastAsiaTheme="minorEastAsia" w:hAnsi="Cambria Math"/>
+                </w:rPr>
+              </m:ctrlPr>
+            </m:sSubPr>
+            <m:e>
+              <m:r>
+                <w:rPr>
+                  <w:rFonts w:ascii="Cambria Math" w:eastAsiaTheme="minorEastAsia" w:hAnsi="Cambria Math"/>
+                </w:rPr>
+                <m:t>β</m:t>
+              </m:r>
+            </m:e>
+            <m:sub>
+              <m:r>
+                <w:rPr>
+                  <w:rFonts w:ascii="Cambria Math" w:eastAsiaTheme="minorEastAsia" w:hAnsi="Cambria Math"/>
+                </w:rPr>
+                <m:t>1</m:t>
+              </m:r>
+            </m:sub>
+          </m:sSub>
+          <m:sSub>
+            <m:sSubPr>
+              <m:ctrlPr>
+                <w:rPr>
+                  <w:rFonts w:ascii="Cambria Math" w:eastAsiaTheme="minorEastAsia" w:hAnsi="Cambria Math"/>
+                </w:rPr>
+              </m:ctrlPr>
+            </m:sSubPr>
+            <m:e>
+              <m:r>
+                <m:rPr>
+                  <m:nor/>
+                </m:rPr>
+                <w:rPr>
+                  <w:rFonts w:ascii="Cambria Math" w:eastAsiaTheme="minorEastAsia" w:hAnsi="Cambria Math"/>
+                </w:rPr>
+                <m:t>time of day</m:t>
+              </m:r>
+            </m:e>
+            <m:sub>
+              <m:r>
+                <w:rPr>
+                  <w:rFonts w:ascii="Cambria Math" w:eastAsiaTheme="minorEastAsia" w:hAnsi="Cambria Math"/>
+                </w:rPr>
+                <m:t>i,j,k</m:t>
+              </m:r>
+            </m:sub>
+          </m:sSub>
+          <m:r>
+            <w:rPr>
+              <w:rFonts w:ascii="Cambria Math" w:eastAsiaTheme="minorEastAsia" w:hAnsi="Cambria Math"/>
+            </w:rPr>
+            <m:t>+</m:t>
+          </m:r>
+          <m:sSub>
+            <m:sSubPr>
+              <m:ctrlPr>
+                <w:rPr>
+                  <w:rFonts w:ascii="Cambria Math" w:eastAsiaTheme="minorEastAsia" w:hAnsi="Cambria Math"/>
+                </w:rPr>
+              </m:ctrlPr>
+            </m:sSubPr>
+            <m:e>
+              <m:r>
+                <w:rPr>
+                  <w:rFonts w:ascii="Cambria Math" w:eastAsiaTheme="minorEastAsia" w:hAnsi="Cambria Math"/>
+                </w:rPr>
+                <m:t>β</m:t>
+              </m:r>
+            </m:e>
+            <m:sub>
+              <m:r>
+                <w:rPr>
+                  <w:rFonts w:ascii="Cambria Math" w:eastAsiaTheme="minorEastAsia" w:hAnsi="Cambria Math"/>
+                </w:rPr>
+                <m:t>2</m:t>
+              </m:r>
+            </m:sub>
+          </m:sSub>
+          <m:sSub>
+            <m:sSubPr>
+              <m:ctrlPr>
+                <w:rPr>
+                  <w:rFonts w:ascii="Cambria Math" w:eastAsiaTheme="minorEastAsia" w:hAnsi="Cambria Math"/>
+                </w:rPr>
+              </m:ctrlPr>
+            </m:sSubPr>
+            <m:e>
+              <m:r>
+                <m:rPr>
+                  <m:nor/>
+                </m:rPr>
+                <w:rPr>
+                  <w:rFonts w:ascii="Cambria Math" w:eastAsiaTheme="minorEastAsia" w:hAnsi="Cambria Math"/>
+                </w:rPr>
+                <m:t>depth</m:t>
+              </m:r>
+            </m:e>
+            <m:sub>
+              <m:r>
+                <w:rPr>
+                  <w:rFonts w:ascii="Cambria Math" w:eastAsiaTheme="minorEastAsia" w:hAnsi="Cambria Math"/>
+                </w:rPr>
+                <m:t>i,j,k</m:t>
+              </m:r>
+            </m:sub>
+          </m:sSub>
+          <m:r>
+            <w:rPr>
+              <w:rFonts w:ascii="Cambria Math" w:eastAsiaTheme="minorEastAsia" w:hAnsi="Cambria Math"/>
+            </w:rPr>
+            <m:t>+bet</m:t>
+          </m:r>
+          <m:sSub>
+            <m:sSubPr>
+              <m:ctrlPr>
+                <w:rPr>
+                  <w:rFonts w:ascii="Cambria Math" w:eastAsiaTheme="minorEastAsia" w:hAnsi="Cambria Math"/>
+                </w:rPr>
+              </m:ctrlPr>
+            </m:sSubPr>
+            <m:e>
+              <m:r>
+                <w:rPr>
+                  <w:rFonts w:ascii="Cambria Math" w:eastAsiaTheme="minorEastAsia" w:hAnsi="Cambria Math"/>
+                </w:rPr>
+                <m:t>a</m:t>
+              </m:r>
+            </m:e>
+            <m:sub>
+              <m:r>
+                <w:rPr>
+                  <w:rFonts w:ascii="Cambria Math" w:eastAsiaTheme="minorEastAsia" w:hAnsi="Cambria Math"/>
+                </w:rPr>
+                <m:t>3</m:t>
+              </m:r>
+            </m:sub>
+          </m:sSub>
+          <m:sSub>
+            <m:sSubPr>
+              <m:ctrlPr>
+                <w:rPr>
+                  <w:rFonts w:ascii="Cambria Math" w:eastAsiaTheme="minorEastAsia" w:hAnsi="Cambria Math"/>
+                </w:rPr>
+              </m:ctrlPr>
+            </m:sSubPr>
+            <m:e>
+              <m:r>
+                <m:rPr>
+                  <m:nor/>
+                </m:rPr>
+                <w:rPr>
+                  <w:rFonts w:ascii="Cambria Math" w:eastAsiaTheme="minorEastAsia" w:hAnsi="Cambria Math"/>
+                </w:rPr>
+                <m:t>latitude</m:t>
+              </m:r>
+            </m:e>
+            <m:sub>
+              <m:r>
+                <w:rPr>
+                  <w:rFonts w:ascii="Cambria Math" w:eastAsiaTheme="minorEastAsia" w:hAnsi="Cambria Math"/>
+                </w:rPr>
+                <m:t>i,j,k</m:t>
+              </m:r>
+            </m:sub>
+          </m:sSub>
+          <m:r>
+            <w:rPr>
+              <w:rFonts w:ascii="Cambria Math" w:eastAsiaTheme="minorEastAsia" w:hAnsi="Cambria Math"/>
+            </w:rPr>
+            <m:t>+</m:t>
+          </m:r>
+          <m:sSub>
+            <m:sSubPr>
+              <m:ctrlPr>
+                <w:rPr>
+                  <w:rFonts w:ascii="Cambria Math" w:eastAsiaTheme="minorEastAsia" w:hAnsi="Cambria Math"/>
+                </w:rPr>
+              </m:ctrlPr>
+            </m:sSubPr>
+            <m:e>
+              <m:r>
+                <w:rPr>
+                  <w:rFonts w:ascii="Cambria Math" w:eastAsiaTheme="minorEastAsia" w:hAnsi="Cambria Math"/>
+                </w:rPr>
+                <m:t>β</m:t>
+              </m:r>
+            </m:e>
+            <m:sub>
+              <m:r>
+                <w:rPr>
+                  <w:rFonts w:ascii="Cambria Math" w:eastAsiaTheme="minorEastAsia" w:hAnsi="Cambria Math"/>
+                </w:rPr>
+                <m:t>4</m:t>
+              </m:r>
+            </m:sub>
+          </m:sSub>
+          <m:sSub>
+            <m:sSubPr>
+              <m:ctrlPr>
+                <w:rPr>
+                  <w:rFonts w:ascii="Cambria Math" w:eastAsiaTheme="minorEastAsia" w:hAnsi="Cambria Math"/>
+                </w:rPr>
+              </m:ctrlPr>
+            </m:sSubPr>
+            <m:e>
+              <m:r>
+                <m:rPr>
+                  <m:nor/>
+                </m:rPr>
+                <w:rPr>
+                  <w:rFonts w:ascii="Cambria Math" w:eastAsiaTheme="minorEastAsia" w:hAnsi="Cambria Math"/>
+                </w:rPr>
+                <m:t>seafloor depth</m:t>
+              </m:r>
+            </m:e>
+            <m:sub>
+              <m:r>
+                <w:rPr>
+                  <w:rFonts w:ascii="Cambria Math" w:eastAsiaTheme="minorEastAsia" w:hAnsi="Cambria Math"/>
+                </w:rPr>
+                <m:t>i,j,k</m:t>
+              </m:r>
+            </m:sub>
+          </m:sSub>
+          <m:r>
+            <w:rPr>
+              <w:rFonts w:ascii="Cambria Math" w:eastAsiaTheme="minorEastAsia" w:hAnsi="Cambria Math"/>
+            </w:rPr>
+            <m:t>+</m:t>
+          </m:r>
+          <m:sSub>
+            <m:sSubPr>
+              <m:ctrlPr>
+                <w:rPr>
+                  <w:rFonts w:ascii="Cambria Math" w:eastAsiaTheme="minorEastAsia" w:hAnsi="Cambria Math"/>
+                </w:rPr>
+              </m:ctrlPr>
+            </m:sSubPr>
+            <m:e>
+              <m:r>
+                <w:rPr>
+                  <w:rFonts w:ascii="Cambria Math" w:eastAsiaTheme="minorEastAsia" w:hAnsi="Cambria Math"/>
+                </w:rPr>
+                <m:t>β</m:t>
+              </m:r>
+            </m:e>
+            <m:sub>
+              <m:r>
+                <w:rPr>
+                  <w:rFonts w:ascii="Cambria Math" w:eastAsiaTheme="minorEastAsia" w:hAnsi="Cambria Math"/>
+                </w:rPr>
+                <m:t>5</m:t>
+              </m:r>
+            </m:sub>
+          </m:sSub>
+          <m:sSub>
+            <m:sSubPr>
+              <m:ctrlPr>
+                <w:rPr>
+                  <w:rFonts w:ascii="Cambria Math" w:eastAsiaTheme="minorEastAsia" w:hAnsi="Cambria Math"/>
+                </w:rPr>
+              </m:ctrlPr>
+            </m:sSubPr>
+            <m:e>
+              <m:r>
+                <m:rPr>
+                  <m:nor/>
+                </m:rPr>
+                <w:rPr>
+                  <w:rFonts w:ascii="Cambria Math" w:eastAsiaTheme="minorEastAsia" w:hAnsi="Cambria Math"/>
+                </w:rPr>
+                <m:t>temperature</m:t>
+              </m:r>
+            </m:e>
+            <m:sub>
+              <m:r>
+                <w:rPr>
+                  <w:rFonts w:ascii="Cambria Math" w:eastAsiaTheme="minorEastAsia" w:hAnsi="Cambria Math"/>
+                </w:rPr>
+                <m:t>i,j,k</m:t>
+              </m:r>
+            </m:sub>
+          </m:sSub>
+          <m:r>
+            <w:rPr>
+              <w:rFonts w:ascii="Cambria Math" w:eastAsiaTheme="minorEastAsia" w:hAnsi="Cambria Math"/>
+            </w:rPr>
+            <m:t>+</m:t>
+          </m:r>
+          <m:sSub>
+            <m:sSubPr>
+              <m:ctrlPr>
+                <w:rPr>
+                  <w:rFonts w:ascii="Cambria Math" w:eastAsiaTheme="minorEastAsia" w:hAnsi="Cambria Math"/>
+                </w:rPr>
+              </m:ctrlPr>
+            </m:sSubPr>
+            <m:e>
+              <m:r>
+                <w:rPr>
+                  <w:rFonts w:ascii="Cambria Math" w:eastAsiaTheme="minorEastAsia" w:hAnsi="Cambria Math"/>
+                </w:rPr>
+                <m:t>β</m:t>
+              </m:r>
+            </m:e>
+            <m:sub>
+              <m:r>
+                <w:rPr>
+                  <w:rFonts w:ascii="Cambria Math" w:eastAsiaTheme="minorEastAsia" w:hAnsi="Cambria Math"/>
+                </w:rPr>
+                <m:t>6</m:t>
+              </m:r>
+            </m:sub>
+          </m:sSub>
+          <m:sSub>
+            <m:sSubPr>
+              <m:ctrlPr>
+                <w:rPr>
+                  <w:rFonts w:ascii="Cambria Math" w:eastAsiaTheme="minorEastAsia" w:hAnsi="Cambria Math"/>
+                </w:rPr>
+              </m:ctrlPr>
+            </m:sSubPr>
+            <m:e>
+              <m:r>
+                <m:rPr>
+                  <m:nor/>
+                </m:rPr>
+                <w:rPr>
+                  <w:rFonts w:ascii="Cambria Math" w:eastAsiaTheme="minorEastAsia" w:hAnsi="Cambria Math"/>
+                </w:rPr>
+                <m:t>salinity</m:t>
+              </m:r>
+            </m:e>
+            <m:sub>
+              <m:r>
+                <w:rPr>
+                  <w:rFonts w:ascii="Cambria Math" w:eastAsiaTheme="minorEastAsia" w:hAnsi="Cambria Math"/>
+                </w:rPr>
+                <m:t>i,j,k</m:t>
+              </m:r>
+            </m:sub>
+          </m:sSub>
+          <m:r>
+            <w:rPr>
+              <w:rFonts w:ascii="Cambria Math" w:eastAsiaTheme="minorEastAsia" w:hAnsi="Cambria Math"/>
+            </w:rPr>
+            <m:t>+</m:t>
+          </m:r>
+          <m:sSub>
+            <m:sSubPr>
+              <m:ctrlPr>
+                <w:rPr>
+                  <w:rFonts w:ascii="Cambria Math" w:eastAsiaTheme="minorEastAsia" w:hAnsi="Cambria Math"/>
+                </w:rPr>
+              </m:ctrlPr>
+            </m:sSubPr>
+            <m:e>
+              <m:r>
+                <w:rPr>
+                  <w:rFonts w:ascii="Cambria Math" w:eastAsiaTheme="minorEastAsia" w:hAnsi="Cambria Math"/>
+                </w:rPr>
+                <m:t>β</m:t>
+              </m:r>
+            </m:e>
+            <m:sub>
+              <m:r>
+                <w:rPr>
+                  <w:rFonts w:ascii="Cambria Math" w:eastAsiaTheme="minorEastAsia" w:hAnsi="Cambria Math"/>
+                </w:rPr>
+                <m:t>7</m:t>
+              </m:r>
+            </m:sub>
+          </m:sSub>
+          <m:sSub>
+            <m:sSubPr>
+              <m:ctrlPr>
+                <w:rPr>
+                  <w:rFonts w:ascii="Cambria Math" w:eastAsiaTheme="minorEastAsia" w:hAnsi="Cambria Math"/>
+                </w:rPr>
+              </m:ctrlPr>
+            </m:sSubPr>
+            <m:e>
+              <m:r>
+                <m:rPr>
+                  <m:nor/>
+                </m:rPr>
+                <w:rPr>
+                  <w:rFonts w:ascii="Cambria Math" w:eastAsiaTheme="minorEastAsia" w:hAnsi="Cambria Math"/>
+                </w:rPr>
+                <m:t>DO</m:t>
+              </m:r>
+            </m:e>
+            <m:sub>
+              <m:r>
+                <w:rPr>
+                  <w:rFonts w:ascii="Cambria Math" w:eastAsiaTheme="minorEastAsia" w:hAnsi="Cambria Math"/>
+                </w:rPr>
+                <m:t>i,j,k</m:t>
+              </m:r>
+            </m:sub>
+          </m:sSub>
+          <m:r>
+            <w:rPr>
+              <w:rFonts w:ascii="Cambria Math" w:eastAsiaTheme="minorEastAsia" w:hAnsi="Cambria Math"/>
+            </w:rPr>
+            <m:t>+</m:t>
+          </m:r>
+          <m:sSub>
+            <m:sSubPr>
+              <m:ctrlPr>
+                <w:rPr>
+                  <w:rFonts w:ascii="Cambria Math" w:eastAsiaTheme="minorEastAsia" w:hAnsi="Cambria Math"/>
+                </w:rPr>
+              </m:ctrlPr>
+            </m:sSubPr>
+            <m:e>
+              <m:r>
+                <w:rPr>
+                  <w:rFonts w:ascii="Cambria Math" w:eastAsiaTheme="minorEastAsia" w:hAnsi="Cambria Math"/>
+                </w:rPr>
+                <m:t>β</m:t>
+              </m:r>
+            </m:e>
+            <m:sub>
+              <m:r>
+                <w:rPr>
+                  <w:rFonts w:ascii="Cambria Math" w:eastAsiaTheme="minorEastAsia" w:hAnsi="Cambria Math"/>
+                </w:rPr>
+                <m:t>8</m:t>
+              </m:r>
+            </m:sub>
+          </m:sSub>
+          <m:sSub>
+            <m:sSubPr>
+              <m:ctrlPr>
+                <w:rPr>
+                  <w:rFonts w:ascii="Cambria Math" w:eastAsiaTheme="minorEastAsia" w:hAnsi="Cambria Math"/>
+                </w:rPr>
+              </m:ctrlPr>
+            </m:sSubPr>
+            <m:e>
+              <m:r>
+                <m:rPr>
+                  <m:nor/>
+                </m:rPr>
+                <w:rPr>
+                  <w:rFonts w:ascii="Cambria Math" w:eastAsiaTheme="minorEastAsia" w:hAnsi="Cambria Math"/>
+                </w:rPr>
+                <m:t>chl-a</m:t>
+              </m:r>
+            </m:e>
+            <m:sub>
+              <m:r>
+                <w:rPr>
+                  <w:rFonts w:ascii="Cambria Math" w:eastAsiaTheme="minorEastAsia" w:hAnsi="Cambria Math"/>
+                </w:rPr>
+                <m:t>i,j,k</m:t>
+              </m:r>
+            </m:sub>
+          </m:sSub>
+          <m:r>
+            <w:rPr>
+              <w:rFonts w:ascii="Cambria Math" w:eastAsiaTheme="minorEastAsia" w:hAnsi="Cambria Math"/>
+            </w:rPr>
+            <m:t>+</m:t>
+          </m:r>
+          <m:sSub>
+            <m:sSubPr>
+              <m:ctrlPr>
+                <w:rPr>
+                  <w:rFonts w:ascii="Cambria Math" w:eastAsiaTheme="minorEastAsia" w:hAnsi="Cambria Math"/>
+                </w:rPr>
+              </m:ctrlPr>
+            </m:sSubPr>
+            <m:e>
+              <m:r>
+                <w:rPr>
+                  <w:rFonts w:ascii="Cambria Math" w:eastAsiaTheme="minorEastAsia" w:hAnsi="Cambria Math"/>
+                </w:rPr>
+                <m:t>β</m:t>
+              </m:r>
+            </m:e>
+            <m:sub>
+              <m:r>
+                <m:rPr>
+                  <m:nor/>
+                </m:rPr>
+                <w:rPr>
+                  <w:rFonts w:ascii="Cambria Math" w:eastAsiaTheme="minorEastAsia" w:hAnsi="Cambria Math"/>
+                </w:rPr>
+                <m:t>taxon:time of day</m:t>
+              </m:r>
+              <m:r>
+                <w:rPr>
+                  <w:rFonts w:ascii="Cambria Math" w:eastAsiaTheme="minorEastAsia" w:hAnsi="Cambria Math"/>
+                </w:rPr>
+                <m:t>,i</m:t>
+              </m:r>
+            </m:sub>
+          </m:sSub>
+          <m:sSub>
+            <m:sSubPr>
+              <m:ctrlPr>
+                <w:rPr>
+                  <w:rFonts w:ascii="Cambria Math" w:eastAsiaTheme="minorEastAsia" w:hAnsi="Cambria Math"/>
+                </w:rPr>
+              </m:ctrlPr>
+            </m:sSubPr>
+            <m:e>
+              <m:r>
+                <m:rPr>
+                  <m:nor/>
+                </m:rPr>
+                <w:rPr>
+                  <w:rFonts w:ascii="Cambria Math" w:eastAsiaTheme="minorEastAsia" w:hAnsi="Cambria Math"/>
+                </w:rPr>
+                <m:t>time of day</m:t>
+              </m:r>
+            </m:e>
+            <m:sub>
+              <m:r>
+                <w:rPr>
+                  <w:rFonts w:ascii="Cambria Math" w:eastAsiaTheme="minorEastAsia" w:hAnsi="Cambria Math"/>
+                </w:rPr>
+                <m:t>i,j,k</m:t>
+              </m:r>
+            </m:sub>
+          </m:sSub>
+          <m:r>
+            <w:rPr>
+              <w:rFonts w:ascii="Cambria Math" w:eastAsiaTheme="minorEastAsia" w:hAnsi="Cambria Math"/>
+            </w:rPr>
+            <m:t>+</m:t>
+          </m:r>
+          <m:sSub>
+            <m:sSubPr>
+              <m:ctrlPr>
+                <w:rPr>
+                  <w:rFonts w:ascii="Cambria Math" w:eastAsiaTheme="minorEastAsia" w:hAnsi="Cambria Math"/>
+                </w:rPr>
+              </m:ctrlPr>
+            </m:sSubPr>
+            <m:e>
+              <m:r>
+                <w:rPr>
+                  <w:rFonts w:ascii="Cambria Math" w:eastAsiaTheme="minorEastAsia" w:hAnsi="Cambria Math"/>
+                </w:rPr>
+                <m:t>β</m:t>
+              </m:r>
+            </m:e>
+            <m:sub>
+              <m:r>
+                <m:rPr>
+                  <m:nor/>
+                </m:rPr>
+                <w:rPr>
+                  <w:rFonts w:ascii="Cambria Math" w:eastAsiaTheme="minorEastAsia" w:hAnsi="Cambria Math"/>
+                </w:rPr>
+                <m:t>taxon:depth</m:t>
+              </m:r>
+              <m:r>
+                <w:rPr>
+                  <w:rFonts w:ascii="Cambria Math" w:eastAsiaTheme="minorEastAsia" w:hAnsi="Cambria Math"/>
+                </w:rPr>
+                <m:t>,i</m:t>
+              </m:r>
+            </m:sub>
+          </m:sSub>
+          <m:sSub>
+            <m:sSubPr>
+              <m:ctrlPr>
+                <w:rPr>
+                  <w:rFonts w:ascii="Cambria Math" w:eastAsiaTheme="minorEastAsia" w:hAnsi="Cambria Math"/>
+                </w:rPr>
+              </m:ctrlPr>
+            </m:sSubPr>
+            <m:e>
+              <m:r>
+                <m:rPr>
+                  <m:nor/>
+                </m:rPr>
+                <w:rPr>
+                  <w:rFonts w:ascii="Cambria Math" w:eastAsiaTheme="minorEastAsia" w:hAnsi="Cambria Math"/>
+                </w:rPr>
+                <m:t>depth</m:t>
+              </m:r>
+            </m:e>
+            <m:sub>
+              <m:r>
+                <w:rPr>
+                  <w:rFonts w:ascii="Cambria Math" w:eastAsiaTheme="minorEastAsia" w:hAnsi="Cambria Math"/>
+                </w:rPr>
+                <m:t>i,j,k</m:t>
+              </m:r>
+            </m:sub>
+          </m:sSub>
+          <m:r>
+            <w:rPr>
+              <w:rFonts w:ascii="Cambria Math" w:eastAsiaTheme="minorEastAsia" w:hAnsi="Cambria Math"/>
+            </w:rPr>
+            <m:t>+</m:t>
+          </m:r>
+          <m:sSub>
+            <m:sSubPr>
+              <m:ctrlPr>
+                <w:rPr>
+                  <w:rFonts w:ascii="Cambria Math" w:eastAsiaTheme="minorEastAsia" w:hAnsi="Cambria Math"/>
+                </w:rPr>
+              </m:ctrlPr>
+            </m:sSubPr>
+            <m:e>
+              <m:r>
+                <w:rPr>
+                  <w:rFonts w:ascii="Cambria Math" w:eastAsiaTheme="minorEastAsia" w:hAnsi="Cambria Math"/>
+                </w:rPr>
+                <m:t>β</m:t>
+              </m:r>
+            </m:e>
+            <m:sub>
+              <m:r>
+                <m:rPr>
+                  <m:nor/>
+                </m:rPr>
+                <w:rPr>
+                  <w:rFonts w:ascii="Cambria Math" w:eastAsiaTheme="minorEastAsia" w:hAnsi="Cambria Math"/>
+                </w:rPr>
+                <m:t>time of day:depth</m:t>
+              </m:r>
+            </m:sub>
+          </m:sSub>
+          <m:sSub>
+            <m:sSubPr>
+              <m:ctrlPr>
+                <w:rPr>
+                  <w:rFonts w:ascii="Cambria Math" w:eastAsiaTheme="minorEastAsia" w:hAnsi="Cambria Math"/>
+                </w:rPr>
+              </m:ctrlPr>
+            </m:sSubPr>
+            <m:e>
+              <m:r>
+                <m:rPr>
+                  <m:nor/>
+                </m:rPr>
+                <w:rPr>
+                  <w:rFonts w:ascii="Cambria Math" w:eastAsiaTheme="minorEastAsia" w:hAnsi="Cambria Math"/>
+                </w:rPr>
+                <m:t>time of day</m:t>
+              </m:r>
+            </m:e>
+            <m:sub>
+              <m:r>
+                <w:rPr>
+                  <w:rFonts w:ascii="Cambria Math" w:eastAsiaTheme="minorEastAsia" w:hAnsi="Cambria Math"/>
+                </w:rPr>
+                <m:t>i,j,k</m:t>
+              </m:r>
+            </m:sub>
+          </m:sSub>
+          <m:sSub>
+            <m:sSubPr>
+              <m:ctrlPr>
+                <w:rPr>
+                  <w:rFonts w:ascii="Cambria Math" w:eastAsiaTheme="minorEastAsia" w:hAnsi="Cambria Math"/>
+                </w:rPr>
+              </m:ctrlPr>
+            </m:sSubPr>
+            <m:e>
+              <m:r>
+                <m:rPr>
+                  <m:nor/>
+                </m:rPr>
+                <w:rPr>
+                  <w:rFonts w:ascii="Cambria Math" w:eastAsiaTheme="minorEastAsia" w:hAnsi="Cambria Math"/>
+                </w:rPr>
+                <m:t>depth</m:t>
+              </m:r>
+            </m:e>
+            <m:sub>
+              <m:r>
+                <w:rPr>
+                  <w:rFonts w:ascii="Cambria Math" w:eastAsiaTheme="minorEastAsia" w:hAnsi="Cambria Math"/>
+                </w:rPr>
+                <m:t>i,j,k</m:t>
+              </m:r>
+            </m:sub>
+          </m:sSub>
+          <m:r>
+            <w:rPr>
+              <w:rFonts w:ascii="Cambria Math" w:eastAsiaTheme="minorEastAsia" w:hAnsi="Cambria Math"/>
+            </w:rPr>
+            <m:t>+</m:t>
+          </m:r>
+          <m:sSub>
+            <m:sSubPr>
+              <m:ctrlPr>
+                <w:rPr>
+                  <w:rFonts w:ascii="Cambria Math" w:eastAsiaTheme="minorEastAsia" w:hAnsi="Cambria Math"/>
+                </w:rPr>
+              </m:ctrlPr>
+            </m:sSubPr>
+            <m:e>
+              <m:r>
+                <w:rPr>
+                  <w:rFonts w:ascii="Cambria Math" w:eastAsiaTheme="minorEastAsia" w:hAnsi="Cambria Math"/>
+                </w:rPr>
+                <m:t>β</m:t>
+              </m:r>
+            </m:e>
+            <m:sub>
+              <m:r>
+                <m:rPr>
+                  <m:nor/>
+                </m:rPr>
+                <w:rPr>
+                  <w:rFonts w:ascii="Cambria Math" w:eastAsiaTheme="minorEastAsia" w:hAnsi="Cambria Math"/>
+                </w:rPr>
+                <m:t>taxon:time of day:depth</m:t>
+              </m:r>
+              <m:r>
+                <w:rPr>
+                  <w:rFonts w:ascii="Cambria Math" w:eastAsiaTheme="minorEastAsia" w:hAnsi="Cambria Math"/>
+                </w:rPr>
+                <m:t>,i</m:t>
+              </m:r>
+            </m:sub>
+          </m:sSub>
+          <m:sSub>
+            <m:sSubPr>
+              <m:ctrlPr>
+                <w:rPr>
+                  <w:rFonts w:ascii="Cambria Math" w:eastAsiaTheme="minorEastAsia" w:hAnsi="Cambria Math"/>
+                </w:rPr>
+              </m:ctrlPr>
+            </m:sSubPr>
+            <m:e>
+              <m:r>
+                <m:rPr>
+                  <m:nor/>
+                </m:rPr>
+                <w:rPr>
+                  <w:rFonts w:ascii="Cambria Math" w:eastAsiaTheme="minorEastAsia" w:hAnsi="Cambria Math"/>
+                </w:rPr>
+                <m:t>time of day</m:t>
+              </m:r>
+            </m:e>
+            <m:sub>
+              <m:r>
+                <w:rPr>
+                  <w:rFonts w:ascii="Cambria Math" w:eastAsiaTheme="minorEastAsia" w:hAnsi="Cambria Math"/>
+                </w:rPr>
+                <m:t>i,j,k</m:t>
+              </m:r>
+            </m:sub>
+          </m:sSub>
+          <m:sSub>
+            <m:sSubPr>
+              <m:ctrlPr>
+                <w:rPr>
+                  <w:rFonts w:ascii="Cambria Math" w:eastAsiaTheme="minorEastAsia" w:hAnsi="Cambria Math"/>
+                </w:rPr>
+              </m:ctrlPr>
+            </m:sSubPr>
+            <m:e>
+              <m:r>
+                <m:rPr>
+                  <m:nor/>
+                </m:rPr>
+                <w:rPr>
+                  <w:rFonts w:ascii="Cambria Math" w:eastAsiaTheme="minorEastAsia" w:hAnsi="Cambria Math"/>
+                </w:rPr>
+                <m:t>depth</m:t>
+              </m:r>
+            </m:e>
+            <m:sub>
+              <m:r>
+                <w:rPr>
+                  <w:rFonts w:ascii="Cambria Math" w:eastAsiaTheme="minorEastAsia" w:hAnsi="Cambria Math"/>
+                </w:rPr>
+                <m:t>i,j,k</m:t>
+              </m:r>
+            </m:sub>
+          </m:sSub>
+          <m:r>
+            <w:rPr>
+              <w:rFonts w:ascii="Cambria Math" w:eastAsiaTheme="minorEastAsia" w:hAnsi="Cambria Math"/>
+            </w:rPr>
+            <m:t>+</m:t>
+          </m:r>
+          <m:sSub>
+            <m:sSubPr>
+              <m:ctrlPr>
+                <w:rPr>
+                  <w:rFonts w:ascii="Cambria Math" w:eastAsiaTheme="minorEastAsia" w:hAnsi="Cambria Math"/>
+                </w:rPr>
+              </m:ctrlPr>
+            </m:sSubPr>
+            <m:e>
+              <m:r>
+                <w:rPr>
+                  <w:rFonts w:ascii="Cambria Math" w:eastAsiaTheme="minorEastAsia" w:hAnsi="Cambria Math"/>
+                </w:rPr>
+                <m:t>b</m:t>
+              </m:r>
+            </m:e>
+            <m:sub>
+              <m:r>
+                <w:rPr>
+                  <w:rFonts w:ascii="Cambria Math" w:eastAsiaTheme="minorEastAsia" w:hAnsi="Cambria Math"/>
+                </w:rPr>
+                <m:t>k</m:t>
+              </m:r>
+            </m:sub>
+          </m:sSub>
+        </m:oMath>
+      </m:oMathPara>
+    </w:p>
+    <w:p>
+      <w:pPr>
+        <w:rPr>
+          <w:rFonts w:eastAsiaTheme="minorEastAsia"/>
+        </w:rPr>
+      </w:pPr>
+      <m:oMathPara>
+        <m:oMath>
+          <m:sSub>
+            <m:sSubPr>
+              <m:ctrlPr>
+                <w:rPr>
+                  <w:rFonts w:ascii="Cambria Math" w:eastAsiaTheme="minorEastAsia" w:hAnsi="Cambria Math"/>
+                </w:rPr>
+              </m:ctrlPr>
+            </m:sSubPr>
+            <m:e>
+              <m:r>
+                <w:rPr>
+                  <w:rFonts w:ascii="Cambria Math" w:eastAsiaTheme="minorEastAsia" w:hAnsi="Cambria Math"/>
+                </w:rPr>
+                <m:t>b</m:t>
+              </m:r>
+            </m:e>
+            <m:sub>
+              <m:r>
+                <w:rPr>
+                  <w:rFonts w:ascii="Cambria Math" w:eastAsiaTheme="minorEastAsia" w:hAnsi="Cambria Math"/>
+                </w:rPr>
+                <m:t>k</m:t>
+              </m:r>
+            </m:sub>
+          </m:sSub>
+          <m:r>
+            <w:rPr>
+              <w:rFonts w:ascii="Cambria Math" w:eastAsiaTheme="minorEastAsia" w:hAnsi="Cambria Math"/>
+            </w:rPr>
+            <m:t> </m:t>
+          </m:r>
+          <m:r>
+            <w:rPr>
+              <w:rFonts w:ascii="Cambria Math" w:eastAsiaTheme="minorEastAsia" w:hAnsi="Cambria Math"/>
+            </w:rPr>
+            <m:t xml:space="preserve">~ </m:t>
+          </m:r>
+          <m:r>
+            <w:rPr>
+              <w:rFonts w:ascii="Cambria Math" w:eastAsiaTheme="minorEastAsia" w:hAnsi="Cambria Math"/>
+            </w:rPr>
+            <m:t>Normal</m:t>
+          </m:r>
+          <m:d>
+            <m:dPr>
+              <m:ctrlPr>
+                <w:rPr>
+                  <w:rFonts w:ascii="Cambria Math" w:eastAsiaTheme="minorEastAsia" w:hAnsi="Cambria Math"/>
+                </w:rPr>
+              </m:ctrlPr>
+            </m:dPr>
+            <m:e>
+              <m:r>
+                <w:rPr>
+                  <w:rFonts w:ascii="Cambria Math" w:eastAsiaTheme="minorEastAsia" w:hAnsi="Cambria Math"/>
+                </w:rPr>
+                <m:t>0,</m:t>
+              </m:r>
+              <m:sSubSup>
+                <m:sSubSupPr>
+                  <m:ctrlPr>
+                    <w:rPr>
+                      <w:rFonts w:ascii="Cambria Math" w:eastAsiaTheme="minorEastAsia" w:hAnsi="Cambria Math"/>
+                    </w:rPr>
+                  </m:ctrlPr>
+                </m:sSubSupPr>
+                <m:e>
+                  <m:r>
+                    <w:rPr>
+                      <w:rFonts w:ascii="Cambria Math" w:eastAsiaTheme="minorEastAsia" w:hAnsi="Cambria Math"/>
+                    </w:rPr>
+                    <m:t>σ</m:t>
+                  </m:r>
+                </m:e>
+                <m:sub>
+                  <m:r>
+                    <m:rPr>
+                      <m:nor/>
+                    </m:rPr>
+                    <w:rPr>
+                      <w:rFonts w:ascii="Cambria Math" w:eastAsiaTheme="minorEastAsia" w:hAnsi="Cambria Math"/>
+                    </w:rPr>
+                    <m:t>sample</m:t>
+                  </m:r>
+                </m:sub>
+                <m:sup>
+                  <m:r>
+                    <w:rPr>
+                      <w:rFonts w:ascii="Cambria Math" w:eastAsiaTheme="minorEastAsia" w:hAnsi="Cambria Math"/>
+                    </w:rPr>
+                    <m:t>2</m:t>
+                  </m:r>
+                </m:sup>
+              </m:sSubSup>
+            </m:e>
+          </m:d>
+        </m:oMath>
+      </m:oMathPara>
+    </w:p>
+    <w:p>
+      <w:ins w:id="366" w:author="Bobay, Luke Andrew" w:date="2026-08-29T00:35:00Z" w16du:dateUtc="2026-08-29T07:35:00Z">
+        <w:r>
+          <w:t xml:space="preserve">where </w:t>
+        </w:r>
+        <w:r>
+          <w:rPr>
+            <w:i/>
+            <w:iCs/>
+          </w:rPr>
+          <w:t>y</w:t>
+        </w:r>
+        <w:r>
+          <w:rPr>
+            <w:i/>
+            <w:iCs/>
+            <w:vertAlign w:val="subscript"/>
+          </w:rPr>
+          <w:t>i,j,k</w:t>
+        </w:r>
+        <w:r>
+          <w:t xml:space="preserve"> is the count for taxon </w:t>
+        </w:r>
+        <w:r>
+          <w:rPr>
+            <w:i/>
+            <w:iCs/>
+          </w:rPr>
+          <w:t xml:space="preserve">i </w:t>
+        </w:r>
+      </w:ins>
+      <w:ins w:id="367" w:author="Bobay, Luke Andrew" w:date="2026-08-29T00:36:00Z" w16du:dateUtc="2026-08-29T07:36:00Z">
+        <w:r>
+          <w:t xml:space="preserve">in </w:t>
+        </w:r>
+      </w:ins>
+      <w:ins w:id="368" w:author="Bobay, Luke Andrew" w:date="2026-08-29T00:37:00Z" w16du:dateUtc="2026-08-29T07:37:00Z">
+        <w:r>
+          <w:t xml:space="preserve">sample </w:t>
+        </w:r>
+        <w:r>
+          <w:rPr>
+            <w:i/>
+            <w:iCs/>
+          </w:rPr>
+          <w:t>k</w:t>
+        </w:r>
+        <w:r>
+          <w:rPr>
+            <w:rPrChange w:id="369" w:author="Bobay, Luke Andrew" w:date="2026-08-29T00:37:00Z" w16du:dateUtc="2026-08-29T07:37:00Z">
+              <w:rPr>
+                <w:i/>
+                <w:iCs/>
+              </w:rPr>
+            </w:rPrChange>
+          </w:rPr>
+          <w:t>,</w:t>
+        </w:r>
+        <w:r>
+          <w:rPr>
+            <w:i/>
+            <w:iCs/>
+          </w:rPr>
+          <w:t xml:space="preserve"> V</w:t>
+        </w:r>
+        <w:r>
+          <w:rPr>
+            <w:i/>
+            <w:iCs/>
+            <w:vertAlign w:val="subscript"/>
+          </w:rPr>
+          <w:t>i,k,j</w:t>
+        </w:r>
+        <w:r>
+          <w:t xml:space="preserve"> is volume filtered, and </w:t>
+        </w:r>
+        <w:r>
+          <w:rPr>
+            <w:i/>
+            <w:iCs/>
+          </w:rPr>
+          <w:t>b</w:t>
+        </w:r>
+        <w:r>
+          <w:rPr>
+            <w:i/>
+            <w:iCs/>
+            <w:vertAlign w:val="subscript"/>
+          </w:rPr>
+          <w:t>k</w:t>
+        </w:r>
+        <w:r>
+          <w:rPr>
+            <w:i/>
+            <w:iCs/>
+          </w:rPr>
+          <w:t xml:space="preserve"> </w:t>
+        </w:r>
+        <w:r>
+          <w:t xml:space="preserve">is </w:t>
+        </w:r>
+      </w:ins>
+      <w:ins w:id="370" w:author="Bobay, Luke Andrew" w:date="2026-08-29T00:38:00Z" w16du:dateUtc="2026-08-29T07:38:00Z">
+        <w:r>
+          <w:t>a</w:t>
+        </w:r>
+      </w:ins>
+      <w:ins w:id="371" w:author="Bobay, Luke Andrew" w:date="2026-08-29T00:37:00Z" w16du:dateUtc="2026-08-29T07:37:00Z">
+        <w:r>
+          <w:t xml:space="preserve"> </w:t>
+        </w:r>
+      </w:ins>
+      <w:ins w:id="372" w:author="Bobay, Luke Andrew" w:date="2026-08-29T00:38:00Z" w16du:dateUtc="2026-08-29T07:38:00Z">
+        <w:r>
+          <w:t xml:space="preserve">random intercept for </w:t>
+        </w:r>
+        <w:r>
+          <w:t>each sample.</w:t>
+        </w:r>
+      </w:ins>
+      <w:del w:id="373" w:author="Bobay, Luke Andrew" w:date="2026-08-29T00:38:00Z" w16du:dateUtc="2026-08-29T07:38:00Z">
+        <w:r>
+          <w:delText xml:space="preserve">. </w:delText>
+        </w:r>
+      </w:del>
+      <w:ins w:id="374" w:author="Bobay, Luke Andrew" w:date="2026-08-29T00:39:00Z" w16du:dateUtc="2026-08-29T07:39:00Z">
+        <w:r>
+          <w:t xml:space="preserve"> </w:t>
+        </w:r>
+      </w:ins>
+    </w:p>
+    <w:p>
+      <w:pPr>
+        <w:rPr>
+          <w:ins w:id="375" w:author="Bobay, Luke Andrew" w:date="2026-08-29T00:40:00Z" w16du:dateUtc="2026-08-29T07:40:00Z"/>
+        </w:rPr>
+      </w:pPr>
+      <w:ins w:id="376" w:author="Bobay, Luke Andrew" w:date="2026-08-29T00:40:00Z" w16du:dateUtc="2026-08-29T07:40:00Z">
+        <w:r>
+          <w:t>T</w:t>
+        </w:r>
+        <w:r>
+          <w:t xml:space="preserve">he model parameters associated with these effects do not directly address whether each taxon undergoes DVM. To visualize how the vertical distribution of each taxon varies over the course of a day, we plotted the predicted </w:t>
+        </w:r>
+      </w:ins>
+      <w:ins w:id="377" w:author="Bobay, Luke Andrew" w:date="2026-08-29T00:48:00Z" w16du:dateUtc="2026-08-29T07:48:00Z">
+        <w:r>
+          <w:t>concentration</w:t>
+        </w:r>
+      </w:ins>
+      <w:ins w:id="378" w:author="Bobay, Luke Andrew" w:date="2026-08-29T00:40:00Z" w16du:dateUtc="2026-08-29T07:40:00Z">
+        <w:r>
+          <w:t xml:space="preserve"> of</w:t>
+        </w:r>
+      </w:ins>
+      <w:ins w:id="379" w:author="Bobay, Luke Andrew" w:date="2026-08-29T00:48:00Z" w16du:dateUtc="2026-08-29T07:48:00Z">
+        <w:r>
+          <w:t xml:space="preserve"> individuals belonging to</w:t>
+        </w:r>
+      </w:ins>
+      <w:ins w:id="380" w:author="Bobay, Luke Andrew" w:date="2026-08-29T00:40:00Z" w16du:dateUtc="2026-08-29T07:40:00Z">
+        <w:r>
+          <w:t xml:space="preserve"> each taxon across combinations of depth and time of day</w:t>
+        </w:r>
+      </w:ins>
+      <w:ins w:id="381" w:author="Bobay, Luke Andrew" w:date="2026-08-29T00:51:00Z" w16du:dateUtc="2026-08-29T07:51:00Z">
+        <w:r>
+          <w:t xml:space="preserve"> (Fig. 6)</w:t>
+        </w:r>
+      </w:ins>
+      <w:ins w:id="382" w:author="Bobay, Luke Andrew" w:date="2026-08-29T00:40:00Z" w16du:dateUtc="2026-08-29T07:40:00Z">
+        <w:r>
+          <w:t xml:space="preserve">. We </w:t>
+        </w:r>
+      </w:ins>
+      <w:ins w:id="383" w:author="Bobay, Luke Andrew" w:date="2026-08-29T00:46:00Z" w16du:dateUtc="2026-08-29T07:46:00Z">
+        <w:r>
+          <w:t xml:space="preserve">also </w:t>
+        </w:r>
+      </w:ins>
+      <w:ins w:id="384" w:author="Bobay, Luke Andrew" w:date="2026-08-29T00:40:00Z" w16du:dateUtc="2026-08-29T07:40:00Z">
+        <w:r>
+          <w:t xml:space="preserve">plotted the </w:t>
+        </w:r>
+      </w:ins>
+      <w:ins w:id="385" w:author="Bobay, Luke Andrew" w:date="2026-08-29T00:48:00Z" w16du:dateUtc="2026-08-29T07:48:00Z">
+        <w:r>
+          <w:t xml:space="preserve">total </w:t>
+        </w:r>
+      </w:ins>
+      <w:ins w:id="386" w:author="Bobay, Luke Andrew" w:date="2026-08-29T00:40:00Z" w16du:dateUtc="2026-08-29T07:40:00Z">
+        <w:r>
+          <w:t xml:space="preserve">predicted </w:t>
+        </w:r>
+      </w:ins>
+      <w:ins w:id="387" w:author="Bobay, Luke Andrew" w:date="2026-08-29T00:49:00Z" w16du:dateUtc="2026-08-29T07:49:00Z">
+        <w:r>
+          <w:t>abundance</w:t>
+        </w:r>
+      </w:ins>
+      <w:ins w:id="388" w:author="Bobay, Luke Andrew" w:date="2026-08-29T00:40:00Z" w16du:dateUtc="2026-08-29T07:40:00Z">
+        <w:r>
+          <w:t xml:space="preserve"> of each taxon</w:t>
+        </w:r>
+      </w:ins>
+      <w:ins w:id="389" w:author="Bobay, Luke Andrew" w:date="2026-08-29T00:49:00Z" w16du:dateUtc="2026-08-29T07:49:00Z">
+        <w:r>
+          <w:t xml:space="preserve"> across the sampled portion of the water column</w:t>
+        </w:r>
+      </w:ins>
+      <w:ins w:id="390" w:author="Bobay, Luke Andrew" w:date="2026-08-29T00:40:00Z" w16du:dateUtc="2026-08-29T07:40:00Z">
+        <w:r>
+          <w:t xml:space="preserve"> against time of day to show how total predicted abundance in the sampled depth strata varied over the course of a day</w:t>
+        </w:r>
+      </w:ins>
+      <w:ins w:id="391" w:author="Bobay, Luke Andrew" w:date="2026-08-29T00:51:00Z" w16du:dateUtc="2026-08-29T07:51:00Z">
+        <w:r>
+          <w:t xml:space="preserve"> (</w:t>
+        </w:r>
+      </w:ins>
+      <w:ins w:id="392" w:author="Bobay, Luke Andrew" w:date="2026-08-29T00:52:00Z" w16du:dateUtc="2026-08-29T07:52:00Z">
+        <w:r>
+          <w:t>Fig. 7)</w:t>
+        </w:r>
+      </w:ins>
+      <w:ins w:id="393" w:author="Bobay, Luke Andrew" w:date="2026-08-29T00:40:00Z" w16du:dateUtc="2026-08-29T07:40:00Z">
+        <w:r>
+          <w:t xml:space="preserve">. </w:t>
+        </w:r>
+      </w:ins>
+      <w:ins w:id="394" w:author="Bobay, Luke Andrew" w:date="2026-08-29T00:52:00Z" w16du:dateUtc="2026-08-29T07:52:00Z">
+        <w:r>
+          <w:t>Finally, we</w:t>
+        </w:r>
+      </w:ins>
+      <w:ins w:id="395" w:author="Bobay, Luke Andrew" w:date="2026-08-29T00:40:00Z" w16du:dateUtc="2026-08-29T07:40:00Z">
+        <w:r>
+          <w:t xml:space="preserve"> plotted the depth-</w:t>
+        </w:r>
+      </w:ins>
+      <w:ins w:id="396" w:author="Bobay, Luke Andrew" w:date="2026-08-29T00:50:00Z" w16du:dateUtc="2026-08-29T07:50:00Z">
+        <w:r>
+          <w:t xml:space="preserve">log predicted </w:t>
+        </w:r>
+      </w:ins>
+      <w:ins w:id="397" w:author="Bobay, Luke Andrew" w:date="2026-08-29T00:40:00Z" w16du:dateUtc="2026-08-29T07:40:00Z">
+        <w:r>
+          <w:t>abundance gradient for each taxon against time of day to show when predicted abundance increased or decreased with depth</w:t>
+        </w:r>
+      </w:ins>
+      <w:ins w:id="398" w:author="Bobay, Luke Andrew" w:date="2026-08-29T00:52:00Z" w16du:dateUtc="2026-08-29T07:52:00Z">
+        <w:r>
+          <w:t xml:space="preserve"> (Fig. 8)</w:t>
+        </w:r>
+      </w:ins>
+      <w:ins w:id="399" w:author="Bobay, Luke Andrew" w:date="2026-08-29T00:40:00Z" w16du:dateUtc="2026-08-29T07:40:00Z">
+        <w:r>
+          <w:t>.</w:t>
+        </w:r>
+      </w:ins>
     </w:p>
     <w:p/>
     <w:p>
@@ -2976,7 +4608,7 @@
       <w:r>
         <w:t xml:space="preserve">Post-thresholding there was a total of 38,363 individual larvae from 82 sampling stations. Among these remaining stations, all transects were represented (Fig. 1A). Oceanographic conditions during sampling varied with depth and interannually. Gradients in temperature </w:t>
       </w:r>
-      <w:del w:id="347" w:author="Bobay, Luke Andrew" w:date="2026-08-28T18:16:00Z" w16du:dateUtc="2026-08-29T01:16:00Z">
+      <w:del w:id="400" w:author="Bobay, Luke Andrew" w:date="2026-08-28T18:16:00Z" w16du:dateUtc="2026-08-29T01:16:00Z">
         <w:r>
           <w:delText xml:space="preserve">(℃) </w:delText>
         </w:r>
@@ -2984,7 +4616,7 @@
       <w:r>
         <w:t>differed between years with 2018 and 2023 exhibiting a peak in temperature around 25-meters depth followed by a general decrease in temperature with increasing depth. Years 2019 and 2022 had similarly minimal changes in temperature across depths (Fig. 1B). During all years, salinity</w:t>
       </w:r>
-      <w:del w:id="348" w:author="Bobay, Luke Andrew" w:date="2026-08-28T18:13:00Z" w16du:dateUtc="2026-08-29T01:13:00Z">
+      <w:del w:id="401" w:author="Bobay, Luke Andrew" w:date="2026-08-28T18:13:00Z" w16du:dateUtc="2026-08-29T01:13:00Z">
         <w:r>
           <w:delText xml:space="preserve"> (PSU)</w:delText>
         </w:r>
@@ -2992,7 +4624,7 @@
       <w:r>
         <w:t xml:space="preserve"> increased with depth while DO</w:t>
       </w:r>
-      <w:del w:id="349" w:author="Bobay, Luke Andrew" w:date="2026-08-28T18:13:00Z" w16du:dateUtc="2026-08-29T01:13:00Z">
+      <w:del w:id="402" w:author="Bobay, Luke Andrew" w:date="2026-08-28T18:13:00Z" w16du:dateUtc="2026-08-29T01:13:00Z">
         <w:r>
           <w:delText xml:space="preserve"> (mL L⁻¹)</w:delText>
         </w:r>
@@ -3082,7 +4714,6 @@
         </w:rPr>
       </w:pPr>
       <w:r>
-        <w:lastRenderedPageBreak/>
         <w:t xml:space="preserve">Net tows were mapped according to the latitude and longitude of the station at which sampling occurred. Points were colored according to the tow’s cluster assignment and color value was applied to represent the mean depth sampled by the tow. This was used to visualize the clustering of the LFC in horizontal and vertical space across the sampling area. The </w:t>
       </w:r>
       <w:r>
@@ -3131,6 +4762,7 @@
         <w:pStyle w:val="Heading2"/>
       </w:pPr>
       <w:r>
+        <w:lastRenderedPageBreak/>
         <w:t>2.3</w:t>
       </w:r>
       <w:r>
@@ -3142,9 +4774,574 @@
       </w:r>
     </w:p>
     <w:p>
-      <w:r>
-        <w:t>[add section text here]</w:t>
-      </w:r>
+      <w:pPr>
+        <w:rPr>
+          <w:del w:id="403" w:author="Bobay, Luke Andrew" w:date="2026-08-28T18:22:00Z" w16du:dateUtc="2026-08-29T01:22:00Z"/>
+        </w:rPr>
+      </w:pPr>
+      <w:del w:id="404" w:author="Bobay, Luke Andrew" w:date="2026-08-28T18:22:00Z" w16du:dateUtc="2026-08-29T01:22:00Z">
+        <w:r>
+          <w:delText>[add section text here]</w:delText>
+        </w:r>
+      </w:del>
+      <w:ins w:id="405" w:author="Bobay, Luke Andrew" w:date="2026-08-28T18:38:00Z" w16du:dateUtc="2026-08-29T01:38:00Z">
+        <w:r>
+          <w:t xml:space="preserve"> In the GLMM of </w:t>
+        </w:r>
+      </w:ins>
+      <w:ins w:id="406" w:author="Bobay, Luke Andrew" w:date="2026-08-28T18:39:00Z" w16du:dateUtc="2026-08-29T01:39:00Z">
+        <w:r>
+          <w:t xml:space="preserve">ichthyoplankton </w:t>
+        </w:r>
+      </w:ins>
+      <w:ins w:id="407" w:author="Bobay, Luke Andrew" w:date="2026-08-29T00:50:00Z" w16du:dateUtc="2026-08-29T07:50:00Z">
+        <w:r>
+          <w:t>counts</w:t>
+        </w:r>
+      </w:ins>
+      <w:ins w:id="408" w:author="Bobay, Luke Andrew" w:date="2026-08-28T18:42:00Z" w16du:dateUtc="2026-08-29T01:42:00Z">
+        <w:r>
+          <w:t>, the</w:t>
+        </w:r>
+      </w:ins>
+      <w:ins w:id="409" w:author="Bobay, Luke Andrew" w:date="2026-08-28T23:03:00Z" w16du:dateUtc="2026-08-29T06:03:00Z">
+        <w:r>
+          <w:t xml:space="preserve"> conditional fixed</w:t>
+        </w:r>
+      </w:ins>
+      <w:ins w:id="410" w:author="Bobay, Luke Andrew" w:date="2026-08-28T18:42:00Z" w16du:dateUtc="2026-08-29T01:42:00Z">
+        <w:r>
+          <w:t xml:space="preserve"> effect</w:t>
+        </w:r>
+      </w:ins>
+      <w:ins w:id="411" w:author="Bobay, Luke Andrew" w:date="2026-08-28T18:43:00Z" w16du:dateUtc="2026-08-29T01:43:00Z">
+        <w:r>
+          <w:t>s</w:t>
+        </w:r>
+      </w:ins>
+      <w:ins w:id="412" w:author="Bobay, Luke Andrew" w:date="2026-08-28T18:42:00Z" w16du:dateUtc="2026-08-29T01:42:00Z">
+        <w:r>
+          <w:t xml:space="preserve"> </w:t>
+        </w:r>
+      </w:ins>
+      <w:ins w:id="413" w:author="Bobay, Luke Andrew" w:date="2026-08-28T23:04:00Z" w16du:dateUtc="2026-08-29T06:04:00Z">
+        <w:r>
+          <w:t xml:space="preserve">on the log-abundance scale </w:t>
+        </w:r>
+      </w:ins>
+      <w:ins w:id="414" w:author="Bobay, Luke Andrew" w:date="2026-08-28T18:42:00Z" w16du:dateUtc="2026-08-29T01:42:00Z">
+        <w:r>
+          <w:t xml:space="preserve">of </w:t>
+        </w:r>
+      </w:ins>
+      <w:ins w:id="415" w:author="Bobay, Luke Andrew" w:date="2026-08-28T18:43:00Z" w16du:dateUtc="2026-08-29T01:43:00Z">
+        <w:r>
+          <w:t xml:space="preserve">latitude (0.64, </w:t>
+        </w:r>
+        <w:r>
+          <w:rPr>
+            <w:i/>
+            <w:iCs/>
+          </w:rPr>
+          <w:t>p</w:t>
+        </w:r>
+        <w:r>
+          <w:t xml:space="preserve"> &lt; 0.001), DO (</w:t>
+        </w:r>
+      </w:ins>
+      <w:ins w:id="416" w:author="Bobay, Luke Andrew" w:date="2026-08-28T18:44:00Z" w16du:dateUtc="2026-08-29T01:44:00Z">
+        <w:r>
+          <w:t xml:space="preserve">-0.65, </w:t>
+        </w:r>
+        <w:r>
+          <w:rPr>
+            <w:i/>
+            <w:iCs/>
+          </w:rPr>
+          <w:t xml:space="preserve">p </w:t>
+        </w:r>
+        <w:r>
+          <w:t xml:space="preserve">&lt; 0.01), </w:t>
+        </w:r>
+      </w:ins>
+      <w:ins w:id="417" w:author="Bobay, Luke Andrew" w:date="2026-08-28T18:45:00Z" w16du:dateUtc="2026-08-29T01:45:00Z">
+        <w:r>
+          <w:t>and chl-</w:t>
+        </w:r>
+        <w:r>
+          <w:rPr>
+            <w:i/>
+            <w:iCs/>
+          </w:rPr>
+          <w:t>a</w:t>
+        </w:r>
+        <w:r>
+          <w:t xml:space="preserve"> (0.44, </w:t>
+        </w:r>
+        <w:r>
+          <w:rPr>
+            <w:i/>
+            <w:iCs/>
+          </w:rPr>
+          <w:t>p</w:t>
+        </w:r>
+        <w:r>
+          <w:t xml:space="preserve"> &lt; 0.001) were significant at the </w:t>
+        </w:r>
+        <w:r>
+          <w:rPr>
+            <w:i/>
+            <w:iCs/>
+            <w:rPrChange w:id="418" w:author="Bobay, Luke Andrew" w:date="2026-08-28T18:45:00Z" w16du:dateUtc="2026-08-29T01:45:00Z">
+              <w:rPr/>
+            </w:rPrChange>
+          </w:rPr>
+          <w:t>ɑ</w:t>
+        </w:r>
+        <w:r>
+          <w:t xml:space="preserve"> = 0.05 </w:t>
+        </w:r>
+      </w:ins>
+      <w:ins w:id="419" w:author="Bobay, Luke Andrew" w:date="2026-08-28T23:03:00Z" w16du:dateUtc="2026-08-29T06:03:00Z">
+        <w:r>
+          <w:t>significance</w:t>
+        </w:r>
+      </w:ins>
+      <w:ins w:id="420" w:author="Bobay, Luke Andrew" w:date="2026-08-28T18:45:00Z" w16du:dateUtc="2026-08-29T01:45:00Z">
+        <w:r>
+          <w:t xml:space="preserve"> level</w:t>
+        </w:r>
+      </w:ins>
+      <w:ins w:id="421" w:author="Bobay, Luke Andrew" w:date="2026-08-28T18:46:00Z" w16du:dateUtc="2026-08-29T01:46:00Z">
+        <w:r>
+          <w:t xml:space="preserve">, while the effects of year, seafloor depth, temperature, and salinity were not (all </w:t>
+        </w:r>
+        <w:r>
+          <w:rPr>
+            <w:i/>
+            <w:iCs/>
+          </w:rPr>
+          <w:t>p</w:t>
+        </w:r>
+        <w:r>
+          <w:t xml:space="preserve"> &gt; 0.05). </w:t>
+        </w:r>
+      </w:ins>
+      <w:ins w:id="422" w:author="Bobay, Luke Andrew" w:date="2026-08-28T18:47:00Z" w16du:dateUtc="2026-08-29T01:47:00Z">
+        <w:r>
+          <w:t>For many taxa</w:t>
+        </w:r>
+      </w:ins>
+      <w:ins w:id="423" w:author="Bobay, Luke Andrew" w:date="2026-08-28T18:39:00Z" w16du:dateUtc="2026-08-29T01:39:00Z">
+        <w:r>
+          <w:t xml:space="preserve">, the </w:t>
+        </w:r>
+      </w:ins>
+      <w:ins w:id="424" w:author="Bobay, Luke Andrew" w:date="2026-08-28T18:40:00Z" w16du:dateUtc="2026-08-29T01:40:00Z">
+        <w:r>
+          <w:t xml:space="preserve">interaction of taxon, time of day, and depth </w:t>
+        </w:r>
+      </w:ins>
+      <w:ins w:id="425" w:author="Bobay, Luke Andrew" w:date="2026-08-28T18:48:00Z" w16du:dateUtc="2026-08-29T01:48:00Z">
+        <w:r>
+          <w:t>or its constituent effects were</w:t>
+        </w:r>
+      </w:ins>
+      <w:ins w:id="426" w:author="Bobay, Luke Andrew" w:date="2026-08-28T18:40:00Z" w16du:dateUtc="2026-08-29T01:40:00Z">
+        <w:r>
+          <w:t xml:space="preserve"> significant </w:t>
+        </w:r>
+      </w:ins>
+      <w:ins w:id="427" w:author="Bobay, Luke Andrew" w:date="2026-08-28T18:41:00Z" w16du:dateUtc="2026-08-29T01:41:00Z">
+        <w:r>
+          <w:t xml:space="preserve">(Table S1). </w:t>
+        </w:r>
+      </w:ins>
+      <w:ins w:id="428" w:author="Bobay, Luke Andrew" w:date="2026-08-29T01:00:00Z" w16du:dateUtc="2026-08-29T08:00:00Z">
+        <w:r>
+          <w:t xml:space="preserve">Plots </w:t>
+        </w:r>
+      </w:ins>
+      <w:ins w:id="429" w:author="Bobay, Luke Andrew" w:date="2026-08-29T01:15:00Z" w16du:dateUtc="2026-08-29T08:15:00Z">
+        <w:r>
+          <w:t>of</w:t>
+        </w:r>
+      </w:ins>
+      <w:ins w:id="430" w:author="Bobay, Luke Andrew" w:date="2026-08-29T01:00:00Z" w16du:dateUtc="2026-08-29T08:00:00Z">
+        <w:r>
+          <w:t xml:space="preserve"> predicted taxon-specific abundance </w:t>
+        </w:r>
+      </w:ins>
+      <w:ins w:id="431" w:author="Bobay, Luke Andrew" w:date="2026-08-29T01:01:00Z" w16du:dateUtc="2026-08-29T08:01:00Z">
+        <w:r>
+          <w:t xml:space="preserve">in relation to time of day and depth revealed </w:t>
+        </w:r>
+      </w:ins>
+      <w:ins w:id="432" w:author="Bobay, Luke Andrew" w:date="2026-08-29T01:06:00Z" w16du:dateUtc="2026-08-29T08:06:00Z">
+        <w:r>
+          <w:t>several patterns of the occurrence of greatest predicted abun</w:t>
+        </w:r>
+      </w:ins>
+      <w:ins w:id="433" w:author="Bobay, Luke Andrew" w:date="2026-08-29T01:07:00Z" w16du:dateUtc="2026-08-29T08:07:00Z">
+        <w:r>
+          <w:t>d</w:t>
+        </w:r>
+      </w:ins>
+      <w:ins w:id="434" w:author="Bobay, Luke Andrew" w:date="2026-08-29T01:06:00Z" w16du:dateUtc="2026-08-29T08:06:00Z">
+        <w:r>
+          <w:t>ance</w:t>
+        </w:r>
+      </w:ins>
+      <w:ins w:id="435" w:author="Bobay, Luke Andrew" w:date="2026-08-29T01:02:00Z" w16du:dateUtc="2026-08-29T08:02:00Z">
+        <w:r>
+          <w:t xml:space="preserve">: </w:t>
+        </w:r>
+      </w:ins>
+      <w:ins w:id="436" w:author="Bobay, Luke Andrew" w:date="2026-08-29T01:04:00Z" w16du:dateUtc="2026-08-29T08:04:00Z">
+        <w:r>
+          <w:t xml:space="preserve">during daytime and in the deepest sampled </w:t>
+        </w:r>
+      </w:ins>
+      <w:ins w:id="437" w:author="Bobay, Luke Andrew" w:date="2026-08-29T01:12:00Z" w16du:dateUtc="2026-08-29T08:12:00Z">
+        <w:r>
+          <w:t>depths</w:t>
+        </w:r>
+      </w:ins>
+      <w:ins w:id="438" w:author="Bobay, Luke Andrew" w:date="2026-08-29T01:04:00Z" w16du:dateUtc="2026-08-29T08:04:00Z">
+        <w:r>
+          <w:t xml:space="preserve"> (Agonidae</w:t>
+        </w:r>
+      </w:ins>
+      <w:ins w:id="439" w:author="Bobay, Luke Andrew" w:date="2026-08-29T01:05:00Z" w16du:dateUtc="2026-08-29T08:05:00Z">
+        <w:r>
+          <w:t xml:space="preserve">), </w:t>
+        </w:r>
+      </w:ins>
+      <w:ins w:id="440" w:author="Bobay, Luke Andrew" w:date="2026-08-29T01:07:00Z" w16du:dateUtc="2026-08-29T08:07:00Z">
+        <w:r>
+          <w:t xml:space="preserve">during nighttime and in the deepest sampled </w:t>
+        </w:r>
+      </w:ins>
+      <w:ins w:id="441" w:author="Bobay, Luke Andrew" w:date="2026-08-29T01:12:00Z" w16du:dateUtc="2026-08-29T08:12:00Z">
+        <w:r>
+          <w:t>depths</w:t>
+        </w:r>
+      </w:ins>
+      <w:ins w:id="442" w:author="Bobay, Luke Andrew" w:date="2026-08-29T01:07:00Z" w16du:dateUtc="2026-08-29T08:07:00Z">
+        <w:r>
+          <w:t xml:space="preserve"> (</w:t>
+        </w:r>
+        <w:r>
+          <w:rPr>
+            <w:i/>
+            <w:iCs/>
+          </w:rPr>
+          <w:t xml:space="preserve">Protomyctophum </w:t>
+        </w:r>
+        <w:r>
+          <w:t xml:space="preserve">spp.), </w:t>
+        </w:r>
+      </w:ins>
+      <w:ins w:id="443" w:author="Bobay, Luke Andrew" w:date="2026-08-29T01:08:00Z" w16du:dateUtc="2026-08-29T08:08:00Z">
+        <w:r>
+          <w:t xml:space="preserve">during nighttime across all sampled </w:t>
+        </w:r>
+      </w:ins>
+      <w:ins w:id="444" w:author="Bobay, Luke Andrew" w:date="2026-08-29T01:12:00Z" w16du:dateUtc="2026-08-29T08:12:00Z">
+        <w:r>
+          <w:t>depths</w:t>
+        </w:r>
+      </w:ins>
+      <w:ins w:id="445" w:author="Bobay, Luke Andrew" w:date="2026-08-29T01:08:00Z" w16du:dateUtc="2026-08-29T08:08:00Z">
+        <w:r>
+          <w:t xml:space="preserve"> (</w:t>
+        </w:r>
+        <w:r>
+          <w:rPr>
+            <w:i/>
+            <w:iCs/>
+          </w:rPr>
+          <w:t xml:space="preserve">Bathylagus ochotensis </w:t>
+        </w:r>
+        <w:r>
+          <w:t xml:space="preserve">and </w:t>
+        </w:r>
+        <w:r>
+          <w:rPr>
+            <w:i/>
+            <w:iCs/>
+          </w:rPr>
+          <w:t>Tarletonbeania crenularis</w:t>
+        </w:r>
+        <w:r>
+          <w:t xml:space="preserve">), </w:t>
+        </w:r>
+      </w:ins>
+      <w:ins w:id="446" w:author="Bobay, Luke Andrew" w:date="2026-08-29T01:09:00Z" w16du:dateUtc="2026-08-29T08:09:00Z">
+        <w:r>
+          <w:t xml:space="preserve">during nighttime and in the shallowest sampled </w:t>
+        </w:r>
+      </w:ins>
+      <w:ins w:id="447" w:author="Bobay, Luke Andrew" w:date="2026-08-29T01:12:00Z" w16du:dateUtc="2026-08-29T08:12:00Z">
+        <w:r>
+          <w:t>depths</w:t>
+        </w:r>
+      </w:ins>
+      <w:ins w:id="448" w:author="Bobay, Luke Andrew" w:date="2026-08-29T01:09:00Z" w16du:dateUtc="2026-08-29T08:09:00Z">
+        <w:r>
+          <w:t xml:space="preserve"> (</w:t>
+        </w:r>
+        <w:r>
+          <w:rPr>
+            <w:i/>
+            <w:iCs/>
+          </w:rPr>
+          <w:t>e.g.</w:t>
+        </w:r>
+        <w:r>
+          <w:t xml:space="preserve">, </w:t>
+        </w:r>
+        <w:r>
+          <w:rPr>
+            <w:i/>
+            <w:iCs/>
+          </w:rPr>
+          <w:t>Lestidiops ringens</w:t>
+        </w:r>
+      </w:ins>
+      <w:ins w:id="449" w:author="Bobay, Luke Andrew" w:date="2026-08-29T01:10:00Z" w16du:dateUtc="2026-08-29T08:10:00Z">
+        <w:r>
+          <w:t xml:space="preserve">), throughout the full day at the </w:t>
+        </w:r>
+      </w:ins>
+      <w:ins w:id="450" w:author="Bobay, Luke Andrew" w:date="2026-08-29T01:11:00Z" w16du:dateUtc="2026-08-29T08:11:00Z">
+        <w:r>
+          <w:t xml:space="preserve">shallowest sampled </w:t>
+        </w:r>
+      </w:ins>
+      <w:ins w:id="451" w:author="Bobay, Luke Andrew" w:date="2026-08-29T01:12:00Z" w16du:dateUtc="2026-08-29T08:12:00Z">
+        <w:r>
+          <w:t>depths</w:t>
+        </w:r>
+      </w:ins>
+      <w:ins w:id="452" w:author="Bobay, Luke Andrew" w:date="2026-08-29T01:10:00Z" w16du:dateUtc="2026-08-29T08:10:00Z">
+        <w:r>
+          <w:t xml:space="preserve"> (</w:t>
+        </w:r>
+        <w:r>
+          <w:rPr>
+            <w:i/>
+            <w:iCs/>
+          </w:rPr>
+          <w:t>e.g.</w:t>
+        </w:r>
+      </w:ins>
+      <w:ins w:id="453" w:author="Bobay, Luke Andrew" w:date="2026-08-29T01:11:00Z" w16du:dateUtc="2026-08-29T08:11:00Z">
+        <w:r>
+          <w:t xml:space="preserve">, Ammodytidae), during daytime and at the shallowest </w:t>
+        </w:r>
+      </w:ins>
+      <w:ins w:id="454" w:author="Bobay, Luke Andrew" w:date="2026-08-29T01:12:00Z" w16du:dateUtc="2026-08-29T08:12:00Z">
+        <w:r>
+          <w:t>sampled depths (</w:t>
+        </w:r>
+        <w:r>
+          <w:rPr>
+            <w:i/>
+            <w:iCs/>
+          </w:rPr>
+          <w:t>e.g.</w:t>
+        </w:r>
+        <w:r>
+          <w:t xml:space="preserve">, Osmeridae), </w:t>
+        </w:r>
+      </w:ins>
+      <w:ins w:id="455" w:author="Bobay, Luke Andrew" w:date="2026-08-29T01:14:00Z" w16du:dateUtc="2026-08-29T08:14:00Z">
+        <w:r>
+          <w:t>and during nighttime at the deepest sampled depth</w:t>
+        </w:r>
+      </w:ins>
+      <w:ins w:id="456" w:author="Bobay, Luke Andrew" w:date="2026-08-29T01:15:00Z" w16du:dateUtc="2026-08-29T08:15:00Z">
+        <w:r>
+          <w:t>s and during daytime at the shallowest sampled depths (</w:t>
+        </w:r>
+        <w:r>
+          <w:rPr>
+            <w:i/>
+            <w:iCs/>
+          </w:rPr>
+          <w:t xml:space="preserve">Liparis </w:t>
+        </w:r>
+        <w:r>
+          <w:t xml:space="preserve">spp. and </w:t>
+        </w:r>
+        <w:r>
+          <w:rPr>
+            <w:i/>
+            <w:iCs/>
+          </w:rPr>
+          <w:t>Stenobrachius leucopsarus</w:t>
+        </w:r>
+        <w:r>
+          <w:t xml:space="preserve">) (Fig. 6). </w:t>
+        </w:r>
+      </w:ins>
+      <w:ins w:id="457" w:author="Bobay, Luke Andrew" w:date="2026-08-29T01:29:00Z" w16du:dateUtc="2026-08-29T08:29:00Z">
+        <w:r>
+          <w:t>T</w:t>
+        </w:r>
+      </w:ins>
+      <w:ins w:id="458" w:author="Bobay, Luke Andrew" w:date="2026-08-29T01:23:00Z" w16du:dateUtc="2026-08-29T08:23:00Z">
+        <w:r>
+          <w:t xml:space="preserve">he total abundance </w:t>
+        </w:r>
+      </w:ins>
+      <w:ins w:id="459" w:author="Bobay, Luke Andrew" w:date="2026-08-29T01:33:00Z" w16du:dateUtc="2026-08-29T08:33:00Z">
+        <w:r>
+          <w:t xml:space="preserve">of larvae </w:t>
+        </w:r>
+      </w:ins>
+      <w:ins w:id="460" w:author="Bobay, Luke Andrew" w:date="2026-08-29T01:30:00Z" w16du:dateUtc="2026-08-29T08:30:00Z">
+        <w:r>
+          <w:t>in the sampled portion of the water column</w:t>
+        </w:r>
+      </w:ins>
+      <w:ins w:id="461" w:author="Bobay, Luke Andrew" w:date="2026-08-29T01:23:00Z" w16du:dateUtc="2026-08-29T08:23:00Z">
+        <w:r>
+          <w:t xml:space="preserve"> varies </w:t>
+        </w:r>
+      </w:ins>
+      <w:ins w:id="462" w:author="Bobay, Luke Andrew" w:date="2026-08-29T01:31:00Z" w16du:dateUtc="2026-08-29T08:31:00Z">
+        <w:r>
+          <w:t xml:space="preserve">substantially </w:t>
+        </w:r>
+      </w:ins>
+      <w:ins w:id="463" w:author="Bobay, Luke Andrew" w:date="2026-08-29T01:23:00Z" w16du:dateUtc="2026-08-29T08:23:00Z">
+        <w:r>
+          <w:t>over the course of a day</w:t>
+        </w:r>
+      </w:ins>
+      <w:ins w:id="464" w:author="Bobay, Luke Andrew" w:date="2026-08-29T01:33:00Z" w16du:dateUtc="2026-08-29T08:33:00Z">
+        <w:r>
+          <w:t xml:space="preserve"> for some taxa</w:t>
+        </w:r>
+      </w:ins>
+      <w:ins w:id="465" w:author="Bobay, Luke Andrew" w:date="2026-08-29T01:23:00Z" w16du:dateUtc="2026-08-29T08:23:00Z">
+        <w:r>
+          <w:t xml:space="preserve"> </w:t>
+        </w:r>
+      </w:ins>
+      <w:ins w:id="466" w:author="Bobay, Luke Andrew" w:date="2026-08-29T01:24:00Z" w16du:dateUtc="2026-08-29T08:24:00Z">
+        <w:r>
+          <w:t>(</w:t>
+        </w:r>
+        <w:r>
+          <w:rPr>
+            <w:i/>
+            <w:iCs/>
+          </w:rPr>
+          <w:t>e.g.</w:t>
+        </w:r>
+        <w:r>
+          <w:t xml:space="preserve">, </w:t>
+        </w:r>
+      </w:ins>
+      <w:ins w:id="467" w:author="Bobay, Luke Andrew" w:date="2026-08-29T01:32:00Z" w16du:dateUtc="2026-08-29T08:32:00Z">
+        <w:r>
+          <w:rPr>
+            <w:i/>
+            <w:iCs/>
+          </w:rPr>
+          <w:t>Bathylagus ochotensis</w:t>
+        </w:r>
+      </w:ins>
+      <w:ins w:id="468" w:author="Bobay, Luke Andrew" w:date="2026-08-29T01:33:00Z" w16du:dateUtc="2026-08-29T08:33:00Z">
+        <w:r>
+          <w:t xml:space="preserve"> and </w:t>
+        </w:r>
+      </w:ins>
+      <w:ins w:id="469" w:author="Bobay, Luke Andrew" w:date="2026-08-29T01:38:00Z" w16du:dateUtc="2026-08-29T08:38:00Z">
+        <w:r>
+          <w:rPr>
+            <w:i/>
+            <w:iCs/>
+          </w:rPr>
+          <w:t>Stenobrachius leucopsarus</w:t>
+        </w:r>
+      </w:ins>
+      <w:ins w:id="470" w:author="Bobay, Luke Andrew" w:date="2026-08-29T01:33:00Z" w16du:dateUtc="2026-08-29T08:33:00Z">
+        <w:r>
+          <w:t>) but not others (</w:t>
+        </w:r>
+      </w:ins>
+      <w:ins w:id="471" w:author="Bobay, Luke Andrew" w:date="2026-08-29T01:34:00Z" w16du:dateUtc="2026-08-29T08:34:00Z">
+        <w:r>
+          <w:rPr>
+            <w:i/>
+            <w:iCs/>
+          </w:rPr>
+          <w:t>e.g.</w:t>
+        </w:r>
+        <w:r>
+          <w:t xml:space="preserve">, Cottidae) (Fig. 7). Similarly, </w:t>
+        </w:r>
+      </w:ins>
+      <w:ins w:id="472" w:author="Bobay, Luke Andrew" w:date="2026-08-29T01:35:00Z" w16du:dateUtc="2026-08-29T08:35:00Z">
+        <w:r>
+          <w:t>depth-abundance gradients vary substantially over the course of a day for some taxa (</w:t>
+        </w:r>
+      </w:ins>
+      <w:ins w:id="473" w:author="Bobay, Luke Andrew" w:date="2026-08-29T01:36:00Z" w16du:dateUtc="2026-08-29T08:36:00Z">
+        <w:r>
+          <w:rPr>
+            <w:i/>
+            <w:iCs/>
+          </w:rPr>
+          <w:t>e.g.</w:t>
+        </w:r>
+        <w:r>
+          <w:t xml:space="preserve">, </w:t>
+        </w:r>
+      </w:ins>
+      <w:ins w:id="474" w:author="Bobay, Luke Andrew" w:date="2026-08-29T01:37:00Z" w16du:dateUtc="2026-08-29T08:37:00Z">
+        <w:r>
+          <w:rPr>
+            <w:i/>
+            <w:iCs/>
+          </w:rPr>
+          <w:t xml:space="preserve">Protomyctophum </w:t>
+        </w:r>
+        <w:r>
+          <w:t xml:space="preserve">spp. and Hexagrammidae) but </w:t>
+        </w:r>
+      </w:ins>
+      <w:ins w:id="475" w:author="Bobay, Luke Andrew" w:date="2026-08-29T01:38:00Z" w16du:dateUtc="2026-08-29T08:38:00Z">
+        <w:r>
+          <w:t>not others (</w:t>
+        </w:r>
+        <w:r>
+          <w:rPr>
+            <w:i/>
+            <w:iCs/>
+          </w:rPr>
+          <w:t>e.g.</w:t>
+        </w:r>
+        <w:r>
+          <w:t xml:space="preserve">, </w:t>
+        </w:r>
+      </w:ins>
+      <w:ins w:id="476" w:author="Bobay, Luke Andrew" w:date="2026-08-29T01:39:00Z" w16du:dateUtc="2026-08-29T08:39:00Z">
+        <w:r>
+          <w:rPr>
+            <w:i/>
+            <w:iCs/>
+          </w:rPr>
+          <w:t xml:space="preserve">Sebastes </w:t>
+        </w:r>
+        <w:r>
+          <w:t>spp. and Osmeridae).</w:t>
+        </w:r>
+      </w:ins>
     </w:p>
     <w:p/>
     <w:p>
@@ -3287,6 +5484,22 @@
       </w:r>
     </w:p>
   </w:comment>
+  <w:comment w:id="54" w:author="Bobay, Luke Andrew" w:date="2026-08-29T00:53:00Z" w:initials="LB">
+    <w:p>
+      <w:pPr>
+        <w:pStyle w:val="CommentText"/>
+      </w:pPr>
+      <w:r>
+        <w:rPr>
+          <w:rStyle w:val="CommentReference"/>
+        </w:rPr>
+        <w:annotationRef/>
+      </w:r>
+      <w:r>
+        <w:t>Let’s refer to these as larval fish “assemblages” rather than “communities”</w:t>
+      </w:r>
+    </w:p>
+  </w:comment>
   <w:comment w:id="51" w:author="Bobay, Luke Andrew" w:date="2026-08-28T09:12:00Z" w:initials="LB">
     <w:p>
       <w:pPr>
@@ -3303,7 +5516,7 @@
       </w:r>
     </w:p>
   </w:comment>
-  <w:comment w:id="71" w:author="McCloskey, Ross" w:date="2026-08-18T15:10:00Z" w:initials="RM">
+  <w:comment w:id="73" w:author="McCloskey, Ross" w:date="2026-08-18T15:10:00Z" w:initials="RM">
     <w:p>
       <w:pPr>
         <w:pStyle w:val="CommentText"/>
@@ -3319,7 +5532,7 @@
       </w:r>
     </w:p>
   </w:comment>
-  <w:comment w:id="69" w:author="Bobay, Luke Andrew" w:date="2026-08-28T09:09:00Z" w:initials="LB">
+  <w:comment w:id="71" w:author="Bobay, Luke Andrew" w:date="2026-08-28T09:09:00Z" w:initials="LB">
     <w:p>
       <w:pPr>
         <w:pStyle w:val="CommentText"/>
@@ -3335,7 +5548,7 @@
       </w:r>
     </w:p>
   </w:comment>
-  <w:comment w:id="77" w:author="McCloskey, Ross" w:date="2026-08-18T15:12:00Z" w:initials="RM">
+  <w:comment w:id="79" w:author="McCloskey, Ross" w:date="2026-08-18T15:12:00Z" w:initials="RM">
     <w:p>
       <w:pPr>
         <w:pStyle w:val="CommentText"/>
@@ -3351,7 +5564,7 @@
       </w:r>
     </w:p>
   </w:comment>
-  <w:comment w:id="78" w:author="McCloskey, Ross" w:date="2026-08-25T13:29:00Z" w:initials="RM">
+  <w:comment w:id="80" w:author="McCloskey, Ross" w:date="2026-08-25T13:29:00Z" w:initials="RM">
     <w:p>
       <w:pPr>
         <w:pStyle w:val="CommentText"/>
@@ -3367,7 +5580,7 @@
       </w:r>
     </w:p>
   </w:comment>
-  <w:comment w:id="79" w:author="Bobay, Luke Andrew" w:date="2026-08-28T14:13:00Z" w:initials="LB">
+  <w:comment w:id="81" w:author="Bobay, Luke Andrew" w:date="2026-08-28T14:13:00Z" w:initials="LB">
     <w:p>
       <w:pPr>
         <w:pStyle w:val="CommentText"/>
@@ -3383,7 +5596,7 @@
       </w:r>
     </w:p>
   </w:comment>
-  <w:comment w:id="111" w:author="Bobay, Luke Andrew" w:date="2026-08-28T10:31:00Z" w:initials="LB">
+  <w:comment w:id="113" w:author="Bobay, Luke Andrew" w:date="2026-08-28T10:31:00Z" w:initials="LB">
     <w:p>
       <w:pPr>
         <w:pStyle w:val="CommentText"/>
@@ -3399,7 +5612,7 @@
       </w:r>
     </w:p>
   </w:comment>
-  <w:comment w:id="157" w:author="Bobay, Luke Andrew" w:date="2026-08-28T13:40:00Z" w:initials="LB">
+  <w:comment w:id="159" w:author="Bobay, Luke Andrew" w:date="2026-08-28T13:40:00Z" w:initials="LB">
     <w:p>
       <w:pPr>
         <w:pStyle w:val="CommentText"/>
@@ -3415,7 +5628,7 @@
       </w:r>
     </w:p>
   </w:comment>
-  <w:comment w:id="72" w:author="Bobay, Luke Andrew" w:date="2026-08-28T09:18:00Z" w:initials="LB">
+  <w:comment w:id="74" w:author="Bobay, Luke Andrew" w:date="2026-08-28T09:18:00Z" w:initials="LB">
     <w:p>
       <w:pPr>
         <w:pStyle w:val="CommentText"/>
@@ -3431,7 +5644,7 @@
       </w:r>
     </w:p>
   </w:comment>
-  <w:comment w:id="182" w:author="McCloskey, Ross" w:date="2026-08-18T15:29:00Z" w:initials="RM">
+  <w:comment w:id="184" w:author="McCloskey, Ross" w:date="2026-08-18T15:29:00Z" w:initials="RM">
     <w:p>
       <w:pPr>
         <w:pStyle w:val="CommentText"/>
@@ -3455,7 +5668,7 @@
       </w:r>
     </w:p>
   </w:comment>
-  <w:comment w:id="183" w:author="Bobay, Luke Andrew" w:date="2026-08-28T14:16:00Z" w:initials="LB">
+  <w:comment w:id="185" w:author="Bobay, Luke Andrew" w:date="2026-08-28T14:16:00Z" w:initials="LB">
     <w:p>
       <w:pPr>
         <w:pStyle w:val="CommentText"/>
@@ -3471,7 +5684,7 @@
       </w:r>
     </w:p>
   </w:comment>
-  <w:comment w:id="215" w:author="Bobay, Luke Andrew" w:date="2026-08-28T14:44:00Z" w:initials="LB">
+  <w:comment w:id="217" w:author="Bobay, Luke Andrew" w:date="2026-08-28T14:44:00Z" w:initials="LB">
     <w:p>
       <w:pPr>
         <w:pStyle w:val="CommentText"/>
@@ -3487,7 +5700,7 @@
       </w:r>
     </w:p>
   </w:comment>
-  <w:comment w:id="343" w:author="McCloskey, Ross" w:date="2026-08-18T14:58:00Z" w:initials="RM">
+  <w:comment w:id="345" w:author="McCloskey, Ross" w:date="2026-08-18T14:58:00Z" w:initials="RM">
     <w:p>
       <w:pPr>
         <w:pStyle w:val="CommentText"/>
@@ -3503,7 +5716,7 @@
       </w:r>
     </w:p>
   </w:comment>
-  <w:comment w:id="344" w:author="McCloskey, Ross" w:date="2026-08-18T14:59:00Z" w:initials="RM">
+  <w:comment w:id="346" w:author="McCloskey, Ross" w:date="2026-08-18T14:59:00Z" w:initials="RM">
     <w:p>
       <w:pPr>
         <w:pStyle w:val="CommentText"/>
@@ -3519,7 +5732,7 @@
       </w:r>
     </w:p>
   </w:comment>
-  <w:comment w:id="345" w:author="McCloskey, Ross" w:date="2026-08-18T15:03:00Z" w:initials="RM">
+  <w:comment w:id="348" w:author="McCloskey, Ross" w:date="2026-08-18T15:03:00Z" w:initials="RM">
     <w:p>
       <w:pPr>
         <w:pStyle w:val="CommentText"/>
@@ -3535,7 +5748,7 @@
       </w:r>
     </w:p>
   </w:comment>
-  <w:comment w:id="346" w:author="McCloskey, Ross" w:date="2026-08-18T15:04:00Z" w:initials="RM">
+  <w:comment w:id="349" w:author="McCloskey, Ross" w:date="2026-08-18T15:04:00Z" w:initials="RM">
     <w:p>
       <w:pPr>
         <w:pStyle w:val="CommentText"/>
@@ -3562,6 +5775,7 @@
   <w15:commentEx w15:paraId="796C364A" w15:paraIdParent="021223F3" w15:done="0"/>
   <w15:commentEx w15:paraId="7A36192A" w15:done="0"/>
   <w15:commentEx w15:paraId="5B8443B7" w15:done="1"/>
+  <w15:commentEx w15:paraId="1979C077" w15:done="0"/>
   <w15:commentEx w15:paraId="14E26377" w15:done="0"/>
   <w15:commentEx w15:paraId="40FE5ADD" w15:done="0"/>
   <w15:commentEx w15:paraId="3D9FDCDB" w15:done="0"/>
@@ -3589,6 +5803,7 @@
   <w16cex:commentExtensible w16cex:durableId="60EC0075" w16cex:dateUtc="2026-08-27T18:16:00Z"/>
   <w16cex:commentExtensible w16cex:durableId="5FC70A75" w16cex:dateUtc="2026-08-28T14:42:00Z"/>
   <w16cex:commentExtensible w16cex:durableId="0798161C" w16cex:dateUtc="2026-08-18T20:06:00Z"/>
+  <w16cex:commentExtensible w16cex:durableId="6CC1B622" w16cex:dateUtc="2026-08-29T07:53:00Z"/>
   <w16cex:commentExtensible w16cex:durableId="5E1E80E1" w16cex:dateUtc="2026-08-28T16:12:00Z"/>
   <w16cex:commentExtensible w16cex:durableId="266E2573" w16cex:dateUtc="2026-08-18T20:10:00Z"/>
   <w16cex:commentExtensible w16cex:durableId="4CAAB168" w16cex:dateUtc="2026-08-28T16:09:00Z"/>
@@ -3616,6 +5831,7 @@
   <w16cid:commentId w16cid:paraId="796C364A" w16cid:durableId="60EC0075"/>
   <w16cid:commentId w16cid:paraId="7A36192A" w16cid:durableId="5FC70A75"/>
   <w16cid:commentId w16cid:paraId="5B8443B7" w16cid:durableId="0798161C"/>
+  <w16cid:commentId w16cid:paraId="1979C077" w16cid:durableId="6CC1B622"/>
   <w16cid:commentId w16cid:paraId="14E26377" w16cid:durableId="5E1E80E1"/>
   <w16cid:commentId w16cid:paraId="40FE5ADD" w16cid:durableId="266E2573"/>
   <w16cid:commentId w16cid:paraId="3D9FDCDB" w16cid:durableId="4CAAB168"/>
@@ -4700,6 +6916,16 @@
       <w:rFonts w:ascii="Times New Roman" w:hAnsi="Times New Roman" w:cs="Times New Roman"/>
     </w:rPr>
   </w:style>
+  <w:style w:type="character" w:styleId="PlaceholderText">
+    <w:name w:val="Placeholder Text"/>
+    <w:basedOn w:val="DefaultParagraphFont"/>
+    <w:uiPriority w:val="99"/>
+    <w:semiHidden/>
+    <w:rsid w:val="00BA2B40"/>
+    <w:rPr>
+      <w:color w:val="666666"/>
+    </w:rPr>
+  </w:style>
 </w:styles>
 </file>
 

</xml_diff>